<commit_message>
Journal et dossiers de phase régénérés
Co-Authored-By: Claude Opus 5.5 <noreply@anthropic.com>
</commit_message>
<xml_diff>
--- a/docs/developpement/phases/word/PHASE_00_SOCLE_DE_PRODUCTION_ET_CONFIGURATION_DUN_LIEU_VIDE.docx
+++ b/docs/developpement/phases/word/PHASE_00_SOCLE_DE_PRODUCTION_ET_CONFIGURATION_DUN_LIEU_VIDE.docx
@@ -20,7 +20,7 @@
       <w:r>
         <w:t xml:space="preserve">FlaiX Expert · dossier de développement · généré le 2026-10-04 depuis le dépôt </w:t>
       </w:r>
-      <w:hyperlink w:history="1" r:id="rIdktaxr9sohocyjxfacuxw2">
+      <w:hyperlink w:history="1" r:id="rId2ekhuerxazwp8pd8dxse5">
         <w:r>
           <w:rPr>
             <w:rStyle w:val="Hyperlink"/>
@@ -592,7 +592,7 @@
           <w:numId w:val="3"/>
         </w:numPr>
       </w:pPr>
-      <w:hyperlink w:history="1" r:id="rId1ebvduehfrdtqs7awipcz">
+      <w:hyperlink w:history="1" r:id="rIdg1p05p_djlhvwx5apjy1s">
         <w:r>
           <w:rPr>
             <w:rStyle w:val="Hyperlink"/>
@@ -612,7 +612,7 @@
           <w:numId w:val="3"/>
         </w:numPr>
       </w:pPr>
-      <w:hyperlink w:history="1" r:id="rIdjhajra1mlstwtenrxxh47">
+      <w:hyperlink w:history="1" r:id="rId24cmycvm7rsqjd4tkgxtf">
         <w:r>
           <w:rPr>
             <w:rStyle w:val="Hyperlink"/>
@@ -660,7 +660,7 @@
       <w:r>
         <w:t xml:space="preserve"> — créé — </w:t>
       </w:r>
-      <w:hyperlink w:history="1" r:id="rId43nt9mr-ht1hogbxsilbu">
+      <w:hyperlink w:history="1" r:id="rIdp6mwklsvgvhe3qt-dbrex">
         <w:r>
           <w:rPr>
             <w:rStyle w:val="Hyperlink"/>
@@ -689,7 +689,7 @@
       <w:r>
         <w:t xml:space="preserve"> — créé — </w:t>
       </w:r>
-      <w:hyperlink w:history="1" r:id="rIdqipohsbsfxiwc-ouz17pd">
+      <w:hyperlink w:history="1" r:id="rIdwmtds4vyzo8x6zpddfrfg">
         <w:r>
           <w:rPr>
             <w:rStyle w:val="Hyperlink"/>
@@ -726,7 +726,7 @@
       <w:r>
         <w:t xml:space="preserve"> — créé — </w:t>
       </w:r>
-      <w:hyperlink w:history="1" r:id="rIdgtjbzke_yvw2xzt4yznci">
+      <w:hyperlink w:history="1" r:id="rIdbk73dqf3uflblea5wsq96">
         <w:r>
           <w:rPr>
             <w:rStyle w:val="Hyperlink"/>
@@ -755,7 +755,7 @@
       <w:r>
         <w:t xml:space="preserve"> — créé — </w:t>
       </w:r>
-      <w:hyperlink w:history="1" r:id="rIdnkrr1zefauueax3vk7u6h">
+      <w:hyperlink w:history="1" r:id="rIdgmm7lq1yimvfzpitsmein">
         <w:r>
           <w:rPr>
             <w:rStyle w:val="Hyperlink"/>
@@ -784,7 +784,7 @@
       <w:r>
         <w:t xml:space="preserve"> — créé — </w:t>
       </w:r>
-      <w:hyperlink w:history="1" r:id="rId3nqn12s7dxpvbmeuafcox">
+      <w:hyperlink w:history="1" r:id="rIdgkd71xw_sd8ufubuf-vs9">
         <w:r>
           <w:rPr>
             <w:rStyle w:val="Hyperlink"/>
@@ -813,7 +813,7 @@
       <w:r>
         <w:t xml:space="preserve"> — créé — </w:t>
       </w:r>
-      <w:hyperlink w:history="1" r:id="rIdggrzcigdvoo77fz3dpipe">
+      <w:hyperlink w:history="1" r:id="rIdjqppar-brr7kdmrn9ucwu">
         <w:r>
           <w:rPr>
             <w:rStyle w:val="Hyperlink"/>
@@ -842,7 +842,7 @@
       <w:r>
         <w:t xml:space="preserve"> — créé — </w:t>
       </w:r>
-      <w:hyperlink w:history="1" r:id="rId5z36sdo3guvvb5chf82rb">
+      <w:hyperlink w:history="1" r:id="rIdtjpnlvo-k9n38xpsdv_bn">
         <w:r>
           <w:rPr>
             <w:rStyle w:val="Hyperlink"/>
@@ -879,7 +879,7 @@
       <w:r>
         <w:t xml:space="preserve"> — créé — </w:t>
       </w:r>
-      <w:hyperlink w:history="1" r:id="rIdsplgshbbrxze0hxkubkms">
+      <w:hyperlink w:history="1" r:id="rId_r28m6jankmr9khjgpypi">
         <w:r>
           <w:rPr>
             <w:rStyle w:val="Hyperlink"/>
@@ -908,7 +908,7 @@
       <w:r>
         <w:t xml:space="preserve"> — créé — </w:t>
       </w:r>
-      <w:hyperlink w:history="1" r:id="rIdenoqxodbol81hfwgxslhl">
+      <w:hyperlink w:history="1" r:id="rIdkxcxizhh6cwbx8gybwoyu">
         <w:r>
           <w:rPr>
             <w:rStyle w:val="Hyperlink"/>
@@ -937,7 +937,7 @@
       <w:r>
         <w:t xml:space="preserve"> — créé — </w:t>
       </w:r>
-      <w:hyperlink w:history="1" r:id="rIdxuyyhsx9bta3osu1j-wya">
+      <w:hyperlink w:history="1" r:id="rIdhwqxpfw-gaziox4hkjqjt">
         <w:r>
           <w:rPr>
             <w:rStyle w:val="Hyperlink"/>
@@ -966,7 +966,7 @@
       <w:r>
         <w:t xml:space="preserve"> — créé — </w:t>
       </w:r>
-      <w:hyperlink w:history="1" r:id="rIdralhauvc1oksxqzdldm6a">
+      <w:hyperlink w:history="1" r:id="rIdbxnpbd3_nj05iraucvrde">
         <w:r>
           <w:rPr>
             <w:rStyle w:val="Hyperlink"/>
@@ -995,7 +995,7 @@
       <w:r>
         <w:t xml:space="preserve"> — créé — </w:t>
       </w:r>
-      <w:hyperlink w:history="1" r:id="rIdr9iekutwp2cauj-09tpyu">
+      <w:hyperlink w:history="1" r:id="rIdjprc1htjaegsgyp9oeein">
         <w:r>
           <w:rPr>
             <w:rStyle w:val="Hyperlink"/>
@@ -1024,7 +1024,7 @@
       <w:r>
         <w:t xml:space="preserve"> — créé — </w:t>
       </w:r>
-      <w:hyperlink w:history="1" r:id="rIdh4t1qpxb55yrv0bwadvfq">
+      <w:hyperlink w:history="1" r:id="rIdrz-nhfkhbby4c7vfkq6t1">
         <w:r>
           <w:rPr>
             <w:rStyle w:val="Hyperlink"/>
@@ -1053,7 +1053,7 @@
       <w:r>
         <w:t xml:space="preserve"> — créé — </w:t>
       </w:r>
-      <w:hyperlink w:history="1" r:id="rId9x_8z8q2fufw3yim_i-0s">
+      <w:hyperlink w:history="1" r:id="rIdcgznovyagfb6a9pw-bsml">
         <w:r>
           <w:rPr>
             <w:rStyle w:val="Hyperlink"/>
@@ -1082,7 +1082,7 @@
       <w:r>
         <w:t xml:space="preserve"> — créé — </w:t>
       </w:r>
-      <w:hyperlink w:history="1" r:id="rIdmhkomxstusvds6vfebzgr">
+      <w:hyperlink w:history="1" r:id="rIdnhukyfcuppqgqadmtkgbu">
         <w:r>
           <w:rPr>
             <w:rStyle w:val="Hyperlink"/>
@@ -1111,7 +1111,7 @@
       <w:r>
         <w:t xml:space="preserve"> — créé — </w:t>
       </w:r>
-      <w:hyperlink w:history="1" r:id="rIdfy55a_7kgq08xv5dawdkf">
+      <w:hyperlink w:history="1" r:id="rIdknrcumahjyb7h3k6g7y0s">
         <w:r>
           <w:rPr>
             <w:rStyle w:val="Hyperlink"/>
@@ -1148,7 +1148,7 @@
       <w:r>
         <w:t xml:space="preserve"> — créé — </w:t>
       </w:r>
-      <w:hyperlink w:history="1" r:id="rIdmbeckjxuseduaog_8jnap">
+      <w:hyperlink w:history="1" r:id="rIdvmdqsvbhocbqelrnfghfm">
         <w:r>
           <w:rPr>
             <w:rStyle w:val="Hyperlink"/>
@@ -1177,7 +1177,7 @@
       <w:r>
         <w:t xml:space="preserve"> — créé — </w:t>
       </w:r>
-      <w:hyperlink w:history="1" r:id="rIdpg6akcxm4c1vf4n0kbaer">
+      <w:hyperlink w:history="1" r:id="rIdqit5d5ignctj0biiobher">
         <w:r>
           <w:rPr>
             <w:rStyle w:val="Hyperlink"/>
@@ -1206,7 +1206,7 @@
       <w:r>
         <w:t xml:space="preserve"> — créé — </w:t>
       </w:r>
-      <w:hyperlink w:history="1" r:id="rIdgj_nla2gurqan4zdwgkav">
+      <w:hyperlink w:history="1" r:id="rIdnehflgxoutemnmosn5bx7">
         <w:r>
           <w:rPr>
             <w:rStyle w:val="Hyperlink"/>
@@ -1235,7 +1235,7 @@
       <w:r>
         <w:t xml:space="preserve"> — créé — </w:t>
       </w:r>
-      <w:hyperlink w:history="1" r:id="rIdssfuj2nlibbgwmnjh5iqs">
+      <w:hyperlink w:history="1" r:id="rIdlituicnxoj1cct2z6vmgm">
         <w:r>
           <w:rPr>
             <w:rStyle w:val="Hyperlink"/>
@@ -1264,7 +1264,7 @@
       <w:r>
         <w:t xml:space="preserve"> — créé — </w:t>
       </w:r>
-      <w:hyperlink w:history="1" r:id="rIdcfm6ul6nbr5eww4uq9cqj">
+      <w:hyperlink w:history="1" r:id="rIdqlpcciqzzwnp0onvpplff">
         <w:r>
           <w:rPr>
             <w:rStyle w:val="Hyperlink"/>
@@ -1293,7 +1293,7 @@
       <w:r>
         <w:t xml:space="preserve"> — créé — </w:t>
       </w:r>
-      <w:hyperlink w:history="1" r:id="rIdp93akcrajnskfspechmw9">
+      <w:hyperlink w:history="1" r:id="rIdtj-h2ufmp9tq9wa3wre74">
         <w:r>
           <w:rPr>
             <w:rStyle w:val="Hyperlink"/>
@@ -1322,7 +1322,7 @@
       <w:r>
         <w:t xml:space="preserve"> — créé — </w:t>
       </w:r>
-      <w:hyperlink w:history="1" r:id="rIdi-24ddnz-n-59_m1uh4bq">
+      <w:hyperlink w:history="1" r:id="rIdb7n885hnzdh3_s3b6kd_6">
         <w:r>
           <w:rPr>
             <w:rStyle w:val="Hyperlink"/>
@@ -1351,7 +1351,7 @@
       <w:r>
         <w:t xml:space="preserve"> — créé — </w:t>
       </w:r>
-      <w:hyperlink w:history="1" r:id="rIdvyf2fbf5axt5cba95vpfs">
+      <w:hyperlink w:history="1" r:id="rIdtqi2kiofnkdvvs3chlaq9">
         <w:r>
           <w:rPr>
             <w:rStyle w:val="Hyperlink"/>
@@ -1380,7 +1380,7 @@
       <w:r>
         <w:t xml:space="preserve"> — créé — </w:t>
       </w:r>
-      <w:hyperlink w:history="1" r:id="rIdik3tjjidsk3ljwxzgskvq">
+      <w:hyperlink w:history="1" r:id="rIdreghmr2dqmgj597d9oqs7">
         <w:r>
           <w:rPr>
             <w:rStyle w:val="Hyperlink"/>
@@ -1409,7 +1409,7 @@
       <w:r>
         <w:t xml:space="preserve"> — créé — </w:t>
       </w:r>
-      <w:hyperlink w:history="1" r:id="rIdjb5qktydv8ewvx75kopfs">
+      <w:hyperlink w:history="1" r:id="rIdixr7puyvrvtpe74nqqy_b">
         <w:r>
           <w:rPr>
             <w:rStyle w:val="Hyperlink"/>
@@ -1438,7 +1438,7 @@
       <w:r>
         <w:t xml:space="preserve"> — créé — </w:t>
       </w:r>
-      <w:hyperlink w:history="1" r:id="rIdo2rearubnjbujbtphvurs">
+      <w:hyperlink w:history="1" r:id="rId5q1ulgdf2uhxcpsyw-p2e">
         <w:r>
           <w:rPr>
             <w:rStyle w:val="Hyperlink"/>
@@ -1467,7 +1467,7 @@
       <w:r>
         <w:t xml:space="preserve"> — créé — </w:t>
       </w:r>
-      <w:hyperlink w:history="1" r:id="rIddylgl2zvd3gkol6se_9kh">
+      <w:hyperlink w:history="1" r:id="rId3xaqakyv49k4rnsduj2yy">
         <w:r>
           <w:rPr>
             <w:rStyle w:val="Hyperlink"/>
@@ -1496,7 +1496,7 @@
       <w:r>
         <w:t xml:space="preserve"> — créé — </w:t>
       </w:r>
-      <w:hyperlink w:history="1" r:id="rId9e9scn1bo8ugyif2vimda">
+      <w:hyperlink w:history="1" r:id="rIdypcvsh3oksjdf9d17c70y">
         <w:r>
           <w:rPr>
             <w:rStyle w:val="Hyperlink"/>
@@ -1525,7 +1525,7 @@
       <w:r>
         <w:t xml:space="preserve"> — créé — </w:t>
       </w:r>
-      <w:hyperlink w:history="1" r:id="rIdk7o3pl9b75i5v9q6fziim">
+      <w:hyperlink w:history="1" r:id="rId7j1fekuj6o-aicl7bjape">
         <w:r>
           <w:rPr>
             <w:rStyle w:val="Hyperlink"/>
@@ -1554,7 +1554,7 @@
       <w:r>
         <w:t xml:space="preserve"> — créé — </w:t>
       </w:r>
-      <w:hyperlink w:history="1" r:id="rIdawk20o9kozrwsui2ba5cg">
+      <w:hyperlink w:history="1" r:id="rIdbdnqnutz_3y4sbomhybuh">
         <w:r>
           <w:rPr>
             <w:rStyle w:val="Hyperlink"/>
@@ -1583,7 +1583,7 @@
       <w:r>
         <w:t xml:space="preserve"> — créé — </w:t>
       </w:r>
-      <w:hyperlink w:history="1" r:id="rIdj5r_lae6cqoztp3ld-xvi">
+      <w:hyperlink w:history="1" r:id="rIdpbg_74ibj8i4oef6cqffz">
         <w:r>
           <w:rPr>
             <w:rStyle w:val="Hyperlink"/>
@@ -1612,7 +1612,7 @@
       <w:r>
         <w:t xml:space="preserve"> — créé — </w:t>
       </w:r>
-      <w:hyperlink w:history="1" r:id="rIddljfmryvgpudfcjzom5jz">
+      <w:hyperlink w:history="1" r:id="rIdnamdv2w2lf0lyslhdj8jh">
         <w:r>
           <w:rPr>
             <w:rStyle w:val="Hyperlink"/>
@@ -1641,7 +1641,7 @@
       <w:r>
         <w:t xml:space="preserve"> — créé — </w:t>
       </w:r>
-      <w:hyperlink w:history="1" r:id="rId6ydtr1avse45zxfd8e8tm">
+      <w:hyperlink w:history="1" r:id="rIdxhltd3wrtcdreh4fbjl7q">
         <w:r>
           <w:rPr>
             <w:rStyle w:val="Hyperlink"/>
@@ -1670,7 +1670,7 @@
       <w:r>
         <w:t xml:space="preserve"> — créé — </w:t>
       </w:r>
-      <w:hyperlink w:history="1" r:id="rIdsen1wwf9spxft7fjfnsnx">
+      <w:hyperlink w:history="1" r:id="rIdnd7qwchjucqwo1bykuljk">
         <w:r>
           <w:rPr>
             <w:rStyle w:val="Hyperlink"/>
@@ -1699,7 +1699,7 @@
       <w:r>
         <w:t xml:space="preserve"> — créé — </w:t>
       </w:r>
-      <w:hyperlink w:history="1" r:id="rIdqfzde0fecdraaxczqz5fv">
+      <w:hyperlink w:history="1" r:id="rIdsioqus7rfvaehmkobyjns">
         <w:r>
           <w:rPr>
             <w:rStyle w:val="Hyperlink"/>
@@ -1728,7 +1728,7 @@
       <w:r>
         <w:t xml:space="preserve"> — créé — </w:t>
       </w:r>
-      <w:hyperlink w:history="1" r:id="rIdlmkzro084xxamgtnqiwzc">
+      <w:hyperlink w:history="1" r:id="rIdddphrqyrtjhsyaydxdvow">
         <w:r>
           <w:rPr>
             <w:rStyle w:val="Hyperlink"/>
@@ -1757,7 +1757,7 @@
       <w:r>
         <w:t xml:space="preserve"> — créé — </w:t>
       </w:r>
-      <w:hyperlink w:history="1" r:id="rIduw37umra9ipc5umelhyrn">
+      <w:hyperlink w:history="1" r:id="rIdqaudwce8wkp5z8i1ttxmb">
         <w:r>
           <w:rPr>
             <w:rStyle w:val="Hyperlink"/>
@@ -1786,7 +1786,7 @@
       <w:r>
         <w:t xml:space="preserve"> — créé — </w:t>
       </w:r>
-      <w:hyperlink w:history="1" r:id="rIdaxmjb9cas3krcu8rk3osb">
+      <w:hyperlink w:history="1" r:id="rIdm6t73xxzibqxscdu_rbi2">
         <w:r>
           <w:rPr>
             <w:rStyle w:val="Hyperlink"/>
@@ -1823,7 +1823,7 @@
       <w:r>
         <w:t xml:space="preserve"> — créé — </w:t>
       </w:r>
-      <w:hyperlink w:history="1" r:id="rIdkygw1xh4ru2mlnwobuq7l">
+      <w:hyperlink w:history="1" r:id="rIdqafa7r1mrxkdrvrjeqmxm">
         <w:r>
           <w:rPr>
             <w:rStyle w:val="Hyperlink"/>
@@ -1852,7 +1852,7 @@
       <w:r>
         <w:t xml:space="preserve"> — créé — </w:t>
       </w:r>
-      <w:hyperlink w:history="1" r:id="rIdmkg-zuvxdrtfkaouvy_in">
+      <w:hyperlink w:history="1" r:id="rIdf85192wafdnylapwzlimu">
         <w:r>
           <w:rPr>
             <w:rStyle w:val="Hyperlink"/>
@@ -1881,7 +1881,7 @@
       <w:r>
         <w:t xml:space="preserve"> — créé — </w:t>
       </w:r>
-      <w:hyperlink w:history="1" r:id="rIduch2h9nfqnqudtquxw8nv">
+      <w:hyperlink w:history="1" r:id="rIdogzwssljqpzjcsizgf3xz">
         <w:r>
           <w:rPr>
             <w:rStyle w:val="Hyperlink"/>
@@ -1910,7 +1910,7 @@
       <w:r>
         <w:t xml:space="preserve"> — créé — </w:t>
       </w:r>
-      <w:hyperlink w:history="1" r:id="rIdrxwe2g-4bo9ruoa37xstt">
+      <w:hyperlink w:history="1" r:id="rIdoxnwfqx3iqta4bcyf1mok">
         <w:r>
           <w:rPr>
             <w:rStyle w:val="Hyperlink"/>
@@ -1939,7 +1939,7 @@
       <w:r>
         <w:t xml:space="preserve"> — créé — </w:t>
       </w:r>
-      <w:hyperlink w:history="1" r:id="rId6b2dubsjskpa6hyqpx1jh">
+      <w:hyperlink w:history="1" r:id="rIdqvnf-j1ypnglw2jv3rvmd">
         <w:r>
           <w:rPr>
             <w:rStyle w:val="Hyperlink"/>
@@ -1968,7 +1968,7 @@
       <w:r>
         <w:t xml:space="preserve"> — créé — </w:t>
       </w:r>
-      <w:hyperlink w:history="1" r:id="rId9c989xnawfluhsrezy4fg">
+      <w:hyperlink w:history="1" r:id="rIds9ykx-2fkrxzrxrmqe21t">
         <w:r>
           <w:rPr>
             <w:rStyle w:val="Hyperlink"/>
@@ -1997,7 +1997,7 @@
       <w:r>
         <w:t xml:space="preserve"> — créé — </w:t>
       </w:r>
-      <w:hyperlink w:history="1" r:id="rIdyt3v8ormtqb5mchsxv1ss">
+      <w:hyperlink w:history="1" r:id="rIdtq6qg67vjenwov31yuiqu">
         <w:r>
           <w:rPr>
             <w:rStyle w:val="Hyperlink"/>
@@ -2026,7 +2026,7 @@
       <w:r>
         <w:t xml:space="preserve"> — créé — </w:t>
       </w:r>
-      <w:hyperlink w:history="1" r:id="rIdmkhxoeqbtm2hqg0z6bhks">
+      <w:hyperlink w:history="1" r:id="rIdotmjkdg38wxpnhjxgsxqc">
         <w:r>
           <w:rPr>
             <w:rStyle w:val="Hyperlink"/>
@@ -2139,7 +2139,7 @@
       <w:r>
         <w:t xml:space="preserve"> — créé — </w:t>
       </w:r>
-      <w:hyperlink w:history="1" r:id="rIdiblrsyjivzgwsduyn76ie">
+      <w:hyperlink w:history="1" r:id="rIdjjdygxwi6p-kz124cmb9r">
         <w:r>
           <w:rPr>
             <w:rStyle w:val="Hyperlink"/>
@@ -2189,7 +2189,7 @@
       <w:r>
         <w:t xml:space="preserve"> — créé — </w:t>
       </w:r>
-      <w:hyperlink w:history="1" r:id="rId2luxohwuja8gm-ev0i8su">
+      <w:hyperlink w:history="1" r:id="rIdoyx-vwc62ahxc8wse2tm5">
         <w:r>
           <w:rPr>
             <w:rStyle w:val="Hyperlink"/>
@@ -2218,7 +2218,7 @@
       <w:r>
         <w:t xml:space="preserve"> — créé — </w:t>
       </w:r>
-      <w:hyperlink w:history="1" r:id="rIdklnjg_xqi5jne4eodqfdn">
+      <w:hyperlink w:history="1" r:id="rIdr-jqekptmlverfoqfxc1m">
         <w:r>
           <w:rPr>
             <w:rStyle w:val="Hyperlink"/>
@@ -2247,7 +2247,7 @@
       <w:r>
         <w:t xml:space="preserve"> — créé — </w:t>
       </w:r>
-      <w:hyperlink w:history="1" r:id="rIdm0pjqc178mftolm8drf6y">
+      <w:hyperlink w:history="1" r:id="rIdyqacdcwu1vtxzkbwbqiyh">
         <w:r>
           <w:rPr>
             <w:rStyle w:val="Hyperlink"/>
@@ -2276,7 +2276,7 @@
       <w:r>
         <w:t xml:space="preserve"> — créé — </w:t>
       </w:r>
-      <w:hyperlink w:history="1" r:id="rId78jqpg63r9tcpsuh688kc">
+      <w:hyperlink w:history="1" r:id="rId1u4fmcfy35ctlimmme1nk">
         <w:r>
           <w:rPr>
             <w:rStyle w:val="Hyperlink"/>
@@ -2313,7 +2313,7 @@
       <w:r>
         <w:t xml:space="preserve"> — créé — </w:t>
       </w:r>
-      <w:hyperlink w:history="1" r:id="rId2a3-f9itjgwvmzacsyun1">
+      <w:hyperlink w:history="1" r:id="rId4zy30lp2z3mq1y0tctxq4">
         <w:r>
           <w:rPr>
             <w:rStyle w:val="Hyperlink"/>
@@ -2342,7 +2342,7 @@
       <w:r>
         <w:t xml:space="preserve"> — créé — </w:t>
       </w:r>
-      <w:hyperlink w:history="1" r:id="rIdhw9oflwkug-i9uqtreouy">
+      <w:hyperlink w:history="1" r:id="rIdfghcsy_wt4lx2o2pmxxkq">
         <w:r>
           <w:rPr>
             <w:rStyle w:val="Hyperlink"/>
@@ -2379,7 +2379,7 @@
       <w:r>
         <w:t xml:space="preserve"> — créé — </w:t>
       </w:r>
-      <w:hyperlink w:history="1" r:id="rIde9_dlfwi8tn0gys__nbze">
+      <w:hyperlink w:history="1" r:id="rIdatky0nyw9kupw6jrbx4pz">
         <w:r>
           <w:rPr>
             <w:rStyle w:val="Hyperlink"/>
@@ -2408,7 +2408,7 @@
       <w:r>
         <w:t xml:space="preserve"> — créé — </w:t>
       </w:r>
-      <w:hyperlink w:history="1" r:id="rIdwbhuujofiqy5j59xjhath">
+      <w:hyperlink w:history="1" r:id="rIdy8mjy7b-hvzlabhcz_s22">
         <w:r>
           <w:rPr>
             <w:rStyle w:val="Hyperlink"/>
@@ -2437,7 +2437,7 @@
       <w:r>
         <w:t xml:space="preserve"> — créé — </w:t>
       </w:r>
-      <w:hyperlink w:history="1" r:id="rIdnd3hazasxcdcnug05_-et">
+      <w:hyperlink w:history="1" r:id="rIdk9jjqlvhlfx8mgmy5uafg">
         <w:r>
           <w:rPr>
             <w:rStyle w:val="Hyperlink"/>
@@ -2466,7 +2466,7 @@
       <w:r>
         <w:t xml:space="preserve"> — créé — </w:t>
       </w:r>
-      <w:hyperlink w:history="1" r:id="rId-xgwjqk_92fis5pttn5h2">
+      <w:hyperlink w:history="1" r:id="rIdyhxgcgi4q0ttztx1eedck">
         <w:r>
           <w:rPr>
             <w:rStyle w:val="Hyperlink"/>
@@ -2495,7 +2495,7 @@
       <w:r>
         <w:t xml:space="preserve"> — créé — </w:t>
       </w:r>
-      <w:hyperlink w:history="1" r:id="rIdvi2bn-6bvxvxtzkiixhvc">
+      <w:hyperlink w:history="1" r:id="rIddffpxjdbwt-iwdonfhpe7">
         <w:r>
           <w:rPr>
             <w:rStyle w:val="Hyperlink"/>
@@ -2524,7 +2524,7 @@
       <w:r>
         <w:t xml:space="preserve"> — créé — </w:t>
       </w:r>
-      <w:hyperlink w:history="1" r:id="rIdti9acw8pod0zq40vpwqym">
+      <w:hyperlink w:history="1" r:id="rIdzynlnldv1oo4wosh7ztfs">
         <w:r>
           <w:rPr>
             <w:rStyle w:val="Hyperlink"/>
@@ -2553,7 +2553,7 @@
       <w:r>
         <w:t xml:space="preserve"> — créé — </w:t>
       </w:r>
-      <w:hyperlink w:history="1" r:id="rIdoui5s3j-ik6ypnjfk-vst">
+      <w:hyperlink w:history="1" r:id="rIdioxzgum2fgf1h2fhjkmaw">
         <w:r>
           <w:rPr>
             <w:rStyle w:val="Hyperlink"/>
@@ -2582,7 +2582,7 @@
       <w:r>
         <w:t xml:space="preserve"> — créé — </w:t>
       </w:r>
-      <w:hyperlink w:history="1" r:id="rIdnn4fonlqavb597qcxtb1r">
+      <w:hyperlink w:history="1" r:id="rIdipcopq3gwq9-go36ffj2v">
         <w:r>
           <w:rPr>
             <w:rStyle w:val="Hyperlink"/>
@@ -2611,7 +2611,7 @@
       <w:r>
         <w:t xml:space="preserve"> — créé — </w:t>
       </w:r>
-      <w:hyperlink w:history="1" r:id="rIdzrkojvzwxknbc604onrcj">
+      <w:hyperlink w:history="1" r:id="rIdcm3oulotp-eiqcv2_avab">
         <w:r>
           <w:rPr>
             <w:rStyle w:val="Hyperlink"/>
@@ -2648,7 +2648,7 @@
       <w:r>
         <w:t xml:space="preserve"> — créé — </w:t>
       </w:r>
-      <w:hyperlink w:history="1" r:id="rIdgu6ewb0ju3rez7qtgos02">
+      <w:hyperlink w:history="1" r:id="rIdoj2-r7rzx0iulb63kqrzb">
         <w:r>
           <w:rPr>
             <w:rStyle w:val="Hyperlink"/>
@@ -2677,7 +2677,7 @@
       <w:r>
         <w:t xml:space="preserve"> — créé — </w:t>
       </w:r>
-      <w:hyperlink w:history="1" r:id="rId1bp1xjut7ipffvtrhvbjx">
+      <w:hyperlink w:history="1" r:id="rIdwt8mbf2bpz1mdr8-kw51x">
         <w:r>
           <w:rPr>
             <w:rStyle w:val="Hyperlink"/>
@@ -2706,7 +2706,7 @@
       <w:r>
         <w:t xml:space="preserve"> — créé — </w:t>
       </w:r>
-      <w:hyperlink w:history="1" r:id="rIdzdf9e0emsjkrv10sheve7">
+      <w:hyperlink w:history="1" r:id="rIduepfun-cwfc1vgm4ftngw">
         <w:r>
           <w:rPr>
             <w:rStyle w:val="Hyperlink"/>
@@ -2735,7 +2735,7 @@
       <w:r>
         <w:t xml:space="preserve"> — créé — </w:t>
       </w:r>
-      <w:hyperlink w:history="1" r:id="rIdbcdrarytjdeefclecgqx_">
+      <w:hyperlink w:history="1" r:id="rIdoowwu4us0_v-dgxy5xx92">
         <w:r>
           <w:rPr>
             <w:rStyle w:val="Hyperlink"/>
@@ -2764,7 +2764,7 @@
       <w:r>
         <w:t xml:space="preserve"> — créé — </w:t>
       </w:r>
-      <w:hyperlink w:history="1" r:id="rIdc8xsmpqab9wsvtvkpz0mh">
+      <w:hyperlink w:history="1" r:id="rId8wjyjnmvwye5shmce8yxd">
         <w:r>
           <w:rPr>
             <w:rStyle w:val="Hyperlink"/>
@@ -2793,7 +2793,7 @@
       <w:r>
         <w:t xml:space="preserve"> — créé — </w:t>
       </w:r>
-      <w:hyperlink w:history="1" r:id="rIdqaqbhmwhsqxhtcwtvhjp4">
+      <w:hyperlink w:history="1" r:id="rIdsormttso8bao1-1sobkpj">
         <w:r>
           <w:rPr>
             <w:rStyle w:val="Hyperlink"/>
@@ -2822,7 +2822,7 @@
       <w:r>
         <w:t xml:space="preserve"> — créé — </w:t>
       </w:r>
-      <w:hyperlink w:history="1" r:id="rId_u0mlopjo_acissrcueff">
+      <w:hyperlink w:history="1" r:id="rId-1qnporul3cxusay6iu2s">
         <w:r>
           <w:rPr>
             <w:rStyle w:val="Hyperlink"/>
@@ -2851,7 +2851,7 @@
       <w:r>
         <w:t xml:space="preserve"> — créé — </w:t>
       </w:r>
-      <w:hyperlink w:history="1" r:id="rIdscagzru1gy6nx3eilulzl">
+      <w:hyperlink w:history="1" r:id="rIdexjpj7evvm1mfdmvsuxz8">
         <w:r>
           <w:rPr>
             <w:rStyle w:val="Hyperlink"/>

</xml_diff>

<commit_message>
Audit Codex : P1 réservation de fidélité vérifiée avant d'être consommée ; option équipe, tests des écrans, documents tout ou rien, chargement allégé
Co-Authored-By: Claude Opus 5.5 <noreply@anthropic.com>
</commit_message>
<xml_diff>
--- a/docs/developpement/phases/word/PHASE_00_SOCLE_DE_PRODUCTION_ET_CONFIGURATION_DUN_LIEU_VIDE.docx
+++ b/docs/developpement/phases/word/PHASE_00_SOCLE_DE_PRODUCTION_ET_CONFIGURATION_DUN_LIEU_VIDE.docx
@@ -20,7 +20,7 @@
       <w:r>
         <w:t xml:space="preserve">FlaiX Expert · dossier de développement · généré le 2026-10-04 depuis le dépôt </w:t>
       </w:r>
-      <w:hyperlink w:history="1" r:id="rId2ekhuerxazwp8pd8dxse5">
+      <w:hyperlink w:history="1" r:id="rIdymarbwxlylq7wpnwvflap">
         <w:r>
           <w:rPr>
             <w:rStyle w:val="Hyperlink"/>
@@ -592,7 +592,7 @@
           <w:numId w:val="3"/>
         </w:numPr>
       </w:pPr>
-      <w:hyperlink w:history="1" r:id="rIdg1p05p_djlhvwx5apjy1s">
+      <w:hyperlink w:history="1" r:id="rIdc7usnbjmmdltwtllpyakr">
         <w:r>
           <w:rPr>
             <w:rStyle w:val="Hyperlink"/>
@@ -612,7 +612,7 @@
           <w:numId w:val="3"/>
         </w:numPr>
       </w:pPr>
-      <w:hyperlink w:history="1" r:id="rId24cmycvm7rsqjd4tkgxtf">
+      <w:hyperlink w:history="1" r:id="rId97jjqnphqamnsq6daenqh">
         <w:r>
           <w:rPr>
             <w:rStyle w:val="Hyperlink"/>
@@ -660,7 +660,7 @@
       <w:r>
         <w:t xml:space="preserve"> — créé — </w:t>
       </w:r>
-      <w:hyperlink w:history="1" r:id="rIdp6mwklsvgvhe3qt-dbrex">
+      <w:hyperlink w:history="1" r:id="rIdb2b4teb1tspn30yllhtll">
         <w:r>
           <w:rPr>
             <w:rStyle w:val="Hyperlink"/>
@@ -689,7 +689,7 @@
       <w:r>
         <w:t xml:space="preserve"> — créé — </w:t>
       </w:r>
-      <w:hyperlink w:history="1" r:id="rIdwmtds4vyzo8x6zpddfrfg">
+      <w:hyperlink w:history="1" r:id="rId1o_0jawtlcwvmkoczyydp">
         <w:r>
           <w:rPr>
             <w:rStyle w:val="Hyperlink"/>
@@ -726,7 +726,7 @@
       <w:r>
         <w:t xml:space="preserve"> — créé — </w:t>
       </w:r>
-      <w:hyperlink w:history="1" r:id="rIdbk73dqf3uflblea5wsq96">
+      <w:hyperlink w:history="1" r:id="rIdyickzzithjjddttbrbpb7">
         <w:r>
           <w:rPr>
             <w:rStyle w:val="Hyperlink"/>
@@ -755,7 +755,7 @@
       <w:r>
         <w:t xml:space="preserve"> — créé — </w:t>
       </w:r>
-      <w:hyperlink w:history="1" r:id="rIdgmm7lq1yimvfzpitsmein">
+      <w:hyperlink w:history="1" r:id="rId2cda5_9hlnq9f-ee_cysw">
         <w:r>
           <w:rPr>
             <w:rStyle w:val="Hyperlink"/>
@@ -784,7 +784,7 @@
       <w:r>
         <w:t xml:space="preserve"> — créé — </w:t>
       </w:r>
-      <w:hyperlink w:history="1" r:id="rIdgkd71xw_sd8ufubuf-vs9">
+      <w:hyperlink w:history="1" r:id="rIdorbdens5zomsf8cjyahwu">
         <w:r>
           <w:rPr>
             <w:rStyle w:val="Hyperlink"/>
@@ -813,7 +813,7 @@
       <w:r>
         <w:t xml:space="preserve"> — créé — </w:t>
       </w:r>
-      <w:hyperlink w:history="1" r:id="rIdjqppar-brr7kdmrn9ucwu">
+      <w:hyperlink w:history="1" r:id="rId9rn38welgqsbrzhhbnmvi">
         <w:r>
           <w:rPr>
             <w:rStyle w:val="Hyperlink"/>
@@ -842,7 +842,7 @@
       <w:r>
         <w:t xml:space="preserve"> — créé — </w:t>
       </w:r>
-      <w:hyperlink w:history="1" r:id="rIdtjpnlvo-k9n38xpsdv_bn">
+      <w:hyperlink w:history="1" r:id="rIdcgex9pivmce9ur3tmro96">
         <w:r>
           <w:rPr>
             <w:rStyle w:val="Hyperlink"/>
@@ -879,7 +879,7 @@
       <w:r>
         <w:t xml:space="preserve"> — créé — </w:t>
       </w:r>
-      <w:hyperlink w:history="1" r:id="rId_r28m6jankmr9khjgpypi">
+      <w:hyperlink w:history="1" r:id="rIdxnueehhxsxfnh4w0bbsql">
         <w:r>
           <w:rPr>
             <w:rStyle w:val="Hyperlink"/>
@@ -908,7 +908,7 @@
       <w:r>
         <w:t xml:space="preserve"> — créé — </w:t>
       </w:r>
-      <w:hyperlink w:history="1" r:id="rIdkxcxizhh6cwbx8gybwoyu">
+      <w:hyperlink w:history="1" r:id="rIdqm_f_n9_pp9pw6mc0r1dq">
         <w:r>
           <w:rPr>
             <w:rStyle w:val="Hyperlink"/>
@@ -937,7 +937,7 @@
       <w:r>
         <w:t xml:space="preserve"> — créé — </w:t>
       </w:r>
-      <w:hyperlink w:history="1" r:id="rIdhwqxpfw-gaziox4hkjqjt">
+      <w:hyperlink w:history="1" r:id="rIdbfn9yfyb7xkoikk6kpwom">
         <w:r>
           <w:rPr>
             <w:rStyle w:val="Hyperlink"/>
@@ -966,7 +966,7 @@
       <w:r>
         <w:t xml:space="preserve"> — créé — </w:t>
       </w:r>
-      <w:hyperlink w:history="1" r:id="rIdbxnpbd3_nj05iraucvrde">
+      <w:hyperlink w:history="1" r:id="rIdvutu5h_ou8v9zlz3qgvco">
         <w:r>
           <w:rPr>
             <w:rStyle w:val="Hyperlink"/>
@@ -995,7 +995,7 @@
       <w:r>
         <w:t xml:space="preserve"> — créé — </w:t>
       </w:r>
-      <w:hyperlink w:history="1" r:id="rIdjprc1htjaegsgyp9oeein">
+      <w:hyperlink w:history="1" r:id="rIdla2o---gsbp7lb0g_wbsz">
         <w:r>
           <w:rPr>
             <w:rStyle w:val="Hyperlink"/>
@@ -1024,7 +1024,7 @@
       <w:r>
         <w:t xml:space="preserve"> — créé — </w:t>
       </w:r>
-      <w:hyperlink w:history="1" r:id="rIdrz-nhfkhbby4c7vfkq6t1">
+      <w:hyperlink w:history="1" r:id="rId69tfy3dk0ukgsygononpz">
         <w:r>
           <w:rPr>
             <w:rStyle w:val="Hyperlink"/>
@@ -1053,7 +1053,7 @@
       <w:r>
         <w:t xml:space="preserve"> — créé — </w:t>
       </w:r>
-      <w:hyperlink w:history="1" r:id="rIdcgznovyagfb6a9pw-bsml">
+      <w:hyperlink w:history="1" r:id="rIdeqscexa3v9af1krjceuyc">
         <w:r>
           <w:rPr>
             <w:rStyle w:val="Hyperlink"/>
@@ -1082,7 +1082,7 @@
       <w:r>
         <w:t xml:space="preserve"> — créé — </w:t>
       </w:r>
-      <w:hyperlink w:history="1" r:id="rIdnhukyfcuppqgqadmtkgbu">
+      <w:hyperlink w:history="1" r:id="rId12hqsnnxdcpue24c_emki">
         <w:r>
           <w:rPr>
             <w:rStyle w:val="Hyperlink"/>
@@ -1111,7 +1111,7 @@
       <w:r>
         <w:t xml:space="preserve"> — créé — </w:t>
       </w:r>
-      <w:hyperlink w:history="1" r:id="rIdknrcumahjyb7h3k6g7y0s">
+      <w:hyperlink w:history="1" r:id="rIdvmpdfhc-bqlbdimthr3vr">
         <w:r>
           <w:rPr>
             <w:rStyle w:val="Hyperlink"/>
@@ -1148,7 +1148,7 @@
       <w:r>
         <w:t xml:space="preserve"> — créé — </w:t>
       </w:r>
-      <w:hyperlink w:history="1" r:id="rIdvmdqsvbhocbqelrnfghfm">
+      <w:hyperlink w:history="1" r:id="rIdsupdehnqaariotoss0b6d">
         <w:r>
           <w:rPr>
             <w:rStyle w:val="Hyperlink"/>
@@ -1177,7 +1177,7 @@
       <w:r>
         <w:t xml:space="preserve"> — créé — </w:t>
       </w:r>
-      <w:hyperlink w:history="1" r:id="rIdqit5d5ignctj0biiobher">
+      <w:hyperlink w:history="1" r:id="rIdkrrbbeveagbhjn_pz-07l">
         <w:r>
           <w:rPr>
             <w:rStyle w:val="Hyperlink"/>
@@ -1206,7 +1206,7 @@
       <w:r>
         <w:t xml:space="preserve"> — créé — </w:t>
       </w:r>
-      <w:hyperlink w:history="1" r:id="rIdnehflgxoutemnmosn5bx7">
+      <w:hyperlink w:history="1" r:id="rId-oxqu47gg1ktex0hoc7js">
         <w:r>
           <w:rPr>
             <w:rStyle w:val="Hyperlink"/>
@@ -1235,7 +1235,7 @@
       <w:r>
         <w:t xml:space="preserve"> — créé — </w:t>
       </w:r>
-      <w:hyperlink w:history="1" r:id="rIdlituicnxoj1cct2z6vmgm">
+      <w:hyperlink w:history="1" r:id="rIdkqgk22kvefco33yoq1tu7">
         <w:r>
           <w:rPr>
             <w:rStyle w:val="Hyperlink"/>
@@ -1264,7 +1264,7 @@
       <w:r>
         <w:t xml:space="preserve"> — créé — </w:t>
       </w:r>
-      <w:hyperlink w:history="1" r:id="rIdqlpcciqzzwnp0onvpplff">
+      <w:hyperlink w:history="1" r:id="rIdyzgunbvmvkxisttaxqny6">
         <w:r>
           <w:rPr>
             <w:rStyle w:val="Hyperlink"/>
@@ -1293,7 +1293,7 @@
       <w:r>
         <w:t xml:space="preserve"> — créé — </w:t>
       </w:r>
-      <w:hyperlink w:history="1" r:id="rIdtj-h2ufmp9tq9wa3wre74">
+      <w:hyperlink w:history="1" r:id="rIdzeb9lgib_abgljilefsl9">
         <w:r>
           <w:rPr>
             <w:rStyle w:val="Hyperlink"/>
@@ -1322,7 +1322,7 @@
       <w:r>
         <w:t xml:space="preserve"> — créé — </w:t>
       </w:r>
-      <w:hyperlink w:history="1" r:id="rIdb7n885hnzdh3_s3b6kd_6">
+      <w:hyperlink w:history="1" r:id="rIdjwdwfkgr1jg4_f04i1nyi">
         <w:r>
           <w:rPr>
             <w:rStyle w:val="Hyperlink"/>
@@ -1351,7 +1351,7 @@
       <w:r>
         <w:t xml:space="preserve"> — créé — </w:t>
       </w:r>
-      <w:hyperlink w:history="1" r:id="rIdtqi2kiofnkdvvs3chlaq9">
+      <w:hyperlink w:history="1" r:id="rId_zvkymotesr5geympgbcn">
         <w:r>
           <w:rPr>
             <w:rStyle w:val="Hyperlink"/>
@@ -1380,7 +1380,7 @@
       <w:r>
         <w:t xml:space="preserve"> — créé — </w:t>
       </w:r>
-      <w:hyperlink w:history="1" r:id="rIdreghmr2dqmgj597d9oqs7">
+      <w:hyperlink w:history="1" r:id="rIdevc-iwgcht-a-yx4jh-v9">
         <w:r>
           <w:rPr>
             <w:rStyle w:val="Hyperlink"/>
@@ -1409,7 +1409,7 @@
       <w:r>
         <w:t xml:space="preserve"> — créé — </w:t>
       </w:r>
-      <w:hyperlink w:history="1" r:id="rIdixr7puyvrvtpe74nqqy_b">
+      <w:hyperlink w:history="1" r:id="rIdnlprhz_-pnx5fzx2accuf">
         <w:r>
           <w:rPr>
             <w:rStyle w:val="Hyperlink"/>
@@ -1438,7 +1438,7 @@
       <w:r>
         <w:t xml:space="preserve"> — créé — </w:t>
       </w:r>
-      <w:hyperlink w:history="1" r:id="rId5q1ulgdf2uhxcpsyw-p2e">
+      <w:hyperlink w:history="1" r:id="rIdhd07bytcim6qr5z0rlz4k">
         <w:r>
           <w:rPr>
             <w:rStyle w:val="Hyperlink"/>
@@ -1467,7 +1467,7 @@
       <w:r>
         <w:t xml:space="preserve"> — créé — </w:t>
       </w:r>
-      <w:hyperlink w:history="1" r:id="rId3xaqakyv49k4rnsduj2yy">
+      <w:hyperlink w:history="1" r:id="rId63xweoniuaysflkrnncq2">
         <w:r>
           <w:rPr>
             <w:rStyle w:val="Hyperlink"/>
@@ -1496,7 +1496,7 @@
       <w:r>
         <w:t xml:space="preserve"> — créé — </w:t>
       </w:r>
-      <w:hyperlink w:history="1" r:id="rIdypcvsh3oksjdf9d17c70y">
+      <w:hyperlink w:history="1" r:id="rIdf_s13om9iawa1de35jllk">
         <w:r>
           <w:rPr>
             <w:rStyle w:val="Hyperlink"/>
@@ -1525,7 +1525,7 @@
       <w:r>
         <w:t xml:space="preserve"> — créé — </w:t>
       </w:r>
-      <w:hyperlink w:history="1" r:id="rId7j1fekuj6o-aicl7bjape">
+      <w:hyperlink w:history="1" r:id="rIdgiki_ukc4e4hzcwaj8yvb">
         <w:r>
           <w:rPr>
             <w:rStyle w:val="Hyperlink"/>
@@ -1554,7 +1554,7 @@
       <w:r>
         <w:t xml:space="preserve"> — créé — </w:t>
       </w:r>
-      <w:hyperlink w:history="1" r:id="rIdbdnqnutz_3y4sbomhybuh">
+      <w:hyperlink w:history="1" r:id="rId33ly0guwfi9psvvegwjuy">
         <w:r>
           <w:rPr>
             <w:rStyle w:val="Hyperlink"/>
@@ -1583,7 +1583,7 @@
       <w:r>
         <w:t xml:space="preserve"> — créé — </w:t>
       </w:r>
-      <w:hyperlink w:history="1" r:id="rIdpbg_74ibj8i4oef6cqffz">
+      <w:hyperlink w:history="1" r:id="rIdhmkaafvxokpczjan8xmux">
         <w:r>
           <w:rPr>
             <w:rStyle w:val="Hyperlink"/>
@@ -1612,7 +1612,7 @@
       <w:r>
         <w:t xml:space="preserve"> — créé — </w:t>
       </w:r>
-      <w:hyperlink w:history="1" r:id="rIdnamdv2w2lf0lyslhdj8jh">
+      <w:hyperlink w:history="1" r:id="rIdokew6okatvqisrgtcrlcb">
         <w:r>
           <w:rPr>
             <w:rStyle w:val="Hyperlink"/>
@@ -1641,7 +1641,7 @@
       <w:r>
         <w:t xml:space="preserve"> — créé — </w:t>
       </w:r>
-      <w:hyperlink w:history="1" r:id="rIdxhltd3wrtcdreh4fbjl7q">
+      <w:hyperlink w:history="1" r:id="rIdcoohvrmfc2yzoxvdlw6sr">
         <w:r>
           <w:rPr>
             <w:rStyle w:val="Hyperlink"/>
@@ -1670,7 +1670,7 @@
       <w:r>
         <w:t xml:space="preserve"> — créé — </w:t>
       </w:r>
-      <w:hyperlink w:history="1" r:id="rIdnd7qwchjucqwo1bykuljk">
+      <w:hyperlink w:history="1" r:id="rIdcnidal_56ozeypqwfbika">
         <w:r>
           <w:rPr>
             <w:rStyle w:val="Hyperlink"/>
@@ -1699,7 +1699,7 @@
       <w:r>
         <w:t xml:space="preserve"> — créé — </w:t>
       </w:r>
-      <w:hyperlink w:history="1" r:id="rIdsioqus7rfvaehmkobyjns">
+      <w:hyperlink w:history="1" r:id="rIdzqjjhddx0gpbeamwn_f0d">
         <w:r>
           <w:rPr>
             <w:rStyle w:val="Hyperlink"/>
@@ -1728,7 +1728,7 @@
       <w:r>
         <w:t xml:space="preserve"> — créé — </w:t>
       </w:r>
-      <w:hyperlink w:history="1" r:id="rIdddphrqyrtjhsyaydxdvow">
+      <w:hyperlink w:history="1" r:id="rIdeglypuvibkukkknhlstab">
         <w:r>
           <w:rPr>
             <w:rStyle w:val="Hyperlink"/>
@@ -1757,7 +1757,7 @@
       <w:r>
         <w:t xml:space="preserve"> — créé — </w:t>
       </w:r>
-      <w:hyperlink w:history="1" r:id="rIdqaudwce8wkp5z8i1ttxmb">
+      <w:hyperlink w:history="1" r:id="rIdbtshwcsrwr4nwdhtu1low">
         <w:r>
           <w:rPr>
             <w:rStyle w:val="Hyperlink"/>
@@ -1786,7 +1786,7 @@
       <w:r>
         <w:t xml:space="preserve"> — créé — </w:t>
       </w:r>
-      <w:hyperlink w:history="1" r:id="rIdm6t73xxzibqxscdu_rbi2">
+      <w:hyperlink w:history="1" r:id="rIdssiz2za5quhqgadeceajj">
         <w:r>
           <w:rPr>
             <w:rStyle w:val="Hyperlink"/>
@@ -1823,7 +1823,7 @@
       <w:r>
         <w:t xml:space="preserve"> — créé — </w:t>
       </w:r>
-      <w:hyperlink w:history="1" r:id="rIdqafa7r1mrxkdrvrjeqmxm">
+      <w:hyperlink w:history="1" r:id="rIdf_8lk5oftnijpd3hau9qk">
         <w:r>
           <w:rPr>
             <w:rStyle w:val="Hyperlink"/>
@@ -1852,7 +1852,7 @@
       <w:r>
         <w:t xml:space="preserve"> — créé — </w:t>
       </w:r>
-      <w:hyperlink w:history="1" r:id="rIdf85192wafdnylapwzlimu">
+      <w:hyperlink w:history="1" r:id="rIdb41fjqs9umxwmafa1h1hy">
         <w:r>
           <w:rPr>
             <w:rStyle w:val="Hyperlink"/>
@@ -1881,7 +1881,7 @@
       <w:r>
         <w:t xml:space="preserve"> — créé — </w:t>
       </w:r>
-      <w:hyperlink w:history="1" r:id="rIdogzwssljqpzjcsizgf3xz">
+      <w:hyperlink w:history="1" r:id="rIdvtivcp8lczkfj8ohwz8_9">
         <w:r>
           <w:rPr>
             <w:rStyle w:val="Hyperlink"/>
@@ -1910,7 +1910,7 @@
       <w:r>
         <w:t xml:space="preserve"> — créé — </w:t>
       </w:r>
-      <w:hyperlink w:history="1" r:id="rIdoxnwfqx3iqta4bcyf1mok">
+      <w:hyperlink w:history="1" r:id="rIdujjwvhqug7-vr31hfnr7b">
         <w:r>
           <w:rPr>
             <w:rStyle w:val="Hyperlink"/>
@@ -1939,7 +1939,7 @@
       <w:r>
         <w:t xml:space="preserve"> — créé — </w:t>
       </w:r>
-      <w:hyperlink w:history="1" r:id="rIdqvnf-j1ypnglw2jv3rvmd">
+      <w:hyperlink w:history="1" r:id="rId_aqt39gmins8v6wjvs-hs">
         <w:r>
           <w:rPr>
             <w:rStyle w:val="Hyperlink"/>
@@ -1968,7 +1968,7 @@
       <w:r>
         <w:t xml:space="preserve"> — créé — </w:t>
       </w:r>
-      <w:hyperlink w:history="1" r:id="rIds9ykx-2fkrxzrxrmqe21t">
+      <w:hyperlink w:history="1" r:id="rIdl6f6d9pehqinapdrmfdcx">
         <w:r>
           <w:rPr>
             <w:rStyle w:val="Hyperlink"/>
@@ -1997,7 +1997,7 @@
       <w:r>
         <w:t xml:space="preserve"> — créé — </w:t>
       </w:r>
-      <w:hyperlink w:history="1" r:id="rIdtq6qg67vjenwov31yuiqu">
+      <w:hyperlink w:history="1" r:id="rIdm8b82lvhevc2tdsdttgxo">
         <w:r>
           <w:rPr>
             <w:rStyle w:val="Hyperlink"/>
@@ -2026,7 +2026,7 @@
       <w:r>
         <w:t xml:space="preserve"> — créé — </w:t>
       </w:r>
-      <w:hyperlink w:history="1" r:id="rIdotmjkdg38wxpnhjxgsxqc">
+      <w:hyperlink w:history="1" r:id="rIdpfh7blqfn9d7amfjrsy6t">
         <w:r>
           <w:rPr>
             <w:rStyle w:val="Hyperlink"/>
@@ -2139,7 +2139,7 @@
       <w:r>
         <w:t xml:space="preserve"> — créé — </w:t>
       </w:r>
-      <w:hyperlink w:history="1" r:id="rIdjjdygxwi6p-kz124cmb9r">
+      <w:hyperlink w:history="1" r:id="rIdljkzrlzgtiehmhooelv1o">
         <w:r>
           <w:rPr>
             <w:rStyle w:val="Hyperlink"/>
@@ -2189,7 +2189,7 @@
       <w:r>
         <w:t xml:space="preserve"> — créé — </w:t>
       </w:r>
-      <w:hyperlink w:history="1" r:id="rIdoyx-vwc62ahxc8wse2tm5">
+      <w:hyperlink w:history="1" r:id="rIdazuvonv_far80vsnzfape">
         <w:r>
           <w:rPr>
             <w:rStyle w:val="Hyperlink"/>
@@ -2218,7 +2218,7 @@
       <w:r>
         <w:t xml:space="preserve"> — créé — </w:t>
       </w:r>
-      <w:hyperlink w:history="1" r:id="rIdr-jqekptmlverfoqfxc1m">
+      <w:hyperlink w:history="1" r:id="rId8dyk0xqnrqy1k5fl2qfwi">
         <w:r>
           <w:rPr>
             <w:rStyle w:val="Hyperlink"/>
@@ -2247,7 +2247,7 @@
       <w:r>
         <w:t xml:space="preserve"> — créé — </w:t>
       </w:r>
-      <w:hyperlink w:history="1" r:id="rIdyqacdcwu1vtxzkbwbqiyh">
+      <w:hyperlink w:history="1" r:id="rIddx7lhduupldeomzqmhf1i">
         <w:r>
           <w:rPr>
             <w:rStyle w:val="Hyperlink"/>
@@ -2276,7 +2276,7 @@
       <w:r>
         <w:t xml:space="preserve"> — créé — </w:t>
       </w:r>
-      <w:hyperlink w:history="1" r:id="rId1u4fmcfy35ctlimmme1nk">
+      <w:hyperlink w:history="1" r:id="rIdw0qq-ikp8sxivnv0guajx">
         <w:r>
           <w:rPr>
             <w:rStyle w:val="Hyperlink"/>
@@ -2313,7 +2313,7 @@
       <w:r>
         <w:t xml:space="preserve"> — créé — </w:t>
       </w:r>
-      <w:hyperlink w:history="1" r:id="rId4zy30lp2z3mq1y0tctxq4">
+      <w:hyperlink w:history="1" r:id="rId3mb55y9cuhqvcndcdzjvi">
         <w:r>
           <w:rPr>
             <w:rStyle w:val="Hyperlink"/>
@@ -2342,7 +2342,7 @@
       <w:r>
         <w:t xml:space="preserve"> — créé — </w:t>
       </w:r>
-      <w:hyperlink w:history="1" r:id="rIdfghcsy_wt4lx2o2pmxxkq">
+      <w:hyperlink w:history="1" r:id="rIdki-hue_l2vpetvs2dzzof">
         <w:r>
           <w:rPr>
             <w:rStyle w:val="Hyperlink"/>
@@ -2379,7 +2379,7 @@
       <w:r>
         <w:t xml:space="preserve"> — créé — </w:t>
       </w:r>
-      <w:hyperlink w:history="1" r:id="rIdatky0nyw9kupw6jrbx4pz">
+      <w:hyperlink w:history="1" r:id="rId68tho2cfkflpqoua_q5i1">
         <w:r>
           <w:rPr>
             <w:rStyle w:val="Hyperlink"/>
@@ -2408,7 +2408,7 @@
       <w:r>
         <w:t xml:space="preserve"> — créé — </w:t>
       </w:r>
-      <w:hyperlink w:history="1" r:id="rIdy8mjy7b-hvzlabhcz_s22">
+      <w:hyperlink w:history="1" r:id="rIdnimpcnj5ohpuq-1pewkqv">
         <w:r>
           <w:rPr>
             <w:rStyle w:val="Hyperlink"/>
@@ -2437,7 +2437,7 @@
       <w:r>
         <w:t xml:space="preserve"> — créé — </w:t>
       </w:r>
-      <w:hyperlink w:history="1" r:id="rIdk9jjqlvhlfx8mgmy5uafg">
+      <w:hyperlink w:history="1" r:id="rIddcqavs-hf5ulil_yj2iav">
         <w:r>
           <w:rPr>
             <w:rStyle w:val="Hyperlink"/>
@@ -2466,7 +2466,7 @@
       <w:r>
         <w:t xml:space="preserve"> — créé — </w:t>
       </w:r>
-      <w:hyperlink w:history="1" r:id="rIdyhxgcgi4q0ttztx1eedck">
+      <w:hyperlink w:history="1" r:id="rId3hekks5xgkz0xtmxxqmkd">
         <w:r>
           <w:rPr>
             <w:rStyle w:val="Hyperlink"/>
@@ -2495,7 +2495,7 @@
       <w:r>
         <w:t xml:space="preserve"> — créé — </w:t>
       </w:r>
-      <w:hyperlink w:history="1" r:id="rIddffpxjdbwt-iwdonfhpe7">
+      <w:hyperlink w:history="1" r:id="rIdqiiezpdcmh1ysonkkd4is">
         <w:r>
           <w:rPr>
             <w:rStyle w:val="Hyperlink"/>
@@ -2524,7 +2524,7 @@
       <w:r>
         <w:t xml:space="preserve"> — créé — </w:t>
       </w:r>
-      <w:hyperlink w:history="1" r:id="rIdzynlnldv1oo4wosh7ztfs">
+      <w:hyperlink w:history="1" r:id="rIdwkpaptwemfp2emgkbeyxa">
         <w:r>
           <w:rPr>
             <w:rStyle w:val="Hyperlink"/>
@@ -2553,7 +2553,7 @@
       <w:r>
         <w:t xml:space="preserve"> — créé — </w:t>
       </w:r>
-      <w:hyperlink w:history="1" r:id="rIdioxzgum2fgf1h2fhjkmaw">
+      <w:hyperlink w:history="1" r:id="rIdj4zsumaowbrfl2fi1ybas">
         <w:r>
           <w:rPr>
             <w:rStyle w:val="Hyperlink"/>
@@ -2582,7 +2582,7 @@
       <w:r>
         <w:t xml:space="preserve"> — créé — </w:t>
       </w:r>
-      <w:hyperlink w:history="1" r:id="rIdipcopq3gwq9-go36ffj2v">
+      <w:hyperlink w:history="1" r:id="rIdffaxaosnxwcz0_taemxp5">
         <w:r>
           <w:rPr>
             <w:rStyle w:val="Hyperlink"/>
@@ -2611,7 +2611,7 @@
       <w:r>
         <w:t xml:space="preserve"> — créé — </w:t>
       </w:r>
-      <w:hyperlink w:history="1" r:id="rIdcm3oulotp-eiqcv2_avab">
+      <w:hyperlink w:history="1" r:id="rIdxwe_yml40ffsatk72nuu2">
         <w:r>
           <w:rPr>
             <w:rStyle w:val="Hyperlink"/>
@@ -2648,7 +2648,7 @@
       <w:r>
         <w:t xml:space="preserve"> — créé — </w:t>
       </w:r>
-      <w:hyperlink w:history="1" r:id="rIdoj2-r7rzx0iulb63kqrzb">
+      <w:hyperlink w:history="1" r:id="rIdynmozciocgelmvhfxzxvc">
         <w:r>
           <w:rPr>
             <w:rStyle w:val="Hyperlink"/>
@@ -2677,7 +2677,7 @@
       <w:r>
         <w:t xml:space="preserve"> — créé — </w:t>
       </w:r>
-      <w:hyperlink w:history="1" r:id="rIdwt8mbf2bpz1mdr8-kw51x">
+      <w:hyperlink w:history="1" r:id="rIdz5pwt3jhxkfneayrigbmf">
         <w:r>
           <w:rPr>
             <w:rStyle w:val="Hyperlink"/>
@@ -2706,7 +2706,7 @@
       <w:r>
         <w:t xml:space="preserve"> — créé — </w:t>
       </w:r>
-      <w:hyperlink w:history="1" r:id="rIduepfun-cwfc1vgm4ftngw">
+      <w:hyperlink w:history="1" r:id="rIdthzm7zageef0zxgflzyok">
         <w:r>
           <w:rPr>
             <w:rStyle w:val="Hyperlink"/>
@@ -2735,7 +2735,7 @@
       <w:r>
         <w:t xml:space="preserve"> — créé — </w:t>
       </w:r>
-      <w:hyperlink w:history="1" r:id="rIdoowwu4us0_v-dgxy5xx92">
+      <w:hyperlink w:history="1" r:id="rIdbtvgzbk1fedq6pzvgziik">
         <w:r>
           <w:rPr>
             <w:rStyle w:val="Hyperlink"/>
@@ -2764,7 +2764,7 @@
       <w:r>
         <w:t xml:space="preserve"> — créé — </w:t>
       </w:r>
-      <w:hyperlink w:history="1" r:id="rId8wjyjnmvwye5shmce8yxd">
+      <w:hyperlink w:history="1" r:id="rIdxuw98ny7s8hvro5eutftu">
         <w:r>
           <w:rPr>
             <w:rStyle w:val="Hyperlink"/>
@@ -2793,7 +2793,7 @@
       <w:r>
         <w:t xml:space="preserve"> — créé — </w:t>
       </w:r>
-      <w:hyperlink w:history="1" r:id="rIdsormttso8bao1-1sobkpj">
+      <w:hyperlink w:history="1" r:id="rId5uvrmzxxg7flb_bcegt5v">
         <w:r>
           <w:rPr>
             <w:rStyle w:val="Hyperlink"/>
@@ -2822,7 +2822,7 @@
       <w:r>
         <w:t xml:space="preserve"> — créé — </w:t>
       </w:r>
-      <w:hyperlink w:history="1" r:id="rId-1qnporul3cxusay6iu2s">
+      <w:hyperlink w:history="1" r:id="rId0ryr7kx1ikspamqase9nm">
         <w:r>
           <w:rPr>
             <w:rStyle w:val="Hyperlink"/>
@@ -2851,7 +2851,7 @@
       <w:r>
         <w:t xml:space="preserve"> — créé — </w:t>
       </w:r>
-      <w:hyperlink w:history="1" r:id="rIdexjpj7evvm1mfdmvsuxz8">
+      <w:hyperlink w:history="1" r:id="rIdtdghotagmg13hy2mvjwss">
         <w:r>
           <w:rPr>
             <w:rStyle w:val="Hyperlink"/>

</xml_diff>

<commit_message>
Journal : phase 32 (audit Codex et corrections)
Co-Authored-By: Claude Opus 5.5 <noreply@anthropic.com>
</commit_message>
<xml_diff>
--- a/docs/developpement/phases/word/PHASE_00_SOCLE_DE_PRODUCTION_ET_CONFIGURATION_DUN_LIEU_VIDE.docx
+++ b/docs/developpement/phases/word/PHASE_00_SOCLE_DE_PRODUCTION_ET_CONFIGURATION_DUN_LIEU_VIDE.docx
@@ -20,7 +20,7 @@
       <w:r>
         <w:t xml:space="preserve">FlaiX Expert · dossier de développement · généré le 2026-10-04 depuis le dépôt </w:t>
       </w:r>
-      <w:hyperlink w:history="1" r:id="rIdymarbwxlylq7wpnwvflap">
+      <w:hyperlink w:history="1" r:id="rIdtk8-lbuymesnnmtg4isvc">
         <w:r>
           <w:rPr>
             <w:rStyle w:val="Hyperlink"/>
@@ -592,7 +592,7 @@
           <w:numId w:val="3"/>
         </w:numPr>
       </w:pPr>
-      <w:hyperlink w:history="1" r:id="rIdc7usnbjmmdltwtllpyakr">
+      <w:hyperlink w:history="1" r:id="rIdb7tfphrl6jvm8nfpoq_ka">
         <w:r>
           <w:rPr>
             <w:rStyle w:val="Hyperlink"/>
@@ -612,7 +612,7 @@
           <w:numId w:val="3"/>
         </w:numPr>
       </w:pPr>
-      <w:hyperlink w:history="1" r:id="rId97jjqnphqamnsq6daenqh">
+      <w:hyperlink w:history="1" r:id="rIdpmbsz5d0nl71y3zoavvsd">
         <w:r>
           <w:rPr>
             <w:rStyle w:val="Hyperlink"/>
@@ -660,7 +660,7 @@
       <w:r>
         <w:t xml:space="preserve"> — créé — </w:t>
       </w:r>
-      <w:hyperlink w:history="1" r:id="rIdb2b4teb1tspn30yllhtll">
+      <w:hyperlink w:history="1" r:id="rIduelth89ixdwzw3v2hbtqm">
         <w:r>
           <w:rPr>
             <w:rStyle w:val="Hyperlink"/>
@@ -689,7 +689,7 @@
       <w:r>
         <w:t xml:space="preserve"> — créé — </w:t>
       </w:r>
-      <w:hyperlink w:history="1" r:id="rId1o_0jawtlcwvmkoczyydp">
+      <w:hyperlink w:history="1" r:id="rIdmzcj3nblxnmb_cidms72s">
         <w:r>
           <w:rPr>
             <w:rStyle w:val="Hyperlink"/>
@@ -726,7 +726,7 @@
       <w:r>
         <w:t xml:space="preserve"> — créé — </w:t>
       </w:r>
-      <w:hyperlink w:history="1" r:id="rIdyickzzithjjddttbrbpb7">
+      <w:hyperlink w:history="1" r:id="rIdngesh_8prst53bgwxp3mr">
         <w:r>
           <w:rPr>
             <w:rStyle w:val="Hyperlink"/>
@@ -755,7 +755,7 @@
       <w:r>
         <w:t xml:space="preserve"> — créé — </w:t>
       </w:r>
-      <w:hyperlink w:history="1" r:id="rId2cda5_9hlnq9f-ee_cysw">
+      <w:hyperlink w:history="1" r:id="rIdk3mkfhkpjkn3rke9jyw6o">
         <w:r>
           <w:rPr>
             <w:rStyle w:val="Hyperlink"/>
@@ -784,7 +784,7 @@
       <w:r>
         <w:t xml:space="preserve"> — créé — </w:t>
       </w:r>
-      <w:hyperlink w:history="1" r:id="rIdorbdens5zomsf8cjyahwu">
+      <w:hyperlink w:history="1" r:id="rIdpbn1y3fww8fmr_cozj5s0">
         <w:r>
           <w:rPr>
             <w:rStyle w:val="Hyperlink"/>
@@ -813,7 +813,7 @@
       <w:r>
         <w:t xml:space="preserve"> — créé — </w:t>
       </w:r>
-      <w:hyperlink w:history="1" r:id="rId9rn38welgqsbrzhhbnmvi">
+      <w:hyperlink w:history="1" r:id="rIdwxorkgkmniznztzhp3tuw">
         <w:r>
           <w:rPr>
             <w:rStyle w:val="Hyperlink"/>
@@ -842,7 +842,7 @@
       <w:r>
         <w:t xml:space="preserve"> — créé — </w:t>
       </w:r>
-      <w:hyperlink w:history="1" r:id="rIdcgex9pivmce9ur3tmro96">
+      <w:hyperlink w:history="1" r:id="rIdeh59ij5fhjjl6pbsbi6av">
         <w:r>
           <w:rPr>
             <w:rStyle w:val="Hyperlink"/>
@@ -879,7 +879,7 @@
       <w:r>
         <w:t xml:space="preserve"> — créé — </w:t>
       </w:r>
-      <w:hyperlink w:history="1" r:id="rIdxnueehhxsxfnh4w0bbsql">
+      <w:hyperlink w:history="1" r:id="rIdhqkv28tsqtfdzxdcbpbkf">
         <w:r>
           <w:rPr>
             <w:rStyle w:val="Hyperlink"/>
@@ -908,7 +908,7 @@
       <w:r>
         <w:t xml:space="preserve"> — créé — </w:t>
       </w:r>
-      <w:hyperlink w:history="1" r:id="rIdqm_f_n9_pp9pw6mc0r1dq">
+      <w:hyperlink w:history="1" r:id="rIdqlqrl4fmlommcmlwn4hyx">
         <w:r>
           <w:rPr>
             <w:rStyle w:val="Hyperlink"/>
@@ -937,7 +937,7 @@
       <w:r>
         <w:t xml:space="preserve"> — créé — </w:t>
       </w:r>
-      <w:hyperlink w:history="1" r:id="rIdbfn9yfyb7xkoikk6kpwom">
+      <w:hyperlink w:history="1" r:id="rId4hjza3ppye3gfmn6quh_v">
         <w:r>
           <w:rPr>
             <w:rStyle w:val="Hyperlink"/>
@@ -966,7 +966,7 @@
       <w:r>
         <w:t xml:space="preserve"> — créé — </w:t>
       </w:r>
-      <w:hyperlink w:history="1" r:id="rIdvutu5h_ou8v9zlz3qgvco">
+      <w:hyperlink w:history="1" r:id="rIde2-o2cx9wxwin4idxizb8">
         <w:r>
           <w:rPr>
             <w:rStyle w:val="Hyperlink"/>
@@ -995,7 +995,7 @@
       <w:r>
         <w:t xml:space="preserve"> — créé — </w:t>
       </w:r>
-      <w:hyperlink w:history="1" r:id="rIdla2o---gsbp7lb0g_wbsz">
+      <w:hyperlink w:history="1" r:id="rIdcngwofk9elhw4c1araf4i">
         <w:r>
           <w:rPr>
             <w:rStyle w:val="Hyperlink"/>
@@ -1024,7 +1024,7 @@
       <w:r>
         <w:t xml:space="preserve"> — créé — </w:t>
       </w:r>
-      <w:hyperlink w:history="1" r:id="rId69tfy3dk0ukgsygononpz">
+      <w:hyperlink w:history="1" r:id="rIdcimi4xhfi6fupvoi0sbeu">
         <w:r>
           <w:rPr>
             <w:rStyle w:val="Hyperlink"/>
@@ -1053,7 +1053,7 @@
       <w:r>
         <w:t xml:space="preserve"> — créé — </w:t>
       </w:r>
-      <w:hyperlink w:history="1" r:id="rIdeqscexa3v9af1krjceuyc">
+      <w:hyperlink w:history="1" r:id="rIdaflmvmsmszuwds0rain1k">
         <w:r>
           <w:rPr>
             <w:rStyle w:val="Hyperlink"/>
@@ -1082,7 +1082,7 @@
       <w:r>
         <w:t xml:space="preserve"> — créé — </w:t>
       </w:r>
-      <w:hyperlink w:history="1" r:id="rId12hqsnnxdcpue24c_emki">
+      <w:hyperlink w:history="1" r:id="rIdeujxz293jozid5m6hdotl">
         <w:r>
           <w:rPr>
             <w:rStyle w:val="Hyperlink"/>
@@ -1111,7 +1111,7 @@
       <w:r>
         <w:t xml:space="preserve"> — créé — </w:t>
       </w:r>
-      <w:hyperlink w:history="1" r:id="rIdvmpdfhc-bqlbdimthr3vr">
+      <w:hyperlink w:history="1" r:id="rIdl2ia3axrbz2a_mxpyqusa">
         <w:r>
           <w:rPr>
             <w:rStyle w:val="Hyperlink"/>
@@ -1148,7 +1148,7 @@
       <w:r>
         <w:t xml:space="preserve"> — créé — </w:t>
       </w:r>
-      <w:hyperlink w:history="1" r:id="rIdsupdehnqaariotoss0b6d">
+      <w:hyperlink w:history="1" r:id="rIdqnmrg6-wsywdfob0vkv7m">
         <w:r>
           <w:rPr>
             <w:rStyle w:val="Hyperlink"/>
@@ -1177,7 +1177,7 @@
       <w:r>
         <w:t xml:space="preserve"> — créé — </w:t>
       </w:r>
-      <w:hyperlink w:history="1" r:id="rIdkrrbbeveagbhjn_pz-07l">
+      <w:hyperlink w:history="1" r:id="rIdbqqiddmqosdwx3ftjiuxk">
         <w:r>
           <w:rPr>
             <w:rStyle w:val="Hyperlink"/>
@@ -1206,7 +1206,7 @@
       <w:r>
         <w:t xml:space="preserve"> — créé — </w:t>
       </w:r>
-      <w:hyperlink w:history="1" r:id="rId-oxqu47gg1ktex0hoc7js">
+      <w:hyperlink w:history="1" r:id="rIdsdtyr-a4-l_4vciehu_0p">
         <w:r>
           <w:rPr>
             <w:rStyle w:val="Hyperlink"/>
@@ -1235,7 +1235,7 @@
       <w:r>
         <w:t xml:space="preserve"> — créé — </w:t>
       </w:r>
-      <w:hyperlink w:history="1" r:id="rIdkqgk22kvefco33yoq1tu7">
+      <w:hyperlink w:history="1" r:id="rId_mmugbsaaf-qw_bwyoonw">
         <w:r>
           <w:rPr>
             <w:rStyle w:val="Hyperlink"/>
@@ -1264,7 +1264,7 @@
       <w:r>
         <w:t xml:space="preserve"> — créé — </w:t>
       </w:r>
-      <w:hyperlink w:history="1" r:id="rIdyzgunbvmvkxisttaxqny6">
+      <w:hyperlink w:history="1" r:id="rIdrrgvfdwgqlgggaaumx5sl">
         <w:r>
           <w:rPr>
             <w:rStyle w:val="Hyperlink"/>
@@ -1293,7 +1293,7 @@
       <w:r>
         <w:t xml:space="preserve"> — créé — </w:t>
       </w:r>
-      <w:hyperlink w:history="1" r:id="rIdzeb9lgib_abgljilefsl9">
+      <w:hyperlink w:history="1" r:id="rIdul9buudgef4tmkszchu6n">
         <w:r>
           <w:rPr>
             <w:rStyle w:val="Hyperlink"/>
@@ -1322,7 +1322,7 @@
       <w:r>
         <w:t xml:space="preserve"> — créé — </w:t>
       </w:r>
-      <w:hyperlink w:history="1" r:id="rIdjwdwfkgr1jg4_f04i1nyi">
+      <w:hyperlink w:history="1" r:id="rIdnfmxnomwn_bgkd9jdwmbj">
         <w:r>
           <w:rPr>
             <w:rStyle w:val="Hyperlink"/>
@@ -1351,7 +1351,7 @@
       <w:r>
         <w:t xml:space="preserve"> — créé — </w:t>
       </w:r>
-      <w:hyperlink w:history="1" r:id="rId_zvkymotesr5geympgbcn">
+      <w:hyperlink w:history="1" r:id="rId5b9y8jptsvfii_0so1lfq">
         <w:r>
           <w:rPr>
             <w:rStyle w:val="Hyperlink"/>
@@ -1380,7 +1380,7 @@
       <w:r>
         <w:t xml:space="preserve"> — créé — </w:t>
       </w:r>
-      <w:hyperlink w:history="1" r:id="rIdevc-iwgcht-a-yx4jh-v9">
+      <w:hyperlink w:history="1" r:id="rIdpx_acpqmdzd3vhtotlxfo">
         <w:r>
           <w:rPr>
             <w:rStyle w:val="Hyperlink"/>
@@ -1409,7 +1409,7 @@
       <w:r>
         <w:t xml:space="preserve"> — créé — </w:t>
       </w:r>
-      <w:hyperlink w:history="1" r:id="rIdnlprhz_-pnx5fzx2accuf">
+      <w:hyperlink w:history="1" r:id="rIdizy0xpfy7waabn2r53rnl">
         <w:r>
           <w:rPr>
             <w:rStyle w:val="Hyperlink"/>
@@ -1438,7 +1438,7 @@
       <w:r>
         <w:t xml:space="preserve"> — créé — </w:t>
       </w:r>
-      <w:hyperlink w:history="1" r:id="rIdhd07bytcim6qr5z0rlz4k">
+      <w:hyperlink w:history="1" r:id="rIdkdnwkqysa5a3xvx9ubuj7">
         <w:r>
           <w:rPr>
             <w:rStyle w:val="Hyperlink"/>
@@ -1467,7 +1467,7 @@
       <w:r>
         <w:t xml:space="preserve"> — créé — </w:t>
       </w:r>
-      <w:hyperlink w:history="1" r:id="rId63xweoniuaysflkrnncq2">
+      <w:hyperlink w:history="1" r:id="rIdk5hrt82lvdoq317acwnbs">
         <w:r>
           <w:rPr>
             <w:rStyle w:val="Hyperlink"/>
@@ -1496,7 +1496,7 @@
       <w:r>
         <w:t xml:space="preserve"> — créé — </w:t>
       </w:r>
-      <w:hyperlink w:history="1" r:id="rIdf_s13om9iawa1de35jllk">
+      <w:hyperlink w:history="1" r:id="rId0e-rc60wpreojbhrs_apw">
         <w:r>
           <w:rPr>
             <w:rStyle w:val="Hyperlink"/>
@@ -1525,7 +1525,7 @@
       <w:r>
         <w:t xml:space="preserve"> — créé — </w:t>
       </w:r>
-      <w:hyperlink w:history="1" r:id="rIdgiki_ukc4e4hzcwaj8yvb">
+      <w:hyperlink w:history="1" r:id="rId-vhennkvfsdptiaqbs1yt">
         <w:r>
           <w:rPr>
             <w:rStyle w:val="Hyperlink"/>
@@ -1554,7 +1554,7 @@
       <w:r>
         <w:t xml:space="preserve"> — créé — </w:t>
       </w:r>
-      <w:hyperlink w:history="1" r:id="rId33ly0guwfi9psvvegwjuy">
+      <w:hyperlink w:history="1" r:id="rIddnkjljbdggm-teovrhol0">
         <w:r>
           <w:rPr>
             <w:rStyle w:val="Hyperlink"/>
@@ -1583,7 +1583,7 @@
       <w:r>
         <w:t xml:space="preserve"> — créé — </w:t>
       </w:r>
-      <w:hyperlink w:history="1" r:id="rIdhmkaafvxokpczjan8xmux">
+      <w:hyperlink w:history="1" r:id="rIdocqnwwbothkbfr8tgxok4">
         <w:r>
           <w:rPr>
             <w:rStyle w:val="Hyperlink"/>
@@ -1612,7 +1612,7 @@
       <w:r>
         <w:t xml:space="preserve"> — créé — </w:t>
       </w:r>
-      <w:hyperlink w:history="1" r:id="rIdokew6okatvqisrgtcrlcb">
+      <w:hyperlink w:history="1" r:id="rIdm8j8q0n_eziurxskc1ldt">
         <w:r>
           <w:rPr>
             <w:rStyle w:val="Hyperlink"/>
@@ -1641,7 +1641,7 @@
       <w:r>
         <w:t xml:space="preserve"> — créé — </w:t>
       </w:r>
-      <w:hyperlink w:history="1" r:id="rIdcoohvrmfc2yzoxvdlw6sr">
+      <w:hyperlink w:history="1" r:id="rIdmruowstex6knlxbu7cysx">
         <w:r>
           <w:rPr>
             <w:rStyle w:val="Hyperlink"/>
@@ -1670,7 +1670,7 @@
       <w:r>
         <w:t xml:space="preserve"> — créé — </w:t>
       </w:r>
-      <w:hyperlink w:history="1" r:id="rIdcnidal_56ozeypqwfbika">
+      <w:hyperlink w:history="1" r:id="rIdcrmtfhdq7_r4am4f2ggur">
         <w:r>
           <w:rPr>
             <w:rStyle w:val="Hyperlink"/>
@@ -1699,7 +1699,7 @@
       <w:r>
         <w:t xml:space="preserve"> — créé — </w:t>
       </w:r>
-      <w:hyperlink w:history="1" r:id="rIdzqjjhddx0gpbeamwn_f0d">
+      <w:hyperlink w:history="1" r:id="rIdxzqoroodhk0xzwureu6mu">
         <w:r>
           <w:rPr>
             <w:rStyle w:val="Hyperlink"/>
@@ -1728,7 +1728,7 @@
       <w:r>
         <w:t xml:space="preserve"> — créé — </w:t>
       </w:r>
-      <w:hyperlink w:history="1" r:id="rIdeglypuvibkukkknhlstab">
+      <w:hyperlink w:history="1" r:id="rIdhbjyocnie66dplcba945u">
         <w:r>
           <w:rPr>
             <w:rStyle w:val="Hyperlink"/>
@@ -1757,7 +1757,7 @@
       <w:r>
         <w:t xml:space="preserve"> — créé — </w:t>
       </w:r>
-      <w:hyperlink w:history="1" r:id="rIdbtshwcsrwr4nwdhtu1low">
+      <w:hyperlink w:history="1" r:id="rIdx6zbkaeihujr8auofagfz">
         <w:r>
           <w:rPr>
             <w:rStyle w:val="Hyperlink"/>
@@ -1786,7 +1786,7 @@
       <w:r>
         <w:t xml:space="preserve"> — créé — </w:t>
       </w:r>
-      <w:hyperlink w:history="1" r:id="rIdssiz2za5quhqgadeceajj">
+      <w:hyperlink w:history="1" r:id="rIdij-_2vtcjx1pr8qtj0sbw">
         <w:r>
           <w:rPr>
             <w:rStyle w:val="Hyperlink"/>
@@ -1823,7 +1823,7 @@
       <w:r>
         <w:t xml:space="preserve"> — créé — </w:t>
       </w:r>
-      <w:hyperlink w:history="1" r:id="rIdf_8lk5oftnijpd3hau9qk">
+      <w:hyperlink w:history="1" r:id="rId4rgh_lnvejzfakm8_xotn">
         <w:r>
           <w:rPr>
             <w:rStyle w:val="Hyperlink"/>
@@ -1852,7 +1852,7 @@
       <w:r>
         <w:t xml:space="preserve"> — créé — </w:t>
       </w:r>
-      <w:hyperlink w:history="1" r:id="rIdb41fjqs9umxwmafa1h1hy">
+      <w:hyperlink w:history="1" r:id="rIdmrs9pziagp9ntv_p6mgd7">
         <w:r>
           <w:rPr>
             <w:rStyle w:val="Hyperlink"/>
@@ -1881,7 +1881,7 @@
       <w:r>
         <w:t xml:space="preserve"> — créé — </w:t>
       </w:r>
-      <w:hyperlink w:history="1" r:id="rIdvtivcp8lczkfj8ohwz8_9">
+      <w:hyperlink w:history="1" r:id="rIdm2rv14_vz9ivo_hyy_msr">
         <w:r>
           <w:rPr>
             <w:rStyle w:val="Hyperlink"/>
@@ -1910,7 +1910,7 @@
       <w:r>
         <w:t xml:space="preserve"> — créé — </w:t>
       </w:r>
-      <w:hyperlink w:history="1" r:id="rIdujjwvhqug7-vr31hfnr7b">
+      <w:hyperlink w:history="1" r:id="rIdf6-3mgrtezmlenwdlpneb">
         <w:r>
           <w:rPr>
             <w:rStyle w:val="Hyperlink"/>
@@ -1939,7 +1939,7 @@
       <w:r>
         <w:t xml:space="preserve"> — créé — </w:t>
       </w:r>
-      <w:hyperlink w:history="1" r:id="rId_aqt39gmins8v6wjvs-hs">
+      <w:hyperlink w:history="1" r:id="rIdqgxyz4c5r4w8jpkmpjewi">
         <w:r>
           <w:rPr>
             <w:rStyle w:val="Hyperlink"/>
@@ -1968,7 +1968,7 @@
       <w:r>
         <w:t xml:space="preserve"> — créé — </w:t>
       </w:r>
-      <w:hyperlink w:history="1" r:id="rIdl6f6d9pehqinapdrmfdcx">
+      <w:hyperlink w:history="1" r:id="rId9lrsrc0k153ek69dz2upq">
         <w:r>
           <w:rPr>
             <w:rStyle w:val="Hyperlink"/>
@@ -1997,7 +1997,7 @@
       <w:r>
         <w:t xml:space="preserve"> — créé — </w:t>
       </w:r>
-      <w:hyperlink w:history="1" r:id="rIdm8b82lvhevc2tdsdttgxo">
+      <w:hyperlink w:history="1" r:id="rIdckggkjsm1q94ljqb0tvon">
         <w:r>
           <w:rPr>
             <w:rStyle w:val="Hyperlink"/>
@@ -2026,7 +2026,7 @@
       <w:r>
         <w:t xml:space="preserve"> — créé — </w:t>
       </w:r>
-      <w:hyperlink w:history="1" r:id="rIdpfh7blqfn9d7amfjrsy6t">
+      <w:hyperlink w:history="1" r:id="rIduqmtg1moienx9a9wgeznx">
         <w:r>
           <w:rPr>
             <w:rStyle w:val="Hyperlink"/>
@@ -2139,7 +2139,7 @@
       <w:r>
         <w:t xml:space="preserve"> — créé — </w:t>
       </w:r>
-      <w:hyperlink w:history="1" r:id="rIdljkzrlzgtiehmhooelv1o">
+      <w:hyperlink w:history="1" r:id="rIdaqhliqioiw6e6u9mkdgke">
         <w:r>
           <w:rPr>
             <w:rStyle w:val="Hyperlink"/>
@@ -2189,7 +2189,7 @@
       <w:r>
         <w:t xml:space="preserve"> — créé — </w:t>
       </w:r>
-      <w:hyperlink w:history="1" r:id="rIdazuvonv_far80vsnzfape">
+      <w:hyperlink w:history="1" r:id="rIdkzb7y3il_7hv0lcyu7bw3">
         <w:r>
           <w:rPr>
             <w:rStyle w:val="Hyperlink"/>
@@ -2218,7 +2218,7 @@
       <w:r>
         <w:t xml:space="preserve"> — créé — </w:t>
       </w:r>
-      <w:hyperlink w:history="1" r:id="rId8dyk0xqnrqy1k5fl2qfwi">
+      <w:hyperlink w:history="1" r:id="rIdbayry5he2jqjeufkt6qkt">
         <w:r>
           <w:rPr>
             <w:rStyle w:val="Hyperlink"/>
@@ -2247,7 +2247,7 @@
       <w:r>
         <w:t xml:space="preserve"> — créé — </w:t>
       </w:r>
-      <w:hyperlink w:history="1" r:id="rIddx7lhduupldeomzqmhf1i">
+      <w:hyperlink w:history="1" r:id="rIdk0mgqmvwu9ku5aq6y8tvz">
         <w:r>
           <w:rPr>
             <w:rStyle w:val="Hyperlink"/>
@@ -2276,7 +2276,7 @@
       <w:r>
         <w:t xml:space="preserve"> — créé — </w:t>
       </w:r>
-      <w:hyperlink w:history="1" r:id="rIdw0qq-ikp8sxivnv0guajx">
+      <w:hyperlink w:history="1" r:id="rIdffkmdluc6zremb6dkd_y1">
         <w:r>
           <w:rPr>
             <w:rStyle w:val="Hyperlink"/>
@@ -2313,7 +2313,7 @@
       <w:r>
         <w:t xml:space="preserve"> — créé — </w:t>
       </w:r>
-      <w:hyperlink w:history="1" r:id="rId3mb55y9cuhqvcndcdzjvi">
+      <w:hyperlink w:history="1" r:id="rId6slf1vt_vvo37t7rlreqi">
         <w:r>
           <w:rPr>
             <w:rStyle w:val="Hyperlink"/>
@@ -2342,7 +2342,7 @@
       <w:r>
         <w:t xml:space="preserve"> — créé — </w:t>
       </w:r>
-      <w:hyperlink w:history="1" r:id="rIdki-hue_l2vpetvs2dzzof">
+      <w:hyperlink w:history="1" r:id="rIdi5ohudlhuly_x1qhw7so4">
         <w:r>
           <w:rPr>
             <w:rStyle w:val="Hyperlink"/>
@@ -2379,7 +2379,7 @@
       <w:r>
         <w:t xml:space="preserve"> — créé — </w:t>
       </w:r>
-      <w:hyperlink w:history="1" r:id="rId68tho2cfkflpqoua_q5i1">
+      <w:hyperlink w:history="1" r:id="rId0rb1cqfxobk76uomjku-w">
         <w:r>
           <w:rPr>
             <w:rStyle w:val="Hyperlink"/>
@@ -2408,7 +2408,7 @@
       <w:r>
         <w:t xml:space="preserve"> — créé — </w:t>
       </w:r>
-      <w:hyperlink w:history="1" r:id="rIdnimpcnj5ohpuq-1pewkqv">
+      <w:hyperlink w:history="1" r:id="rIdxhxidkpvcbseei0o-pzwe">
         <w:r>
           <w:rPr>
             <w:rStyle w:val="Hyperlink"/>
@@ -2437,7 +2437,7 @@
       <w:r>
         <w:t xml:space="preserve"> — créé — </w:t>
       </w:r>
-      <w:hyperlink w:history="1" r:id="rIddcqavs-hf5ulil_yj2iav">
+      <w:hyperlink w:history="1" r:id="rIdp5eoj-xmhefkbyse9horb">
         <w:r>
           <w:rPr>
             <w:rStyle w:val="Hyperlink"/>
@@ -2466,7 +2466,7 @@
       <w:r>
         <w:t xml:space="preserve"> — créé — </w:t>
       </w:r>
-      <w:hyperlink w:history="1" r:id="rId3hekks5xgkz0xtmxxqmkd">
+      <w:hyperlink w:history="1" r:id="rId2hkrr8i06p9caonxpilri">
         <w:r>
           <w:rPr>
             <w:rStyle w:val="Hyperlink"/>
@@ -2495,7 +2495,7 @@
       <w:r>
         <w:t xml:space="preserve"> — créé — </w:t>
       </w:r>
-      <w:hyperlink w:history="1" r:id="rIdqiiezpdcmh1ysonkkd4is">
+      <w:hyperlink w:history="1" r:id="rIdgxkyild4foj79acc3dh00">
         <w:r>
           <w:rPr>
             <w:rStyle w:val="Hyperlink"/>
@@ -2524,7 +2524,7 @@
       <w:r>
         <w:t xml:space="preserve"> — créé — </w:t>
       </w:r>
-      <w:hyperlink w:history="1" r:id="rIdwkpaptwemfp2emgkbeyxa">
+      <w:hyperlink w:history="1" r:id="rId7br3l1rfskmr02auuan40">
         <w:r>
           <w:rPr>
             <w:rStyle w:val="Hyperlink"/>
@@ -2553,7 +2553,7 @@
       <w:r>
         <w:t xml:space="preserve"> — créé — </w:t>
       </w:r>
-      <w:hyperlink w:history="1" r:id="rIdj4zsumaowbrfl2fi1ybas">
+      <w:hyperlink w:history="1" r:id="rIdh_8bmyk_ncbfcuvmmcvqr">
         <w:r>
           <w:rPr>
             <w:rStyle w:val="Hyperlink"/>
@@ -2582,7 +2582,7 @@
       <w:r>
         <w:t xml:space="preserve"> — créé — </w:t>
       </w:r>
-      <w:hyperlink w:history="1" r:id="rIdffaxaosnxwcz0_taemxp5">
+      <w:hyperlink w:history="1" r:id="rIdqysmxzaxpu2ik4nvixx8e">
         <w:r>
           <w:rPr>
             <w:rStyle w:val="Hyperlink"/>
@@ -2611,7 +2611,7 @@
       <w:r>
         <w:t xml:space="preserve"> — créé — </w:t>
       </w:r>
-      <w:hyperlink w:history="1" r:id="rIdxwe_yml40ffsatk72nuu2">
+      <w:hyperlink w:history="1" r:id="rIdhd43nbs6xhaveqcgjog6d">
         <w:r>
           <w:rPr>
             <w:rStyle w:val="Hyperlink"/>
@@ -2648,7 +2648,7 @@
       <w:r>
         <w:t xml:space="preserve"> — créé — </w:t>
       </w:r>
-      <w:hyperlink w:history="1" r:id="rIdynmozciocgelmvhfxzxvc">
+      <w:hyperlink w:history="1" r:id="rIda_6oeysne_l_fk_ofusc0">
         <w:r>
           <w:rPr>
             <w:rStyle w:val="Hyperlink"/>
@@ -2677,7 +2677,7 @@
       <w:r>
         <w:t xml:space="preserve"> — créé — </w:t>
       </w:r>
-      <w:hyperlink w:history="1" r:id="rIdz5pwt3jhxkfneayrigbmf">
+      <w:hyperlink w:history="1" r:id="rIdpceupgrkcwturjvyc8svq">
         <w:r>
           <w:rPr>
             <w:rStyle w:val="Hyperlink"/>
@@ -2706,7 +2706,7 @@
       <w:r>
         <w:t xml:space="preserve"> — créé — </w:t>
       </w:r>
-      <w:hyperlink w:history="1" r:id="rIdthzm7zageef0zxgflzyok">
+      <w:hyperlink w:history="1" r:id="rIdj2pm2io32x6yufgzrpbo1">
         <w:r>
           <w:rPr>
             <w:rStyle w:val="Hyperlink"/>
@@ -2735,7 +2735,7 @@
       <w:r>
         <w:t xml:space="preserve"> — créé — </w:t>
       </w:r>
-      <w:hyperlink w:history="1" r:id="rIdbtvgzbk1fedq6pzvgziik">
+      <w:hyperlink w:history="1" r:id="rIdm240iqb40rnl4wx8cyq76">
         <w:r>
           <w:rPr>
             <w:rStyle w:val="Hyperlink"/>
@@ -2764,7 +2764,7 @@
       <w:r>
         <w:t xml:space="preserve"> — créé — </w:t>
       </w:r>
-      <w:hyperlink w:history="1" r:id="rIdxuw98ny7s8hvro5eutftu">
+      <w:hyperlink w:history="1" r:id="rIdiyhzyywjjrq01jqhgxm1t">
         <w:r>
           <w:rPr>
             <w:rStyle w:val="Hyperlink"/>
@@ -2793,7 +2793,7 @@
       <w:r>
         <w:t xml:space="preserve"> — créé — </w:t>
       </w:r>
-      <w:hyperlink w:history="1" r:id="rId5uvrmzxxg7flb_bcegt5v">
+      <w:hyperlink w:history="1" r:id="rIdxkm8iwycxdjolqatru0qm">
         <w:r>
           <w:rPr>
             <w:rStyle w:val="Hyperlink"/>
@@ -2822,7 +2822,7 @@
       <w:r>
         <w:t xml:space="preserve"> — créé — </w:t>
       </w:r>
-      <w:hyperlink w:history="1" r:id="rId0ryr7kx1ikspamqase9nm">
+      <w:hyperlink w:history="1" r:id="rId-esmsnfxebjlexbio5yyz">
         <w:r>
           <w:rPr>
             <w:rStyle w:val="Hyperlink"/>
@@ -2851,7 +2851,7 @@
       <w:r>
         <w:t xml:space="preserve"> — créé — </w:t>
       </w:r>
-      <w:hyperlink w:history="1" r:id="rIdtdghotagmg13hy2mvjwss">
+      <w:hyperlink w:history="1" r:id="rIdffktfiwwgyv48am74shwl">
         <w:r>
           <w:rPr>
             <w:rStyle w:val="Hyperlink"/>

</xml_diff>

<commit_message>
Journal : phase 33 (caisse automatique selon la date)
Co-Authored-By: Claude Opus 5.5 <noreply@anthropic.com>
</commit_message>
<xml_diff>
--- a/docs/developpement/phases/word/PHASE_00_SOCLE_DE_PRODUCTION_ET_CONFIGURATION_DUN_LIEU_VIDE.docx
+++ b/docs/developpement/phases/word/PHASE_00_SOCLE_DE_PRODUCTION_ET_CONFIGURATION_DUN_LIEU_VIDE.docx
@@ -20,7 +20,7 @@
       <w:r>
         <w:t xml:space="preserve">FlaiX Expert · dossier de développement · généré le 2026-10-04 depuis le dépôt </w:t>
       </w:r>
-      <w:hyperlink w:history="1" r:id="rIdtk8-lbuymesnnmtg4isvc">
+      <w:hyperlink w:history="1" r:id="rIdq8ntcycee96zrb4rrov3b">
         <w:r>
           <w:rPr>
             <w:rStyle w:val="Hyperlink"/>
@@ -592,7 +592,7 @@
           <w:numId w:val="3"/>
         </w:numPr>
       </w:pPr>
-      <w:hyperlink w:history="1" r:id="rIdb7tfphrl6jvm8nfpoq_ka">
+      <w:hyperlink w:history="1" r:id="rIdxa9t2hgedesvanukhs9ml">
         <w:r>
           <w:rPr>
             <w:rStyle w:val="Hyperlink"/>
@@ -612,7 +612,7 @@
           <w:numId w:val="3"/>
         </w:numPr>
       </w:pPr>
-      <w:hyperlink w:history="1" r:id="rIdpmbsz5d0nl71y3zoavvsd">
+      <w:hyperlink w:history="1" r:id="rIdvtpzd4uaff8l-ila-c7aj">
         <w:r>
           <w:rPr>
             <w:rStyle w:val="Hyperlink"/>
@@ -660,7 +660,7 @@
       <w:r>
         <w:t xml:space="preserve"> — créé — </w:t>
       </w:r>
-      <w:hyperlink w:history="1" r:id="rIduelth89ixdwzw3v2hbtqm">
+      <w:hyperlink w:history="1" r:id="rIdmnpz3gc1x9i3fh4pap-kr">
         <w:r>
           <w:rPr>
             <w:rStyle w:val="Hyperlink"/>
@@ -689,7 +689,7 @@
       <w:r>
         <w:t xml:space="preserve"> — créé — </w:t>
       </w:r>
-      <w:hyperlink w:history="1" r:id="rIdmzcj3nblxnmb_cidms72s">
+      <w:hyperlink w:history="1" r:id="rId7bm_w9nv8kjn4ovz0bu8v">
         <w:r>
           <w:rPr>
             <w:rStyle w:val="Hyperlink"/>
@@ -726,7 +726,7 @@
       <w:r>
         <w:t xml:space="preserve"> — créé — </w:t>
       </w:r>
-      <w:hyperlink w:history="1" r:id="rIdngesh_8prst53bgwxp3mr">
+      <w:hyperlink w:history="1" r:id="rIdigukl2mr-q2ppmi3pyxhn">
         <w:r>
           <w:rPr>
             <w:rStyle w:val="Hyperlink"/>
@@ -755,7 +755,7 @@
       <w:r>
         <w:t xml:space="preserve"> — créé — </w:t>
       </w:r>
-      <w:hyperlink w:history="1" r:id="rIdk3mkfhkpjkn3rke9jyw6o">
+      <w:hyperlink w:history="1" r:id="rId9a72sairdjlnhzp7dtgcx">
         <w:r>
           <w:rPr>
             <w:rStyle w:val="Hyperlink"/>
@@ -784,7 +784,7 @@
       <w:r>
         <w:t xml:space="preserve"> — créé — </w:t>
       </w:r>
-      <w:hyperlink w:history="1" r:id="rIdpbn1y3fww8fmr_cozj5s0">
+      <w:hyperlink w:history="1" r:id="rIdyinvo4fg-jrf_aakoq8gh">
         <w:r>
           <w:rPr>
             <w:rStyle w:val="Hyperlink"/>
@@ -813,7 +813,7 @@
       <w:r>
         <w:t xml:space="preserve"> — créé — </w:t>
       </w:r>
-      <w:hyperlink w:history="1" r:id="rIdwxorkgkmniznztzhp3tuw">
+      <w:hyperlink w:history="1" r:id="rIdrbkgrj4d832xdqfzlgws_">
         <w:r>
           <w:rPr>
             <w:rStyle w:val="Hyperlink"/>
@@ -842,7 +842,7 @@
       <w:r>
         <w:t xml:space="preserve"> — créé — </w:t>
       </w:r>
-      <w:hyperlink w:history="1" r:id="rIdeh59ij5fhjjl6pbsbi6av">
+      <w:hyperlink w:history="1" r:id="rId_2ydnseuiqqub_uswlb4n">
         <w:r>
           <w:rPr>
             <w:rStyle w:val="Hyperlink"/>
@@ -879,7 +879,7 @@
       <w:r>
         <w:t xml:space="preserve"> — créé — </w:t>
       </w:r>
-      <w:hyperlink w:history="1" r:id="rIdhqkv28tsqtfdzxdcbpbkf">
+      <w:hyperlink w:history="1" r:id="rIdofeyblr7r4ynf_pozcs2x">
         <w:r>
           <w:rPr>
             <w:rStyle w:val="Hyperlink"/>
@@ -908,7 +908,7 @@
       <w:r>
         <w:t xml:space="preserve"> — créé — </w:t>
       </w:r>
-      <w:hyperlink w:history="1" r:id="rIdqlqrl4fmlommcmlwn4hyx">
+      <w:hyperlink w:history="1" r:id="rIdoyckq_bq1qeldagty5hrb">
         <w:r>
           <w:rPr>
             <w:rStyle w:val="Hyperlink"/>
@@ -937,7 +937,7 @@
       <w:r>
         <w:t xml:space="preserve"> — créé — </w:t>
       </w:r>
-      <w:hyperlink w:history="1" r:id="rId4hjza3ppye3gfmn6quh_v">
+      <w:hyperlink w:history="1" r:id="rId_ktnmdz_au_7aljqdnflh">
         <w:r>
           <w:rPr>
             <w:rStyle w:val="Hyperlink"/>
@@ -966,7 +966,7 @@
       <w:r>
         <w:t xml:space="preserve"> — créé — </w:t>
       </w:r>
-      <w:hyperlink w:history="1" r:id="rIde2-o2cx9wxwin4idxizb8">
+      <w:hyperlink w:history="1" r:id="rIds_machs4uskbea_5vkwen">
         <w:r>
           <w:rPr>
             <w:rStyle w:val="Hyperlink"/>
@@ -995,7 +995,7 @@
       <w:r>
         <w:t xml:space="preserve"> — créé — </w:t>
       </w:r>
-      <w:hyperlink w:history="1" r:id="rIdcngwofk9elhw4c1araf4i">
+      <w:hyperlink w:history="1" r:id="rIdpeeiaw_88mwr9f4yyrbi3">
         <w:r>
           <w:rPr>
             <w:rStyle w:val="Hyperlink"/>
@@ -1024,7 +1024,7 @@
       <w:r>
         <w:t xml:space="preserve"> — créé — </w:t>
       </w:r>
-      <w:hyperlink w:history="1" r:id="rIdcimi4xhfi6fupvoi0sbeu">
+      <w:hyperlink w:history="1" r:id="rIdw_gaddvxvlv1hp9kz7ege">
         <w:r>
           <w:rPr>
             <w:rStyle w:val="Hyperlink"/>
@@ -1053,7 +1053,7 @@
       <w:r>
         <w:t xml:space="preserve"> — créé — </w:t>
       </w:r>
-      <w:hyperlink w:history="1" r:id="rIdaflmvmsmszuwds0rain1k">
+      <w:hyperlink w:history="1" r:id="rIdwwqd7bcbcpnupffu6uekh">
         <w:r>
           <w:rPr>
             <w:rStyle w:val="Hyperlink"/>
@@ -1082,7 +1082,7 @@
       <w:r>
         <w:t xml:space="preserve"> — créé — </w:t>
       </w:r>
-      <w:hyperlink w:history="1" r:id="rIdeujxz293jozid5m6hdotl">
+      <w:hyperlink w:history="1" r:id="rIdsyfvoppeax4mqzixzgl-7">
         <w:r>
           <w:rPr>
             <w:rStyle w:val="Hyperlink"/>
@@ -1111,7 +1111,7 @@
       <w:r>
         <w:t xml:space="preserve"> — créé — </w:t>
       </w:r>
-      <w:hyperlink w:history="1" r:id="rIdl2ia3axrbz2a_mxpyqusa">
+      <w:hyperlink w:history="1" r:id="rIddeix-cty5kykers1p2a7b">
         <w:r>
           <w:rPr>
             <w:rStyle w:val="Hyperlink"/>
@@ -1148,7 +1148,7 @@
       <w:r>
         <w:t xml:space="preserve"> — créé — </w:t>
       </w:r>
-      <w:hyperlink w:history="1" r:id="rIdqnmrg6-wsywdfob0vkv7m">
+      <w:hyperlink w:history="1" r:id="rIdwzhfzigdx3dy4ihom4osz">
         <w:r>
           <w:rPr>
             <w:rStyle w:val="Hyperlink"/>
@@ -1177,7 +1177,7 @@
       <w:r>
         <w:t xml:space="preserve"> — créé — </w:t>
       </w:r>
-      <w:hyperlink w:history="1" r:id="rIdbqqiddmqosdwx3ftjiuxk">
+      <w:hyperlink w:history="1" r:id="rIdbh_4nwnd03xrdcyqvmvqi">
         <w:r>
           <w:rPr>
             <w:rStyle w:val="Hyperlink"/>
@@ -1206,7 +1206,7 @@
       <w:r>
         <w:t xml:space="preserve"> — créé — </w:t>
       </w:r>
-      <w:hyperlink w:history="1" r:id="rIdsdtyr-a4-l_4vciehu_0p">
+      <w:hyperlink w:history="1" r:id="rIdwnvvq_n-is5-3pc5lfrf4">
         <w:r>
           <w:rPr>
             <w:rStyle w:val="Hyperlink"/>
@@ -1235,7 +1235,7 @@
       <w:r>
         <w:t xml:space="preserve"> — créé — </w:t>
       </w:r>
-      <w:hyperlink w:history="1" r:id="rId_mmugbsaaf-qw_bwyoonw">
+      <w:hyperlink w:history="1" r:id="rIdm9qyosyhsjewiqwqq5ddv">
         <w:r>
           <w:rPr>
             <w:rStyle w:val="Hyperlink"/>
@@ -1264,7 +1264,7 @@
       <w:r>
         <w:t xml:space="preserve"> — créé — </w:t>
       </w:r>
-      <w:hyperlink w:history="1" r:id="rIdrrgvfdwgqlgggaaumx5sl">
+      <w:hyperlink w:history="1" r:id="rIdjzkk5u6lxgf4mq8ojsjt_">
         <w:r>
           <w:rPr>
             <w:rStyle w:val="Hyperlink"/>
@@ -1293,7 +1293,7 @@
       <w:r>
         <w:t xml:space="preserve"> — créé — </w:t>
       </w:r>
-      <w:hyperlink w:history="1" r:id="rIdul9buudgef4tmkszchu6n">
+      <w:hyperlink w:history="1" r:id="rId2jmzzbclxifpyub3-xg2f">
         <w:r>
           <w:rPr>
             <w:rStyle w:val="Hyperlink"/>
@@ -1322,7 +1322,7 @@
       <w:r>
         <w:t xml:space="preserve"> — créé — </w:t>
       </w:r>
-      <w:hyperlink w:history="1" r:id="rIdnfmxnomwn_bgkd9jdwmbj">
+      <w:hyperlink w:history="1" r:id="rIdjez1h1xoq3pucszeg8vrk">
         <w:r>
           <w:rPr>
             <w:rStyle w:val="Hyperlink"/>
@@ -1351,7 +1351,7 @@
       <w:r>
         <w:t xml:space="preserve"> — créé — </w:t>
       </w:r>
-      <w:hyperlink w:history="1" r:id="rId5b9y8jptsvfii_0so1lfq">
+      <w:hyperlink w:history="1" r:id="rIdcwpbjjjkyywuag3ej2xto">
         <w:r>
           <w:rPr>
             <w:rStyle w:val="Hyperlink"/>
@@ -1380,7 +1380,7 @@
       <w:r>
         <w:t xml:space="preserve"> — créé — </w:t>
       </w:r>
-      <w:hyperlink w:history="1" r:id="rIdpx_acpqmdzd3vhtotlxfo">
+      <w:hyperlink w:history="1" r:id="rIdoa4tdyrtjsufzbjgktact">
         <w:r>
           <w:rPr>
             <w:rStyle w:val="Hyperlink"/>
@@ -1409,7 +1409,7 @@
       <w:r>
         <w:t xml:space="preserve"> — créé — </w:t>
       </w:r>
-      <w:hyperlink w:history="1" r:id="rIdizy0xpfy7waabn2r53rnl">
+      <w:hyperlink w:history="1" r:id="rIdno85yhcwrjayv5t86a5q_">
         <w:r>
           <w:rPr>
             <w:rStyle w:val="Hyperlink"/>
@@ -1438,7 +1438,7 @@
       <w:r>
         <w:t xml:space="preserve"> — créé — </w:t>
       </w:r>
-      <w:hyperlink w:history="1" r:id="rIdkdnwkqysa5a3xvx9ubuj7">
+      <w:hyperlink w:history="1" r:id="rIdfom8zngg69sa6ctzi0hba">
         <w:r>
           <w:rPr>
             <w:rStyle w:val="Hyperlink"/>
@@ -1467,7 +1467,7 @@
       <w:r>
         <w:t xml:space="preserve"> — créé — </w:t>
       </w:r>
-      <w:hyperlink w:history="1" r:id="rIdk5hrt82lvdoq317acwnbs">
+      <w:hyperlink w:history="1" r:id="rIdaljlvdjqh8u8op7pjywal">
         <w:r>
           <w:rPr>
             <w:rStyle w:val="Hyperlink"/>
@@ -1496,7 +1496,7 @@
       <w:r>
         <w:t xml:space="preserve"> — créé — </w:t>
       </w:r>
-      <w:hyperlink w:history="1" r:id="rId0e-rc60wpreojbhrs_apw">
+      <w:hyperlink w:history="1" r:id="rIdj5wv-ismqsjqcgthzuqlx">
         <w:r>
           <w:rPr>
             <w:rStyle w:val="Hyperlink"/>
@@ -1525,7 +1525,7 @@
       <w:r>
         <w:t xml:space="preserve"> — créé — </w:t>
       </w:r>
-      <w:hyperlink w:history="1" r:id="rId-vhennkvfsdptiaqbs1yt">
+      <w:hyperlink w:history="1" r:id="rIdstfgp91vc8gsxpw2f_csa">
         <w:r>
           <w:rPr>
             <w:rStyle w:val="Hyperlink"/>
@@ -1554,7 +1554,7 @@
       <w:r>
         <w:t xml:space="preserve"> — créé — </w:t>
       </w:r>
-      <w:hyperlink w:history="1" r:id="rIddnkjljbdggm-teovrhol0">
+      <w:hyperlink w:history="1" r:id="rId3miu61bkwpwj4rczuvvv2">
         <w:r>
           <w:rPr>
             <w:rStyle w:val="Hyperlink"/>
@@ -1583,7 +1583,7 @@
       <w:r>
         <w:t xml:space="preserve"> — créé — </w:t>
       </w:r>
-      <w:hyperlink w:history="1" r:id="rIdocqnwwbothkbfr8tgxok4">
+      <w:hyperlink w:history="1" r:id="rId71-u3zabwodya0ocyoxkg">
         <w:r>
           <w:rPr>
             <w:rStyle w:val="Hyperlink"/>
@@ -1612,7 +1612,7 @@
       <w:r>
         <w:t xml:space="preserve"> — créé — </w:t>
       </w:r>
-      <w:hyperlink w:history="1" r:id="rIdm8j8q0n_eziurxskc1ldt">
+      <w:hyperlink w:history="1" r:id="rIdobpt7debnmj4qxfr-re_w">
         <w:r>
           <w:rPr>
             <w:rStyle w:val="Hyperlink"/>
@@ -1641,7 +1641,7 @@
       <w:r>
         <w:t xml:space="preserve"> — créé — </w:t>
       </w:r>
-      <w:hyperlink w:history="1" r:id="rIdmruowstex6knlxbu7cysx">
+      <w:hyperlink w:history="1" r:id="rIdn2jp1qpgppne5lykq3yod">
         <w:r>
           <w:rPr>
             <w:rStyle w:val="Hyperlink"/>
@@ -1670,7 +1670,7 @@
       <w:r>
         <w:t xml:space="preserve"> — créé — </w:t>
       </w:r>
-      <w:hyperlink w:history="1" r:id="rIdcrmtfhdq7_r4am4f2ggur">
+      <w:hyperlink w:history="1" r:id="rIddhby5oemvzprhszibpq_j">
         <w:r>
           <w:rPr>
             <w:rStyle w:val="Hyperlink"/>
@@ -1699,7 +1699,7 @@
       <w:r>
         <w:t xml:space="preserve"> — créé — </w:t>
       </w:r>
-      <w:hyperlink w:history="1" r:id="rIdxzqoroodhk0xzwureu6mu">
+      <w:hyperlink w:history="1" r:id="rIdkpwe39wxjjv2hd9ghlcxt">
         <w:r>
           <w:rPr>
             <w:rStyle w:val="Hyperlink"/>
@@ -1728,7 +1728,7 @@
       <w:r>
         <w:t xml:space="preserve"> — créé — </w:t>
       </w:r>
-      <w:hyperlink w:history="1" r:id="rIdhbjyocnie66dplcba945u">
+      <w:hyperlink w:history="1" r:id="rIdabao66ramhlm9orqf5-yc">
         <w:r>
           <w:rPr>
             <w:rStyle w:val="Hyperlink"/>
@@ -1757,7 +1757,7 @@
       <w:r>
         <w:t xml:space="preserve"> — créé — </w:t>
       </w:r>
-      <w:hyperlink w:history="1" r:id="rIdx6zbkaeihujr8auofagfz">
+      <w:hyperlink w:history="1" r:id="rId_qcbi0xzvojkvcjyv1p4w">
         <w:r>
           <w:rPr>
             <w:rStyle w:val="Hyperlink"/>
@@ -1786,7 +1786,7 @@
       <w:r>
         <w:t xml:space="preserve"> — créé — </w:t>
       </w:r>
-      <w:hyperlink w:history="1" r:id="rIdij-_2vtcjx1pr8qtj0sbw">
+      <w:hyperlink w:history="1" r:id="rIdfqplsnivrsrqnvyverdkf">
         <w:r>
           <w:rPr>
             <w:rStyle w:val="Hyperlink"/>
@@ -1823,7 +1823,7 @@
       <w:r>
         <w:t xml:space="preserve"> — créé — </w:t>
       </w:r>
-      <w:hyperlink w:history="1" r:id="rId4rgh_lnvejzfakm8_xotn">
+      <w:hyperlink w:history="1" r:id="rIdioll6dfwqzknxcf_s4au7">
         <w:r>
           <w:rPr>
             <w:rStyle w:val="Hyperlink"/>
@@ -1852,7 +1852,7 @@
       <w:r>
         <w:t xml:space="preserve"> — créé — </w:t>
       </w:r>
-      <w:hyperlink w:history="1" r:id="rIdmrs9pziagp9ntv_p6mgd7">
+      <w:hyperlink w:history="1" r:id="rIdoookv-r8vabhngxoh-ihy">
         <w:r>
           <w:rPr>
             <w:rStyle w:val="Hyperlink"/>
@@ -1881,7 +1881,7 @@
       <w:r>
         <w:t xml:space="preserve"> — créé — </w:t>
       </w:r>
-      <w:hyperlink w:history="1" r:id="rIdm2rv14_vz9ivo_hyy_msr">
+      <w:hyperlink w:history="1" r:id="rIdhna2rlzdjk7ocx5yzflsu">
         <w:r>
           <w:rPr>
             <w:rStyle w:val="Hyperlink"/>
@@ -1910,7 +1910,7 @@
       <w:r>
         <w:t xml:space="preserve"> — créé — </w:t>
       </w:r>
-      <w:hyperlink w:history="1" r:id="rIdf6-3mgrtezmlenwdlpneb">
+      <w:hyperlink w:history="1" r:id="rId8kbco-o5htz-eatwqol53">
         <w:r>
           <w:rPr>
             <w:rStyle w:val="Hyperlink"/>
@@ -1939,7 +1939,7 @@
       <w:r>
         <w:t xml:space="preserve"> — créé — </w:t>
       </w:r>
-      <w:hyperlink w:history="1" r:id="rIdqgxyz4c5r4w8jpkmpjewi">
+      <w:hyperlink w:history="1" r:id="rIdvlycb78o7yvamvrbpueey">
         <w:r>
           <w:rPr>
             <w:rStyle w:val="Hyperlink"/>
@@ -1968,7 +1968,7 @@
       <w:r>
         <w:t xml:space="preserve"> — créé — </w:t>
       </w:r>
-      <w:hyperlink w:history="1" r:id="rId9lrsrc0k153ek69dz2upq">
+      <w:hyperlink w:history="1" r:id="rIdwepozsx73tk5t8eo1-kkp">
         <w:r>
           <w:rPr>
             <w:rStyle w:val="Hyperlink"/>
@@ -1997,7 +1997,7 @@
       <w:r>
         <w:t xml:space="preserve"> — créé — </w:t>
       </w:r>
-      <w:hyperlink w:history="1" r:id="rIdckggkjsm1q94ljqb0tvon">
+      <w:hyperlink w:history="1" r:id="rIdz87ieva3z2ej1bf7myl_q">
         <w:r>
           <w:rPr>
             <w:rStyle w:val="Hyperlink"/>
@@ -2026,7 +2026,7 @@
       <w:r>
         <w:t xml:space="preserve"> — créé — </w:t>
       </w:r>
-      <w:hyperlink w:history="1" r:id="rIduqmtg1moienx9a9wgeznx">
+      <w:hyperlink w:history="1" r:id="rIdbzomjs9k_jsstw9rcbyi3">
         <w:r>
           <w:rPr>
             <w:rStyle w:val="Hyperlink"/>
@@ -2139,7 +2139,7 @@
       <w:r>
         <w:t xml:space="preserve"> — créé — </w:t>
       </w:r>
-      <w:hyperlink w:history="1" r:id="rIdaqhliqioiw6e6u9mkdgke">
+      <w:hyperlink w:history="1" r:id="rId16l5bc3z0tlhzho86sxfh">
         <w:r>
           <w:rPr>
             <w:rStyle w:val="Hyperlink"/>
@@ -2189,7 +2189,7 @@
       <w:r>
         <w:t xml:space="preserve"> — créé — </w:t>
       </w:r>
-      <w:hyperlink w:history="1" r:id="rIdkzb7y3il_7hv0lcyu7bw3">
+      <w:hyperlink w:history="1" r:id="rIdeldyvdmur6ak1v2a6xazq">
         <w:r>
           <w:rPr>
             <w:rStyle w:val="Hyperlink"/>
@@ -2218,7 +2218,7 @@
       <w:r>
         <w:t xml:space="preserve"> — créé — </w:t>
       </w:r>
-      <w:hyperlink w:history="1" r:id="rIdbayry5he2jqjeufkt6qkt">
+      <w:hyperlink w:history="1" r:id="rId8ubzdcbymidffajzdjdeb">
         <w:r>
           <w:rPr>
             <w:rStyle w:val="Hyperlink"/>
@@ -2247,7 +2247,7 @@
       <w:r>
         <w:t xml:space="preserve"> — créé — </w:t>
       </w:r>
-      <w:hyperlink w:history="1" r:id="rIdk0mgqmvwu9ku5aq6y8tvz">
+      <w:hyperlink w:history="1" r:id="rIdlcrhpll2bgkkhhdobcpc6">
         <w:r>
           <w:rPr>
             <w:rStyle w:val="Hyperlink"/>
@@ -2276,7 +2276,7 @@
       <w:r>
         <w:t xml:space="preserve"> — créé — </w:t>
       </w:r>
-      <w:hyperlink w:history="1" r:id="rIdffkmdluc6zremb6dkd_y1">
+      <w:hyperlink w:history="1" r:id="rIdlqyqcdomgg4eklkkhaw_7">
         <w:r>
           <w:rPr>
             <w:rStyle w:val="Hyperlink"/>
@@ -2313,7 +2313,7 @@
       <w:r>
         <w:t xml:space="preserve"> — créé — </w:t>
       </w:r>
-      <w:hyperlink w:history="1" r:id="rId6slf1vt_vvo37t7rlreqi">
+      <w:hyperlink w:history="1" r:id="rIdx70z2m-7wwwx9c7d_wz7d">
         <w:r>
           <w:rPr>
             <w:rStyle w:val="Hyperlink"/>
@@ -2342,7 +2342,7 @@
       <w:r>
         <w:t xml:space="preserve"> — créé — </w:t>
       </w:r>
-      <w:hyperlink w:history="1" r:id="rIdi5ohudlhuly_x1qhw7so4">
+      <w:hyperlink w:history="1" r:id="rIddylpcridag7xiimfyquqi">
         <w:r>
           <w:rPr>
             <w:rStyle w:val="Hyperlink"/>
@@ -2379,7 +2379,7 @@
       <w:r>
         <w:t xml:space="preserve"> — créé — </w:t>
       </w:r>
-      <w:hyperlink w:history="1" r:id="rId0rb1cqfxobk76uomjku-w">
+      <w:hyperlink w:history="1" r:id="rIdgo_3rdoq-tcvsozcy-aaz">
         <w:r>
           <w:rPr>
             <w:rStyle w:val="Hyperlink"/>
@@ -2408,7 +2408,7 @@
       <w:r>
         <w:t xml:space="preserve"> — créé — </w:t>
       </w:r>
-      <w:hyperlink w:history="1" r:id="rIdxhxidkpvcbseei0o-pzwe">
+      <w:hyperlink w:history="1" r:id="rIdgrcxsmnn3kx-dkr7d7xn7">
         <w:r>
           <w:rPr>
             <w:rStyle w:val="Hyperlink"/>
@@ -2437,7 +2437,7 @@
       <w:r>
         <w:t xml:space="preserve"> — créé — </w:t>
       </w:r>
-      <w:hyperlink w:history="1" r:id="rIdp5eoj-xmhefkbyse9horb">
+      <w:hyperlink w:history="1" r:id="rIdwm6p18hycprzn9ctf3mq9">
         <w:r>
           <w:rPr>
             <w:rStyle w:val="Hyperlink"/>
@@ -2466,7 +2466,7 @@
       <w:r>
         <w:t xml:space="preserve"> — créé — </w:t>
       </w:r>
-      <w:hyperlink w:history="1" r:id="rId2hkrr8i06p9caonxpilri">
+      <w:hyperlink w:history="1" r:id="rIdnrspqqre9zk2n4bdxhsk5">
         <w:r>
           <w:rPr>
             <w:rStyle w:val="Hyperlink"/>
@@ -2495,7 +2495,7 @@
       <w:r>
         <w:t xml:space="preserve"> — créé — </w:t>
       </w:r>
-      <w:hyperlink w:history="1" r:id="rIdgxkyild4foj79acc3dh00">
+      <w:hyperlink w:history="1" r:id="rIdqj7zbph9ekphdyxivf-ol">
         <w:r>
           <w:rPr>
             <w:rStyle w:val="Hyperlink"/>
@@ -2524,7 +2524,7 @@
       <w:r>
         <w:t xml:space="preserve"> — créé — </w:t>
       </w:r>
-      <w:hyperlink w:history="1" r:id="rId7br3l1rfskmr02auuan40">
+      <w:hyperlink w:history="1" r:id="rIdl1resndd1feh6d2r0mzyg">
         <w:r>
           <w:rPr>
             <w:rStyle w:val="Hyperlink"/>
@@ -2553,7 +2553,7 @@
       <w:r>
         <w:t xml:space="preserve"> — créé — </w:t>
       </w:r>
-      <w:hyperlink w:history="1" r:id="rIdh_8bmyk_ncbfcuvmmcvqr">
+      <w:hyperlink w:history="1" r:id="rIdeclzjbowioml7-zcmtayh">
         <w:r>
           <w:rPr>
             <w:rStyle w:val="Hyperlink"/>
@@ -2582,7 +2582,7 @@
       <w:r>
         <w:t xml:space="preserve"> — créé — </w:t>
       </w:r>
-      <w:hyperlink w:history="1" r:id="rIdqysmxzaxpu2ik4nvixx8e">
+      <w:hyperlink w:history="1" r:id="rIdfhefdfunect8tx5wsj4_b">
         <w:r>
           <w:rPr>
             <w:rStyle w:val="Hyperlink"/>
@@ -2611,7 +2611,7 @@
       <w:r>
         <w:t xml:space="preserve"> — créé — </w:t>
       </w:r>
-      <w:hyperlink w:history="1" r:id="rIdhd43nbs6xhaveqcgjog6d">
+      <w:hyperlink w:history="1" r:id="rIdgtbnrxsmiwi0net9frclf">
         <w:r>
           <w:rPr>
             <w:rStyle w:val="Hyperlink"/>
@@ -2648,7 +2648,7 @@
       <w:r>
         <w:t xml:space="preserve"> — créé — </w:t>
       </w:r>
-      <w:hyperlink w:history="1" r:id="rIda_6oeysne_l_fk_ofusc0">
+      <w:hyperlink w:history="1" r:id="rIdfo1ifj5zn-agktwsnjbof">
         <w:r>
           <w:rPr>
             <w:rStyle w:val="Hyperlink"/>
@@ -2677,7 +2677,7 @@
       <w:r>
         <w:t xml:space="preserve"> — créé — </w:t>
       </w:r>
-      <w:hyperlink w:history="1" r:id="rIdpceupgrkcwturjvyc8svq">
+      <w:hyperlink w:history="1" r:id="rId8whqt80p-21iw8n3oc5ih">
         <w:r>
           <w:rPr>
             <w:rStyle w:val="Hyperlink"/>
@@ -2706,7 +2706,7 @@
       <w:r>
         <w:t xml:space="preserve"> — créé — </w:t>
       </w:r>
-      <w:hyperlink w:history="1" r:id="rIdj2pm2io32x6yufgzrpbo1">
+      <w:hyperlink w:history="1" r:id="rId2th1n8mn_nvbpb15gnm52">
         <w:r>
           <w:rPr>
             <w:rStyle w:val="Hyperlink"/>
@@ -2735,7 +2735,7 @@
       <w:r>
         <w:t xml:space="preserve"> — créé — </w:t>
       </w:r>
-      <w:hyperlink w:history="1" r:id="rIdm240iqb40rnl4wx8cyq76">
+      <w:hyperlink w:history="1" r:id="rIdd0yvwx-uin1-ojdqzudbw">
         <w:r>
           <w:rPr>
             <w:rStyle w:val="Hyperlink"/>
@@ -2764,7 +2764,7 @@
       <w:r>
         <w:t xml:space="preserve"> — créé — </w:t>
       </w:r>
-      <w:hyperlink w:history="1" r:id="rIdiyhzyywjjrq01jqhgxm1t">
+      <w:hyperlink w:history="1" r:id="rIdlxqlb67surkqsvvi3nm94">
         <w:r>
           <w:rPr>
             <w:rStyle w:val="Hyperlink"/>
@@ -2793,7 +2793,7 @@
       <w:r>
         <w:t xml:space="preserve"> — créé — </w:t>
       </w:r>
-      <w:hyperlink w:history="1" r:id="rIdxkm8iwycxdjolqatru0qm">
+      <w:hyperlink w:history="1" r:id="rId2vyu_jc7xww7vzsyjdug8">
         <w:r>
           <w:rPr>
             <w:rStyle w:val="Hyperlink"/>
@@ -2822,7 +2822,7 @@
       <w:r>
         <w:t xml:space="preserve"> — créé — </w:t>
       </w:r>
-      <w:hyperlink w:history="1" r:id="rId-esmsnfxebjlexbio5yyz">
+      <w:hyperlink w:history="1" r:id="rIdc3c9g05gw8bgivhvtk7ym">
         <w:r>
           <w:rPr>
             <w:rStyle w:val="Hyperlink"/>
@@ -2851,7 +2851,7 @@
       <w:r>
         <w:t xml:space="preserve"> — créé — </w:t>
       </w:r>
-      <w:hyperlink w:history="1" r:id="rIdffktfiwwgyv48am74shwl">
+      <w:hyperlink w:history="1" r:id="rIdb3j84p16f4lnih-iqegby">
         <w:r>
           <w:rPr>
             <w:rStyle w:val="Hyperlink"/>

</xml_diff>

<commit_message>
Journal : phase 34 (rapport de soirée)
Co-Authored-By: Claude Opus 5.5 <noreply@anthropic.com>
</commit_message>
<xml_diff>
--- a/docs/developpement/phases/word/PHASE_00_SOCLE_DE_PRODUCTION_ET_CONFIGURATION_DUN_LIEU_VIDE.docx
+++ b/docs/developpement/phases/word/PHASE_00_SOCLE_DE_PRODUCTION_ET_CONFIGURATION_DUN_LIEU_VIDE.docx
@@ -20,7 +20,7 @@
       <w:r>
         <w:t xml:space="preserve">FlaiX Expert · dossier de développement · généré le 2026-10-04 depuis le dépôt </w:t>
       </w:r>
-      <w:hyperlink w:history="1" r:id="rIdq8ntcycee96zrb4rrov3b">
+      <w:hyperlink w:history="1" r:id="rId0xypshwbm3ksy6smgflin">
         <w:r>
           <w:rPr>
             <w:rStyle w:val="Hyperlink"/>
@@ -592,7 +592,7 @@
           <w:numId w:val="3"/>
         </w:numPr>
       </w:pPr>
-      <w:hyperlink w:history="1" r:id="rIdxa9t2hgedesvanukhs9ml">
+      <w:hyperlink w:history="1" r:id="rIdekpo5au6nib3du1x9ixre">
         <w:r>
           <w:rPr>
             <w:rStyle w:val="Hyperlink"/>
@@ -612,7 +612,7 @@
           <w:numId w:val="3"/>
         </w:numPr>
       </w:pPr>
-      <w:hyperlink w:history="1" r:id="rIdvtpzd4uaff8l-ila-c7aj">
+      <w:hyperlink w:history="1" r:id="rId6v1zp0egrtt2m7baq556x">
         <w:r>
           <w:rPr>
             <w:rStyle w:val="Hyperlink"/>
@@ -660,7 +660,7 @@
       <w:r>
         <w:t xml:space="preserve"> — créé — </w:t>
       </w:r>
-      <w:hyperlink w:history="1" r:id="rIdmnpz3gc1x9i3fh4pap-kr">
+      <w:hyperlink w:history="1" r:id="rIddp9imgg6f1kxbxybgz65k">
         <w:r>
           <w:rPr>
             <w:rStyle w:val="Hyperlink"/>
@@ -689,7 +689,7 @@
       <w:r>
         <w:t xml:space="preserve"> — créé — </w:t>
       </w:r>
-      <w:hyperlink w:history="1" r:id="rId7bm_w9nv8kjn4ovz0bu8v">
+      <w:hyperlink w:history="1" r:id="rIddcocn6jn-pww9tklaf-ka">
         <w:r>
           <w:rPr>
             <w:rStyle w:val="Hyperlink"/>
@@ -726,7 +726,7 @@
       <w:r>
         <w:t xml:space="preserve"> — créé — </w:t>
       </w:r>
-      <w:hyperlink w:history="1" r:id="rIdigukl2mr-q2ppmi3pyxhn">
+      <w:hyperlink w:history="1" r:id="rIdfi4jwhukt3kdtd_vyy-oy">
         <w:r>
           <w:rPr>
             <w:rStyle w:val="Hyperlink"/>
@@ -755,7 +755,7 @@
       <w:r>
         <w:t xml:space="preserve"> — créé — </w:t>
       </w:r>
-      <w:hyperlink w:history="1" r:id="rId9a72sairdjlnhzp7dtgcx">
+      <w:hyperlink w:history="1" r:id="rIdpyivgm-l4ntsvlfr_0wcu">
         <w:r>
           <w:rPr>
             <w:rStyle w:val="Hyperlink"/>
@@ -784,7 +784,7 @@
       <w:r>
         <w:t xml:space="preserve"> — créé — </w:t>
       </w:r>
-      <w:hyperlink w:history="1" r:id="rIdyinvo4fg-jrf_aakoq8gh">
+      <w:hyperlink w:history="1" r:id="rIdv8w6n1xq4q9inztdf8twv">
         <w:r>
           <w:rPr>
             <w:rStyle w:val="Hyperlink"/>
@@ -813,7 +813,7 @@
       <w:r>
         <w:t xml:space="preserve"> — créé — </w:t>
       </w:r>
-      <w:hyperlink w:history="1" r:id="rIdrbkgrj4d832xdqfzlgws_">
+      <w:hyperlink w:history="1" r:id="rIdwrnu1cdb25jiicabeqex4">
         <w:r>
           <w:rPr>
             <w:rStyle w:val="Hyperlink"/>
@@ -842,7 +842,7 @@
       <w:r>
         <w:t xml:space="preserve"> — créé — </w:t>
       </w:r>
-      <w:hyperlink w:history="1" r:id="rId_2ydnseuiqqub_uswlb4n">
+      <w:hyperlink w:history="1" r:id="rIdbtqi_jgi8n8cecqdasjqw">
         <w:r>
           <w:rPr>
             <w:rStyle w:val="Hyperlink"/>
@@ -879,7 +879,7 @@
       <w:r>
         <w:t xml:space="preserve"> — créé — </w:t>
       </w:r>
-      <w:hyperlink w:history="1" r:id="rIdofeyblr7r4ynf_pozcs2x">
+      <w:hyperlink w:history="1" r:id="rIdbb-ydsfpyzkvosmfmr_vk">
         <w:r>
           <w:rPr>
             <w:rStyle w:val="Hyperlink"/>
@@ -908,7 +908,7 @@
       <w:r>
         <w:t xml:space="preserve"> — créé — </w:t>
       </w:r>
-      <w:hyperlink w:history="1" r:id="rIdoyckq_bq1qeldagty5hrb">
+      <w:hyperlink w:history="1" r:id="rId1mhh66omfex5iyhklzroi">
         <w:r>
           <w:rPr>
             <w:rStyle w:val="Hyperlink"/>
@@ -937,7 +937,7 @@
       <w:r>
         <w:t xml:space="preserve"> — créé — </w:t>
       </w:r>
-      <w:hyperlink w:history="1" r:id="rId_ktnmdz_au_7aljqdnflh">
+      <w:hyperlink w:history="1" r:id="rId-tc70v81tirde9-eqmspy">
         <w:r>
           <w:rPr>
             <w:rStyle w:val="Hyperlink"/>
@@ -966,7 +966,7 @@
       <w:r>
         <w:t xml:space="preserve"> — créé — </w:t>
       </w:r>
-      <w:hyperlink w:history="1" r:id="rIds_machs4uskbea_5vkwen">
+      <w:hyperlink w:history="1" r:id="rIdg-ozo-tqg5xiczsc6kgl_">
         <w:r>
           <w:rPr>
             <w:rStyle w:val="Hyperlink"/>
@@ -995,7 +995,7 @@
       <w:r>
         <w:t xml:space="preserve"> — créé — </w:t>
       </w:r>
-      <w:hyperlink w:history="1" r:id="rIdpeeiaw_88mwr9f4yyrbi3">
+      <w:hyperlink w:history="1" r:id="rIdcf_e2bk6y923fkizydbdd">
         <w:r>
           <w:rPr>
             <w:rStyle w:val="Hyperlink"/>
@@ -1024,7 +1024,7 @@
       <w:r>
         <w:t xml:space="preserve"> — créé — </w:t>
       </w:r>
-      <w:hyperlink w:history="1" r:id="rIdw_gaddvxvlv1hp9kz7ege">
+      <w:hyperlink w:history="1" r:id="rIdt9efjgudkevvk_22qetx4">
         <w:r>
           <w:rPr>
             <w:rStyle w:val="Hyperlink"/>
@@ -1053,7 +1053,7 @@
       <w:r>
         <w:t xml:space="preserve"> — créé — </w:t>
       </w:r>
-      <w:hyperlink w:history="1" r:id="rIdwwqd7bcbcpnupffu6uekh">
+      <w:hyperlink w:history="1" r:id="rIdbfafmpkb0fzfitmo552dt">
         <w:r>
           <w:rPr>
             <w:rStyle w:val="Hyperlink"/>
@@ -1082,7 +1082,7 @@
       <w:r>
         <w:t xml:space="preserve"> — créé — </w:t>
       </w:r>
-      <w:hyperlink w:history="1" r:id="rIdsyfvoppeax4mqzixzgl-7">
+      <w:hyperlink w:history="1" r:id="rIdvi5oclfcjb7curxmc_y6i">
         <w:r>
           <w:rPr>
             <w:rStyle w:val="Hyperlink"/>
@@ -1111,7 +1111,7 @@
       <w:r>
         <w:t xml:space="preserve"> — créé — </w:t>
       </w:r>
-      <w:hyperlink w:history="1" r:id="rIddeix-cty5kykers1p2a7b">
+      <w:hyperlink w:history="1" r:id="rId70agi_o3vfcck5yfvj-qp">
         <w:r>
           <w:rPr>
             <w:rStyle w:val="Hyperlink"/>
@@ -1148,7 +1148,7 @@
       <w:r>
         <w:t xml:space="preserve"> — créé — </w:t>
       </w:r>
-      <w:hyperlink w:history="1" r:id="rIdwzhfzigdx3dy4ihom4osz">
+      <w:hyperlink w:history="1" r:id="rIddhh6pg38k2thmvww94mhq">
         <w:r>
           <w:rPr>
             <w:rStyle w:val="Hyperlink"/>
@@ -1177,7 +1177,7 @@
       <w:r>
         <w:t xml:space="preserve"> — créé — </w:t>
       </w:r>
-      <w:hyperlink w:history="1" r:id="rIdbh_4nwnd03xrdcyqvmvqi">
+      <w:hyperlink w:history="1" r:id="rIdbpnktnppl1pzceviyhx7n">
         <w:r>
           <w:rPr>
             <w:rStyle w:val="Hyperlink"/>
@@ -1206,7 +1206,7 @@
       <w:r>
         <w:t xml:space="preserve"> — créé — </w:t>
       </w:r>
-      <w:hyperlink w:history="1" r:id="rIdwnvvq_n-is5-3pc5lfrf4">
+      <w:hyperlink w:history="1" r:id="rIdinaklghpdqgnzue-cx2jz">
         <w:r>
           <w:rPr>
             <w:rStyle w:val="Hyperlink"/>
@@ -1235,7 +1235,7 @@
       <w:r>
         <w:t xml:space="preserve"> — créé — </w:t>
       </w:r>
-      <w:hyperlink w:history="1" r:id="rIdm9qyosyhsjewiqwqq5ddv">
+      <w:hyperlink w:history="1" r:id="rId-ninxeqrpyksrhayvncmk">
         <w:r>
           <w:rPr>
             <w:rStyle w:val="Hyperlink"/>
@@ -1264,7 +1264,7 @@
       <w:r>
         <w:t xml:space="preserve"> — créé — </w:t>
       </w:r>
-      <w:hyperlink w:history="1" r:id="rIdjzkk5u6lxgf4mq8ojsjt_">
+      <w:hyperlink w:history="1" r:id="rIdfbdiz0i-2cludfpxmjhjf">
         <w:r>
           <w:rPr>
             <w:rStyle w:val="Hyperlink"/>
@@ -1293,7 +1293,7 @@
       <w:r>
         <w:t xml:space="preserve"> — créé — </w:t>
       </w:r>
-      <w:hyperlink w:history="1" r:id="rId2jmzzbclxifpyub3-xg2f">
+      <w:hyperlink w:history="1" r:id="rId5szdvo_5gxd1lcplp4_zb">
         <w:r>
           <w:rPr>
             <w:rStyle w:val="Hyperlink"/>
@@ -1322,7 +1322,7 @@
       <w:r>
         <w:t xml:space="preserve"> — créé — </w:t>
       </w:r>
-      <w:hyperlink w:history="1" r:id="rIdjez1h1xoq3pucszeg8vrk">
+      <w:hyperlink w:history="1" r:id="rIdyzhio3v1ug-i9zj0tf27x">
         <w:r>
           <w:rPr>
             <w:rStyle w:val="Hyperlink"/>
@@ -1351,7 +1351,7 @@
       <w:r>
         <w:t xml:space="preserve"> — créé — </w:t>
       </w:r>
-      <w:hyperlink w:history="1" r:id="rIdcwpbjjjkyywuag3ej2xto">
+      <w:hyperlink w:history="1" r:id="rIdy5yhgzkfotww_-4eanywf">
         <w:r>
           <w:rPr>
             <w:rStyle w:val="Hyperlink"/>
@@ -1380,7 +1380,7 @@
       <w:r>
         <w:t xml:space="preserve"> — créé — </w:t>
       </w:r>
-      <w:hyperlink w:history="1" r:id="rIdoa4tdyrtjsufzbjgktact">
+      <w:hyperlink w:history="1" r:id="rId3nmu4zv-rkxuwtgcz0vm1">
         <w:r>
           <w:rPr>
             <w:rStyle w:val="Hyperlink"/>
@@ -1409,7 +1409,7 @@
       <w:r>
         <w:t xml:space="preserve"> — créé — </w:t>
       </w:r>
-      <w:hyperlink w:history="1" r:id="rIdno85yhcwrjayv5t86a5q_">
+      <w:hyperlink w:history="1" r:id="rIddomlzp3fyykgqj793j19x">
         <w:r>
           <w:rPr>
             <w:rStyle w:val="Hyperlink"/>
@@ -1438,7 +1438,7 @@
       <w:r>
         <w:t xml:space="preserve"> — créé — </w:t>
       </w:r>
-      <w:hyperlink w:history="1" r:id="rIdfom8zngg69sa6ctzi0hba">
+      <w:hyperlink w:history="1" r:id="rIdewgzen6ylilvcljciqgu9">
         <w:r>
           <w:rPr>
             <w:rStyle w:val="Hyperlink"/>
@@ -1467,7 +1467,7 @@
       <w:r>
         <w:t xml:space="preserve"> — créé — </w:t>
       </w:r>
-      <w:hyperlink w:history="1" r:id="rIdaljlvdjqh8u8op7pjywal">
+      <w:hyperlink w:history="1" r:id="rIddvx-x0pwykk6jtf1x8pw1">
         <w:r>
           <w:rPr>
             <w:rStyle w:val="Hyperlink"/>
@@ -1496,7 +1496,7 @@
       <w:r>
         <w:t xml:space="preserve"> — créé — </w:t>
       </w:r>
-      <w:hyperlink w:history="1" r:id="rIdj5wv-ismqsjqcgthzuqlx">
+      <w:hyperlink w:history="1" r:id="rIdxsavraxjjelay8mkuz_qz">
         <w:r>
           <w:rPr>
             <w:rStyle w:val="Hyperlink"/>
@@ -1525,7 +1525,7 @@
       <w:r>
         <w:t xml:space="preserve"> — créé — </w:t>
       </w:r>
-      <w:hyperlink w:history="1" r:id="rIdstfgp91vc8gsxpw2f_csa">
+      <w:hyperlink w:history="1" r:id="rIdyz3kuw7els34awnaxenpv">
         <w:r>
           <w:rPr>
             <w:rStyle w:val="Hyperlink"/>
@@ -1554,7 +1554,7 @@
       <w:r>
         <w:t xml:space="preserve"> — créé — </w:t>
       </w:r>
-      <w:hyperlink w:history="1" r:id="rId3miu61bkwpwj4rczuvvv2">
+      <w:hyperlink w:history="1" r:id="rIdhhlxqcqbfl2nemy0ungmg">
         <w:r>
           <w:rPr>
             <w:rStyle w:val="Hyperlink"/>
@@ -1583,7 +1583,7 @@
       <w:r>
         <w:t xml:space="preserve"> — créé — </w:t>
       </w:r>
-      <w:hyperlink w:history="1" r:id="rId71-u3zabwodya0ocyoxkg">
+      <w:hyperlink w:history="1" r:id="rIdwg4dem772jiwuydqckn-7">
         <w:r>
           <w:rPr>
             <w:rStyle w:val="Hyperlink"/>
@@ -1612,7 +1612,7 @@
       <w:r>
         <w:t xml:space="preserve"> — créé — </w:t>
       </w:r>
-      <w:hyperlink w:history="1" r:id="rIdobpt7debnmj4qxfr-re_w">
+      <w:hyperlink w:history="1" r:id="rIddhazb4ekrz6oynstlm9yq">
         <w:r>
           <w:rPr>
             <w:rStyle w:val="Hyperlink"/>
@@ -1641,7 +1641,7 @@
       <w:r>
         <w:t xml:space="preserve"> — créé — </w:t>
       </w:r>
-      <w:hyperlink w:history="1" r:id="rIdn2jp1qpgppne5lykq3yod">
+      <w:hyperlink w:history="1" r:id="rIdwqhng8ejzcsoovgduti-m">
         <w:r>
           <w:rPr>
             <w:rStyle w:val="Hyperlink"/>
@@ -1670,7 +1670,7 @@
       <w:r>
         <w:t xml:space="preserve"> — créé — </w:t>
       </w:r>
-      <w:hyperlink w:history="1" r:id="rIddhby5oemvzprhszibpq_j">
+      <w:hyperlink w:history="1" r:id="rIdt8ao1g0mhiqegakmjvkqu">
         <w:r>
           <w:rPr>
             <w:rStyle w:val="Hyperlink"/>
@@ -1699,7 +1699,7 @@
       <w:r>
         <w:t xml:space="preserve"> — créé — </w:t>
       </w:r>
-      <w:hyperlink w:history="1" r:id="rIdkpwe39wxjjv2hd9ghlcxt">
+      <w:hyperlink w:history="1" r:id="rIdefs2oceytpr2ixgcgbbea">
         <w:r>
           <w:rPr>
             <w:rStyle w:val="Hyperlink"/>
@@ -1728,7 +1728,7 @@
       <w:r>
         <w:t xml:space="preserve"> — créé — </w:t>
       </w:r>
-      <w:hyperlink w:history="1" r:id="rIdabao66ramhlm9orqf5-yc">
+      <w:hyperlink w:history="1" r:id="rIdr-pomev5xjajf5fdx8tad">
         <w:r>
           <w:rPr>
             <w:rStyle w:val="Hyperlink"/>
@@ -1757,7 +1757,7 @@
       <w:r>
         <w:t xml:space="preserve"> — créé — </w:t>
       </w:r>
-      <w:hyperlink w:history="1" r:id="rId_qcbi0xzvojkvcjyv1p4w">
+      <w:hyperlink w:history="1" r:id="rIdx-i0scqzs0hngkw-no8la">
         <w:r>
           <w:rPr>
             <w:rStyle w:val="Hyperlink"/>
@@ -1786,7 +1786,7 @@
       <w:r>
         <w:t xml:space="preserve"> — créé — </w:t>
       </w:r>
-      <w:hyperlink w:history="1" r:id="rIdfqplsnivrsrqnvyverdkf">
+      <w:hyperlink w:history="1" r:id="rIdq4_rswelvbwxumgm7wfnx">
         <w:r>
           <w:rPr>
             <w:rStyle w:val="Hyperlink"/>
@@ -1823,7 +1823,7 @@
       <w:r>
         <w:t xml:space="preserve"> — créé — </w:t>
       </w:r>
-      <w:hyperlink w:history="1" r:id="rIdioll6dfwqzknxcf_s4au7">
+      <w:hyperlink w:history="1" r:id="rIdttoa4lx32f4r1c-8xanw-">
         <w:r>
           <w:rPr>
             <w:rStyle w:val="Hyperlink"/>
@@ -1852,7 +1852,7 @@
       <w:r>
         <w:t xml:space="preserve"> — créé — </w:t>
       </w:r>
-      <w:hyperlink w:history="1" r:id="rIdoookv-r8vabhngxoh-ihy">
+      <w:hyperlink w:history="1" r:id="rIdba8axtyeit5ht2e1hok6e">
         <w:r>
           <w:rPr>
             <w:rStyle w:val="Hyperlink"/>
@@ -1881,7 +1881,7 @@
       <w:r>
         <w:t xml:space="preserve"> — créé — </w:t>
       </w:r>
-      <w:hyperlink w:history="1" r:id="rIdhna2rlzdjk7ocx5yzflsu">
+      <w:hyperlink w:history="1" r:id="rIddp_jld_-uy2mbh7oi_ylh">
         <w:r>
           <w:rPr>
             <w:rStyle w:val="Hyperlink"/>
@@ -1910,7 +1910,7 @@
       <w:r>
         <w:t xml:space="preserve"> — créé — </w:t>
       </w:r>
-      <w:hyperlink w:history="1" r:id="rId8kbco-o5htz-eatwqol53">
+      <w:hyperlink w:history="1" r:id="rIdz0ci8fzkul7x6hzqekhhn">
         <w:r>
           <w:rPr>
             <w:rStyle w:val="Hyperlink"/>
@@ -1939,7 +1939,7 @@
       <w:r>
         <w:t xml:space="preserve"> — créé — </w:t>
       </w:r>
-      <w:hyperlink w:history="1" r:id="rIdvlycb78o7yvamvrbpueey">
+      <w:hyperlink w:history="1" r:id="rIdnirg9oncyfudjkkhfdmw6">
         <w:r>
           <w:rPr>
             <w:rStyle w:val="Hyperlink"/>
@@ -1968,7 +1968,7 @@
       <w:r>
         <w:t xml:space="preserve"> — créé — </w:t>
       </w:r>
-      <w:hyperlink w:history="1" r:id="rIdwepozsx73tk5t8eo1-kkp">
+      <w:hyperlink w:history="1" r:id="rIdhxuwfndqojkqafeanfent">
         <w:r>
           <w:rPr>
             <w:rStyle w:val="Hyperlink"/>
@@ -1997,7 +1997,7 @@
       <w:r>
         <w:t xml:space="preserve"> — créé — </w:t>
       </w:r>
-      <w:hyperlink w:history="1" r:id="rIdz87ieva3z2ej1bf7myl_q">
+      <w:hyperlink w:history="1" r:id="rIdk7cvd9qtysxv0ttvx5tff">
         <w:r>
           <w:rPr>
             <w:rStyle w:val="Hyperlink"/>
@@ -2026,7 +2026,7 @@
       <w:r>
         <w:t xml:space="preserve"> — créé — </w:t>
       </w:r>
-      <w:hyperlink w:history="1" r:id="rIdbzomjs9k_jsstw9rcbyi3">
+      <w:hyperlink w:history="1" r:id="rIdmgbv8l3qseuaaurdxc-al">
         <w:r>
           <w:rPr>
             <w:rStyle w:val="Hyperlink"/>
@@ -2139,7 +2139,7 @@
       <w:r>
         <w:t xml:space="preserve"> — créé — </w:t>
       </w:r>
-      <w:hyperlink w:history="1" r:id="rId16l5bc3z0tlhzho86sxfh">
+      <w:hyperlink w:history="1" r:id="rIdrnpi_hgvrtn1sloirxds7">
         <w:r>
           <w:rPr>
             <w:rStyle w:val="Hyperlink"/>
@@ -2189,7 +2189,7 @@
       <w:r>
         <w:t xml:space="preserve"> — créé — </w:t>
       </w:r>
-      <w:hyperlink w:history="1" r:id="rIdeldyvdmur6ak1v2a6xazq">
+      <w:hyperlink w:history="1" r:id="rIdcr-g56njmk0dli8k3fvwm">
         <w:r>
           <w:rPr>
             <w:rStyle w:val="Hyperlink"/>
@@ -2218,7 +2218,7 @@
       <w:r>
         <w:t xml:space="preserve"> — créé — </w:t>
       </w:r>
-      <w:hyperlink w:history="1" r:id="rId8ubzdcbymidffajzdjdeb">
+      <w:hyperlink w:history="1" r:id="rIdd1hhbnrlzt9dbdocpkudq">
         <w:r>
           <w:rPr>
             <w:rStyle w:val="Hyperlink"/>
@@ -2247,7 +2247,7 @@
       <w:r>
         <w:t xml:space="preserve"> — créé — </w:t>
       </w:r>
-      <w:hyperlink w:history="1" r:id="rIdlcrhpll2bgkkhhdobcpc6">
+      <w:hyperlink w:history="1" r:id="rIdsqeijrp9nbcbaido2gday">
         <w:r>
           <w:rPr>
             <w:rStyle w:val="Hyperlink"/>
@@ -2276,7 +2276,7 @@
       <w:r>
         <w:t xml:space="preserve"> — créé — </w:t>
       </w:r>
-      <w:hyperlink w:history="1" r:id="rIdlqyqcdomgg4eklkkhaw_7">
+      <w:hyperlink w:history="1" r:id="rIddffqyekdbhdbyv1v6f9nh">
         <w:r>
           <w:rPr>
             <w:rStyle w:val="Hyperlink"/>
@@ -2313,7 +2313,7 @@
       <w:r>
         <w:t xml:space="preserve"> — créé — </w:t>
       </w:r>
-      <w:hyperlink w:history="1" r:id="rIdx70z2m-7wwwx9c7d_wz7d">
+      <w:hyperlink w:history="1" r:id="rIds5kuxj_cl0dvmgisvy-r6">
         <w:r>
           <w:rPr>
             <w:rStyle w:val="Hyperlink"/>
@@ -2342,7 +2342,7 @@
       <w:r>
         <w:t xml:space="preserve"> — créé — </w:t>
       </w:r>
-      <w:hyperlink w:history="1" r:id="rIddylpcridag7xiimfyquqi">
+      <w:hyperlink w:history="1" r:id="rIdqwedcfr0cybaunm3xojcg">
         <w:r>
           <w:rPr>
             <w:rStyle w:val="Hyperlink"/>
@@ -2379,7 +2379,7 @@
       <w:r>
         <w:t xml:space="preserve"> — créé — </w:t>
       </w:r>
-      <w:hyperlink w:history="1" r:id="rIdgo_3rdoq-tcvsozcy-aaz">
+      <w:hyperlink w:history="1" r:id="rIdtcrqqikafoapx0u-utm7n">
         <w:r>
           <w:rPr>
             <w:rStyle w:val="Hyperlink"/>
@@ -2408,7 +2408,7 @@
       <w:r>
         <w:t xml:space="preserve"> — créé — </w:t>
       </w:r>
-      <w:hyperlink w:history="1" r:id="rIdgrcxsmnn3kx-dkr7d7xn7">
+      <w:hyperlink w:history="1" r:id="rIdhlz1hbcmx--zoixanhjaj">
         <w:r>
           <w:rPr>
             <w:rStyle w:val="Hyperlink"/>
@@ -2437,7 +2437,7 @@
       <w:r>
         <w:t xml:space="preserve"> — créé — </w:t>
       </w:r>
-      <w:hyperlink w:history="1" r:id="rIdwm6p18hycprzn9ctf3mq9">
+      <w:hyperlink w:history="1" r:id="rIdzzmjwi_u6zu6oqpzx0wir">
         <w:r>
           <w:rPr>
             <w:rStyle w:val="Hyperlink"/>
@@ -2466,7 +2466,7 @@
       <w:r>
         <w:t xml:space="preserve"> — créé — </w:t>
       </w:r>
-      <w:hyperlink w:history="1" r:id="rIdnrspqqre9zk2n4bdxhsk5">
+      <w:hyperlink w:history="1" r:id="rIdqdscxzz-dqqlk-dyznhub">
         <w:r>
           <w:rPr>
             <w:rStyle w:val="Hyperlink"/>
@@ -2495,7 +2495,7 @@
       <w:r>
         <w:t xml:space="preserve"> — créé — </w:t>
       </w:r>
-      <w:hyperlink w:history="1" r:id="rIdqj7zbph9ekphdyxivf-ol">
+      <w:hyperlink w:history="1" r:id="rIdccewyxbjus3widttnp2fl">
         <w:r>
           <w:rPr>
             <w:rStyle w:val="Hyperlink"/>
@@ -2524,7 +2524,7 @@
       <w:r>
         <w:t xml:space="preserve"> — créé — </w:t>
       </w:r>
-      <w:hyperlink w:history="1" r:id="rIdl1resndd1feh6d2r0mzyg">
+      <w:hyperlink w:history="1" r:id="rIdqfciqbdcii7w2e9efzk_m">
         <w:r>
           <w:rPr>
             <w:rStyle w:val="Hyperlink"/>
@@ -2553,7 +2553,7 @@
       <w:r>
         <w:t xml:space="preserve"> — créé — </w:t>
       </w:r>
-      <w:hyperlink w:history="1" r:id="rIdeclzjbowioml7-zcmtayh">
+      <w:hyperlink w:history="1" r:id="rIdojetvuv3zw51bytr0sstu">
         <w:r>
           <w:rPr>
             <w:rStyle w:val="Hyperlink"/>
@@ -2582,7 +2582,7 @@
       <w:r>
         <w:t xml:space="preserve"> — créé — </w:t>
       </w:r>
-      <w:hyperlink w:history="1" r:id="rIdfhefdfunect8tx5wsj4_b">
+      <w:hyperlink w:history="1" r:id="rIdaka2vuaol9ort7-k644dm">
         <w:r>
           <w:rPr>
             <w:rStyle w:val="Hyperlink"/>
@@ -2611,7 +2611,7 @@
       <w:r>
         <w:t xml:space="preserve"> — créé — </w:t>
       </w:r>
-      <w:hyperlink w:history="1" r:id="rIdgtbnrxsmiwi0net9frclf">
+      <w:hyperlink w:history="1" r:id="rIdnmaojtpjxgmxwic4hquya">
         <w:r>
           <w:rPr>
             <w:rStyle w:val="Hyperlink"/>
@@ -2648,7 +2648,7 @@
       <w:r>
         <w:t xml:space="preserve"> — créé — </w:t>
       </w:r>
-      <w:hyperlink w:history="1" r:id="rIdfo1ifj5zn-agktwsnjbof">
+      <w:hyperlink w:history="1" r:id="rIdamvoffsgdgd0iyp4fixxb">
         <w:r>
           <w:rPr>
             <w:rStyle w:val="Hyperlink"/>
@@ -2677,7 +2677,7 @@
       <w:r>
         <w:t xml:space="preserve"> — créé — </w:t>
       </w:r>
-      <w:hyperlink w:history="1" r:id="rId8whqt80p-21iw8n3oc5ih">
+      <w:hyperlink w:history="1" r:id="rIdcxgixpewqjjj-n9g79wxi">
         <w:r>
           <w:rPr>
             <w:rStyle w:val="Hyperlink"/>
@@ -2706,7 +2706,7 @@
       <w:r>
         <w:t xml:space="preserve"> — créé — </w:t>
       </w:r>
-      <w:hyperlink w:history="1" r:id="rId2th1n8mn_nvbpb15gnm52">
+      <w:hyperlink w:history="1" r:id="rIdhaenve_dcokah1pbf1are">
         <w:r>
           <w:rPr>
             <w:rStyle w:val="Hyperlink"/>
@@ -2735,7 +2735,7 @@
       <w:r>
         <w:t xml:space="preserve"> — créé — </w:t>
       </w:r>
-      <w:hyperlink w:history="1" r:id="rIdd0yvwx-uin1-ojdqzudbw">
+      <w:hyperlink w:history="1" r:id="rId84_tifqlycsioezcxsvrz">
         <w:r>
           <w:rPr>
             <w:rStyle w:val="Hyperlink"/>
@@ -2764,7 +2764,7 @@
       <w:r>
         <w:t xml:space="preserve"> — créé — </w:t>
       </w:r>
-      <w:hyperlink w:history="1" r:id="rIdlxqlb67surkqsvvi3nm94">
+      <w:hyperlink w:history="1" r:id="rIdjrkubuhfrsqcdshpdthb0">
         <w:r>
           <w:rPr>
             <w:rStyle w:val="Hyperlink"/>
@@ -2793,7 +2793,7 @@
       <w:r>
         <w:t xml:space="preserve"> — créé — </w:t>
       </w:r>
-      <w:hyperlink w:history="1" r:id="rId2vyu_jc7xww7vzsyjdug8">
+      <w:hyperlink w:history="1" r:id="rIdkuraa7lvef2ycvn6yma3_">
         <w:r>
           <w:rPr>
             <w:rStyle w:val="Hyperlink"/>
@@ -2822,7 +2822,7 @@
       <w:r>
         <w:t xml:space="preserve"> — créé — </w:t>
       </w:r>
-      <w:hyperlink w:history="1" r:id="rIdc3c9g05gw8bgivhvtk7ym">
+      <w:hyperlink w:history="1" r:id="rIdxklihm4izcfg4rhu5ovm_">
         <w:r>
           <w:rPr>
             <w:rStyle w:val="Hyperlink"/>
@@ -2851,7 +2851,7 @@
       <w:r>
         <w:t xml:space="preserve"> — créé — </w:t>
       </w:r>
-      <w:hyperlink w:history="1" r:id="rIdb3j84p16f4lnih-iqegby">
+      <w:hyperlink w:history="1" r:id="rIdimfhws9eiu9lib6qud6cg">
         <w:r>
           <w:rPr>
             <w:rStyle w:val="Hyperlink"/>

</xml_diff>

<commit_message>
Journal : phase 35 (cibles de marge et gestion financière)
Co-Authored-By: Claude Opus 5.5 <noreply@anthropic.com>
</commit_message>
<xml_diff>
--- a/docs/developpement/phases/word/PHASE_00_SOCLE_DE_PRODUCTION_ET_CONFIGURATION_DUN_LIEU_VIDE.docx
+++ b/docs/developpement/phases/word/PHASE_00_SOCLE_DE_PRODUCTION_ET_CONFIGURATION_DUN_LIEU_VIDE.docx
@@ -20,7 +20,7 @@
       <w:r>
         <w:t xml:space="preserve">FlaiX Expert · dossier de développement · généré le 2026-10-04 depuis le dépôt </w:t>
       </w:r>
-      <w:hyperlink w:history="1" r:id="rId0xypshwbm3ksy6smgflin">
+      <w:hyperlink w:history="1" r:id="rIdd5qjsdm0lelgkvdeax5yk">
         <w:r>
           <w:rPr>
             <w:rStyle w:val="Hyperlink"/>
@@ -592,7 +592,7 @@
           <w:numId w:val="3"/>
         </w:numPr>
       </w:pPr>
-      <w:hyperlink w:history="1" r:id="rIdekpo5au6nib3du1x9ixre">
+      <w:hyperlink w:history="1" r:id="rIdp5p0rhuwar0fdzkbb4vj_">
         <w:r>
           <w:rPr>
             <w:rStyle w:val="Hyperlink"/>
@@ -612,7 +612,7 @@
           <w:numId w:val="3"/>
         </w:numPr>
       </w:pPr>
-      <w:hyperlink w:history="1" r:id="rId6v1zp0egrtt2m7baq556x">
+      <w:hyperlink w:history="1" r:id="rIdjvxnjhztvahtizh1pap74">
         <w:r>
           <w:rPr>
             <w:rStyle w:val="Hyperlink"/>
@@ -660,7 +660,7 @@
       <w:r>
         <w:t xml:space="preserve"> — créé — </w:t>
       </w:r>
-      <w:hyperlink w:history="1" r:id="rIddp9imgg6f1kxbxybgz65k">
+      <w:hyperlink w:history="1" r:id="rIdljwlwxgiqexuli1sbunwb">
         <w:r>
           <w:rPr>
             <w:rStyle w:val="Hyperlink"/>
@@ -689,7 +689,7 @@
       <w:r>
         <w:t xml:space="preserve"> — créé — </w:t>
       </w:r>
-      <w:hyperlink w:history="1" r:id="rIddcocn6jn-pww9tklaf-ka">
+      <w:hyperlink w:history="1" r:id="rId2z5ueb7rsmeubawea4nd3">
         <w:r>
           <w:rPr>
             <w:rStyle w:val="Hyperlink"/>
@@ -726,7 +726,7 @@
       <w:r>
         <w:t xml:space="preserve"> — créé — </w:t>
       </w:r>
-      <w:hyperlink w:history="1" r:id="rIdfi4jwhukt3kdtd_vyy-oy">
+      <w:hyperlink w:history="1" r:id="rIdtqkbnejgsw81n7jjh3kju">
         <w:r>
           <w:rPr>
             <w:rStyle w:val="Hyperlink"/>
@@ -755,7 +755,7 @@
       <w:r>
         <w:t xml:space="preserve"> — créé — </w:t>
       </w:r>
-      <w:hyperlink w:history="1" r:id="rIdpyivgm-l4ntsvlfr_0wcu">
+      <w:hyperlink w:history="1" r:id="rIdvrpolv_p4k-k5n8b6olyg">
         <w:r>
           <w:rPr>
             <w:rStyle w:val="Hyperlink"/>
@@ -784,7 +784,7 @@
       <w:r>
         <w:t xml:space="preserve"> — créé — </w:t>
       </w:r>
-      <w:hyperlink w:history="1" r:id="rIdv8w6n1xq4q9inztdf8twv">
+      <w:hyperlink w:history="1" r:id="rId4uibywa8r13z3vkzd8htt">
         <w:r>
           <w:rPr>
             <w:rStyle w:val="Hyperlink"/>
@@ -813,7 +813,7 @@
       <w:r>
         <w:t xml:space="preserve"> — créé — </w:t>
       </w:r>
-      <w:hyperlink w:history="1" r:id="rIdwrnu1cdb25jiicabeqex4">
+      <w:hyperlink w:history="1" r:id="rIdu96-6ttuwpkjgzwjdqpzs">
         <w:r>
           <w:rPr>
             <w:rStyle w:val="Hyperlink"/>
@@ -842,7 +842,7 @@
       <w:r>
         <w:t xml:space="preserve"> — créé — </w:t>
       </w:r>
-      <w:hyperlink w:history="1" r:id="rIdbtqi_jgi8n8cecqdasjqw">
+      <w:hyperlink w:history="1" r:id="rIdhm7qxglaj9jq_qmnpv4ut">
         <w:r>
           <w:rPr>
             <w:rStyle w:val="Hyperlink"/>
@@ -879,7 +879,7 @@
       <w:r>
         <w:t xml:space="preserve"> — créé — </w:t>
       </w:r>
-      <w:hyperlink w:history="1" r:id="rIdbb-ydsfpyzkvosmfmr_vk">
+      <w:hyperlink w:history="1" r:id="rIdzo-woqnf-ammx7bki1blb">
         <w:r>
           <w:rPr>
             <w:rStyle w:val="Hyperlink"/>
@@ -908,7 +908,7 @@
       <w:r>
         <w:t xml:space="preserve"> — créé — </w:t>
       </w:r>
-      <w:hyperlink w:history="1" r:id="rId1mhh66omfex5iyhklzroi">
+      <w:hyperlink w:history="1" r:id="rIdmozkjmpfcxirgcihr-afe">
         <w:r>
           <w:rPr>
             <w:rStyle w:val="Hyperlink"/>
@@ -937,7 +937,7 @@
       <w:r>
         <w:t xml:space="preserve"> — créé — </w:t>
       </w:r>
-      <w:hyperlink w:history="1" r:id="rId-tc70v81tirde9-eqmspy">
+      <w:hyperlink w:history="1" r:id="rIdxiqaetlh11ypzhq4trtu4">
         <w:r>
           <w:rPr>
             <w:rStyle w:val="Hyperlink"/>
@@ -966,7 +966,7 @@
       <w:r>
         <w:t xml:space="preserve"> — créé — </w:t>
       </w:r>
-      <w:hyperlink w:history="1" r:id="rIdg-ozo-tqg5xiczsc6kgl_">
+      <w:hyperlink w:history="1" r:id="rIdx0woksdpf14ttactkvpnf">
         <w:r>
           <w:rPr>
             <w:rStyle w:val="Hyperlink"/>
@@ -995,7 +995,7 @@
       <w:r>
         <w:t xml:space="preserve"> — créé — </w:t>
       </w:r>
-      <w:hyperlink w:history="1" r:id="rIdcf_e2bk6y923fkizydbdd">
+      <w:hyperlink w:history="1" r:id="rId7cjwvvtc8vbij-ivqp6ke">
         <w:r>
           <w:rPr>
             <w:rStyle w:val="Hyperlink"/>
@@ -1024,7 +1024,7 @@
       <w:r>
         <w:t xml:space="preserve"> — créé — </w:t>
       </w:r>
-      <w:hyperlink w:history="1" r:id="rIdt9efjgudkevvk_22qetx4">
+      <w:hyperlink w:history="1" r:id="rIdy2kzj_l9c1_-iighbreis">
         <w:r>
           <w:rPr>
             <w:rStyle w:val="Hyperlink"/>
@@ -1053,7 +1053,7 @@
       <w:r>
         <w:t xml:space="preserve"> — créé — </w:t>
       </w:r>
-      <w:hyperlink w:history="1" r:id="rIdbfafmpkb0fzfitmo552dt">
+      <w:hyperlink w:history="1" r:id="rIdbvqnar1jasopi65b3fykc">
         <w:r>
           <w:rPr>
             <w:rStyle w:val="Hyperlink"/>
@@ -1082,7 +1082,7 @@
       <w:r>
         <w:t xml:space="preserve"> — créé — </w:t>
       </w:r>
-      <w:hyperlink w:history="1" r:id="rIdvi5oclfcjb7curxmc_y6i">
+      <w:hyperlink w:history="1" r:id="rIdxg8ydiytxh5g6v1crd0-m">
         <w:r>
           <w:rPr>
             <w:rStyle w:val="Hyperlink"/>
@@ -1111,7 +1111,7 @@
       <w:r>
         <w:t xml:space="preserve"> — créé — </w:t>
       </w:r>
-      <w:hyperlink w:history="1" r:id="rId70agi_o3vfcck5yfvj-qp">
+      <w:hyperlink w:history="1" r:id="rIdik4ybiqkc0erthphgxqau">
         <w:r>
           <w:rPr>
             <w:rStyle w:val="Hyperlink"/>
@@ -1148,7 +1148,7 @@
       <w:r>
         <w:t xml:space="preserve"> — créé — </w:t>
       </w:r>
-      <w:hyperlink w:history="1" r:id="rIddhh6pg38k2thmvww94mhq">
+      <w:hyperlink w:history="1" r:id="rIdzpi8vy2nb3jzzr-0dockc">
         <w:r>
           <w:rPr>
             <w:rStyle w:val="Hyperlink"/>
@@ -1177,7 +1177,7 @@
       <w:r>
         <w:t xml:space="preserve"> — créé — </w:t>
       </w:r>
-      <w:hyperlink w:history="1" r:id="rIdbpnktnppl1pzceviyhx7n">
+      <w:hyperlink w:history="1" r:id="rId0pbun3v9lm9ki4dxrdoxv">
         <w:r>
           <w:rPr>
             <w:rStyle w:val="Hyperlink"/>
@@ -1206,7 +1206,7 @@
       <w:r>
         <w:t xml:space="preserve"> — créé — </w:t>
       </w:r>
-      <w:hyperlink w:history="1" r:id="rIdinaklghpdqgnzue-cx2jz">
+      <w:hyperlink w:history="1" r:id="rIdazmzzcywcm3y4dwpzenh7">
         <w:r>
           <w:rPr>
             <w:rStyle w:val="Hyperlink"/>
@@ -1235,7 +1235,7 @@
       <w:r>
         <w:t xml:space="preserve"> — créé — </w:t>
       </w:r>
-      <w:hyperlink w:history="1" r:id="rId-ninxeqrpyksrhayvncmk">
+      <w:hyperlink w:history="1" r:id="rId8lx2yloiyaf-jzukayvqt">
         <w:r>
           <w:rPr>
             <w:rStyle w:val="Hyperlink"/>
@@ -1264,7 +1264,7 @@
       <w:r>
         <w:t xml:space="preserve"> — créé — </w:t>
       </w:r>
-      <w:hyperlink w:history="1" r:id="rIdfbdiz0i-2cludfpxmjhjf">
+      <w:hyperlink w:history="1" r:id="rIdqanwjzgeirtammnzxxc-n">
         <w:r>
           <w:rPr>
             <w:rStyle w:val="Hyperlink"/>
@@ -1293,7 +1293,7 @@
       <w:r>
         <w:t xml:space="preserve"> — créé — </w:t>
       </w:r>
-      <w:hyperlink w:history="1" r:id="rId5szdvo_5gxd1lcplp4_zb">
+      <w:hyperlink w:history="1" r:id="rIdzthllcsotj8zvck39da0z">
         <w:r>
           <w:rPr>
             <w:rStyle w:val="Hyperlink"/>
@@ -1322,7 +1322,7 @@
       <w:r>
         <w:t xml:space="preserve"> — créé — </w:t>
       </w:r>
-      <w:hyperlink w:history="1" r:id="rIdyzhio3v1ug-i9zj0tf27x">
+      <w:hyperlink w:history="1" r:id="rIdasx30jlcdhgkbiz2jwdze">
         <w:r>
           <w:rPr>
             <w:rStyle w:val="Hyperlink"/>
@@ -1351,7 +1351,7 @@
       <w:r>
         <w:t xml:space="preserve"> — créé — </w:t>
       </w:r>
-      <w:hyperlink w:history="1" r:id="rIdy5yhgzkfotww_-4eanywf">
+      <w:hyperlink w:history="1" r:id="rIdhwrd0y4rujargraw3ghm-">
         <w:r>
           <w:rPr>
             <w:rStyle w:val="Hyperlink"/>
@@ -1380,7 +1380,7 @@
       <w:r>
         <w:t xml:space="preserve"> — créé — </w:t>
       </w:r>
-      <w:hyperlink w:history="1" r:id="rId3nmu4zv-rkxuwtgcz0vm1">
+      <w:hyperlink w:history="1" r:id="rId8pqmy0acyp0buqztocqb5">
         <w:r>
           <w:rPr>
             <w:rStyle w:val="Hyperlink"/>
@@ -1409,7 +1409,7 @@
       <w:r>
         <w:t xml:space="preserve"> — créé — </w:t>
       </w:r>
-      <w:hyperlink w:history="1" r:id="rIddomlzp3fyykgqj793j19x">
+      <w:hyperlink w:history="1" r:id="rIdmgwpgsclthyw-c-ti7rig">
         <w:r>
           <w:rPr>
             <w:rStyle w:val="Hyperlink"/>
@@ -1438,7 +1438,7 @@
       <w:r>
         <w:t xml:space="preserve"> — créé — </w:t>
       </w:r>
-      <w:hyperlink w:history="1" r:id="rIdewgzen6ylilvcljciqgu9">
+      <w:hyperlink w:history="1" r:id="rIdm2hxukuvalpih4ztb0ubf">
         <w:r>
           <w:rPr>
             <w:rStyle w:val="Hyperlink"/>
@@ -1467,7 +1467,7 @@
       <w:r>
         <w:t xml:space="preserve"> — créé — </w:t>
       </w:r>
-      <w:hyperlink w:history="1" r:id="rIddvx-x0pwykk6jtf1x8pw1">
+      <w:hyperlink w:history="1" r:id="rIddmm3mzi3flliqv404qrkh">
         <w:r>
           <w:rPr>
             <w:rStyle w:val="Hyperlink"/>
@@ -1496,7 +1496,7 @@
       <w:r>
         <w:t xml:space="preserve"> — créé — </w:t>
       </w:r>
-      <w:hyperlink w:history="1" r:id="rIdxsavraxjjelay8mkuz_qz">
+      <w:hyperlink w:history="1" r:id="rId6wzjbu-seqxvvly0ukq1b">
         <w:r>
           <w:rPr>
             <w:rStyle w:val="Hyperlink"/>
@@ -1525,7 +1525,7 @@
       <w:r>
         <w:t xml:space="preserve"> — créé — </w:t>
       </w:r>
-      <w:hyperlink w:history="1" r:id="rIdyz3kuw7els34awnaxenpv">
+      <w:hyperlink w:history="1" r:id="rIdzyjjjgld5knmbgibk2jhz">
         <w:r>
           <w:rPr>
             <w:rStyle w:val="Hyperlink"/>
@@ -1554,7 +1554,7 @@
       <w:r>
         <w:t xml:space="preserve"> — créé — </w:t>
       </w:r>
-      <w:hyperlink w:history="1" r:id="rIdhhlxqcqbfl2nemy0ungmg">
+      <w:hyperlink w:history="1" r:id="rIdtdtigi0qywleotlq13ymd">
         <w:r>
           <w:rPr>
             <w:rStyle w:val="Hyperlink"/>
@@ -1583,7 +1583,7 @@
       <w:r>
         <w:t xml:space="preserve"> — créé — </w:t>
       </w:r>
-      <w:hyperlink w:history="1" r:id="rIdwg4dem772jiwuydqckn-7">
+      <w:hyperlink w:history="1" r:id="rIdsnwa-pj3zggegvsoiftuu">
         <w:r>
           <w:rPr>
             <w:rStyle w:val="Hyperlink"/>
@@ -1612,7 +1612,7 @@
       <w:r>
         <w:t xml:space="preserve"> — créé — </w:t>
       </w:r>
-      <w:hyperlink w:history="1" r:id="rIddhazb4ekrz6oynstlm9yq">
+      <w:hyperlink w:history="1" r:id="rIdk-ess5bqmk4xqoz5fdzdx">
         <w:r>
           <w:rPr>
             <w:rStyle w:val="Hyperlink"/>
@@ -1641,7 +1641,7 @@
       <w:r>
         <w:t xml:space="preserve"> — créé — </w:t>
       </w:r>
-      <w:hyperlink w:history="1" r:id="rIdwqhng8ejzcsoovgduti-m">
+      <w:hyperlink w:history="1" r:id="rId-ukekkteuqdmsr_a_rhhw">
         <w:r>
           <w:rPr>
             <w:rStyle w:val="Hyperlink"/>
@@ -1670,7 +1670,7 @@
       <w:r>
         <w:t xml:space="preserve"> — créé — </w:t>
       </w:r>
-      <w:hyperlink w:history="1" r:id="rIdt8ao1g0mhiqegakmjvkqu">
+      <w:hyperlink w:history="1" r:id="rIdusosdinc0v0whapf-1ocv">
         <w:r>
           <w:rPr>
             <w:rStyle w:val="Hyperlink"/>
@@ -1699,7 +1699,7 @@
       <w:r>
         <w:t xml:space="preserve"> — créé — </w:t>
       </w:r>
-      <w:hyperlink w:history="1" r:id="rIdefs2oceytpr2ixgcgbbea">
+      <w:hyperlink w:history="1" r:id="rId7o6qx_srelk_5tvcgbtmq">
         <w:r>
           <w:rPr>
             <w:rStyle w:val="Hyperlink"/>
@@ -1728,7 +1728,7 @@
       <w:r>
         <w:t xml:space="preserve"> — créé — </w:t>
       </w:r>
-      <w:hyperlink w:history="1" r:id="rIdr-pomev5xjajf5fdx8tad">
+      <w:hyperlink w:history="1" r:id="rIdra8fcyzldpoob_q0psnln">
         <w:r>
           <w:rPr>
             <w:rStyle w:val="Hyperlink"/>
@@ -1757,7 +1757,7 @@
       <w:r>
         <w:t xml:space="preserve"> — créé — </w:t>
       </w:r>
-      <w:hyperlink w:history="1" r:id="rIdx-i0scqzs0hngkw-no8la">
+      <w:hyperlink w:history="1" r:id="rIdyi-ei5qd6w5a1-qe_epm9">
         <w:r>
           <w:rPr>
             <w:rStyle w:val="Hyperlink"/>
@@ -1786,7 +1786,7 @@
       <w:r>
         <w:t xml:space="preserve"> — créé — </w:t>
       </w:r>
-      <w:hyperlink w:history="1" r:id="rIdq4_rswelvbwxumgm7wfnx">
+      <w:hyperlink w:history="1" r:id="rIdm8tm0sz3_pjvdsortdf3q">
         <w:r>
           <w:rPr>
             <w:rStyle w:val="Hyperlink"/>
@@ -1823,7 +1823,7 @@
       <w:r>
         <w:t xml:space="preserve"> — créé — </w:t>
       </w:r>
-      <w:hyperlink w:history="1" r:id="rIdttoa4lx32f4r1c-8xanw-">
+      <w:hyperlink w:history="1" r:id="rIdmv-vxjnptizwqlqn5vthm">
         <w:r>
           <w:rPr>
             <w:rStyle w:val="Hyperlink"/>
@@ -1852,7 +1852,7 @@
       <w:r>
         <w:t xml:space="preserve"> — créé — </w:t>
       </w:r>
-      <w:hyperlink w:history="1" r:id="rIdba8axtyeit5ht2e1hok6e">
+      <w:hyperlink w:history="1" r:id="rIdbfhawkr87ot7x_tfow5w4">
         <w:r>
           <w:rPr>
             <w:rStyle w:val="Hyperlink"/>
@@ -1881,7 +1881,7 @@
       <w:r>
         <w:t xml:space="preserve"> — créé — </w:t>
       </w:r>
-      <w:hyperlink w:history="1" r:id="rIddp_jld_-uy2mbh7oi_ylh">
+      <w:hyperlink w:history="1" r:id="rIdpw9-ug28p8ids18fezcjw">
         <w:r>
           <w:rPr>
             <w:rStyle w:val="Hyperlink"/>
@@ -1910,7 +1910,7 @@
       <w:r>
         <w:t xml:space="preserve"> — créé — </w:t>
       </w:r>
-      <w:hyperlink w:history="1" r:id="rIdz0ci8fzkul7x6hzqekhhn">
+      <w:hyperlink w:history="1" r:id="rId2kmsbr8vjsizhpuxkexzs">
         <w:r>
           <w:rPr>
             <w:rStyle w:val="Hyperlink"/>
@@ -1939,7 +1939,7 @@
       <w:r>
         <w:t xml:space="preserve"> — créé — </w:t>
       </w:r>
-      <w:hyperlink w:history="1" r:id="rIdnirg9oncyfudjkkhfdmw6">
+      <w:hyperlink w:history="1" r:id="rIdvmm_gpvkqkgr1k7uyusaw">
         <w:r>
           <w:rPr>
             <w:rStyle w:val="Hyperlink"/>
@@ -1968,7 +1968,7 @@
       <w:r>
         <w:t xml:space="preserve"> — créé — </w:t>
       </w:r>
-      <w:hyperlink w:history="1" r:id="rIdhxuwfndqojkqafeanfent">
+      <w:hyperlink w:history="1" r:id="rIdestolk6vbwb1sokan_xav">
         <w:r>
           <w:rPr>
             <w:rStyle w:val="Hyperlink"/>
@@ -1997,7 +1997,7 @@
       <w:r>
         <w:t xml:space="preserve"> — créé — </w:t>
       </w:r>
-      <w:hyperlink w:history="1" r:id="rIdk7cvd9qtysxv0ttvx5tff">
+      <w:hyperlink w:history="1" r:id="rIdj8byxqsjdmbhdndrcbfb-">
         <w:r>
           <w:rPr>
             <w:rStyle w:val="Hyperlink"/>
@@ -2026,7 +2026,7 @@
       <w:r>
         <w:t xml:space="preserve"> — créé — </w:t>
       </w:r>
-      <w:hyperlink w:history="1" r:id="rIdmgbv8l3qseuaaurdxc-al">
+      <w:hyperlink w:history="1" r:id="rIdnq9pho8v5dfqw2llxroyk">
         <w:r>
           <w:rPr>
             <w:rStyle w:val="Hyperlink"/>
@@ -2139,7 +2139,7 @@
       <w:r>
         <w:t xml:space="preserve"> — créé — </w:t>
       </w:r>
-      <w:hyperlink w:history="1" r:id="rIdrnpi_hgvrtn1sloirxds7">
+      <w:hyperlink w:history="1" r:id="rIdrinct7zhrcdvmkco8uu_b">
         <w:r>
           <w:rPr>
             <w:rStyle w:val="Hyperlink"/>
@@ -2189,7 +2189,7 @@
       <w:r>
         <w:t xml:space="preserve"> — créé — </w:t>
       </w:r>
-      <w:hyperlink w:history="1" r:id="rIdcr-g56njmk0dli8k3fvwm">
+      <w:hyperlink w:history="1" r:id="rIdbjbbqarl3zv3lz6rr_8jw">
         <w:r>
           <w:rPr>
             <w:rStyle w:val="Hyperlink"/>
@@ -2218,7 +2218,7 @@
       <w:r>
         <w:t xml:space="preserve"> — créé — </w:t>
       </w:r>
-      <w:hyperlink w:history="1" r:id="rIdd1hhbnrlzt9dbdocpkudq">
+      <w:hyperlink w:history="1" r:id="rIdag9kfwcvcj0gd-96d-q9v">
         <w:r>
           <w:rPr>
             <w:rStyle w:val="Hyperlink"/>
@@ -2247,7 +2247,7 @@
       <w:r>
         <w:t xml:space="preserve"> — créé — </w:t>
       </w:r>
-      <w:hyperlink w:history="1" r:id="rIdsqeijrp9nbcbaido2gday">
+      <w:hyperlink w:history="1" r:id="rIdxdmqdpv5cnf4vukys7v47">
         <w:r>
           <w:rPr>
             <w:rStyle w:val="Hyperlink"/>
@@ -2276,7 +2276,7 @@
       <w:r>
         <w:t xml:space="preserve"> — créé — </w:t>
       </w:r>
-      <w:hyperlink w:history="1" r:id="rIddffqyekdbhdbyv1v6f9nh">
+      <w:hyperlink w:history="1" r:id="rId10glmmdjuvoer6gptpqhh">
         <w:r>
           <w:rPr>
             <w:rStyle w:val="Hyperlink"/>
@@ -2313,7 +2313,7 @@
       <w:r>
         <w:t xml:space="preserve"> — créé — </w:t>
       </w:r>
-      <w:hyperlink w:history="1" r:id="rIds5kuxj_cl0dvmgisvy-r6">
+      <w:hyperlink w:history="1" r:id="rIdkc0o60xpgtcjobjpht7gy">
         <w:r>
           <w:rPr>
             <w:rStyle w:val="Hyperlink"/>
@@ -2342,7 +2342,7 @@
       <w:r>
         <w:t xml:space="preserve"> — créé — </w:t>
       </w:r>
-      <w:hyperlink w:history="1" r:id="rIdqwedcfr0cybaunm3xojcg">
+      <w:hyperlink w:history="1" r:id="rIdqwfxqgx8rrx2dm_tooyef">
         <w:r>
           <w:rPr>
             <w:rStyle w:val="Hyperlink"/>
@@ -2379,7 +2379,7 @@
       <w:r>
         <w:t xml:space="preserve"> — créé — </w:t>
       </w:r>
-      <w:hyperlink w:history="1" r:id="rIdtcrqqikafoapx0u-utm7n">
+      <w:hyperlink w:history="1" r:id="rIdshkq0fs5rz9mq9ykrw2qh">
         <w:r>
           <w:rPr>
             <w:rStyle w:val="Hyperlink"/>
@@ -2408,7 +2408,7 @@
       <w:r>
         <w:t xml:space="preserve"> — créé — </w:t>
       </w:r>
-      <w:hyperlink w:history="1" r:id="rIdhlz1hbcmx--zoixanhjaj">
+      <w:hyperlink w:history="1" r:id="rId9irhbjlvpawoxuyraxpto">
         <w:r>
           <w:rPr>
             <w:rStyle w:val="Hyperlink"/>
@@ -2437,7 +2437,7 @@
       <w:r>
         <w:t xml:space="preserve"> — créé — </w:t>
       </w:r>
-      <w:hyperlink w:history="1" r:id="rIdzzmjwi_u6zu6oqpzx0wir">
+      <w:hyperlink w:history="1" r:id="rId7nczpvw--a3y1dewj8u_p">
         <w:r>
           <w:rPr>
             <w:rStyle w:val="Hyperlink"/>
@@ -2466,7 +2466,7 @@
       <w:r>
         <w:t xml:space="preserve"> — créé — </w:t>
       </w:r>
-      <w:hyperlink w:history="1" r:id="rIdqdscxzz-dqqlk-dyznhub">
+      <w:hyperlink w:history="1" r:id="rIdj_joqbnaasn8zqzdj6-xk">
         <w:r>
           <w:rPr>
             <w:rStyle w:val="Hyperlink"/>
@@ -2495,7 +2495,7 @@
       <w:r>
         <w:t xml:space="preserve"> — créé — </w:t>
       </w:r>
-      <w:hyperlink w:history="1" r:id="rIdccewyxbjus3widttnp2fl">
+      <w:hyperlink w:history="1" r:id="rIdbjytvmhy_egcqfyz9z0u3">
         <w:r>
           <w:rPr>
             <w:rStyle w:val="Hyperlink"/>
@@ -2524,7 +2524,7 @@
       <w:r>
         <w:t xml:space="preserve"> — créé — </w:t>
       </w:r>
-      <w:hyperlink w:history="1" r:id="rIdqfciqbdcii7w2e9efzk_m">
+      <w:hyperlink w:history="1" r:id="rIdmxth4vl3m0dlzsdah3q96">
         <w:r>
           <w:rPr>
             <w:rStyle w:val="Hyperlink"/>
@@ -2553,7 +2553,7 @@
       <w:r>
         <w:t xml:space="preserve"> — créé — </w:t>
       </w:r>
-      <w:hyperlink w:history="1" r:id="rIdojetvuv3zw51bytr0sstu">
+      <w:hyperlink w:history="1" r:id="rIdwggamjxipy-lnn4au4bx0">
         <w:r>
           <w:rPr>
             <w:rStyle w:val="Hyperlink"/>
@@ -2582,7 +2582,7 @@
       <w:r>
         <w:t xml:space="preserve"> — créé — </w:t>
       </w:r>
-      <w:hyperlink w:history="1" r:id="rIdaka2vuaol9ort7-k644dm">
+      <w:hyperlink w:history="1" r:id="rIdxfnk7ci0qhez402wprq9y">
         <w:r>
           <w:rPr>
             <w:rStyle w:val="Hyperlink"/>
@@ -2611,7 +2611,7 @@
       <w:r>
         <w:t xml:space="preserve"> — créé — </w:t>
       </w:r>
-      <w:hyperlink w:history="1" r:id="rIdnmaojtpjxgmxwic4hquya">
+      <w:hyperlink w:history="1" r:id="rIdgpbbk0wauqwg0zo1ugusq">
         <w:r>
           <w:rPr>
             <w:rStyle w:val="Hyperlink"/>
@@ -2648,7 +2648,7 @@
       <w:r>
         <w:t xml:space="preserve"> — créé — </w:t>
       </w:r>
-      <w:hyperlink w:history="1" r:id="rIdamvoffsgdgd0iyp4fixxb">
+      <w:hyperlink w:history="1" r:id="rId7lly5rez3ig32o0nfahtc">
         <w:r>
           <w:rPr>
             <w:rStyle w:val="Hyperlink"/>
@@ -2677,7 +2677,7 @@
       <w:r>
         <w:t xml:space="preserve"> — créé — </w:t>
       </w:r>
-      <w:hyperlink w:history="1" r:id="rIdcxgixpewqjjj-n9g79wxi">
+      <w:hyperlink w:history="1" r:id="rIdqdmddhnsyydn86v13nqe1">
         <w:r>
           <w:rPr>
             <w:rStyle w:val="Hyperlink"/>
@@ -2706,7 +2706,7 @@
       <w:r>
         <w:t xml:space="preserve"> — créé — </w:t>
       </w:r>
-      <w:hyperlink w:history="1" r:id="rIdhaenve_dcokah1pbf1are">
+      <w:hyperlink w:history="1" r:id="rIdxvg3au8rjv_o8ba1hmisw">
         <w:r>
           <w:rPr>
             <w:rStyle w:val="Hyperlink"/>
@@ -2735,7 +2735,7 @@
       <w:r>
         <w:t xml:space="preserve"> — créé — </w:t>
       </w:r>
-      <w:hyperlink w:history="1" r:id="rId84_tifqlycsioezcxsvrz">
+      <w:hyperlink w:history="1" r:id="rIdm6zxgpinvgzpzfnhfn2fo">
         <w:r>
           <w:rPr>
             <w:rStyle w:val="Hyperlink"/>
@@ -2764,7 +2764,7 @@
       <w:r>
         <w:t xml:space="preserve"> — créé — </w:t>
       </w:r>
-      <w:hyperlink w:history="1" r:id="rIdjrkubuhfrsqcdshpdthb0">
+      <w:hyperlink w:history="1" r:id="rIdha1eqbez9uzhmn-meahrt">
         <w:r>
           <w:rPr>
             <w:rStyle w:val="Hyperlink"/>
@@ -2793,7 +2793,7 @@
       <w:r>
         <w:t xml:space="preserve"> — créé — </w:t>
       </w:r>
-      <w:hyperlink w:history="1" r:id="rIdkuraa7lvef2ycvn6yma3_">
+      <w:hyperlink w:history="1" r:id="rIdfgzs2r-xe_wptplghb28x">
         <w:r>
           <w:rPr>
             <w:rStyle w:val="Hyperlink"/>
@@ -2822,7 +2822,7 @@
       <w:r>
         <w:t xml:space="preserve"> — créé — </w:t>
       </w:r>
-      <w:hyperlink w:history="1" r:id="rIdxklihm4izcfg4rhu5ovm_">
+      <w:hyperlink w:history="1" r:id="rId87nugurw-ywhppijeaygn">
         <w:r>
           <w:rPr>
             <w:rStyle w:val="Hyperlink"/>
@@ -2851,7 +2851,7 @@
       <w:r>
         <w:t xml:space="preserve"> — créé — </w:t>
       </w:r>
-      <w:hyperlink w:history="1" r:id="rIdimfhws9eiu9lib6qud6cg">
+      <w:hyperlink w:history="1" r:id="rIdhw8r9mbrrjleznf8wzniw">
         <w:r>
           <w:rPr>
             <w:rStyle w:val="Hyperlink"/>

</xml_diff>

<commit_message>
Journal : phase 36 (bilan sur une période)
Co-Authored-By: Claude Opus 5.5 <noreply@anthropic.com>
</commit_message>
<xml_diff>
--- a/docs/developpement/phases/word/PHASE_00_SOCLE_DE_PRODUCTION_ET_CONFIGURATION_DUN_LIEU_VIDE.docx
+++ b/docs/developpement/phases/word/PHASE_00_SOCLE_DE_PRODUCTION_ET_CONFIGURATION_DUN_LIEU_VIDE.docx
@@ -20,7 +20,7 @@
       <w:r>
         <w:t xml:space="preserve">FlaiX Expert · dossier de développement · généré le 2026-10-04 depuis le dépôt </w:t>
       </w:r>
-      <w:hyperlink w:history="1" r:id="rIdd5qjsdm0lelgkvdeax5yk">
+      <w:hyperlink w:history="1" r:id="rIdzyz_mfpkgldihm9aoqqkp">
         <w:r>
           <w:rPr>
             <w:rStyle w:val="Hyperlink"/>
@@ -592,7 +592,7 @@
           <w:numId w:val="3"/>
         </w:numPr>
       </w:pPr>
-      <w:hyperlink w:history="1" r:id="rIdp5p0rhuwar0fdzkbb4vj_">
+      <w:hyperlink w:history="1" r:id="rIdugqkijr7zylgb8h8sy6jm">
         <w:r>
           <w:rPr>
             <w:rStyle w:val="Hyperlink"/>
@@ -612,7 +612,7 @@
           <w:numId w:val="3"/>
         </w:numPr>
       </w:pPr>
-      <w:hyperlink w:history="1" r:id="rIdjvxnjhztvahtizh1pap74">
+      <w:hyperlink w:history="1" r:id="rIdlygn3bkkenjud1htwhzde">
         <w:r>
           <w:rPr>
             <w:rStyle w:val="Hyperlink"/>
@@ -660,7 +660,7 @@
       <w:r>
         <w:t xml:space="preserve"> — créé — </w:t>
       </w:r>
-      <w:hyperlink w:history="1" r:id="rIdljwlwxgiqexuli1sbunwb">
+      <w:hyperlink w:history="1" r:id="rIdqrj5a2th98tbyu7ihkso2">
         <w:r>
           <w:rPr>
             <w:rStyle w:val="Hyperlink"/>
@@ -689,7 +689,7 @@
       <w:r>
         <w:t xml:space="preserve"> — créé — </w:t>
       </w:r>
-      <w:hyperlink w:history="1" r:id="rId2z5ueb7rsmeubawea4nd3">
+      <w:hyperlink w:history="1" r:id="rIdmm4wd0qshu6h-lq9jh593">
         <w:r>
           <w:rPr>
             <w:rStyle w:val="Hyperlink"/>
@@ -726,7 +726,7 @@
       <w:r>
         <w:t xml:space="preserve"> — créé — </w:t>
       </w:r>
-      <w:hyperlink w:history="1" r:id="rIdtqkbnejgsw81n7jjh3kju">
+      <w:hyperlink w:history="1" r:id="rIdahxmstabwl19y-5nr_qgl">
         <w:r>
           <w:rPr>
             <w:rStyle w:val="Hyperlink"/>
@@ -755,7 +755,7 @@
       <w:r>
         <w:t xml:space="preserve"> — créé — </w:t>
       </w:r>
-      <w:hyperlink w:history="1" r:id="rIdvrpolv_p4k-k5n8b6olyg">
+      <w:hyperlink w:history="1" r:id="rIdk7goc5mu6m2ws9o6sxkyn">
         <w:r>
           <w:rPr>
             <w:rStyle w:val="Hyperlink"/>
@@ -784,7 +784,7 @@
       <w:r>
         <w:t xml:space="preserve"> — créé — </w:t>
       </w:r>
-      <w:hyperlink w:history="1" r:id="rId4uibywa8r13z3vkzd8htt">
+      <w:hyperlink w:history="1" r:id="rId7af9reiaqmjmynl4-t01a">
         <w:r>
           <w:rPr>
             <w:rStyle w:val="Hyperlink"/>
@@ -813,7 +813,7 @@
       <w:r>
         <w:t xml:space="preserve"> — créé — </w:t>
       </w:r>
-      <w:hyperlink w:history="1" r:id="rIdu96-6ttuwpkjgzwjdqpzs">
+      <w:hyperlink w:history="1" r:id="rIdeaj5ynbjeay5gtuw9oa90">
         <w:r>
           <w:rPr>
             <w:rStyle w:val="Hyperlink"/>
@@ -842,7 +842,7 @@
       <w:r>
         <w:t xml:space="preserve"> — créé — </w:t>
       </w:r>
-      <w:hyperlink w:history="1" r:id="rIdhm7qxglaj9jq_qmnpv4ut">
+      <w:hyperlink w:history="1" r:id="rIdicfx-ppnh_j2p3j-zo42r">
         <w:r>
           <w:rPr>
             <w:rStyle w:val="Hyperlink"/>
@@ -879,7 +879,7 @@
       <w:r>
         <w:t xml:space="preserve"> — créé — </w:t>
       </w:r>
-      <w:hyperlink w:history="1" r:id="rIdzo-woqnf-ammx7bki1blb">
+      <w:hyperlink w:history="1" r:id="rIdsdcaszsb_ucqed2tzqyuu">
         <w:r>
           <w:rPr>
             <w:rStyle w:val="Hyperlink"/>
@@ -908,7 +908,7 @@
       <w:r>
         <w:t xml:space="preserve"> — créé — </w:t>
       </w:r>
-      <w:hyperlink w:history="1" r:id="rIdmozkjmpfcxirgcihr-afe">
+      <w:hyperlink w:history="1" r:id="rIdimmcg6glqvr01pzqdeuzr">
         <w:r>
           <w:rPr>
             <w:rStyle w:val="Hyperlink"/>
@@ -937,7 +937,7 @@
       <w:r>
         <w:t xml:space="preserve"> — créé — </w:t>
       </w:r>
-      <w:hyperlink w:history="1" r:id="rIdxiqaetlh11ypzhq4trtu4">
+      <w:hyperlink w:history="1" r:id="rIdthoe7i8ansjfmrng0d5ix">
         <w:r>
           <w:rPr>
             <w:rStyle w:val="Hyperlink"/>
@@ -966,7 +966,7 @@
       <w:r>
         <w:t xml:space="preserve"> — créé — </w:t>
       </w:r>
-      <w:hyperlink w:history="1" r:id="rIdx0woksdpf14ttactkvpnf">
+      <w:hyperlink w:history="1" r:id="rIdnwet9lerzg-ljhu96dsge">
         <w:r>
           <w:rPr>
             <w:rStyle w:val="Hyperlink"/>
@@ -995,7 +995,7 @@
       <w:r>
         <w:t xml:space="preserve"> — créé — </w:t>
       </w:r>
-      <w:hyperlink w:history="1" r:id="rId7cjwvvtc8vbij-ivqp6ke">
+      <w:hyperlink w:history="1" r:id="rIddwloz_d23sgjghnf14qpu">
         <w:r>
           <w:rPr>
             <w:rStyle w:val="Hyperlink"/>
@@ -1024,7 +1024,7 @@
       <w:r>
         <w:t xml:space="preserve"> — créé — </w:t>
       </w:r>
-      <w:hyperlink w:history="1" r:id="rIdy2kzj_l9c1_-iighbreis">
+      <w:hyperlink w:history="1" r:id="rIdpdefbmy_rcmlcywkal5rh">
         <w:r>
           <w:rPr>
             <w:rStyle w:val="Hyperlink"/>
@@ -1053,7 +1053,7 @@
       <w:r>
         <w:t xml:space="preserve"> — créé — </w:t>
       </w:r>
-      <w:hyperlink w:history="1" r:id="rIdbvqnar1jasopi65b3fykc">
+      <w:hyperlink w:history="1" r:id="rIde08dh0dcbh1jibjdponcy">
         <w:r>
           <w:rPr>
             <w:rStyle w:val="Hyperlink"/>
@@ -1082,7 +1082,7 @@
       <w:r>
         <w:t xml:space="preserve"> — créé — </w:t>
       </w:r>
-      <w:hyperlink w:history="1" r:id="rIdxg8ydiytxh5g6v1crd0-m">
+      <w:hyperlink w:history="1" r:id="rId53dv1q0nsyrluc_n66vwi">
         <w:r>
           <w:rPr>
             <w:rStyle w:val="Hyperlink"/>
@@ -1111,7 +1111,7 @@
       <w:r>
         <w:t xml:space="preserve"> — créé — </w:t>
       </w:r>
-      <w:hyperlink w:history="1" r:id="rIdik4ybiqkc0erthphgxqau">
+      <w:hyperlink w:history="1" r:id="rIdjjie6lwe9pdgxusar5fi5">
         <w:r>
           <w:rPr>
             <w:rStyle w:val="Hyperlink"/>
@@ -1148,7 +1148,7 @@
       <w:r>
         <w:t xml:space="preserve"> — créé — </w:t>
       </w:r>
-      <w:hyperlink w:history="1" r:id="rIdzpi8vy2nb3jzzr-0dockc">
+      <w:hyperlink w:history="1" r:id="rIdqx8s-c-vpjinmfzqh74mf">
         <w:r>
           <w:rPr>
             <w:rStyle w:val="Hyperlink"/>
@@ -1177,7 +1177,7 @@
       <w:r>
         <w:t xml:space="preserve"> — créé — </w:t>
       </w:r>
-      <w:hyperlink w:history="1" r:id="rId0pbun3v9lm9ki4dxrdoxv">
+      <w:hyperlink w:history="1" r:id="rIdawri8oejjzqjgqm1aqjcp">
         <w:r>
           <w:rPr>
             <w:rStyle w:val="Hyperlink"/>
@@ -1206,7 +1206,7 @@
       <w:r>
         <w:t xml:space="preserve"> — créé — </w:t>
       </w:r>
-      <w:hyperlink w:history="1" r:id="rIdazmzzcywcm3y4dwpzenh7">
+      <w:hyperlink w:history="1" r:id="rIdhmclmtf7a1cwhlda3gzxo">
         <w:r>
           <w:rPr>
             <w:rStyle w:val="Hyperlink"/>
@@ -1235,7 +1235,7 @@
       <w:r>
         <w:t xml:space="preserve"> — créé — </w:t>
       </w:r>
-      <w:hyperlink w:history="1" r:id="rId8lx2yloiyaf-jzukayvqt">
+      <w:hyperlink w:history="1" r:id="rIdihjpxg6uymf9monuww1ks">
         <w:r>
           <w:rPr>
             <w:rStyle w:val="Hyperlink"/>
@@ -1264,7 +1264,7 @@
       <w:r>
         <w:t xml:space="preserve"> — créé — </w:t>
       </w:r>
-      <w:hyperlink w:history="1" r:id="rIdqanwjzgeirtammnzxxc-n">
+      <w:hyperlink w:history="1" r:id="rIdkuzhk6rtj4547iet_tvs7">
         <w:r>
           <w:rPr>
             <w:rStyle w:val="Hyperlink"/>
@@ -1293,7 +1293,7 @@
       <w:r>
         <w:t xml:space="preserve"> — créé — </w:t>
       </w:r>
-      <w:hyperlink w:history="1" r:id="rIdzthllcsotj8zvck39da0z">
+      <w:hyperlink w:history="1" r:id="rIdwvwnof-9hxjrez6dvqhnn">
         <w:r>
           <w:rPr>
             <w:rStyle w:val="Hyperlink"/>
@@ -1322,7 +1322,7 @@
       <w:r>
         <w:t xml:space="preserve"> — créé — </w:t>
       </w:r>
-      <w:hyperlink w:history="1" r:id="rIdasx30jlcdhgkbiz2jwdze">
+      <w:hyperlink w:history="1" r:id="rIdjtegsvhz00-ya_t-dpvx5">
         <w:r>
           <w:rPr>
             <w:rStyle w:val="Hyperlink"/>
@@ -1351,7 +1351,7 @@
       <w:r>
         <w:t xml:space="preserve"> — créé — </w:t>
       </w:r>
-      <w:hyperlink w:history="1" r:id="rIdhwrd0y4rujargraw3ghm-">
+      <w:hyperlink w:history="1" r:id="rId_dhn0ho6cxzmkbpagkxa7">
         <w:r>
           <w:rPr>
             <w:rStyle w:val="Hyperlink"/>
@@ -1380,7 +1380,7 @@
       <w:r>
         <w:t xml:space="preserve"> — créé — </w:t>
       </w:r>
-      <w:hyperlink w:history="1" r:id="rId8pqmy0acyp0buqztocqb5">
+      <w:hyperlink w:history="1" r:id="rIdz01n_rhsqzug5jf8ydmcq">
         <w:r>
           <w:rPr>
             <w:rStyle w:val="Hyperlink"/>
@@ -1409,7 +1409,7 @@
       <w:r>
         <w:t xml:space="preserve"> — créé — </w:t>
       </w:r>
-      <w:hyperlink w:history="1" r:id="rIdmgwpgsclthyw-c-ti7rig">
+      <w:hyperlink w:history="1" r:id="rIdh-q2zezfrmyyk_9zsxk6-">
         <w:r>
           <w:rPr>
             <w:rStyle w:val="Hyperlink"/>
@@ -1438,7 +1438,7 @@
       <w:r>
         <w:t xml:space="preserve"> — créé — </w:t>
       </w:r>
-      <w:hyperlink w:history="1" r:id="rIdm2hxukuvalpih4ztb0ubf">
+      <w:hyperlink w:history="1" r:id="rIdt2wrgsppjts7uqlcvmrhf">
         <w:r>
           <w:rPr>
             <w:rStyle w:val="Hyperlink"/>
@@ -1467,7 +1467,7 @@
       <w:r>
         <w:t xml:space="preserve"> — créé — </w:t>
       </w:r>
-      <w:hyperlink w:history="1" r:id="rIddmm3mzi3flliqv404qrkh">
+      <w:hyperlink w:history="1" r:id="rId6eii46amdktfqdfihq2ra">
         <w:r>
           <w:rPr>
             <w:rStyle w:val="Hyperlink"/>
@@ -1496,7 +1496,7 @@
       <w:r>
         <w:t xml:space="preserve"> — créé — </w:t>
       </w:r>
-      <w:hyperlink w:history="1" r:id="rId6wzjbu-seqxvvly0ukq1b">
+      <w:hyperlink w:history="1" r:id="rIdkxvyytkzyz40z70ezxnko">
         <w:r>
           <w:rPr>
             <w:rStyle w:val="Hyperlink"/>
@@ -1525,7 +1525,7 @@
       <w:r>
         <w:t xml:space="preserve"> — créé — </w:t>
       </w:r>
-      <w:hyperlink w:history="1" r:id="rIdzyjjjgld5knmbgibk2jhz">
+      <w:hyperlink w:history="1" r:id="rIddxlx5e_f5kpywfyyq2kob">
         <w:r>
           <w:rPr>
             <w:rStyle w:val="Hyperlink"/>
@@ -1554,7 +1554,7 @@
       <w:r>
         <w:t xml:space="preserve"> — créé — </w:t>
       </w:r>
-      <w:hyperlink w:history="1" r:id="rIdtdtigi0qywleotlq13ymd">
+      <w:hyperlink w:history="1" r:id="rIdgw64tuwgo4vqtfzljlnhh">
         <w:r>
           <w:rPr>
             <w:rStyle w:val="Hyperlink"/>
@@ -1583,7 +1583,7 @@
       <w:r>
         <w:t xml:space="preserve"> — créé — </w:t>
       </w:r>
-      <w:hyperlink w:history="1" r:id="rIdsnwa-pj3zggegvsoiftuu">
+      <w:hyperlink w:history="1" r:id="rIdaco6ncrcdoythzxdshseu">
         <w:r>
           <w:rPr>
             <w:rStyle w:val="Hyperlink"/>
@@ -1612,7 +1612,7 @@
       <w:r>
         <w:t xml:space="preserve"> — créé — </w:t>
       </w:r>
-      <w:hyperlink w:history="1" r:id="rIdk-ess5bqmk4xqoz5fdzdx">
+      <w:hyperlink w:history="1" r:id="rIdizt-p0kbpdqpnuuadrx41">
         <w:r>
           <w:rPr>
             <w:rStyle w:val="Hyperlink"/>
@@ -1641,7 +1641,7 @@
       <w:r>
         <w:t xml:space="preserve"> — créé — </w:t>
       </w:r>
-      <w:hyperlink w:history="1" r:id="rId-ukekkteuqdmsr_a_rhhw">
+      <w:hyperlink w:history="1" r:id="rId1ibjgxtn_qxc8yw1cxeod">
         <w:r>
           <w:rPr>
             <w:rStyle w:val="Hyperlink"/>
@@ -1670,7 +1670,7 @@
       <w:r>
         <w:t xml:space="preserve"> — créé — </w:t>
       </w:r>
-      <w:hyperlink w:history="1" r:id="rIdusosdinc0v0whapf-1ocv">
+      <w:hyperlink w:history="1" r:id="rIdkbbk1g7ln8ebowfcmj6e-">
         <w:r>
           <w:rPr>
             <w:rStyle w:val="Hyperlink"/>
@@ -1699,7 +1699,7 @@
       <w:r>
         <w:t xml:space="preserve"> — créé — </w:t>
       </w:r>
-      <w:hyperlink w:history="1" r:id="rId7o6qx_srelk_5tvcgbtmq">
+      <w:hyperlink w:history="1" r:id="rIddoxqnpjj2xf9lmbhqtank">
         <w:r>
           <w:rPr>
             <w:rStyle w:val="Hyperlink"/>
@@ -1728,7 +1728,7 @@
       <w:r>
         <w:t xml:space="preserve"> — créé — </w:t>
       </w:r>
-      <w:hyperlink w:history="1" r:id="rIdra8fcyzldpoob_q0psnln">
+      <w:hyperlink w:history="1" r:id="rIdte5bwgbq6unq4wm7mrjcb">
         <w:r>
           <w:rPr>
             <w:rStyle w:val="Hyperlink"/>
@@ -1757,7 +1757,7 @@
       <w:r>
         <w:t xml:space="preserve"> — créé — </w:t>
       </w:r>
-      <w:hyperlink w:history="1" r:id="rIdyi-ei5qd6w5a1-qe_epm9">
+      <w:hyperlink w:history="1" r:id="rIde_ikczqufnzwbxwyabwvr">
         <w:r>
           <w:rPr>
             <w:rStyle w:val="Hyperlink"/>
@@ -1786,7 +1786,7 @@
       <w:r>
         <w:t xml:space="preserve"> — créé — </w:t>
       </w:r>
-      <w:hyperlink w:history="1" r:id="rIdm8tm0sz3_pjvdsortdf3q">
+      <w:hyperlink w:history="1" r:id="rIdi_d8ba1jdvvx_lhzlnw7u">
         <w:r>
           <w:rPr>
             <w:rStyle w:val="Hyperlink"/>
@@ -1823,7 +1823,7 @@
       <w:r>
         <w:t xml:space="preserve"> — créé — </w:t>
       </w:r>
-      <w:hyperlink w:history="1" r:id="rIdmv-vxjnptizwqlqn5vthm">
+      <w:hyperlink w:history="1" r:id="rId-ol1vj-97vsoext7kd6ra">
         <w:r>
           <w:rPr>
             <w:rStyle w:val="Hyperlink"/>
@@ -1852,7 +1852,7 @@
       <w:r>
         <w:t xml:space="preserve"> — créé — </w:t>
       </w:r>
-      <w:hyperlink w:history="1" r:id="rIdbfhawkr87ot7x_tfow5w4">
+      <w:hyperlink w:history="1" r:id="rId7gkco4tffg7anuhpz3yms">
         <w:r>
           <w:rPr>
             <w:rStyle w:val="Hyperlink"/>
@@ -1881,7 +1881,7 @@
       <w:r>
         <w:t xml:space="preserve"> — créé — </w:t>
       </w:r>
-      <w:hyperlink w:history="1" r:id="rIdpw9-ug28p8ids18fezcjw">
+      <w:hyperlink w:history="1" r:id="rIdbhyyrqac8ixxhpzjvxdig">
         <w:r>
           <w:rPr>
             <w:rStyle w:val="Hyperlink"/>
@@ -1910,7 +1910,7 @@
       <w:r>
         <w:t xml:space="preserve"> — créé — </w:t>
       </w:r>
-      <w:hyperlink w:history="1" r:id="rId2kmsbr8vjsizhpuxkexzs">
+      <w:hyperlink w:history="1" r:id="rIdwdfbfmd2xugfuojcmdflr">
         <w:r>
           <w:rPr>
             <w:rStyle w:val="Hyperlink"/>
@@ -1939,7 +1939,7 @@
       <w:r>
         <w:t xml:space="preserve"> — créé — </w:t>
       </w:r>
-      <w:hyperlink w:history="1" r:id="rIdvmm_gpvkqkgr1k7uyusaw">
+      <w:hyperlink w:history="1" r:id="rIdxvoplrasrhf3eqi8kc9ug">
         <w:r>
           <w:rPr>
             <w:rStyle w:val="Hyperlink"/>
@@ -1968,7 +1968,7 @@
       <w:r>
         <w:t xml:space="preserve"> — créé — </w:t>
       </w:r>
-      <w:hyperlink w:history="1" r:id="rIdestolk6vbwb1sokan_xav">
+      <w:hyperlink w:history="1" r:id="rIdojnzht1-akzoownr1dnjf">
         <w:r>
           <w:rPr>
             <w:rStyle w:val="Hyperlink"/>
@@ -1997,7 +1997,7 @@
       <w:r>
         <w:t xml:space="preserve"> — créé — </w:t>
       </w:r>
-      <w:hyperlink w:history="1" r:id="rIdj8byxqsjdmbhdndrcbfb-">
+      <w:hyperlink w:history="1" r:id="rIdqpza4tjv55tqcn0mm0sa8">
         <w:r>
           <w:rPr>
             <w:rStyle w:val="Hyperlink"/>
@@ -2026,7 +2026,7 @@
       <w:r>
         <w:t xml:space="preserve"> — créé — </w:t>
       </w:r>
-      <w:hyperlink w:history="1" r:id="rIdnq9pho8v5dfqw2llxroyk">
+      <w:hyperlink w:history="1" r:id="rIdm6r2ue0xlj2rs-qkduodx">
         <w:r>
           <w:rPr>
             <w:rStyle w:val="Hyperlink"/>
@@ -2139,7 +2139,7 @@
       <w:r>
         <w:t xml:space="preserve"> — créé — </w:t>
       </w:r>
-      <w:hyperlink w:history="1" r:id="rIdrinct7zhrcdvmkco8uu_b">
+      <w:hyperlink w:history="1" r:id="rIdzsngmp1nrkvrfrvacs9cc">
         <w:r>
           <w:rPr>
             <w:rStyle w:val="Hyperlink"/>
@@ -2189,7 +2189,7 @@
       <w:r>
         <w:t xml:space="preserve"> — créé — </w:t>
       </w:r>
-      <w:hyperlink w:history="1" r:id="rIdbjbbqarl3zv3lz6rr_8jw">
+      <w:hyperlink w:history="1" r:id="rIdjt6xdabwdoq75ipsamhtb">
         <w:r>
           <w:rPr>
             <w:rStyle w:val="Hyperlink"/>
@@ -2218,7 +2218,7 @@
       <w:r>
         <w:t xml:space="preserve"> — créé — </w:t>
       </w:r>
-      <w:hyperlink w:history="1" r:id="rIdag9kfwcvcj0gd-96d-q9v">
+      <w:hyperlink w:history="1" r:id="rIdvh_ayoli36f8jcv91rvfe">
         <w:r>
           <w:rPr>
             <w:rStyle w:val="Hyperlink"/>
@@ -2247,7 +2247,7 @@
       <w:r>
         <w:t xml:space="preserve"> — créé — </w:t>
       </w:r>
-      <w:hyperlink w:history="1" r:id="rIdxdmqdpv5cnf4vukys7v47">
+      <w:hyperlink w:history="1" r:id="rId1vekzheb_7p2-xxeglt3j">
         <w:r>
           <w:rPr>
             <w:rStyle w:val="Hyperlink"/>
@@ -2276,7 +2276,7 @@
       <w:r>
         <w:t xml:space="preserve"> — créé — </w:t>
       </w:r>
-      <w:hyperlink w:history="1" r:id="rId10glmmdjuvoer6gptpqhh">
+      <w:hyperlink w:history="1" r:id="rIdwcgn733vouyxgrxfakx-r">
         <w:r>
           <w:rPr>
             <w:rStyle w:val="Hyperlink"/>
@@ -2313,7 +2313,7 @@
       <w:r>
         <w:t xml:space="preserve"> — créé — </w:t>
       </w:r>
-      <w:hyperlink w:history="1" r:id="rIdkc0o60xpgtcjobjpht7gy">
+      <w:hyperlink w:history="1" r:id="rIdjiopxq9p9-znpqvnkkekv">
         <w:r>
           <w:rPr>
             <w:rStyle w:val="Hyperlink"/>
@@ -2342,7 +2342,7 @@
       <w:r>
         <w:t xml:space="preserve"> — créé — </w:t>
       </w:r>
-      <w:hyperlink w:history="1" r:id="rIdqwfxqgx8rrx2dm_tooyef">
+      <w:hyperlink w:history="1" r:id="rId481oqgmbob0agp-cgh2he">
         <w:r>
           <w:rPr>
             <w:rStyle w:val="Hyperlink"/>
@@ -2379,7 +2379,7 @@
       <w:r>
         <w:t xml:space="preserve"> — créé — </w:t>
       </w:r>
-      <w:hyperlink w:history="1" r:id="rIdshkq0fs5rz9mq9ykrw2qh">
+      <w:hyperlink w:history="1" r:id="rIdd5snzkvfwckzie297zc8l">
         <w:r>
           <w:rPr>
             <w:rStyle w:val="Hyperlink"/>
@@ -2408,7 +2408,7 @@
       <w:r>
         <w:t xml:space="preserve"> — créé — </w:t>
       </w:r>
-      <w:hyperlink w:history="1" r:id="rId9irhbjlvpawoxuyraxpto">
+      <w:hyperlink w:history="1" r:id="rIdnspbfdfnyumt5fvirzp77">
         <w:r>
           <w:rPr>
             <w:rStyle w:val="Hyperlink"/>
@@ -2437,7 +2437,7 @@
       <w:r>
         <w:t xml:space="preserve"> — créé — </w:t>
       </w:r>
-      <w:hyperlink w:history="1" r:id="rId7nczpvw--a3y1dewj8u_p">
+      <w:hyperlink w:history="1" r:id="rIdsiqi10d4fy9rfp7gaknbo">
         <w:r>
           <w:rPr>
             <w:rStyle w:val="Hyperlink"/>
@@ -2466,7 +2466,7 @@
       <w:r>
         <w:t xml:space="preserve"> — créé — </w:t>
       </w:r>
-      <w:hyperlink w:history="1" r:id="rIdj_joqbnaasn8zqzdj6-xk">
+      <w:hyperlink w:history="1" r:id="rIdat5g8-twlpig8bw19lovz">
         <w:r>
           <w:rPr>
             <w:rStyle w:val="Hyperlink"/>
@@ -2495,7 +2495,7 @@
       <w:r>
         <w:t xml:space="preserve"> — créé — </w:t>
       </w:r>
-      <w:hyperlink w:history="1" r:id="rIdbjytvmhy_egcqfyz9z0u3">
+      <w:hyperlink w:history="1" r:id="rIdrbrw1zhqm8_mxznigi-bn">
         <w:r>
           <w:rPr>
             <w:rStyle w:val="Hyperlink"/>
@@ -2524,7 +2524,7 @@
       <w:r>
         <w:t xml:space="preserve"> — créé — </w:t>
       </w:r>
-      <w:hyperlink w:history="1" r:id="rIdmxth4vl3m0dlzsdah3q96">
+      <w:hyperlink w:history="1" r:id="rIdu2e0t8v2tkjcgljq0_mep">
         <w:r>
           <w:rPr>
             <w:rStyle w:val="Hyperlink"/>
@@ -2553,7 +2553,7 @@
       <w:r>
         <w:t xml:space="preserve"> — créé — </w:t>
       </w:r>
-      <w:hyperlink w:history="1" r:id="rIdwggamjxipy-lnn4au4bx0">
+      <w:hyperlink w:history="1" r:id="rIdonhdxjy2zvpthjmbnwck6">
         <w:r>
           <w:rPr>
             <w:rStyle w:val="Hyperlink"/>
@@ -2582,7 +2582,7 @@
       <w:r>
         <w:t xml:space="preserve"> — créé — </w:t>
       </w:r>
-      <w:hyperlink w:history="1" r:id="rIdxfnk7ci0qhez402wprq9y">
+      <w:hyperlink w:history="1" r:id="rId4zwwgnp7xecncalcbrltm">
         <w:r>
           <w:rPr>
             <w:rStyle w:val="Hyperlink"/>
@@ -2611,7 +2611,7 @@
       <w:r>
         <w:t xml:space="preserve"> — créé — </w:t>
       </w:r>
-      <w:hyperlink w:history="1" r:id="rIdgpbbk0wauqwg0zo1ugusq">
+      <w:hyperlink w:history="1" r:id="rIdw9bbtnkeiujhz4gnxis1a">
         <w:r>
           <w:rPr>
             <w:rStyle w:val="Hyperlink"/>
@@ -2648,7 +2648,7 @@
       <w:r>
         <w:t xml:space="preserve"> — créé — </w:t>
       </w:r>
-      <w:hyperlink w:history="1" r:id="rId7lly5rez3ig32o0nfahtc">
+      <w:hyperlink w:history="1" r:id="rId5wts280912ulstjljuqyz">
         <w:r>
           <w:rPr>
             <w:rStyle w:val="Hyperlink"/>
@@ -2677,7 +2677,7 @@
       <w:r>
         <w:t xml:space="preserve"> — créé — </w:t>
       </w:r>
-      <w:hyperlink w:history="1" r:id="rIdqdmddhnsyydn86v13nqe1">
+      <w:hyperlink w:history="1" r:id="rId-rhekkn-2_cigmry7m8i1">
         <w:r>
           <w:rPr>
             <w:rStyle w:val="Hyperlink"/>
@@ -2706,7 +2706,7 @@
       <w:r>
         <w:t xml:space="preserve"> — créé — </w:t>
       </w:r>
-      <w:hyperlink w:history="1" r:id="rIdxvg3au8rjv_o8ba1hmisw">
+      <w:hyperlink w:history="1" r:id="rId5tkuxdr42fb3poskl8kp7">
         <w:r>
           <w:rPr>
             <w:rStyle w:val="Hyperlink"/>
@@ -2735,7 +2735,7 @@
       <w:r>
         <w:t xml:space="preserve"> — créé — </w:t>
       </w:r>
-      <w:hyperlink w:history="1" r:id="rIdm6zxgpinvgzpzfnhfn2fo">
+      <w:hyperlink w:history="1" r:id="rIdg0sjcrl1lyj4ljxnc2qup">
         <w:r>
           <w:rPr>
             <w:rStyle w:val="Hyperlink"/>
@@ -2764,7 +2764,7 @@
       <w:r>
         <w:t xml:space="preserve"> — créé — </w:t>
       </w:r>
-      <w:hyperlink w:history="1" r:id="rIdha1eqbez9uzhmn-meahrt">
+      <w:hyperlink w:history="1" r:id="rIdt4caegw-zsq2iwtk8nol6">
         <w:r>
           <w:rPr>
             <w:rStyle w:val="Hyperlink"/>
@@ -2793,7 +2793,7 @@
       <w:r>
         <w:t xml:space="preserve"> — créé — </w:t>
       </w:r>
-      <w:hyperlink w:history="1" r:id="rIdfgzs2r-xe_wptplghb28x">
+      <w:hyperlink w:history="1" r:id="rIdqeciigmhmp3oac5z82ikc">
         <w:r>
           <w:rPr>
             <w:rStyle w:val="Hyperlink"/>
@@ -2822,7 +2822,7 @@
       <w:r>
         <w:t xml:space="preserve"> — créé — </w:t>
       </w:r>
-      <w:hyperlink w:history="1" r:id="rId87nugurw-ywhppijeaygn">
+      <w:hyperlink w:history="1" r:id="rIdtd3n4balbhcfw5szbcgf9">
         <w:r>
           <w:rPr>
             <w:rStyle w:val="Hyperlink"/>
@@ -2851,7 +2851,7 @@
       <w:r>
         <w:t xml:space="preserve"> — créé — </w:t>
       </w:r>
-      <w:hyperlink w:history="1" r:id="rIdhw8r9mbrrjleznf8wzniw">
+      <w:hyperlink w:history="1" r:id="rIddetmtvzzxjxmbkmri08hx">
         <w:r>
           <w:rPr>
             <w:rStyle w:val="Hyperlink"/>

</xml_diff>

<commit_message>
Journal : phase 37 (brief de fin de soirée)
Co-Authored-By: Claude Opus 5.5 <noreply@anthropic.com>
</commit_message>
<xml_diff>
--- a/docs/developpement/phases/word/PHASE_00_SOCLE_DE_PRODUCTION_ET_CONFIGURATION_DUN_LIEU_VIDE.docx
+++ b/docs/developpement/phases/word/PHASE_00_SOCLE_DE_PRODUCTION_ET_CONFIGURATION_DUN_LIEU_VIDE.docx
@@ -20,7 +20,7 @@
       <w:r>
         <w:t xml:space="preserve">FlaiX Expert · dossier de développement · généré le 2026-10-04 depuis le dépôt </w:t>
       </w:r>
-      <w:hyperlink w:history="1" r:id="rIdzyz_mfpkgldihm9aoqqkp">
+      <w:hyperlink w:history="1" r:id="rIdtr1fobgvrxgxzkmhnrjkm">
         <w:r>
           <w:rPr>
             <w:rStyle w:val="Hyperlink"/>
@@ -592,7 +592,7 @@
           <w:numId w:val="3"/>
         </w:numPr>
       </w:pPr>
-      <w:hyperlink w:history="1" r:id="rIdugqkijr7zylgb8h8sy6jm">
+      <w:hyperlink w:history="1" r:id="rId7uffg8x-tn88mka1gjzsu">
         <w:r>
           <w:rPr>
             <w:rStyle w:val="Hyperlink"/>
@@ -612,7 +612,7 @@
           <w:numId w:val="3"/>
         </w:numPr>
       </w:pPr>
-      <w:hyperlink w:history="1" r:id="rIdlygn3bkkenjud1htwhzde">
+      <w:hyperlink w:history="1" r:id="rIdqept3ekkujemery4hxgmm">
         <w:r>
           <w:rPr>
             <w:rStyle w:val="Hyperlink"/>
@@ -660,7 +660,7 @@
       <w:r>
         <w:t xml:space="preserve"> — créé — </w:t>
       </w:r>
-      <w:hyperlink w:history="1" r:id="rIdqrj5a2th98tbyu7ihkso2">
+      <w:hyperlink w:history="1" r:id="rIdffta71uxh-3yvqdwpxvb7">
         <w:r>
           <w:rPr>
             <w:rStyle w:val="Hyperlink"/>
@@ -689,7 +689,7 @@
       <w:r>
         <w:t xml:space="preserve"> — créé — </w:t>
       </w:r>
-      <w:hyperlink w:history="1" r:id="rIdmm4wd0qshu6h-lq9jh593">
+      <w:hyperlink w:history="1" r:id="rIdrebcs_ozecr9wvajhgtsl">
         <w:r>
           <w:rPr>
             <w:rStyle w:val="Hyperlink"/>
@@ -726,7 +726,7 @@
       <w:r>
         <w:t xml:space="preserve"> — créé — </w:t>
       </w:r>
-      <w:hyperlink w:history="1" r:id="rIdahxmstabwl19y-5nr_qgl">
+      <w:hyperlink w:history="1" r:id="rIdnejknb9gzaptizmta6yzu">
         <w:r>
           <w:rPr>
             <w:rStyle w:val="Hyperlink"/>
@@ -755,7 +755,7 @@
       <w:r>
         <w:t xml:space="preserve"> — créé — </w:t>
       </w:r>
-      <w:hyperlink w:history="1" r:id="rIdk7goc5mu6m2ws9o6sxkyn">
+      <w:hyperlink w:history="1" r:id="rIdxmosxwrx5kk39wiylzrx3">
         <w:r>
           <w:rPr>
             <w:rStyle w:val="Hyperlink"/>
@@ -784,7 +784,7 @@
       <w:r>
         <w:t xml:space="preserve"> — créé — </w:t>
       </w:r>
-      <w:hyperlink w:history="1" r:id="rId7af9reiaqmjmynl4-t01a">
+      <w:hyperlink w:history="1" r:id="rIdcflsuxjffcumilarorlkg">
         <w:r>
           <w:rPr>
             <w:rStyle w:val="Hyperlink"/>
@@ -813,7 +813,7 @@
       <w:r>
         <w:t xml:space="preserve"> — créé — </w:t>
       </w:r>
-      <w:hyperlink w:history="1" r:id="rIdeaj5ynbjeay5gtuw9oa90">
+      <w:hyperlink w:history="1" r:id="rIdwwa3obf930f9pgakpr4lf">
         <w:r>
           <w:rPr>
             <w:rStyle w:val="Hyperlink"/>
@@ -842,7 +842,7 @@
       <w:r>
         <w:t xml:space="preserve"> — créé — </w:t>
       </w:r>
-      <w:hyperlink w:history="1" r:id="rIdicfx-ppnh_j2p3j-zo42r">
+      <w:hyperlink w:history="1" r:id="rIdhb1bm_kghsq958v6kkzxy">
         <w:r>
           <w:rPr>
             <w:rStyle w:val="Hyperlink"/>
@@ -879,7 +879,7 @@
       <w:r>
         <w:t xml:space="preserve"> — créé — </w:t>
       </w:r>
-      <w:hyperlink w:history="1" r:id="rIdsdcaszsb_ucqed2tzqyuu">
+      <w:hyperlink w:history="1" r:id="rIdscp5i4hgxhseoctblwla8">
         <w:r>
           <w:rPr>
             <w:rStyle w:val="Hyperlink"/>
@@ -908,7 +908,7 @@
       <w:r>
         <w:t xml:space="preserve"> — créé — </w:t>
       </w:r>
-      <w:hyperlink w:history="1" r:id="rIdimmcg6glqvr01pzqdeuzr">
+      <w:hyperlink w:history="1" r:id="rIdbfhmh3erljlsio-rsb7th">
         <w:r>
           <w:rPr>
             <w:rStyle w:val="Hyperlink"/>
@@ -937,7 +937,7 @@
       <w:r>
         <w:t xml:space="preserve"> — créé — </w:t>
       </w:r>
-      <w:hyperlink w:history="1" r:id="rIdthoe7i8ansjfmrng0d5ix">
+      <w:hyperlink w:history="1" r:id="rIdmdcboepx1qhbq0edj9hjh">
         <w:r>
           <w:rPr>
             <w:rStyle w:val="Hyperlink"/>
@@ -966,7 +966,7 @@
       <w:r>
         <w:t xml:space="preserve"> — créé — </w:t>
       </w:r>
-      <w:hyperlink w:history="1" r:id="rIdnwet9lerzg-ljhu96dsge">
+      <w:hyperlink w:history="1" r:id="rIdbaje_biqv899y5urhdvsl">
         <w:r>
           <w:rPr>
             <w:rStyle w:val="Hyperlink"/>
@@ -995,7 +995,7 @@
       <w:r>
         <w:t xml:space="preserve"> — créé — </w:t>
       </w:r>
-      <w:hyperlink w:history="1" r:id="rIddwloz_d23sgjghnf14qpu">
+      <w:hyperlink w:history="1" r:id="rId8tmn2upg5oqqq9mifjvnu">
         <w:r>
           <w:rPr>
             <w:rStyle w:val="Hyperlink"/>
@@ -1024,7 +1024,7 @@
       <w:r>
         <w:t xml:space="preserve"> — créé — </w:t>
       </w:r>
-      <w:hyperlink w:history="1" r:id="rIdpdefbmy_rcmlcywkal5rh">
+      <w:hyperlink w:history="1" r:id="rId6ybyfpyvwplc4lndp0fhn">
         <w:r>
           <w:rPr>
             <w:rStyle w:val="Hyperlink"/>
@@ -1053,7 +1053,7 @@
       <w:r>
         <w:t xml:space="preserve"> — créé — </w:t>
       </w:r>
-      <w:hyperlink w:history="1" r:id="rIde08dh0dcbh1jibjdponcy">
+      <w:hyperlink w:history="1" r:id="rIdfsedrqsvriklnedqxhn4l">
         <w:r>
           <w:rPr>
             <w:rStyle w:val="Hyperlink"/>
@@ -1082,7 +1082,7 @@
       <w:r>
         <w:t xml:space="preserve"> — créé — </w:t>
       </w:r>
-      <w:hyperlink w:history="1" r:id="rId53dv1q0nsyrluc_n66vwi">
+      <w:hyperlink w:history="1" r:id="rIdazydkj_hp-j0slc7jjwjm">
         <w:r>
           <w:rPr>
             <w:rStyle w:val="Hyperlink"/>
@@ -1111,7 +1111,7 @@
       <w:r>
         <w:t xml:space="preserve"> — créé — </w:t>
       </w:r>
-      <w:hyperlink w:history="1" r:id="rIdjjie6lwe9pdgxusar5fi5">
+      <w:hyperlink w:history="1" r:id="rIdkskaeztmjcwqrb_tagi22">
         <w:r>
           <w:rPr>
             <w:rStyle w:val="Hyperlink"/>
@@ -1148,7 +1148,7 @@
       <w:r>
         <w:t xml:space="preserve"> — créé — </w:t>
       </w:r>
-      <w:hyperlink w:history="1" r:id="rIdqx8s-c-vpjinmfzqh74mf">
+      <w:hyperlink w:history="1" r:id="rIdx1ljlywkrv--gdmvhauzd">
         <w:r>
           <w:rPr>
             <w:rStyle w:val="Hyperlink"/>
@@ -1177,7 +1177,7 @@
       <w:r>
         <w:t xml:space="preserve"> — créé — </w:t>
       </w:r>
-      <w:hyperlink w:history="1" r:id="rIdawri8oejjzqjgqm1aqjcp">
+      <w:hyperlink w:history="1" r:id="rIdw6q0jpxp56g80rfyowqot">
         <w:r>
           <w:rPr>
             <w:rStyle w:val="Hyperlink"/>
@@ -1206,7 +1206,7 @@
       <w:r>
         <w:t xml:space="preserve"> — créé — </w:t>
       </w:r>
-      <w:hyperlink w:history="1" r:id="rIdhmclmtf7a1cwhlda3gzxo">
+      <w:hyperlink w:history="1" r:id="rIdp8pv8hjniuya9xmazsrv9">
         <w:r>
           <w:rPr>
             <w:rStyle w:val="Hyperlink"/>
@@ -1235,7 +1235,7 @@
       <w:r>
         <w:t xml:space="preserve"> — créé — </w:t>
       </w:r>
-      <w:hyperlink w:history="1" r:id="rIdihjpxg6uymf9monuww1ks">
+      <w:hyperlink w:history="1" r:id="rIdhas59i01vaw36m0tsvuvk">
         <w:r>
           <w:rPr>
             <w:rStyle w:val="Hyperlink"/>
@@ -1264,7 +1264,7 @@
       <w:r>
         <w:t xml:space="preserve"> — créé — </w:t>
       </w:r>
-      <w:hyperlink w:history="1" r:id="rIdkuzhk6rtj4547iet_tvs7">
+      <w:hyperlink w:history="1" r:id="rId--1i38atehwui5s7lqf12">
         <w:r>
           <w:rPr>
             <w:rStyle w:val="Hyperlink"/>
@@ -1293,7 +1293,7 @@
       <w:r>
         <w:t xml:space="preserve"> — créé — </w:t>
       </w:r>
-      <w:hyperlink w:history="1" r:id="rIdwvwnof-9hxjrez6dvqhnn">
+      <w:hyperlink w:history="1" r:id="rIdlw9fwjjilzumyxv4jefc1">
         <w:r>
           <w:rPr>
             <w:rStyle w:val="Hyperlink"/>
@@ -1322,7 +1322,7 @@
       <w:r>
         <w:t xml:space="preserve"> — créé — </w:t>
       </w:r>
-      <w:hyperlink w:history="1" r:id="rIdjtegsvhz00-ya_t-dpvx5">
+      <w:hyperlink w:history="1" r:id="rIdcla1dzgq18hqzccy8wdyv">
         <w:r>
           <w:rPr>
             <w:rStyle w:val="Hyperlink"/>
@@ -1351,7 +1351,7 @@
       <w:r>
         <w:t xml:space="preserve"> — créé — </w:t>
       </w:r>
-      <w:hyperlink w:history="1" r:id="rId_dhn0ho6cxzmkbpagkxa7">
+      <w:hyperlink w:history="1" r:id="rIds7wdyqz9xh2zcnkp8r2mc">
         <w:r>
           <w:rPr>
             <w:rStyle w:val="Hyperlink"/>
@@ -1380,7 +1380,7 @@
       <w:r>
         <w:t xml:space="preserve"> — créé — </w:t>
       </w:r>
-      <w:hyperlink w:history="1" r:id="rIdz01n_rhsqzug5jf8ydmcq">
+      <w:hyperlink w:history="1" r:id="rIdoydd4uc0yh7-c2loqtcdx">
         <w:r>
           <w:rPr>
             <w:rStyle w:val="Hyperlink"/>
@@ -1409,7 +1409,7 @@
       <w:r>
         <w:t xml:space="preserve"> — créé — </w:t>
       </w:r>
-      <w:hyperlink w:history="1" r:id="rIdh-q2zezfrmyyk_9zsxk6-">
+      <w:hyperlink w:history="1" r:id="rId97bqslei02w0dwtzmsikh">
         <w:r>
           <w:rPr>
             <w:rStyle w:val="Hyperlink"/>
@@ -1438,7 +1438,7 @@
       <w:r>
         <w:t xml:space="preserve"> — créé — </w:t>
       </w:r>
-      <w:hyperlink w:history="1" r:id="rIdt2wrgsppjts7uqlcvmrhf">
+      <w:hyperlink w:history="1" r:id="rIdg2zsbsogos435x42ko5w1">
         <w:r>
           <w:rPr>
             <w:rStyle w:val="Hyperlink"/>
@@ -1467,7 +1467,7 @@
       <w:r>
         <w:t xml:space="preserve"> — créé — </w:t>
       </w:r>
-      <w:hyperlink w:history="1" r:id="rId6eii46amdktfqdfihq2ra">
+      <w:hyperlink w:history="1" r:id="rIdj2uimrnvacrxirkth9xke">
         <w:r>
           <w:rPr>
             <w:rStyle w:val="Hyperlink"/>
@@ -1496,7 +1496,7 @@
       <w:r>
         <w:t xml:space="preserve"> — créé — </w:t>
       </w:r>
-      <w:hyperlink w:history="1" r:id="rIdkxvyytkzyz40z70ezxnko">
+      <w:hyperlink w:history="1" r:id="rIdwku6wextifyc1klx1gjqm">
         <w:r>
           <w:rPr>
             <w:rStyle w:val="Hyperlink"/>
@@ -1525,7 +1525,7 @@
       <w:r>
         <w:t xml:space="preserve"> — créé — </w:t>
       </w:r>
-      <w:hyperlink w:history="1" r:id="rIddxlx5e_f5kpywfyyq2kob">
+      <w:hyperlink w:history="1" r:id="rIdyjcpxinadv-6i_ristnbh">
         <w:r>
           <w:rPr>
             <w:rStyle w:val="Hyperlink"/>
@@ -1554,7 +1554,7 @@
       <w:r>
         <w:t xml:space="preserve"> — créé — </w:t>
       </w:r>
-      <w:hyperlink w:history="1" r:id="rIdgw64tuwgo4vqtfzljlnhh">
+      <w:hyperlink w:history="1" r:id="rIdejiaiqexv46n5othwwxuv">
         <w:r>
           <w:rPr>
             <w:rStyle w:val="Hyperlink"/>
@@ -1583,7 +1583,7 @@
       <w:r>
         <w:t xml:space="preserve"> — créé — </w:t>
       </w:r>
-      <w:hyperlink w:history="1" r:id="rIdaco6ncrcdoythzxdshseu">
+      <w:hyperlink w:history="1" r:id="rIdiph6dosuajz1zgvdegt1i">
         <w:r>
           <w:rPr>
             <w:rStyle w:val="Hyperlink"/>
@@ -1612,7 +1612,7 @@
       <w:r>
         <w:t xml:space="preserve"> — créé — </w:t>
       </w:r>
-      <w:hyperlink w:history="1" r:id="rIdizt-p0kbpdqpnuuadrx41">
+      <w:hyperlink w:history="1" r:id="rIdht5b2bmtk1dxqoznnivxs">
         <w:r>
           <w:rPr>
             <w:rStyle w:val="Hyperlink"/>
@@ -1641,7 +1641,7 @@
       <w:r>
         <w:t xml:space="preserve"> — créé — </w:t>
       </w:r>
-      <w:hyperlink w:history="1" r:id="rId1ibjgxtn_qxc8yw1cxeod">
+      <w:hyperlink w:history="1" r:id="rId-pnlnb4r6xja9dqzgfblu">
         <w:r>
           <w:rPr>
             <w:rStyle w:val="Hyperlink"/>
@@ -1670,7 +1670,7 @@
       <w:r>
         <w:t xml:space="preserve"> — créé — </w:t>
       </w:r>
-      <w:hyperlink w:history="1" r:id="rIdkbbk1g7ln8ebowfcmj6e-">
+      <w:hyperlink w:history="1" r:id="rId393bilvsnfdxo_wm6mpsv">
         <w:r>
           <w:rPr>
             <w:rStyle w:val="Hyperlink"/>
@@ -1699,7 +1699,7 @@
       <w:r>
         <w:t xml:space="preserve"> — créé — </w:t>
       </w:r>
-      <w:hyperlink w:history="1" r:id="rIddoxqnpjj2xf9lmbhqtank">
+      <w:hyperlink w:history="1" r:id="rIdoccnkjfszbbapwivgp4hm">
         <w:r>
           <w:rPr>
             <w:rStyle w:val="Hyperlink"/>
@@ -1728,7 +1728,7 @@
       <w:r>
         <w:t xml:space="preserve"> — créé — </w:t>
       </w:r>
-      <w:hyperlink w:history="1" r:id="rIdte5bwgbq6unq4wm7mrjcb">
+      <w:hyperlink w:history="1" r:id="rIdmfjfvukwtixppzs6mdwia">
         <w:r>
           <w:rPr>
             <w:rStyle w:val="Hyperlink"/>
@@ -1757,7 +1757,7 @@
       <w:r>
         <w:t xml:space="preserve"> — créé — </w:t>
       </w:r>
-      <w:hyperlink w:history="1" r:id="rIde_ikczqufnzwbxwyabwvr">
+      <w:hyperlink w:history="1" r:id="rIdzjuqgulzm4a886sxq6whl">
         <w:r>
           <w:rPr>
             <w:rStyle w:val="Hyperlink"/>
@@ -1786,7 +1786,7 @@
       <w:r>
         <w:t xml:space="preserve"> — créé — </w:t>
       </w:r>
-      <w:hyperlink w:history="1" r:id="rIdi_d8ba1jdvvx_lhzlnw7u">
+      <w:hyperlink w:history="1" r:id="rIdlrwjvr489fxtu3d5afcaf">
         <w:r>
           <w:rPr>
             <w:rStyle w:val="Hyperlink"/>
@@ -1823,7 +1823,7 @@
       <w:r>
         <w:t xml:space="preserve"> — créé — </w:t>
       </w:r>
-      <w:hyperlink w:history="1" r:id="rId-ol1vj-97vsoext7kd6ra">
+      <w:hyperlink w:history="1" r:id="rIdmubc0wx0ubx5sgtw08zz0">
         <w:r>
           <w:rPr>
             <w:rStyle w:val="Hyperlink"/>
@@ -1852,7 +1852,7 @@
       <w:r>
         <w:t xml:space="preserve"> — créé — </w:t>
       </w:r>
-      <w:hyperlink w:history="1" r:id="rId7gkco4tffg7anuhpz3yms">
+      <w:hyperlink w:history="1" r:id="rIdtv_fbtjbtonmrijugzqhj">
         <w:r>
           <w:rPr>
             <w:rStyle w:val="Hyperlink"/>
@@ -1881,7 +1881,7 @@
       <w:r>
         <w:t xml:space="preserve"> — créé — </w:t>
       </w:r>
-      <w:hyperlink w:history="1" r:id="rIdbhyyrqac8ixxhpzjvxdig">
+      <w:hyperlink w:history="1" r:id="rIddazglx_x-o5wy2yv4nsao">
         <w:r>
           <w:rPr>
             <w:rStyle w:val="Hyperlink"/>
@@ -1910,7 +1910,7 @@
       <w:r>
         <w:t xml:space="preserve"> — créé — </w:t>
       </w:r>
-      <w:hyperlink w:history="1" r:id="rIdwdfbfmd2xugfuojcmdflr">
+      <w:hyperlink w:history="1" r:id="rIdaghixeckradyzifdijn7k">
         <w:r>
           <w:rPr>
             <w:rStyle w:val="Hyperlink"/>
@@ -1939,7 +1939,7 @@
       <w:r>
         <w:t xml:space="preserve"> — créé — </w:t>
       </w:r>
-      <w:hyperlink w:history="1" r:id="rIdxvoplrasrhf3eqi8kc9ug">
+      <w:hyperlink w:history="1" r:id="rIdtmq1fxxl2pryv5mzj_h6d">
         <w:r>
           <w:rPr>
             <w:rStyle w:val="Hyperlink"/>
@@ -1968,7 +1968,7 @@
       <w:r>
         <w:t xml:space="preserve"> — créé — </w:t>
       </w:r>
-      <w:hyperlink w:history="1" r:id="rIdojnzht1-akzoownr1dnjf">
+      <w:hyperlink w:history="1" r:id="rIdmzur9xenvhvxuzseidrzw">
         <w:r>
           <w:rPr>
             <w:rStyle w:val="Hyperlink"/>
@@ -1997,7 +1997,7 @@
       <w:r>
         <w:t xml:space="preserve"> — créé — </w:t>
       </w:r>
-      <w:hyperlink w:history="1" r:id="rIdqpza4tjv55tqcn0mm0sa8">
+      <w:hyperlink w:history="1" r:id="rIdepdykv7lmzzfzznsnhkuh">
         <w:r>
           <w:rPr>
             <w:rStyle w:val="Hyperlink"/>
@@ -2026,7 +2026,7 @@
       <w:r>
         <w:t xml:space="preserve"> — créé — </w:t>
       </w:r>
-      <w:hyperlink w:history="1" r:id="rIdm6r2ue0xlj2rs-qkduodx">
+      <w:hyperlink w:history="1" r:id="rIdrkq-ntmhystgsi3moqeiy">
         <w:r>
           <w:rPr>
             <w:rStyle w:val="Hyperlink"/>
@@ -2139,7 +2139,7 @@
       <w:r>
         <w:t xml:space="preserve"> — créé — </w:t>
       </w:r>
-      <w:hyperlink w:history="1" r:id="rIdzsngmp1nrkvrfrvacs9cc">
+      <w:hyperlink w:history="1" r:id="rIdbdzptbg1xzojozvviyfur">
         <w:r>
           <w:rPr>
             <w:rStyle w:val="Hyperlink"/>
@@ -2189,7 +2189,7 @@
       <w:r>
         <w:t xml:space="preserve"> — créé — </w:t>
       </w:r>
-      <w:hyperlink w:history="1" r:id="rIdjt6xdabwdoq75ipsamhtb">
+      <w:hyperlink w:history="1" r:id="rId-teeps7nji1u2c3oty7ye">
         <w:r>
           <w:rPr>
             <w:rStyle w:val="Hyperlink"/>
@@ -2218,7 +2218,7 @@
       <w:r>
         <w:t xml:space="preserve"> — créé — </w:t>
       </w:r>
-      <w:hyperlink w:history="1" r:id="rIdvh_ayoli36f8jcv91rvfe">
+      <w:hyperlink w:history="1" r:id="rIdveozmkexcztnlkzxcuy_3">
         <w:r>
           <w:rPr>
             <w:rStyle w:val="Hyperlink"/>
@@ -2247,7 +2247,7 @@
       <w:r>
         <w:t xml:space="preserve"> — créé — </w:t>
       </w:r>
-      <w:hyperlink w:history="1" r:id="rId1vekzheb_7p2-xxeglt3j">
+      <w:hyperlink w:history="1" r:id="rId1g-fyplst9val7pdhl97d">
         <w:r>
           <w:rPr>
             <w:rStyle w:val="Hyperlink"/>
@@ -2276,7 +2276,7 @@
       <w:r>
         <w:t xml:space="preserve"> — créé — </w:t>
       </w:r>
-      <w:hyperlink w:history="1" r:id="rIdwcgn733vouyxgrxfakx-r">
+      <w:hyperlink w:history="1" r:id="rIdworexbf4auemtiozgxl9w">
         <w:r>
           <w:rPr>
             <w:rStyle w:val="Hyperlink"/>
@@ -2313,7 +2313,7 @@
       <w:r>
         <w:t xml:space="preserve"> — créé — </w:t>
       </w:r>
-      <w:hyperlink w:history="1" r:id="rIdjiopxq9p9-znpqvnkkekv">
+      <w:hyperlink w:history="1" r:id="rIdxdzp1eynqsru4b9_x7lxk">
         <w:r>
           <w:rPr>
             <w:rStyle w:val="Hyperlink"/>
@@ -2342,7 +2342,7 @@
       <w:r>
         <w:t xml:space="preserve"> — créé — </w:t>
       </w:r>
-      <w:hyperlink w:history="1" r:id="rId481oqgmbob0agp-cgh2he">
+      <w:hyperlink w:history="1" r:id="rIdpydpmic2hnssas8g8v1wj">
         <w:r>
           <w:rPr>
             <w:rStyle w:val="Hyperlink"/>
@@ -2379,7 +2379,7 @@
       <w:r>
         <w:t xml:space="preserve"> — créé — </w:t>
       </w:r>
-      <w:hyperlink w:history="1" r:id="rIdd5snzkvfwckzie297zc8l">
+      <w:hyperlink w:history="1" r:id="rIdxrykbhdrfjbot9mmn99vx">
         <w:r>
           <w:rPr>
             <w:rStyle w:val="Hyperlink"/>
@@ -2408,7 +2408,7 @@
       <w:r>
         <w:t xml:space="preserve"> — créé — </w:t>
       </w:r>
-      <w:hyperlink w:history="1" r:id="rIdnspbfdfnyumt5fvirzp77">
+      <w:hyperlink w:history="1" r:id="rIdiojo14sctbic2cttht2zo">
         <w:r>
           <w:rPr>
             <w:rStyle w:val="Hyperlink"/>
@@ -2437,7 +2437,7 @@
       <w:r>
         <w:t xml:space="preserve"> — créé — </w:t>
       </w:r>
-      <w:hyperlink w:history="1" r:id="rIdsiqi10d4fy9rfp7gaknbo">
+      <w:hyperlink w:history="1" r:id="rIda-s3ro7yrgyrgi69xjyaz">
         <w:r>
           <w:rPr>
             <w:rStyle w:val="Hyperlink"/>
@@ -2466,7 +2466,7 @@
       <w:r>
         <w:t xml:space="preserve"> — créé — </w:t>
       </w:r>
-      <w:hyperlink w:history="1" r:id="rIdat5g8-twlpig8bw19lovz">
+      <w:hyperlink w:history="1" r:id="rIdyrqgooxbulzcqs6a5o9pc">
         <w:r>
           <w:rPr>
             <w:rStyle w:val="Hyperlink"/>
@@ -2495,7 +2495,7 @@
       <w:r>
         <w:t xml:space="preserve"> — créé — </w:t>
       </w:r>
-      <w:hyperlink w:history="1" r:id="rIdrbrw1zhqm8_mxznigi-bn">
+      <w:hyperlink w:history="1" r:id="rIdhtja-ft7yazkl6odhag8y">
         <w:r>
           <w:rPr>
             <w:rStyle w:val="Hyperlink"/>
@@ -2524,7 +2524,7 @@
       <w:r>
         <w:t xml:space="preserve"> — créé — </w:t>
       </w:r>
-      <w:hyperlink w:history="1" r:id="rIdu2e0t8v2tkjcgljq0_mep">
+      <w:hyperlink w:history="1" r:id="rId7ugxdh8m-9pych8hts-4e">
         <w:r>
           <w:rPr>
             <w:rStyle w:val="Hyperlink"/>
@@ -2553,7 +2553,7 @@
       <w:r>
         <w:t xml:space="preserve"> — créé — </w:t>
       </w:r>
-      <w:hyperlink w:history="1" r:id="rIdonhdxjy2zvpthjmbnwck6">
+      <w:hyperlink w:history="1" r:id="rIdq4tvwkzquqzuhhbuzd7bk">
         <w:r>
           <w:rPr>
             <w:rStyle w:val="Hyperlink"/>
@@ -2582,7 +2582,7 @@
       <w:r>
         <w:t xml:space="preserve"> — créé — </w:t>
       </w:r>
-      <w:hyperlink w:history="1" r:id="rId4zwwgnp7xecncalcbrltm">
+      <w:hyperlink w:history="1" r:id="rId9wj_ezk3bpype6uaufcx_">
         <w:r>
           <w:rPr>
             <w:rStyle w:val="Hyperlink"/>
@@ -2611,7 +2611,7 @@
       <w:r>
         <w:t xml:space="preserve"> — créé — </w:t>
       </w:r>
-      <w:hyperlink w:history="1" r:id="rIdw9bbtnkeiujhz4gnxis1a">
+      <w:hyperlink w:history="1" r:id="rIdtfr_zm7nu8uid6tntcuha">
         <w:r>
           <w:rPr>
             <w:rStyle w:val="Hyperlink"/>
@@ -2648,7 +2648,7 @@
       <w:r>
         <w:t xml:space="preserve"> — créé — </w:t>
       </w:r>
-      <w:hyperlink w:history="1" r:id="rId5wts280912ulstjljuqyz">
+      <w:hyperlink w:history="1" r:id="rIdlxidof04y_insww5qzuoz">
         <w:r>
           <w:rPr>
             <w:rStyle w:val="Hyperlink"/>
@@ -2677,7 +2677,7 @@
       <w:r>
         <w:t xml:space="preserve"> — créé — </w:t>
       </w:r>
-      <w:hyperlink w:history="1" r:id="rId-rhekkn-2_cigmry7m8i1">
+      <w:hyperlink w:history="1" r:id="rIdf9ey8d09hq6pbqxbh2x6f">
         <w:r>
           <w:rPr>
             <w:rStyle w:val="Hyperlink"/>
@@ -2706,7 +2706,7 @@
       <w:r>
         <w:t xml:space="preserve"> — créé — </w:t>
       </w:r>
-      <w:hyperlink w:history="1" r:id="rId5tkuxdr42fb3poskl8kp7">
+      <w:hyperlink w:history="1" r:id="rIdxk8jefpxkhuiv_zqwbe7o">
         <w:r>
           <w:rPr>
             <w:rStyle w:val="Hyperlink"/>
@@ -2735,7 +2735,7 @@
       <w:r>
         <w:t xml:space="preserve"> — créé — </w:t>
       </w:r>
-      <w:hyperlink w:history="1" r:id="rIdg0sjcrl1lyj4ljxnc2qup">
+      <w:hyperlink w:history="1" r:id="rIdtj81h3bo8b2qzvwstsnkr">
         <w:r>
           <w:rPr>
             <w:rStyle w:val="Hyperlink"/>
@@ -2764,7 +2764,7 @@
       <w:r>
         <w:t xml:space="preserve"> — créé — </w:t>
       </w:r>
-      <w:hyperlink w:history="1" r:id="rIdt4caegw-zsq2iwtk8nol6">
+      <w:hyperlink w:history="1" r:id="rIdtmjkvymoahu5zddogvfiw">
         <w:r>
           <w:rPr>
             <w:rStyle w:val="Hyperlink"/>
@@ -2793,7 +2793,7 @@
       <w:r>
         <w:t xml:space="preserve"> — créé — </w:t>
       </w:r>
-      <w:hyperlink w:history="1" r:id="rIdqeciigmhmp3oac5z82ikc">
+      <w:hyperlink w:history="1" r:id="rIdwrbe6k45iksjmx9-9dbs7">
         <w:r>
           <w:rPr>
             <w:rStyle w:val="Hyperlink"/>
@@ -2822,7 +2822,7 @@
       <w:r>
         <w:t xml:space="preserve"> — créé — </w:t>
       </w:r>
-      <w:hyperlink w:history="1" r:id="rIdtd3n4balbhcfw5szbcgf9">
+      <w:hyperlink w:history="1" r:id="rIdoe5oirdwzexsyzvghi7xf">
         <w:r>
           <w:rPr>
             <w:rStyle w:val="Hyperlink"/>
@@ -2851,7 +2851,7 @@
       <w:r>
         <w:t xml:space="preserve"> — créé — </w:t>
       </w:r>
-      <w:hyperlink w:history="1" r:id="rIddetmtvzzxjxmbkmri08hx">
+      <w:hyperlink w:history="1" r:id="rIdzt5jmo0x8lyhzxvckmqwh">
         <w:r>
           <w:rPr>
             <w:rStyle w:val="Hyperlink"/>

</xml_diff>

<commit_message>
Journal : phase 38 (assistant Mistral)
Co-Authored-By: Claude Opus 5.5 <noreply@anthropic.com>
</commit_message>
<xml_diff>
--- a/docs/developpement/phases/word/PHASE_00_SOCLE_DE_PRODUCTION_ET_CONFIGURATION_DUN_LIEU_VIDE.docx
+++ b/docs/developpement/phases/word/PHASE_00_SOCLE_DE_PRODUCTION_ET_CONFIGURATION_DUN_LIEU_VIDE.docx
@@ -20,7 +20,7 @@
       <w:r>
         <w:t xml:space="preserve">FlaiX Expert · dossier de développement · généré le 2026-10-04 depuis le dépôt </w:t>
       </w:r>
-      <w:hyperlink w:history="1" r:id="rIdtr1fobgvrxgxzkmhnrjkm">
+      <w:hyperlink w:history="1" r:id="rIdsnakqs5dsy95bm897cdvw">
         <w:r>
           <w:rPr>
             <w:rStyle w:val="Hyperlink"/>
@@ -592,7 +592,7 @@
           <w:numId w:val="3"/>
         </w:numPr>
       </w:pPr>
-      <w:hyperlink w:history="1" r:id="rId7uffg8x-tn88mka1gjzsu">
+      <w:hyperlink w:history="1" r:id="rIdh2nfvcel8vfqbaar3ev13">
         <w:r>
           <w:rPr>
             <w:rStyle w:val="Hyperlink"/>
@@ -612,7 +612,7 @@
           <w:numId w:val="3"/>
         </w:numPr>
       </w:pPr>
-      <w:hyperlink w:history="1" r:id="rIdqept3ekkujemery4hxgmm">
+      <w:hyperlink w:history="1" r:id="rIduryvnvpljkhkmnarjfz8k">
         <w:r>
           <w:rPr>
             <w:rStyle w:val="Hyperlink"/>
@@ -660,7 +660,7 @@
       <w:r>
         <w:t xml:space="preserve"> — créé — </w:t>
       </w:r>
-      <w:hyperlink w:history="1" r:id="rIdffta71uxh-3yvqdwpxvb7">
+      <w:hyperlink w:history="1" r:id="rIdatevikztbdsyovqtbl11c">
         <w:r>
           <w:rPr>
             <w:rStyle w:val="Hyperlink"/>
@@ -689,7 +689,7 @@
       <w:r>
         <w:t xml:space="preserve"> — créé — </w:t>
       </w:r>
-      <w:hyperlink w:history="1" r:id="rIdrebcs_ozecr9wvajhgtsl">
+      <w:hyperlink w:history="1" r:id="rIdiu93zvcelkcvt32ycoj88">
         <w:r>
           <w:rPr>
             <w:rStyle w:val="Hyperlink"/>
@@ -726,7 +726,7 @@
       <w:r>
         <w:t xml:space="preserve"> — créé — </w:t>
       </w:r>
-      <w:hyperlink w:history="1" r:id="rIdnejknb9gzaptizmta6yzu">
+      <w:hyperlink w:history="1" r:id="rId2-ycs5ajiyngf02u780yd">
         <w:r>
           <w:rPr>
             <w:rStyle w:val="Hyperlink"/>
@@ -755,7 +755,7 @@
       <w:r>
         <w:t xml:space="preserve"> — créé — </w:t>
       </w:r>
-      <w:hyperlink w:history="1" r:id="rIdxmosxwrx5kk39wiylzrx3">
+      <w:hyperlink w:history="1" r:id="rIdskmjdwpvnsbi7613tjxvu">
         <w:r>
           <w:rPr>
             <w:rStyle w:val="Hyperlink"/>
@@ -784,7 +784,7 @@
       <w:r>
         <w:t xml:space="preserve"> — créé — </w:t>
       </w:r>
-      <w:hyperlink w:history="1" r:id="rIdcflsuxjffcumilarorlkg">
+      <w:hyperlink w:history="1" r:id="rIdqnp_5iwxljuonltri4x2l">
         <w:r>
           <w:rPr>
             <w:rStyle w:val="Hyperlink"/>
@@ -813,7 +813,7 @@
       <w:r>
         <w:t xml:space="preserve"> — créé — </w:t>
       </w:r>
-      <w:hyperlink w:history="1" r:id="rIdwwa3obf930f9pgakpr4lf">
+      <w:hyperlink w:history="1" r:id="rIdbrfehxqshqucwahsr4xs0">
         <w:r>
           <w:rPr>
             <w:rStyle w:val="Hyperlink"/>
@@ -842,7 +842,7 @@
       <w:r>
         <w:t xml:space="preserve"> — créé — </w:t>
       </w:r>
-      <w:hyperlink w:history="1" r:id="rIdhb1bm_kghsq958v6kkzxy">
+      <w:hyperlink w:history="1" r:id="rIdnp9kg5x7vmbnlh33rhfvq">
         <w:r>
           <w:rPr>
             <w:rStyle w:val="Hyperlink"/>
@@ -879,7 +879,7 @@
       <w:r>
         <w:t xml:space="preserve"> — créé — </w:t>
       </w:r>
-      <w:hyperlink w:history="1" r:id="rIdscp5i4hgxhseoctblwla8">
+      <w:hyperlink w:history="1" r:id="rId4iu97s5f9c37xqvzj3atj">
         <w:r>
           <w:rPr>
             <w:rStyle w:val="Hyperlink"/>
@@ -908,7 +908,7 @@
       <w:r>
         <w:t xml:space="preserve"> — créé — </w:t>
       </w:r>
-      <w:hyperlink w:history="1" r:id="rIdbfhmh3erljlsio-rsb7th">
+      <w:hyperlink w:history="1" r:id="rIdev4ldrpiwb6zqrjtqbciw">
         <w:r>
           <w:rPr>
             <w:rStyle w:val="Hyperlink"/>
@@ -937,7 +937,7 @@
       <w:r>
         <w:t xml:space="preserve"> — créé — </w:t>
       </w:r>
-      <w:hyperlink w:history="1" r:id="rIdmdcboepx1qhbq0edj9hjh">
+      <w:hyperlink w:history="1" r:id="rIdvuj2ddbb6toujdxm2zrka">
         <w:r>
           <w:rPr>
             <w:rStyle w:val="Hyperlink"/>
@@ -966,7 +966,7 @@
       <w:r>
         <w:t xml:space="preserve"> — créé — </w:t>
       </w:r>
-      <w:hyperlink w:history="1" r:id="rIdbaje_biqv899y5urhdvsl">
+      <w:hyperlink w:history="1" r:id="rIdgppfk61mznuefodit0atw">
         <w:r>
           <w:rPr>
             <w:rStyle w:val="Hyperlink"/>
@@ -995,7 +995,7 @@
       <w:r>
         <w:t xml:space="preserve"> — créé — </w:t>
       </w:r>
-      <w:hyperlink w:history="1" r:id="rId8tmn2upg5oqqq9mifjvnu">
+      <w:hyperlink w:history="1" r:id="rId5gvwzfyrgcxrx95cktos0">
         <w:r>
           <w:rPr>
             <w:rStyle w:val="Hyperlink"/>
@@ -1024,7 +1024,7 @@
       <w:r>
         <w:t xml:space="preserve"> — créé — </w:t>
       </w:r>
-      <w:hyperlink w:history="1" r:id="rId6ybyfpyvwplc4lndp0fhn">
+      <w:hyperlink w:history="1" r:id="rIdopio7iya5kqoo-pqb--sb">
         <w:r>
           <w:rPr>
             <w:rStyle w:val="Hyperlink"/>
@@ -1053,7 +1053,7 @@
       <w:r>
         <w:t xml:space="preserve"> — créé — </w:t>
       </w:r>
-      <w:hyperlink w:history="1" r:id="rIdfsedrqsvriklnedqxhn4l">
+      <w:hyperlink w:history="1" r:id="rIdasihvkz5dmvjwbu_3u4jd">
         <w:r>
           <w:rPr>
             <w:rStyle w:val="Hyperlink"/>
@@ -1082,7 +1082,7 @@
       <w:r>
         <w:t xml:space="preserve"> — créé — </w:t>
       </w:r>
-      <w:hyperlink w:history="1" r:id="rIdazydkj_hp-j0slc7jjwjm">
+      <w:hyperlink w:history="1" r:id="rIdjnvmfebpg0bvknjom7qp-">
         <w:r>
           <w:rPr>
             <w:rStyle w:val="Hyperlink"/>
@@ -1111,7 +1111,7 @@
       <w:r>
         <w:t xml:space="preserve"> — créé — </w:t>
       </w:r>
-      <w:hyperlink w:history="1" r:id="rIdkskaeztmjcwqrb_tagi22">
+      <w:hyperlink w:history="1" r:id="rIdrcg1g1ilehf-meohlvhvy">
         <w:r>
           <w:rPr>
             <w:rStyle w:val="Hyperlink"/>
@@ -1148,7 +1148,7 @@
       <w:r>
         <w:t xml:space="preserve"> — créé — </w:t>
       </w:r>
-      <w:hyperlink w:history="1" r:id="rIdx1ljlywkrv--gdmvhauzd">
+      <w:hyperlink w:history="1" r:id="rIdlmm6rektr_bcdnpnzmeuo">
         <w:r>
           <w:rPr>
             <w:rStyle w:val="Hyperlink"/>
@@ -1177,7 +1177,7 @@
       <w:r>
         <w:t xml:space="preserve"> — créé — </w:t>
       </w:r>
-      <w:hyperlink w:history="1" r:id="rIdw6q0jpxp56g80rfyowqot">
+      <w:hyperlink w:history="1" r:id="rIdf4kdguinlfjkglg1ua5g4">
         <w:r>
           <w:rPr>
             <w:rStyle w:val="Hyperlink"/>
@@ -1206,7 +1206,7 @@
       <w:r>
         <w:t xml:space="preserve"> — créé — </w:t>
       </w:r>
-      <w:hyperlink w:history="1" r:id="rIdp8pv8hjniuya9xmazsrv9">
+      <w:hyperlink w:history="1" r:id="rIdi8jdynkfxrua9me1xshfu">
         <w:r>
           <w:rPr>
             <w:rStyle w:val="Hyperlink"/>
@@ -1235,7 +1235,7 @@
       <w:r>
         <w:t xml:space="preserve"> — créé — </w:t>
       </w:r>
-      <w:hyperlink w:history="1" r:id="rIdhas59i01vaw36m0tsvuvk">
+      <w:hyperlink w:history="1" r:id="rIdthwrcxtuoxxiz7atmfobn">
         <w:r>
           <w:rPr>
             <w:rStyle w:val="Hyperlink"/>
@@ -1264,7 +1264,7 @@
       <w:r>
         <w:t xml:space="preserve"> — créé — </w:t>
       </w:r>
-      <w:hyperlink w:history="1" r:id="rId--1i38atehwui5s7lqf12">
+      <w:hyperlink w:history="1" r:id="rIdeqm3feluaaltnx4zxwse6">
         <w:r>
           <w:rPr>
             <w:rStyle w:val="Hyperlink"/>
@@ -1293,7 +1293,7 @@
       <w:r>
         <w:t xml:space="preserve"> — créé — </w:t>
       </w:r>
-      <w:hyperlink w:history="1" r:id="rIdlw9fwjjilzumyxv4jefc1">
+      <w:hyperlink w:history="1" r:id="rIdypn6zv4zcwrdpa_vzjxyc">
         <w:r>
           <w:rPr>
             <w:rStyle w:val="Hyperlink"/>
@@ -1322,7 +1322,7 @@
       <w:r>
         <w:t xml:space="preserve"> — créé — </w:t>
       </w:r>
-      <w:hyperlink w:history="1" r:id="rIdcla1dzgq18hqzccy8wdyv">
+      <w:hyperlink w:history="1" r:id="rIdmwu70apkpv1nfvsuvbaxp">
         <w:r>
           <w:rPr>
             <w:rStyle w:val="Hyperlink"/>
@@ -1351,7 +1351,7 @@
       <w:r>
         <w:t xml:space="preserve"> — créé — </w:t>
       </w:r>
-      <w:hyperlink w:history="1" r:id="rIds7wdyqz9xh2zcnkp8r2mc">
+      <w:hyperlink w:history="1" r:id="rIds71x4ia26p3yliser5o76">
         <w:r>
           <w:rPr>
             <w:rStyle w:val="Hyperlink"/>
@@ -1380,7 +1380,7 @@
       <w:r>
         <w:t xml:space="preserve"> — créé — </w:t>
       </w:r>
-      <w:hyperlink w:history="1" r:id="rIdoydd4uc0yh7-c2loqtcdx">
+      <w:hyperlink w:history="1" r:id="rIdl0nqnjhf1opujrs2fox1z">
         <w:r>
           <w:rPr>
             <w:rStyle w:val="Hyperlink"/>
@@ -1409,7 +1409,7 @@
       <w:r>
         <w:t xml:space="preserve"> — créé — </w:t>
       </w:r>
-      <w:hyperlink w:history="1" r:id="rId97bqslei02w0dwtzmsikh">
+      <w:hyperlink w:history="1" r:id="rIdwrw870hv5bt3aoatjencq">
         <w:r>
           <w:rPr>
             <w:rStyle w:val="Hyperlink"/>
@@ -1438,7 +1438,7 @@
       <w:r>
         <w:t xml:space="preserve"> — créé — </w:t>
       </w:r>
-      <w:hyperlink w:history="1" r:id="rIdg2zsbsogos435x42ko5w1">
+      <w:hyperlink w:history="1" r:id="rIdrdkhwnfrp-oqbpynr61ld">
         <w:r>
           <w:rPr>
             <w:rStyle w:val="Hyperlink"/>
@@ -1467,7 +1467,7 @@
       <w:r>
         <w:t xml:space="preserve"> — créé — </w:t>
       </w:r>
-      <w:hyperlink w:history="1" r:id="rIdj2uimrnvacrxirkth9xke">
+      <w:hyperlink w:history="1" r:id="rIdqre_znu6qjmm7ycenmyry">
         <w:r>
           <w:rPr>
             <w:rStyle w:val="Hyperlink"/>
@@ -1496,7 +1496,7 @@
       <w:r>
         <w:t xml:space="preserve"> — créé — </w:t>
       </w:r>
-      <w:hyperlink w:history="1" r:id="rIdwku6wextifyc1klx1gjqm">
+      <w:hyperlink w:history="1" r:id="rIdqijl9vt23k2cze9nz0yro">
         <w:r>
           <w:rPr>
             <w:rStyle w:val="Hyperlink"/>
@@ -1525,7 +1525,7 @@
       <w:r>
         <w:t xml:space="preserve"> — créé — </w:t>
       </w:r>
-      <w:hyperlink w:history="1" r:id="rIdyjcpxinadv-6i_ristnbh">
+      <w:hyperlink w:history="1" r:id="rIdxhqw4k66drc6ehvttd79m">
         <w:r>
           <w:rPr>
             <w:rStyle w:val="Hyperlink"/>
@@ -1554,7 +1554,7 @@
       <w:r>
         <w:t xml:space="preserve"> — créé — </w:t>
       </w:r>
-      <w:hyperlink w:history="1" r:id="rIdejiaiqexv46n5othwwxuv">
+      <w:hyperlink w:history="1" r:id="rIdfykf2n5pknzpmd1haytvd">
         <w:r>
           <w:rPr>
             <w:rStyle w:val="Hyperlink"/>
@@ -1583,7 +1583,7 @@
       <w:r>
         <w:t xml:space="preserve"> — créé — </w:t>
       </w:r>
-      <w:hyperlink w:history="1" r:id="rIdiph6dosuajz1zgvdegt1i">
+      <w:hyperlink w:history="1" r:id="rIduowfxuvqvdrkczbubg3ey">
         <w:r>
           <w:rPr>
             <w:rStyle w:val="Hyperlink"/>
@@ -1612,7 +1612,7 @@
       <w:r>
         <w:t xml:space="preserve"> — créé — </w:t>
       </w:r>
-      <w:hyperlink w:history="1" r:id="rIdht5b2bmtk1dxqoznnivxs">
+      <w:hyperlink w:history="1" r:id="rIdwct1aff_gzwcmtxaatzye">
         <w:r>
           <w:rPr>
             <w:rStyle w:val="Hyperlink"/>
@@ -1641,7 +1641,7 @@
       <w:r>
         <w:t xml:space="preserve"> — créé — </w:t>
       </w:r>
-      <w:hyperlink w:history="1" r:id="rId-pnlnb4r6xja9dqzgfblu">
+      <w:hyperlink w:history="1" r:id="rIdyjaaffr6xud0vw4vwzj8e">
         <w:r>
           <w:rPr>
             <w:rStyle w:val="Hyperlink"/>
@@ -1670,7 +1670,7 @@
       <w:r>
         <w:t xml:space="preserve"> — créé — </w:t>
       </w:r>
-      <w:hyperlink w:history="1" r:id="rId393bilvsnfdxo_wm6mpsv">
+      <w:hyperlink w:history="1" r:id="rId53wjp-19mzs6tpgmekzyj">
         <w:r>
           <w:rPr>
             <w:rStyle w:val="Hyperlink"/>
@@ -1699,7 +1699,7 @@
       <w:r>
         <w:t xml:space="preserve"> — créé — </w:t>
       </w:r>
-      <w:hyperlink w:history="1" r:id="rIdoccnkjfszbbapwivgp4hm">
+      <w:hyperlink w:history="1" r:id="rIdlpciqyoyoorwti1tarwen">
         <w:r>
           <w:rPr>
             <w:rStyle w:val="Hyperlink"/>
@@ -1728,7 +1728,7 @@
       <w:r>
         <w:t xml:space="preserve"> — créé — </w:t>
       </w:r>
-      <w:hyperlink w:history="1" r:id="rIdmfjfvukwtixppzs6mdwia">
+      <w:hyperlink w:history="1" r:id="rIdk1jmk7chqilmvfxryn6tb">
         <w:r>
           <w:rPr>
             <w:rStyle w:val="Hyperlink"/>
@@ -1757,7 +1757,7 @@
       <w:r>
         <w:t xml:space="preserve"> — créé — </w:t>
       </w:r>
-      <w:hyperlink w:history="1" r:id="rIdzjuqgulzm4a886sxq6whl">
+      <w:hyperlink w:history="1" r:id="rIdv1xifi2n5xckntzlehv4r">
         <w:r>
           <w:rPr>
             <w:rStyle w:val="Hyperlink"/>
@@ -1786,7 +1786,7 @@
       <w:r>
         <w:t xml:space="preserve"> — créé — </w:t>
       </w:r>
-      <w:hyperlink w:history="1" r:id="rIdlrwjvr489fxtu3d5afcaf">
+      <w:hyperlink w:history="1" r:id="rIdorcjxjx_hbgikphwypoza">
         <w:r>
           <w:rPr>
             <w:rStyle w:val="Hyperlink"/>
@@ -1823,7 +1823,7 @@
       <w:r>
         <w:t xml:space="preserve"> — créé — </w:t>
       </w:r>
-      <w:hyperlink w:history="1" r:id="rIdmubc0wx0ubx5sgtw08zz0">
+      <w:hyperlink w:history="1" r:id="rIdq5qvaa22_a7kjk_ync-g0">
         <w:r>
           <w:rPr>
             <w:rStyle w:val="Hyperlink"/>
@@ -1852,7 +1852,7 @@
       <w:r>
         <w:t xml:space="preserve"> — créé — </w:t>
       </w:r>
-      <w:hyperlink w:history="1" r:id="rIdtv_fbtjbtonmrijugzqhj">
+      <w:hyperlink w:history="1" r:id="rId6jbgiap6ovgplgowgn1le">
         <w:r>
           <w:rPr>
             <w:rStyle w:val="Hyperlink"/>
@@ -1881,7 +1881,7 @@
       <w:r>
         <w:t xml:space="preserve"> — créé — </w:t>
       </w:r>
-      <w:hyperlink w:history="1" r:id="rIddazglx_x-o5wy2yv4nsao">
+      <w:hyperlink w:history="1" r:id="rId3qztlaes8qnfnoe29sxys">
         <w:r>
           <w:rPr>
             <w:rStyle w:val="Hyperlink"/>
@@ -1910,7 +1910,7 @@
       <w:r>
         <w:t xml:space="preserve"> — créé — </w:t>
       </w:r>
-      <w:hyperlink w:history="1" r:id="rIdaghixeckradyzifdijn7k">
+      <w:hyperlink w:history="1" r:id="rId-mcjpo40xbnk1oo0iqfda">
         <w:r>
           <w:rPr>
             <w:rStyle w:val="Hyperlink"/>
@@ -1939,7 +1939,7 @@
       <w:r>
         <w:t xml:space="preserve"> — créé — </w:t>
       </w:r>
-      <w:hyperlink w:history="1" r:id="rIdtmq1fxxl2pryv5mzj_h6d">
+      <w:hyperlink w:history="1" r:id="rIdc2f0n390mduxxtcakqaai">
         <w:r>
           <w:rPr>
             <w:rStyle w:val="Hyperlink"/>
@@ -1968,7 +1968,7 @@
       <w:r>
         <w:t xml:space="preserve"> — créé — </w:t>
       </w:r>
-      <w:hyperlink w:history="1" r:id="rIdmzur9xenvhvxuzseidrzw">
+      <w:hyperlink w:history="1" r:id="rIdd5h4xhtn6y0zz_anbvfrk">
         <w:r>
           <w:rPr>
             <w:rStyle w:val="Hyperlink"/>
@@ -1997,7 +1997,7 @@
       <w:r>
         <w:t xml:space="preserve"> — créé — </w:t>
       </w:r>
-      <w:hyperlink w:history="1" r:id="rIdepdykv7lmzzfzznsnhkuh">
+      <w:hyperlink w:history="1" r:id="rIdk_sw96hp0rschpt1biym1">
         <w:r>
           <w:rPr>
             <w:rStyle w:val="Hyperlink"/>
@@ -2026,7 +2026,7 @@
       <w:r>
         <w:t xml:space="preserve"> — créé — </w:t>
       </w:r>
-      <w:hyperlink w:history="1" r:id="rIdrkq-ntmhystgsi3moqeiy">
+      <w:hyperlink w:history="1" r:id="rIdewfeocuhrtg9x95f2bfxn">
         <w:r>
           <w:rPr>
             <w:rStyle w:val="Hyperlink"/>
@@ -2139,7 +2139,7 @@
       <w:r>
         <w:t xml:space="preserve"> — créé — </w:t>
       </w:r>
-      <w:hyperlink w:history="1" r:id="rIdbdzptbg1xzojozvviyfur">
+      <w:hyperlink w:history="1" r:id="rIdw_ezpw6vesohc4ip5qwx3">
         <w:r>
           <w:rPr>
             <w:rStyle w:val="Hyperlink"/>
@@ -2189,7 +2189,7 @@
       <w:r>
         <w:t xml:space="preserve"> — créé — </w:t>
       </w:r>
-      <w:hyperlink w:history="1" r:id="rId-teeps7nji1u2c3oty7ye">
+      <w:hyperlink w:history="1" r:id="rIdntmatikrf0hypxsgzqd8m">
         <w:r>
           <w:rPr>
             <w:rStyle w:val="Hyperlink"/>
@@ -2218,7 +2218,7 @@
       <w:r>
         <w:t xml:space="preserve"> — créé — </w:t>
       </w:r>
-      <w:hyperlink w:history="1" r:id="rIdveozmkexcztnlkzxcuy_3">
+      <w:hyperlink w:history="1" r:id="rIdxog2inaivhncrskq-tcog">
         <w:r>
           <w:rPr>
             <w:rStyle w:val="Hyperlink"/>
@@ -2247,7 +2247,7 @@
       <w:r>
         <w:t xml:space="preserve"> — créé — </w:t>
       </w:r>
-      <w:hyperlink w:history="1" r:id="rId1g-fyplst9val7pdhl97d">
+      <w:hyperlink w:history="1" r:id="rIdoduucnsntnnqdznw-2x6q">
         <w:r>
           <w:rPr>
             <w:rStyle w:val="Hyperlink"/>
@@ -2276,7 +2276,7 @@
       <w:r>
         <w:t xml:space="preserve"> — créé — </w:t>
       </w:r>
-      <w:hyperlink w:history="1" r:id="rIdworexbf4auemtiozgxl9w">
+      <w:hyperlink w:history="1" r:id="rId2npy8yxsmbqducroxigef">
         <w:r>
           <w:rPr>
             <w:rStyle w:val="Hyperlink"/>
@@ -2313,7 +2313,7 @@
       <w:r>
         <w:t xml:space="preserve"> — créé — </w:t>
       </w:r>
-      <w:hyperlink w:history="1" r:id="rIdxdzp1eynqsru4b9_x7lxk">
+      <w:hyperlink w:history="1" r:id="rIdyywzza1eohep6_126soiw">
         <w:r>
           <w:rPr>
             <w:rStyle w:val="Hyperlink"/>
@@ -2342,7 +2342,7 @@
       <w:r>
         <w:t xml:space="preserve"> — créé — </w:t>
       </w:r>
-      <w:hyperlink w:history="1" r:id="rIdpydpmic2hnssas8g8v1wj">
+      <w:hyperlink w:history="1" r:id="rIdkgvbe4knbnw_wuubgc4ay">
         <w:r>
           <w:rPr>
             <w:rStyle w:val="Hyperlink"/>
@@ -2379,7 +2379,7 @@
       <w:r>
         <w:t xml:space="preserve"> — créé — </w:t>
       </w:r>
-      <w:hyperlink w:history="1" r:id="rIdxrykbhdrfjbot9mmn99vx">
+      <w:hyperlink w:history="1" r:id="rIdkqkoqn8whgpol0lilkddj">
         <w:r>
           <w:rPr>
             <w:rStyle w:val="Hyperlink"/>
@@ -2408,7 +2408,7 @@
       <w:r>
         <w:t xml:space="preserve"> — créé — </w:t>
       </w:r>
-      <w:hyperlink w:history="1" r:id="rIdiojo14sctbic2cttht2zo">
+      <w:hyperlink w:history="1" r:id="rIdk8xerdsspih60u6jcubgp">
         <w:r>
           <w:rPr>
             <w:rStyle w:val="Hyperlink"/>
@@ -2437,7 +2437,7 @@
       <w:r>
         <w:t xml:space="preserve"> — créé — </w:t>
       </w:r>
-      <w:hyperlink w:history="1" r:id="rIda-s3ro7yrgyrgi69xjyaz">
+      <w:hyperlink w:history="1" r:id="rIdjp4f3kp_k5ffzwfyzwll9">
         <w:r>
           <w:rPr>
             <w:rStyle w:val="Hyperlink"/>
@@ -2466,7 +2466,7 @@
       <w:r>
         <w:t xml:space="preserve"> — créé — </w:t>
       </w:r>
-      <w:hyperlink w:history="1" r:id="rIdyrqgooxbulzcqs6a5o9pc">
+      <w:hyperlink w:history="1" r:id="rIdgtt9glkh7jcq4qrvah42u">
         <w:r>
           <w:rPr>
             <w:rStyle w:val="Hyperlink"/>
@@ -2495,7 +2495,7 @@
       <w:r>
         <w:t xml:space="preserve"> — créé — </w:t>
       </w:r>
-      <w:hyperlink w:history="1" r:id="rIdhtja-ft7yazkl6odhag8y">
+      <w:hyperlink w:history="1" r:id="rIdxs1so18zaezrog69srhmk">
         <w:r>
           <w:rPr>
             <w:rStyle w:val="Hyperlink"/>
@@ -2524,7 +2524,7 @@
       <w:r>
         <w:t xml:space="preserve"> — créé — </w:t>
       </w:r>
-      <w:hyperlink w:history="1" r:id="rId7ugxdh8m-9pych8hts-4e">
+      <w:hyperlink w:history="1" r:id="rIdzhvirc-szhtjnle5tkbb2">
         <w:r>
           <w:rPr>
             <w:rStyle w:val="Hyperlink"/>
@@ -2553,7 +2553,7 @@
       <w:r>
         <w:t xml:space="preserve"> — créé — </w:t>
       </w:r>
-      <w:hyperlink w:history="1" r:id="rIdq4tvwkzquqzuhhbuzd7bk">
+      <w:hyperlink w:history="1" r:id="rId8r59vbzdtivh7oxt34hpe">
         <w:r>
           <w:rPr>
             <w:rStyle w:val="Hyperlink"/>
@@ -2582,7 +2582,7 @@
       <w:r>
         <w:t xml:space="preserve"> — créé — </w:t>
       </w:r>
-      <w:hyperlink w:history="1" r:id="rId9wj_ezk3bpype6uaufcx_">
+      <w:hyperlink w:history="1" r:id="rId6sqvakwwngmo8cc1rgmcp">
         <w:r>
           <w:rPr>
             <w:rStyle w:val="Hyperlink"/>
@@ -2611,7 +2611,7 @@
       <w:r>
         <w:t xml:space="preserve"> — créé — </w:t>
       </w:r>
-      <w:hyperlink w:history="1" r:id="rIdtfr_zm7nu8uid6tntcuha">
+      <w:hyperlink w:history="1" r:id="rId3maemobcu3w-igbgerrzs">
         <w:r>
           <w:rPr>
             <w:rStyle w:val="Hyperlink"/>
@@ -2648,7 +2648,7 @@
       <w:r>
         <w:t xml:space="preserve"> — créé — </w:t>
       </w:r>
-      <w:hyperlink w:history="1" r:id="rIdlxidof04y_insww5qzuoz">
+      <w:hyperlink w:history="1" r:id="rIdzrxxiudenfnddjnqizcg8">
         <w:r>
           <w:rPr>
             <w:rStyle w:val="Hyperlink"/>
@@ -2677,7 +2677,7 @@
       <w:r>
         <w:t xml:space="preserve"> — créé — </w:t>
       </w:r>
-      <w:hyperlink w:history="1" r:id="rIdf9ey8d09hq6pbqxbh2x6f">
+      <w:hyperlink w:history="1" r:id="rIdrcqh8xrradnybp0ktd_qd">
         <w:r>
           <w:rPr>
             <w:rStyle w:val="Hyperlink"/>
@@ -2706,7 +2706,7 @@
       <w:r>
         <w:t xml:space="preserve"> — créé — </w:t>
       </w:r>
-      <w:hyperlink w:history="1" r:id="rIdxk8jefpxkhuiv_zqwbe7o">
+      <w:hyperlink w:history="1" r:id="rId41schyoj9ac57lkizhi-c">
         <w:r>
           <w:rPr>
             <w:rStyle w:val="Hyperlink"/>
@@ -2735,7 +2735,7 @@
       <w:r>
         <w:t xml:space="preserve"> — créé — </w:t>
       </w:r>
-      <w:hyperlink w:history="1" r:id="rIdtj81h3bo8b2qzvwstsnkr">
+      <w:hyperlink w:history="1" r:id="rId5oo-hhq5waomw1ajc58p6">
         <w:r>
           <w:rPr>
             <w:rStyle w:val="Hyperlink"/>
@@ -2764,7 +2764,7 @@
       <w:r>
         <w:t xml:space="preserve"> — créé — </w:t>
       </w:r>
-      <w:hyperlink w:history="1" r:id="rIdtmjkvymoahu5zddogvfiw">
+      <w:hyperlink w:history="1" r:id="rIdoeqazhombkkmoqodogvvx">
         <w:r>
           <w:rPr>
             <w:rStyle w:val="Hyperlink"/>
@@ -2793,7 +2793,7 @@
       <w:r>
         <w:t xml:space="preserve"> — créé — </w:t>
       </w:r>
-      <w:hyperlink w:history="1" r:id="rIdwrbe6k45iksjmx9-9dbs7">
+      <w:hyperlink w:history="1" r:id="rId47pemrbmpnenqzh7sgtma">
         <w:r>
           <w:rPr>
             <w:rStyle w:val="Hyperlink"/>
@@ -2822,7 +2822,7 @@
       <w:r>
         <w:t xml:space="preserve"> — créé — </w:t>
       </w:r>
-      <w:hyperlink w:history="1" r:id="rIdoe5oirdwzexsyzvghi7xf">
+      <w:hyperlink w:history="1" r:id="rIdrvwfb7dbnrylgvechulld">
         <w:r>
           <w:rPr>
             <w:rStyle w:val="Hyperlink"/>
@@ -2851,7 +2851,7 @@
       <w:r>
         <w:t xml:space="preserve"> — créé — </w:t>
       </w:r>
-      <w:hyperlink w:history="1" r:id="rIdzt5jmo0x8lyhzxvckmqwh">
+      <w:hyperlink w:history="1" r:id="rIddeqzc86v7ktkx3ao_rsm9">
         <w:r>
           <w:rPr>
             <w:rStyle w:val="Hyperlink"/>

</xml_diff>

<commit_message>
Journal : passerelle d'IA rattachée à la phase 38
Co-Authored-By: Claude Opus 5.5 <noreply@anthropic.com>
</commit_message>
<xml_diff>
--- a/docs/developpement/phases/word/PHASE_00_SOCLE_DE_PRODUCTION_ET_CONFIGURATION_DUN_LIEU_VIDE.docx
+++ b/docs/developpement/phases/word/PHASE_00_SOCLE_DE_PRODUCTION_ET_CONFIGURATION_DUN_LIEU_VIDE.docx
@@ -20,7 +20,7 @@
       <w:r>
         <w:t xml:space="preserve">FlaiX Expert · dossier de développement · généré le 2026-10-04 depuis le dépôt </w:t>
       </w:r>
-      <w:hyperlink w:history="1" r:id="rIdsnakqs5dsy95bm897cdvw">
+      <w:hyperlink w:history="1" r:id="rIdnrgbwszp0yh6o1qkpbc1v">
         <w:r>
           <w:rPr>
             <w:rStyle w:val="Hyperlink"/>
@@ -592,7 +592,7 @@
           <w:numId w:val="3"/>
         </w:numPr>
       </w:pPr>
-      <w:hyperlink w:history="1" r:id="rIdh2nfvcel8vfqbaar3ev13">
+      <w:hyperlink w:history="1" r:id="rIdstdrmvwuva2_exfrxlhip">
         <w:r>
           <w:rPr>
             <w:rStyle w:val="Hyperlink"/>
@@ -612,7 +612,7 @@
           <w:numId w:val="3"/>
         </w:numPr>
       </w:pPr>
-      <w:hyperlink w:history="1" r:id="rIduryvnvpljkhkmnarjfz8k">
+      <w:hyperlink w:history="1" r:id="rIdl4dx9ysdjc5jpxppll0ih">
         <w:r>
           <w:rPr>
             <w:rStyle w:val="Hyperlink"/>
@@ -660,7 +660,7 @@
       <w:r>
         <w:t xml:space="preserve"> — créé — </w:t>
       </w:r>
-      <w:hyperlink w:history="1" r:id="rIdatevikztbdsyovqtbl11c">
+      <w:hyperlink w:history="1" r:id="rIdvjambus0fj2kvziydelid">
         <w:r>
           <w:rPr>
             <w:rStyle w:val="Hyperlink"/>
@@ -689,7 +689,7 @@
       <w:r>
         <w:t xml:space="preserve"> — créé — </w:t>
       </w:r>
-      <w:hyperlink w:history="1" r:id="rIdiu93zvcelkcvt32ycoj88">
+      <w:hyperlink w:history="1" r:id="rIdylvn49mqavjxn7gogoust">
         <w:r>
           <w:rPr>
             <w:rStyle w:val="Hyperlink"/>
@@ -726,7 +726,7 @@
       <w:r>
         <w:t xml:space="preserve"> — créé — </w:t>
       </w:r>
-      <w:hyperlink w:history="1" r:id="rId2-ycs5ajiyngf02u780yd">
+      <w:hyperlink w:history="1" r:id="rId3evh-2uarzgokuhaehgxi">
         <w:r>
           <w:rPr>
             <w:rStyle w:val="Hyperlink"/>
@@ -755,7 +755,7 @@
       <w:r>
         <w:t xml:space="preserve"> — créé — </w:t>
       </w:r>
-      <w:hyperlink w:history="1" r:id="rIdskmjdwpvnsbi7613tjxvu">
+      <w:hyperlink w:history="1" r:id="rIda79d4ybc53jc8fuzun2rp">
         <w:r>
           <w:rPr>
             <w:rStyle w:val="Hyperlink"/>
@@ -784,7 +784,7 @@
       <w:r>
         <w:t xml:space="preserve"> — créé — </w:t>
       </w:r>
-      <w:hyperlink w:history="1" r:id="rIdqnp_5iwxljuonltri4x2l">
+      <w:hyperlink w:history="1" r:id="rIdii0d6mmuxvhnayok_lycl">
         <w:r>
           <w:rPr>
             <w:rStyle w:val="Hyperlink"/>
@@ -813,7 +813,7 @@
       <w:r>
         <w:t xml:space="preserve"> — créé — </w:t>
       </w:r>
-      <w:hyperlink w:history="1" r:id="rIdbrfehxqshqucwahsr4xs0">
+      <w:hyperlink w:history="1" r:id="rIdznisfi12oy7k8vydin4eo">
         <w:r>
           <w:rPr>
             <w:rStyle w:val="Hyperlink"/>
@@ -842,7 +842,7 @@
       <w:r>
         <w:t xml:space="preserve"> — créé — </w:t>
       </w:r>
-      <w:hyperlink w:history="1" r:id="rIdnp9kg5x7vmbnlh33rhfvq">
+      <w:hyperlink w:history="1" r:id="rIdzbvsnafx3hwcwy1q3wllw">
         <w:r>
           <w:rPr>
             <w:rStyle w:val="Hyperlink"/>
@@ -879,7 +879,7 @@
       <w:r>
         <w:t xml:space="preserve"> — créé — </w:t>
       </w:r>
-      <w:hyperlink w:history="1" r:id="rId4iu97s5f9c37xqvzj3atj">
+      <w:hyperlink w:history="1" r:id="rIdjxzneg02wz_i1kw8ibwpj">
         <w:r>
           <w:rPr>
             <w:rStyle w:val="Hyperlink"/>
@@ -908,7 +908,7 @@
       <w:r>
         <w:t xml:space="preserve"> — créé — </w:t>
       </w:r>
-      <w:hyperlink w:history="1" r:id="rIdev4ldrpiwb6zqrjtqbciw">
+      <w:hyperlink w:history="1" r:id="rIdin4s6nhrdmoix5jpswfj-">
         <w:r>
           <w:rPr>
             <w:rStyle w:val="Hyperlink"/>
@@ -937,7 +937,7 @@
       <w:r>
         <w:t xml:space="preserve"> — créé — </w:t>
       </w:r>
-      <w:hyperlink w:history="1" r:id="rIdvuj2ddbb6toujdxm2zrka">
+      <w:hyperlink w:history="1" r:id="rId2mtt3yjebvks_lnsooosg">
         <w:r>
           <w:rPr>
             <w:rStyle w:val="Hyperlink"/>
@@ -966,7 +966,7 @@
       <w:r>
         <w:t xml:space="preserve"> — créé — </w:t>
       </w:r>
-      <w:hyperlink w:history="1" r:id="rIdgppfk61mznuefodit0atw">
+      <w:hyperlink w:history="1" r:id="rId80bnqdlost35v7fers0i4">
         <w:r>
           <w:rPr>
             <w:rStyle w:val="Hyperlink"/>
@@ -995,7 +995,7 @@
       <w:r>
         <w:t xml:space="preserve"> — créé — </w:t>
       </w:r>
-      <w:hyperlink w:history="1" r:id="rId5gvwzfyrgcxrx95cktos0">
+      <w:hyperlink w:history="1" r:id="rIdimiuld9kllthsvfy9-xw7">
         <w:r>
           <w:rPr>
             <w:rStyle w:val="Hyperlink"/>
@@ -1024,7 +1024,7 @@
       <w:r>
         <w:t xml:space="preserve"> — créé — </w:t>
       </w:r>
-      <w:hyperlink w:history="1" r:id="rIdopio7iya5kqoo-pqb--sb">
+      <w:hyperlink w:history="1" r:id="rIddlpvyfhqrpa1ygfoxmbkm">
         <w:r>
           <w:rPr>
             <w:rStyle w:val="Hyperlink"/>
@@ -1053,7 +1053,7 @@
       <w:r>
         <w:t xml:space="preserve"> — créé — </w:t>
       </w:r>
-      <w:hyperlink w:history="1" r:id="rIdasihvkz5dmvjwbu_3u4jd">
+      <w:hyperlink w:history="1" r:id="rIdaj18xpg7njncxydtydztz">
         <w:r>
           <w:rPr>
             <w:rStyle w:val="Hyperlink"/>
@@ -1082,7 +1082,7 @@
       <w:r>
         <w:t xml:space="preserve"> — créé — </w:t>
       </w:r>
-      <w:hyperlink w:history="1" r:id="rIdjnvmfebpg0bvknjom7qp-">
+      <w:hyperlink w:history="1" r:id="rIdvcdxwnt7fe3zlnaxrzqmy">
         <w:r>
           <w:rPr>
             <w:rStyle w:val="Hyperlink"/>
@@ -1111,7 +1111,7 @@
       <w:r>
         <w:t xml:space="preserve"> — créé — </w:t>
       </w:r>
-      <w:hyperlink w:history="1" r:id="rIdrcg1g1ilehf-meohlvhvy">
+      <w:hyperlink w:history="1" r:id="rIdeehldnn8iiyakfdzgrapj">
         <w:r>
           <w:rPr>
             <w:rStyle w:val="Hyperlink"/>
@@ -1148,7 +1148,7 @@
       <w:r>
         <w:t xml:space="preserve"> — créé — </w:t>
       </w:r>
-      <w:hyperlink w:history="1" r:id="rIdlmm6rektr_bcdnpnzmeuo">
+      <w:hyperlink w:history="1" r:id="rIdx-eszqdkmnjm3uyxekclr">
         <w:r>
           <w:rPr>
             <w:rStyle w:val="Hyperlink"/>
@@ -1177,7 +1177,7 @@
       <w:r>
         <w:t xml:space="preserve"> — créé — </w:t>
       </w:r>
-      <w:hyperlink w:history="1" r:id="rIdf4kdguinlfjkglg1ua5g4">
+      <w:hyperlink w:history="1" r:id="rIdlqmmz54fl6crf3gh-dfsy">
         <w:r>
           <w:rPr>
             <w:rStyle w:val="Hyperlink"/>
@@ -1206,7 +1206,7 @@
       <w:r>
         <w:t xml:space="preserve"> — créé — </w:t>
       </w:r>
-      <w:hyperlink w:history="1" r:id="rIdi8jdynkfxrua9me1xshfu">
+      <w:hyperlink w:history="1" r:id="rIdzhatbaysvp7bqra9m8sb0">
         <w:r>
           <w:rPr>
             <w:rStyle w:val="Hyperlink"/>
@@ -1235,7 +1235,7 @@
       <w:r>
         <w:t xml:space="preserve"> — créé — </w:t>
       </w:r>
-      <w:hyperlink w:history="1" r:id="rIdthwrcxtuoxxiz7atmfobn">
+      <w:hyperlink w:history="1" r:id="rIdhqjslfmq-sxcczcgydidn">
         <w:r>
           <w:rPr>
             <w:rStyle w:val="Hyperlink"/>
@@ -1264,7 +1264,7 @@
       <w:r>
         <w:t xml:space="preserve"> — créé — </w:t>
       </w:r>
-      <w:hyperlink w:history="1" r:id="rIdeqm3feluaaltnx4zxwse6">
+      <w:hyperlink w:history="1" r:id="rId8nqrk80ntmyvibm6vo135">
         <w:r>
           <w:rPr>
             <w:rStyle w:val="Hyperlink"/>
@@ -1293,7 +1293,7 @@
       <w:r>
         <w:t xml:space="preserve"> — créé — </w:t>
       </w:r>
-      <w:hyperlink w:history="1" r:id="rIdypn6zv4zcwrdpa_vzjxyc">
+      <w:hyperlink w:history="1" r:id="rIde9z1_lmnnqmwalswtnoyw">
         <w:r>
           <w:rPr>
             <w:rStyle w:val="Hyperlink"/>
@@ -1322,7 +1322,7 @@
       <w:r>
         <w:t xml:space="preserve"> — créé — </w:t>
       </w:r>
-      <w:hyperlink w:history="1" r:id="rIdmwu70apkpv1nfvsuvbaxp">
+      <w:hyperlink w:history="1" r:id="rIdepvq_6xawdjounn2ooqng">
         <w:r>
           <w:rPr>
             <w:rStyle w:val="Hyperlink"/>
@@ -1351,7 +1351,7 @@
       <w:r>
         <w:t xml:space="preserve"> — créé — </w:t>
       </w:r>
-      <w:hyperlink w:history="1" r:id="rIds71x4ia26p3yliser5o76">
+      <w:hyperlink w:history="1" r:id="rIdlakw2qtmqrgm0fkfeo8r_">
         <w:r>
           <w:rPr>
             <w:rStyle w:val="Hyperlink"/>
@@ -1380,7 +1380,7 @@
       <w:r>
         <w:t xml:space="preserve"> — créé — </w:t>
       </w:r>
-      <w:hyperlink w:history="1" r:id="rIdl0nqnjhf1opujrs2fox1z">
+      <w:hyperlink w:history="1" r:id="rIdrecrsa5j0zc4wmpceln04">
         <w:r>
           <w:rPr>
             <w:rStyle w:val="Hyperlink"/>
@@ -1409,7 +1409,7 @@
       <w:r>
         <w:t xml:space="preserve"> — créé — </w:t>
       </w:r>
-      <w:hyperlink w:history="1" r:id="rIdwrw870hv5bt3aoatjencq">
+      <w:hyperlink w:history="1" r:id="rIduibbi6wkcua_cybh46geh">
         <w:r>
           <w:rPr>
             <w:rStyle w:val="Hyperlink"/>
@@ -1438,7 +1438,7 @@
       <w:r>
         <w:t xml:space="preserve"> — créé — </w:t>
       </w:r>
-      <w:hyperlink w:history="1" r:id="rIdrdkhwnfrp-oqbpynr61ld">
+      <w:hyperlink w:history="1" r:id="rIdq6yqmfck6b6x9ra1fhvha">
         <w:r>
           <w:rPr>
             <w:rStyle w:val="Hyperlink"/>
@@ -1467,7 +1467,7 @@
       <w:r>
         <w:t xml:space="preserve"> — créé — </w:t>
       </w:r>
-      <w:hyperlink w:history="1" r:id="rIdqre_znu6qjmm7ycenmyry">
+      <w:hyperlink w:history="1" r:id="rIdadhdfap-nqi6dwloog45z">
         <w:r>
           <w:rPr>
             <w:rStyle w:val="Hyperlink"/>
@@ -1496,7 +1496,7 @@
       <w:r>
         <w:t xml:space="preserve"> — créé — </w:t>
       </w:r>
-      <w:hyperlink w:history="1" r:id="rIdqijl9vt23k2cze9nz0yro">
+      <w:hyperlink w:history="1" r:id="rIda00imswv04jht4ponymlo">
         <w:r>
           <w:rPr>
             <w:rStyle w:val="Hyperlink"/>
@@ -1525,7 +1525,7 @@
       <w:r>
         <w:t xml:space="preserve"> — créé — </w:t>
       </w:r>
-      <w:hyperlink w:history="1" r:id="rIdxhqw4k66drc6ehvttd79m">
+      <w:hyperlink w:history="1" r:id="rIdqrlplhykjsgznv5ozhvdv">
         <w:r>
           <w:rPr>
             <w:rStyle w:val="Hyperlink"/>
@@ -1554,7 +1554,7 @@
       <w:r>
         <w:t xml:space="preserve"> — créé — </w:t>
       </w:r>
-      <w:hyperlink w:history="1" r:id="rIdfykf2n5pknzpmd1haytvd">
+      <w:hyperlink w:history="1" r:id="rId6h3xdq3m-jfsfchs1czsp">
         <w:r>
           <w:rPr>
             <w:rStyle w:val="Hyperlink"/>
@@ -1583,7 +1583,7 @@
       <w:r>
         <w:t xml:space="preserve"> — créé — </w:t>
       </w:r>
-      <w:hyperlink w:history="1" r:id="rIduowfxuvqvdrkczbubg3ey">
+      <w:hyperlink w:history="1" r:id="rId3ea0jynnpenqfvslfd-nx">
         <w:r>
           <w:rPr>
             <w:rStyle w:val="Hyperlink"/>
@@ -1612,7 +1612,7 @@
       <w:r>
         <w:t xml:space="preserve"> — créé — </w:t>
       </w:r>
-      <w:hyperlink w:history="1" r:id="rIdwct1aff_gzwcmtxaatzye">
+      <w:hyperlink w:history="1" r:id="rIdd_q7ct3e4k5rxpadn2uff">
         <w:r>
           <w:rPr>
             <w:rStyle w:val="Hyperlink"/>
@@ -1641,7 +1641,7 @@
       <w:r>
         <w:t xml:space="preserve"> — créé — </w:t>
       </w:r>
-      <w:hyperlink w:history="1" r:id="rIdyjaaffr6xud0vw4vwzj8e">
+      <w:hyperlink w:history="1" r:id="rIdo-wmpl6fu_-lyg3seckia">
         <w:r>
           <w:rPr>
             <w:rStyle w:val="Hyperlink"/>
@@ -1670,7 +1670,7 @@
       <w:r>
         <w:t xml:space="preserve"> — créé — </w:t>
       </w:r>
-      <w:hyperlink w:history="1" r:id="rId53wjp-19mzs6tpgmekzyj">
+      <w:hyperlink w:history="1" r:id="rIdhqdzl6lcghbzlqr458oki">
         <w:r>
           <w:rPr>
             <w:rStyle w:val="Hyperlink"/>
@@ -1699,7 +1699,7 @@
       <w:r>
         <w:t xml:space="preserve"> — créé — </w:t>
       </w:r>
-      <w:hyperlink w:history="1" r:id="rIdlpciqyoyoorwti1tarwen">
+      <w:hyperlink w:history="1" r:id="rIdzevyckvpkpthyvjrysmal">
         <w:r>
           <w:rPr>
             <w:rStyle w:val="Hyperlink"/>
@@ -1728,7 +1728,7 @@
       <w:r>
         <w:t xml:space="preserve"> — créé — </w:t>
       </w:r>
-      <w:hyperlink w:history="1" r:id="rIdk1jmk7chqilmvfxryn6tb">
+      <w:hyperlink w:history="1" r:id="rIdjm3rtlsyyoun20lcnl7cm">
         <w:r>
           <w:rPr>
             <w:rStyle w:val="Hyperlink"/>
@@ -1757,7 +1757,7 @@
       <w:r>
         <w:t xml:space="preserve"> — créé — </w:t>
       </w:r>
-      <w:hyperlink w:history="1" r:id="rIdv1xifi2n5xckntzlehv4r">
+      <w:hyperlink w:history="1" r:id="rIdytowdgvkyairzfsisrrgg">
         <w:r>
           <w:rPr>
             <w:rStyle w:val="Hyperlink"/>
@@ -1786,7 +1786,7 @@
       <w:r>
         <w:t xml:space="preserve"> — créé — </w:t>
       </w:r>
-      <w:hyperlink w:history="1" r:id="rIdorcjxjx_hbgikphwypoza">
+      <w:hyperlink w:history="1" r:id="rIdxcmiwntggb-du8sircx5p">
         <w:r>
           <w:rPr>
             <w:rStyle w:val="Hyperlink"/>
@@ -1823,7 +1823,7 @@
       <w:r>
         <w:t xml:space="preserve"> — créé — </w:t>
       </w:r>
-      <w:hyperlink w:history="1" r:id="rIdq5qvaa22_a7kjk_ync-g0">
+      <w:hyperlink w:history="1" r:id="rIdlkr_bnk4gz60x2fvqv24n">
         <w:r>
           <w:rPr>
             <w:rStyle w:val="Hyperlink"/>
@@ -1852,7 +1852,7 @@
       <w:r>
         <w:t xml:space="preserve"> — créé — </w:t>
       </w:r>
-      <w:hyperlink w:history="1" r:id="rId6jbgiap6ovgplgowgn1le">
+      <w:hyperlink w:history="1" r:id="rIde-vmtumacweyedjqmlict">
         <w:r>
           <w:rPr>
             <w:rStyle w:val="Hyperlink"/>
@@ -1881,7 +1881,7 @@
       <w:r>
         <w:t xml:space="preserve"> — créé — </w:t>
       </w:r>
-      <w:hyperlink w:history="1" r:id="rId3qztlaes8qnfnoe29sxys">
+      <w:hyperlink w:history="1" r:id="rIdrbrpo9ajyh_ztakzg-fnl">
         <w:r>
           <w:rPr>
             <w:rStyle w:val="Hyperlink"/>
@@ -1910,7 +1910,7 @@
       <w:r>
         <w:t xml:space="preserve"> — créé — </w:t>
       </w:r>
-      <w:hyperlink w:history="1" r:id="rId-mcjpo40xbnk1oo0iqfda">
+      <w:hyperlink w:history="1" r:id="rIdryxl9o8ivowqawsihlgtf">
         <w:r>
           <w:rPr>
             <w:rStyle w:val="Hyperlink"/>
@@ -1939,7 +1939,7 @@
       <w:r>
         <w:t xml:space="preserve"> — créé — </w:t>
       </w:r>
-      <w:hyperlink w:history="1" r:id="rIdc2f0n390mduxxtcakqaai">
+      <w:hyperlink w:history="1" r:id="rId-yss7ihwdosgdk15xv-lg">
         <w:r>
           <w:rPr>
             <w:rStyle w:val="Hyperlink"/>
@@ -1968,7 +1968,7 @@
       <w:r>
         <w:t xml:space="preserve"> — créé — </w:t>
       </w:r>
-      <w:hyperlink w:history="1" r:id="rIdd5h4xhtn6y0zz_anbvfrk">
+      <w:hyperlink w:history="1" r:id="rIdf9kv1e0dozgyuvqel_6s5">
         <w:r>
           <w:rPr>
             <w:rStyle w:val="Hyperlink"/>
@@ -1997,7 +1997,7 @@
       <w:r>
         <w:t xml:space="preserve"> — créé — </w:t>
       </w:r>
-      <w:hyperlink w:history="1" r:id="rIdk_sw96hp0rschpt1biym1">
+      <w:hyperlink w:history="1" r:id="rIdz31g-mrtfizfeyde9pc1i">
         <w:r>
           <w:rPr>
             <w:rStyle w:val="Hyperlink"/>
@@ -2026,7 +2026,7 @@
       <w:r>
         <w:t xml:space="preserve"> — créé — </w:t>
       </w:r>
-      <w:hyperlink w:history="1" r:id="rIdewfeocuhrtg9x95f2bfxn">
+      <w:hyperlink w:history="1" r:id="rIdnzkficpsu6f6iyewy2zaz">
         <w:r>
           <w:rPr>
             <w:rStyle w:val="Hyperlink"/>
@@ -2139,7 +2139,7 @@
       <w:r>
         <w:t xml:space="preserve"> — créé — </w:t>
       </w:r>
-      <w:hyperlink w:history="1" r:id="rIdw_ezpw6vesohc4ip5qwx3">
+      <w:hyperlink w:history="1" r:id="rIdbx76id8hbs4klkcvm68hj">
         <w:r>
           <w:rPr>
             <w:rStyle w:val="Hyperlink"/>
@@ -2189,7 +2189,7 @@
       <w:r>
         <w:t xml:space="preserve"> — créé — </w:t>
       </w:r>
-      <w:hyperlink w:history="1" r:id="rIdntmatikrf0hypxsgzqd8m">
+      <w:hyperlink w:history="1" r:id="rIdnje1oigsijneb2scpnpom">
         <w:r>
           <w:rPr>
             <w:rStyle w:val="Hyperlink"/>
@@ -2218,7 +2218,7 @@
       <w:r>
         <w:t xml:space="preserve"> — créé — </w:t>
       </w:r>
-      <w:hyperlink w:history="1" r:id="rIdxog2inaivhncrskq-tcog">
+      <w:hyperlink w:history="1" r:id="rId0ve6ek7ohcbmurevbyouo">
         <w:r>
           <w:rPr>
             <w:rStyle w:val="Hyperlink"/>
@@ -2247,7 +2247,7 @@
       <w:r>
         <w:t xml:space="preserve"> — créé — </w:t>
       </w:r>
-      <w:hyperlink w:history="1" r:id="rIdoduucnsntnnqdznw-2x6q">
+      <w:hyperlink w:history="1" r:id="rIdajmndl0crgki-ckkiqisc">
         <w:r>
           <w:rPr>
             <w:rStyle w:val="Hyperlink"/>
@@ -2276,7 +2276,7 @@
       <w:r>
         <w:t xml:space="preserve"> — créé — </w:t>
       </w:r>
-      <w:hyperlink w:history="1" r:id="rId2npy8yxsmbqducroxigef">
+      <w:hyperlink w:history="1" r:id="rIdmctejol4sp1z6j24htac9">
         <w:r>
           <w:rPr>
             <w:rStyle w:val="Hyperlink"/>
@@ -2313,7 +2313,7 @@
       <w:r>
         <w:t xml:space="preserve"> — créé — </w:t>
       </w:r>
-      <w:hyperlink w:history="1" r:id="rIdyywzza1eohep6_126soiw">
+      <w:hyperlink w:history="1" r:id="rIdfvqw1ikelmthrby-mgimw">
         <w:r>
           <w:rPr>
             <w:rStyle w:val="Hyperlink"/>
@@ -2342,7 +2342,7 @@
       <w:r>
         <w:t xml:space="preserve"> — créé — </w:t>
       </w:r>
-      <w:hyperlink w:history="1" r:id="rIdkgvbe4knbnw_wuubgc4ay">
+      <w:hyperlink w:history="1" r:id="rIdyoomnzx9civbzjxvmhdzp">
         <w:r>
           <w:rPr>
             <w:rStyle w:val="Hyperlink"/>
@@ -2379,7 +2379,7 @@
       <w:r>
         <w:t xml:space="preserve"> — créé — </w:t>
       </w:r>
-      <w:hyperlink w:history="1" r:id="rIdkqkoqn8whgpol0lilkddj">
+      <w:hyperlink w:history="1" r:id="rIdemkg6w8vi0ttjdawijgir">
         <w:r>
           <w:rPr>
             <w:rStyle w:val="Hyperlink"/>
@@ -2408,7 +2408,7 @@
       <w:r>
         <w:t xml:space="preserve"> — créé — </w:t>
       </w:r>
-      <w:hyperlink w:history="1" r:id="rIdk8xerdsspih60u6jcubgp">
+      <w:hyperlink w:history="1" r:id="rIdsyqio4qedw5dm8danod3x">
         <w:r>
           <w:rPr>
             <w:rStyle w:val="Hyperlink"/>
@@ -2437,7 +2437,7 @@
       <w:r>
         <w:t xml:space="preserve"> — créé — </w:t>
       </w:r>
-      <w:hyperlink w:history="1" r:id="rIdjp4f3kp_k5ffzwfyzwll9">
+      <w:hyperlink w:history="1" r:id="rIdysr3sowjjviqqfeut-3sq">
         <w:r>
           <w:rPr>
             <w:rStyle w:val="Hyperlink"/>
@@ -2466,7 +2466,7 @@
       <w:r>
         <w:t xml:space="preserve"> — créé — </w:t>
       </w:r>
-      <w:hyperlink w:history="1" r:id="rIdgtt9glkh7jcq4qrvah42u">
+      <w:hyperlink w:history="1" r:id="rIdv-sy1mp4jlcxf6kadxflo">
         <w:r>
           <w:rPr>
             <w:rStyle w:val="Hyperlink"/>
@@ -2495,7 +2495,7 @@
       <w:r>
         <w:t xml:space="preserve"> — créé — </w:t>
       </w:r>
-      <w:hyperlink w:history="1" r:id="rIdxs1so18zaezrog69srhmk">
+      <w:hyperlink w:history="1" r:id="rIdsiovk2-yd08gtfueg4g31">
         <w:r>
           <w:rPr>
             <w:rStyle w:val="Hyperlink"/>
@@ -2524,7 +2524,7 @@
       <w:r>
         <w:t xml:space="preserve"> — créé — </w:t>
       </w:r>
-      <w:hyperlink w:history="1" r:id="rIdzhvirc-szhtjnle5tkbb2">
+      <w:hyperlink w:history="1" r:id="rId-cl0yehxqcp_4tib8plz8">
         <w:r>
           <w:rPr>
             <w:rStyle w:val="Hyperlink"/>
@@ -2553,7 +2553,7 @@
       <w:r>
         <w:t xml:space="preserve"> — créé — </w:t>
       </w:r>
-      <w:hyperlink w:history="1" r:id="rId8r59vbzdtivh7oxt34hpe">
+      <w:hyperlink w:history="1" r:id="rIdgf9ffpftq0ta5hahbom69">
         <w:r>
           <w:rPr>
             <w:rStyle w:val="Hyperlink"/>
@@ -2582,7 +2582,7 @@
       <w:r>
         <w:t xml:space="preserve"> — créé — </w:t>
       </w:r>
-      <w:hyperlink w:history="1" r:id="rId6sqvakwwngmo8cc1rgmcp">
+      <w:hyperlink w:history="1" r:id="rIdarialaig0fsi7r_o5hco5">
         <w:r>
           <w:rPr>
             <w:rStyle w:val="Hyperlink"/>
@@ -2611,7 +2611,7 @@
       <w:r>
         <w:t xml:space="preserve"> — créé — </w:t>
       </w:r>
-      <w:hyperlink w:history="1" r:id="rId3maemobcu3w-igbgerrzs">
+      <w:hyperlink w:history="1" r:id="rIdxuvojqp78z1ee6uleflp3">
         <w:r>
           <w:rPr>
             <w:rStyle w:val="Hyperlink"/>
@@ -2648,7 +2648,7 @@
       <w:r>
         <w:t xml:space="preserve"> — créé — </w:t>
       </w:r>
-      <w:hyperlink w:history="1" r:id="rIdzrxxiudenfnddjnqizcg8">
+      <w:hyperlink w:history="1" r:id="rIdz0dmtjryt4yflwzzwrhtf">
         <w:r>
           <w:rPr>
             <w:rStyle w:val="Hyperlink"/>
@@ -2677,7 +2677,7 @@
       <w:r>
         <w:t xml:space="preserve"> — créé — </w:t>
       </w:r>
-      <w:hyperlink w:history="1" r:id="rIdrcqh8xrradnybp0ktd_qd">
+      <w:hyperlink w:history="1" r:id="rIdkr1pqtesj2xek7anpvt_0">
         <w:r>
           <w:rPr>
             <w:rStyle w:val="Hyperlink"/>
@@ -2706,7 +2706,7 @@
       <w:r>
         <w:t xml:space="preserve"> — créé — </w:t>
       </w:r>
-      <w:hyperlink w:history="1" r:id="rId41schyoj9ac57lkizhi-c">
+      <w:hyperlink w:history="1" r:id="rIdfs5xgf7gopxw6mcmo-6bg">
         <w:r>
           <w:rPr>
             <w:rStyle w:val="Hyperlink"/>
@@ -2735,7 +2735,7 @@
       <w:r>
         <w:t xml:space="preserve"> — créé — </w:t>
       </w:r>
-      <w:hyperlink w:history="1" r:id="rId5oo-hhq5waomw1ajc58p6">
+      <w:hyperlink w:history="1" r:id="rIdgh_pdc2dui74lpk4-ro9a">
         <w:r>
           <w:rPr>
             <w:rStyle w:val="Hyperlink"/>
@@ -2764,7 +2764,7 @@
       <w:r>
         <w:t xml:space="preserve"> — créé — </w:t>
       </w:r>
-      <w:hyperlink w:history="1" r:id="rIdoeqazhombkkmoqodogvvx">
+      <w:hyperlink w:history="1" r:id="rIdrxor5wtikqbwikbofnz0z">
         <w:r>
           <w:rPr>
             <w:rStyle w:val="Hyperlink"/>
@@ -2793,7 +2793,7 @@
       <w:r>
         <w:t xml:space="preserve"> — créé — </w:t>
       </w:r>
-      <w:hyperlink w:history="1" r:id="rId47pemrbmpnenqzh7sgtma">
+      <w:hyperlink w:history="1" r:id="rIdccs8zzy48c4hbryicq93w">
         <w:r>
           <w:rPr>
             <w:rStyle w:val="Hyperlink"/>
@@ -2822,7 +2822,7 @@
       <w:r>
         <w:t xml:space="preserve"> — créé — </w:t>
       </w:r>
-      <w:hyperlink w:history="1" r:id="rIdrvwfb7dbnrylgvechulld">
+      <w:hyperlink w:history="1" r:id="rIdb_-mawxp3ytjja4zxstve">
         <w:r>
           <w:rPr>
             <w:rStyle w:val="Hyperlink"/>
@@ -2851,7 +2851,7 @@
       <w:r>
         <w:t xml:space="preserve"> — créé — </w:t>
       </w:r>
-      <w:hyperlink w:history="1" r:id="rIddeqzc86v7ktkx3ao_rsm9">
+      <w:hyperlink w:history="1" r:id="rId6-lcr6wwjfxgv9gtjzc3j">
         <w:r>
           <w:rPr>
             <w:rStyle w:val="Hyperlink"/>

</xml_diff>

<commit_message>
Documentation de reprise : guide pour un développeur (Markdown et Word), carte du code complète, fiches des 67 phases régénérées
Co-Authored-By: Claude Opus 5.5 <noreply@anthropic.com>
</commit_message>
<xml_diff>
--- a/docs/developpement/phases/word/PHASE_00_SOCLE_DE_PRODUCTION_ET_CONFIGURATION_DUN_LIEU_VIDE.docx
+++ b/docs/developpement/phases/word/PHASE_00_SOCLE_DE_PRODUCTION_ET_CONFIGURATION_DUN_LIEU_VIDE.docx
@@ -18,9 +18,9 @@
         <w:shd w:fill="F6F3FF" w:color="auto" w:val="clear"/>
       </w:pPr>
       <w:r>
-        <w:t xml:space="preserve">FlaiX Expert · dossier de développement · généré le 2026-10-04 depuis le dépôt </w:t>
-      </w:r>
-      <w:hyperlink w:history="1" r:id="rIdnrgbwszp0yh6o1qkpbc1v">
+        <w:t xml:space="preserve">FlaiX Expert · dossier de développement · généré le 2026-10-19 depuis le dépôt </w:t>
+      </w:r>
+      <w:hyperlink w:history="1" r:id="rIdowhrl6bxck0-of_j1tush">
         <w:r>
           <w:rPr>
             <w:rStyle w:val="Hyperlink"/>
@@ -592,7 +592,7 @@
           <w:numId w:val="3"/>
         </w:numPr>
       </w:pPr>
-      <w:hyperlink w:history="1" r:id="rIdstdrmvwuva2_exfrxlhip">
+      <w:hyperlink w:history="1" r:id="rIdcf008cmuqmmci-ftemy8m">
         <w:r>
           <w:rPr>
             <w:rStyle w:val="Hyperlink"/>
@@ -612,7 +612,7 @@
           <w:numId w:val="3"/>
         </w:numPr>
       </w:pPr>
-      <w:hyperlink w:history="1" r:id="rIdl4dx9ysdjc5jpxppll0ih">
+      <w:hyperlink w:history="1" r:id="rIdr1vlz_31o1gl6m4-x_f5u">
         <w:r>
           <w:rPr>
             <w:rStyle w:val="Hyperlink"/>
@@ -660,7 +660,7 @@
       <w:r>
         <w:t xml:space="preserve"> — créé — </w:t>
       </w:r>
-      <w:hyperlink w:history="1" r:id="rIdvjambus0fj2kvziydelid">
+      <w:hyperlink w:history="1" r:id="rIdrngdohyzgmy-umumcaofu">
         <w:r>
           <w:rPr>
             <w:rStyle w:val="Hyperlink"/>
@@ -689,7 +689,7 @@
       <w:r>
         <w:t xml:space="preserve"> — créé — </w:t>
       </w:r>
-      <w:hyperlink w:history="1" r:id="rIdylvn49mqavjxn7gogoust">
+      <w:hyperlink w:history="1" r:id="rIddacviyfotw9fmhi5iopzg">
         <w:r>
           <w:rPr>
             <w:rStyle w:val="Hyperlink"/>
@@ -726,7 +726,7 @@
       <w:r>
         <w:t xml:space="preserve"> — créé — </w:t>
       </w:r>
-      <w:hyperlink w:history="1" r:id="rId3evh-2uarzgokuhaehgxi">
+      <w:hyperlink w:history="1" r:id="rId3sd1xuxspi0k2ziqiqilq">
         <w:r>
           <w:rPr>
             <w:rStyle w:val="Hyperlink"/>
@@ -755,7 +755,7 @@
       <w:r>
         <w:t xml:space="preserve"> — créé — </w:t>
       </w:r>
-      <w:hyperlink w:history="1" r:id="rIda79d4ybc53jc8fuzun2rp">
+      <w:hyperlink w:history="1" r:id="rIdu19ymhhwfn3wlnghj8qrg">
         <w:r>
           <w:rPr>
             <w:rStyle w:val="Hyperlink"/>
@@ -784,7 +784,7 @@
       <w:r>
         <w:t xml:space="preserve"> — créé — </w:t>
       </w:r>
-      <w:hyperlink w:history="1" r:id="rIdii0d6mmuxvhnayok_lycl">
+      <w:hyperlink w:history="1" r:id="rIdr8nktrqdgyff-5o3uku-z">
         <w:r>
           <w:rPr>
             <w:rStyle w:val="Hyperlink"/>
@@ -813,7 +813,7 @@
       <w:r>
         <w:t xml:space="preserve"> — créé — </w:t>
       </w:r>
-      <w:hyperlink w:history="1" r:id="rIdznisfi12oy7k8vydin4eo">
+      <w:hyperlink w:history="1" r:id="rIdhbrws7l99tagonp1e1spu">
         <w:r>
           <w:rPr>
             <w:rStyle w:val="Hyperlink"/>
@@ -842,7 +842,7 @@
       <w:r>
         <w:t xml:space="preserve"> — créé — </w:t>
       </w:r>
-      <w:hyperlink w:history="1" r:id="rIdzbvsnafx3hwcwy1q3wllw">
+      <w:hyperlink w:history="1" r:id="rIdcwmegavrqkzsiv_ewfpi9">
         <w:r>
           <w:rPr>
             <w:rStyle w:val="Hyperlink"/>
@@ -879,7 +879,7 @@
       <w:r>
         <w:t xml:space="preserve"> — créé — </w:t>
       </w:r>
-      <w:hyperlink w:history="1" r:id="rIdjxzneg02wz_i1kw8ibwpj">
+      <w:hyperlink w:history="1" r:id="rIdgvkiactwj4z7iocgztfk2">
         <w:r>
           <w:rPr>
             <w:rStyle w:val="Hyperlink"/>
@@ -908,7 +908,7 @@
       <w:r>
         <w:t xml:space="preserve"> — créé — </w:t>
       </w:r>
-      <w:hyperlink w:history="1" r:id="rIdin4s6nhrdmoix5jpswfj-">
+      <w:hyperlink w:history="1" r:id="rIdx0ojhn82nlzpujxnn-7go">
         <w:r>
           <w:rPr>
             <w:rStyle w:val="Hyperlink"/>
@@ -937,7 +937,7 @@
       <w:r>
         <w:t xml:space="preserve"> — créé — </w:t>
       </w:r>
-      <w:hyperlink w:history="1" r:id="rId2mtt3yjebvks_lnsooosg">
+      <w:hyperlink w:history="1" r:id="rIdinypbx1-itsekvnyb07uj">
         <w:r>
           <w:rPr>
             <w:rStyle w:val="Hyperlink"/>
@@ -966,7 +966,7 @@
       <w:r>
         <w:t xml:space="preserve"> — créé — </w:t>
       </w:r>
-      <w:hyperlink w:history="1" r:id="rId80bnqdlost35v7fers0i4">
+      <w:hyperlink w:history="1" r:id="rIdwcgno45ge37n-rymq751t">
         <w:r>
           <w:rPr>
             <w:rStyle w:val="Hyperlink"/>
@@ -995,7 +995,7 @@
       <w:r>
         <w:t xml:space="preserve"> — créé — </w:t>
       </w:r>
-      <w:hyperlink w:history="1" r:id="rIdimiuld9kllthsvfy9-xw7">
+      <w:hyperlink w:history="1" r:id="rId2lluxi2d35gnn3dpnr8rl">
         <w:r>
           <w:rPr>
             <w:rStyle w:val="Hyperlink"/>
@@ -1024,7 +1024,7 @@
       <w:r>
         <w:t xml:space="preserve"> — créé — </w:t>
       </w:r>
-      <w:hyperlink w:history="1" r:id="rIddlpvyfhqrpa1ygfoxmbkm">
+      <w:hyperlink w:history="1" r:id="rIdcewvnv_mqcysn4uywbx48">
         <w:r>
           <w:rPr>
             <w:rStyle w:val="Hyperlink"/>
@@ -1053,7 +1053,7 @@
       <w:r>
         <w:t xml:space="preserve"> — créé — </w:t>
       </w:r>
-      <w:hyperlink w:history="1" r:id="rIdaj18xpg7njncxydtydztz">
+      <w:hyperlink w:history="1" r:id="rIdjz0qb0acqxfbmq_w0qax_">
         <w:r>
           <w:rPr>
             <w:rStyle w:val="Hyperlink"/>
@@ -1082,7 +1082,7 @@
       <w:r>
         <w:t xml:space="preserve"> — créé — </w:t>
       </w:r>
-      <w:hyperlink w:history="1" r:id="rIdvcdxwnt7fe3zlnaxrzqmy">
+      <w:hyperlink w:history="1" r:id="rIdf6mcjeqebeqmgcruk4jk_">
         <w:r>
           <w:rPr>
             <w:rStyle w:val="Hyperlink"/>
@@ -1111,7 +1111,7 @@
       <w:r>
         <w:t xml:space="preserve"> — créé — </w:t>
       </w:r>
-      <w:hyperlink w:history="1" r:id="rIdeehldnn8iiyakfdzgrapj">
+      <w:hyperlink w:history="1" r:id="rIdn8qcejejpolgm76xcdaii">
         <w:r>
           <w:rPr>
             <w:rStyle w:val="Hyperlink"/>
@@ -1148,7 +1148,7 @@
       <w:r>
         <w:t xml:space="preserve"> — créé — </w:t>
       </w:r>
-      <w:hyperlink w:history="1" r:id="rIdx-eszqdkmnjm3uyxekclr">
+      <w:hyperlink w:history="1" r:id="rIduin8dknzjv5o-kdi4mo5h">
         <w:r>
           <w:rPr>
             <w:rStyle w:val="Hyperlink"/>
@@ -1177,7 +1177,7 @@
       <w:r>
         <w:t xml:space="preserve"> — créé — </w:t>
       </w:r>
-      <w:hyperlink w:history="1" r:id="rIdlqmmz54fl6crf3gh-dfsy">
+      <w:hyperlink w:history="1" r:id="rIdsjk6uwbkf2yse1o_sruvv">
         <w:r>
           <w:rPr>
             <w:rStyle w:val="Hyperlink"/>
@@ -1206,7 +1206,7 @@
       <w:r>
         <w:t xml:space="preserve"> — créé — </w:t>
       </w:r>
-      <w:hyperlink w:history="1" r:id="rIdzhatbaysvp7bqra9m8sb0">
+      <w:hyperlink w:history="1" r:id="rIdcxy-ok2vet93su5duzzn3">
         <w:r>
           <w:rPr>
             <w:rStyle w:val="Hyperlink"/>
@@ -1235,7 +1235,7 @@
       <w:r>
         <w:t xml:space="preserve"> — créé — </w:t>
       </w:r>
-      <w:hyperlink w:history="1" r:id="rIdhqjslfmq-sxcczcgydidn">
+      <w:hyperlink w:history="1" r:id="rIdlbnupgpzm1bvtppkqtw20">
         <w:r>
           <w:rPr>
             <w:rStyle w:val="Hyperlink"/>
@@ -1264,7 +1264,7 @@
       <w:r>
         <w:t xml:space="preserve"> — créé — </w:t>
       </w:r>
-      <w:hyperlink w:history="1" r:id="rId8nqrk80ntmyvibm6vo135">
+      <w:hyperlink w:history="1" r:id="rIdvw2loujnlk0m98jy428jw">
         <w:r>
           <w:rPr>
             <w:rStyle w:val="Hyperlink"/>
@@ -1293,7 +1293,7 @@
       <w:r>
         <w:t xml:space="preserve"> — créé — </w:t>
       </w:r>
-      <w:hyperlink w:history="1" r:id="rIde9z1_lmnnqmwalswtnoyw">
+      <w:hyperlink w:history="1" r:id="rIddttve6h2xrjj-hf6vzgqe">
         <w:r>
           <w:rPr>
             <w:rStyle w:val="Hyperlink"/>
@@ -1322,7 +1322,7 @@
       <w:r>
         <w:t xml:space="preserve"> — créé — </w:t>
       </w:r>
-      <w:hyperlink w:history="1" r:id="rIdepvq_6xawdjounn2ooqng">
+      <w:hyperlink w:history="1" r:id="rIdxoczdvdrmf4gtdzxfynkr">
         <w:r>
           <w:rPr>
             <w:rStyle w:val="Hyperlink"/>
@@ -1351,7 +1351,7 @@
       <w:r>
         <w:t xml:space="preserve"> — créé — </w:t>
       </w:r>
-      <w:hyperlink w:history="1" r:id="rIdlakw2qtmqrgm0fkfeo8r_">
+      <w:hyperlink w:history="1" r:id="rId50wtnienaf8_dpdwrtucb">
         <w:r>
           <w:rPr>
             <w:rStyle w:val="Hyperlink"/>
@@ -1380,7 +1380,7 @@
       <w:r>
         <w:t xml:space="preserve"> — créé — </w:t>
       </w:r>
-      <w:hyperlink w:history="1" r:id="rIdrecrsa5j0zc4wmpceln04">
+      <w:hyperlink w:history="1" r:id="rId5mbee6b41jysaaidd4-d2">
         <w:r>
           <w:rPr>
             <w:rStyle w:val="Hyperlink"/>
@@ -1409,7 +1409,7 @@
       <w:r>
         <w:t xml:space="preserve"> — créé — </w:t>
       </w:r>
-      <w:hyperlink w:history="1" r:id="rIduibbi6wkcua_cybh46geh">
+      <w:hyperlink w:history="1" r:id="rIdkl8rrf8eo0i5nrb3ino53">
         <w:r>
           <w:rPr>
             <w:rStyle w:val="Hyperlink"/>
@@ -1438,7 +1438,7 @@
       <w:r>
         <w:t xml:space="preserve"> — créé — </w:t>
       </w:r>
-      <w:hyperlink w:history="1" r:id="rIdq6yqmfck6b6x9ra1fhvha">
+      <w:hyperlink w:history="1" r:id="rId4nltjksgdjtjl-gynqcii">
         <w:r>
           <w:rPr>
             <w:rStyle w:val="Hyperlink"/>
@@ -1467,7 +1467,7 @@
       <w:r>
         <w:t xml:space="preserve"> — créé — </w:t>
       </w:r>
-      <w:hyperlink w:history="1" r:id="rIdadhdfap-nqi6dwloog45z">
+      <w:hyperlink w:history="1" r:id="rId8fzowbons-z_ow0ds_rgp">
         <w:r>
           <w:rPr>
             <w:rStyle w:val="Hyperlink"/>
@@ -1496,7 +1496,7 @@
       <w:r>
         <w:t xml:space="preserve"> — créé — </w:t>
       </w:r>
-      <w:hyperlink w:history="1" r:id="rIda00imswv04jht4ponymlo">
+      <w:hyperlink w:history="1" r:id="rIdqtndxdui7nm53zrcl9tge">
         <w:r>
           <w:rPr>
             <w:rStyle w:val="Hyperlink"/>
@@ -1525,7 +1525,7 @@
       <w:r>
         <w:t xml:space="preserve"> — créé — </w:t>
       </w:r>
-      <w:hyperlink w:history="1" r:id="rIdqrlplhykjsgznv5ozhvdv">
+      <w:hyperlink w:history="1" r:id="rIdp4jec1xhhylpr0t__e7p5">
         <w:r>
           <w:rPr>
             <w:rStyle w:val="Hyperlink"/>
@@ -1554,7 +1554,7 @@
       <w:r>
         <w:t xml:space="preserve"> — créé — </w:t>
       </w:r>
-      <w:hyperlink w:history="1" r:id="rId6h3xdq3m-jfsfchs1czsp">
+      <w:hyperlink w:history="1" r:id="rIdwzrv5rr4bzwbf0-mbtug6">
         <w:r>
           <w:rPr>
             <w:rStyle w:val="Hyperlink"/>
@@ -1583,7 +1583,7 @@
       <w:r>
         <w:t xml:space="preserve"> — créé — </w:t>
       </w:r>
-      <w:hyperlink w:history="1" r:id="rId3ea0jynnpenqfvslfd-nx">
+      <w:hyperlink w:history="1" r:id="rId_qdv3osbgdbtwqsfqlm4f">
         <w:r>
           <w:rPr>
             <w:rStyle w:val="Hyperlink"/>
@@ -1612,7 +1612,7 @@
       <w:r>
         <w:t xml:space="preserve"> — créé — </w:t>
       </w:r>
-      <w:hyperlink w:history="1" r:id="rIdd_q7ct3e4k5rxpadn2uff">
+      <w:hyperlink w:history="1" r:id="rId_yj-d1gsixt0c5n4pl3xu">
         <w:r>
           <w:rPr>
             <w:rStyle w:val="Hyperlink"/>
@@ -1641,7 +1641,7 @@
       <w:r>
         <w:t xml:space="preserve"> — créé — </w:t>
       </w:r>
-      <w:hyperlink w:history="1" r:id="rIdo-wmpl6fu_-lyg3seckia">
+      <w:hyperlink w:history="1" r:id="rIdj9bxstyr3mxy_bpzxldeu">
         <w:r>
           <w:rPr>
             <w:rStyle w:val="Hyperlink"/>
@@ -1670,7 +1670,7 @@
       <w:r>
         <w:t xml:space="preserve"> — créé — </w:t>
       </w:r>
-      <w:hyperlink w:history="1" r:id="rIdhqdzl6lcghbzlqr458oki">
+      <w:hyperlink w:history="1" r:id="rIdx5sl98ghyuqsfkg0kiqsq">
         <w:r>
           <w:rPr>
             <w:rStyle w:val="Hyperlink"/>
@@ -1699,7 +1699,7 @@
       <w:r>
         <w:t xml:space="preserve"> — créé — </w:t>
       </w:r>
-      <w:hyperlink w:history="1" r:id="rIdzevyckvpkpthyvjrysmal">
+      <w:hyperlink w:history="1" r:id="rId-qt6w6kyjrqix7ac60uzi">
         <w:r>
           <w:rPr>
             <w:rStyle w:val="Hyperlink"/>
@@ -1728,7 +1728,7 @@
       <w:r>
         <w:t xml:space="preserve"> — créé — </w:t>
       </w:r>
-      <w:hyperlink w:history="1" r:id="rIdjm3rtlsyyoun20lcnl7cm">
+      <w:hyperlink w:history="1" r:id="rId51qinniywsjgzd9rzxfuj">
         <w:r>
           <w:rPr>
             <w:rStyle w:val="Hyperlink"/>
@@ -1757,7 +1757,7 @@
       <w:r>
         <w:t xml:space="preserve"> — créé — </w:t>
       </w:r>
-      <w:hyperlink w:history="1" r:id="rIdytowdgvkyairzfsisrrgg">
+      <w:hyperlink w:history="1" r:id="rIdjjhmeyztz7cax_a0qkhsr">
         <w:r>
           <w:rPr>
             <w:rStyle w:val="Hyperlink"/>
@@ -1786,7 +1786,7 @@
       <w:r>
         <w:t xml:space="preserve"> — créé — </w:t>
       </w:r>
-      <w:hyperlink w:history="1" r:id="rIdxcmiwntggb-du8sircx5p">
+      <w:hyperlink w:history="1" r:id="rIdiizozjlzksmpklms84rkp">
         <w:r>
           <w:rPr>
             <w:rStyle w:val="Hyperlink"/>
@@ -1823,7 +1823,7 @@
       <w:r>
         <w:t xml:space="preserve"> — créé — </w:t>
       </w:r>
-      <w:hyperlink w:history="1" r:id="rIdlkr_bnk4gz60x2fvqv24n">
+      <w:hyperlink w:history="1" r:id="rIdyssyix1hzr2m2bx8flasj">
         <w:r>
           <w:rPr>
             <w:rStyle w:val="Hyperlink"/>
@@ -1852,7 +1852,7 @@
       <w:r>
         <w:t xml:space="preserve"> — créé — </w:t>
       </w:r>
-      <w:hyperlink w:history="1" r:id="rIde-vmtumacweyedjqmlict">
+      <w:hyperlink w:history="1" r:id="rIdmlt6i-ikui2idthb8dhwt">
         <w:r>
           <w:rPr>
             <w:rStyle w:val="Hyperlink"/>
@@ -1881,7 +1881,7 @@
       <w:r>
         <w:t xml:space="preserve"> — créé — </w:t>
       </w:r>
-      <w:hyperlink w:history="1" r:id="rIdrbrpo9ajyh_ztakzg-fnl">
+      <w:hyperlink w:history="1" r:id="rId-aqwodmj7uu5765ng5g6z">
         <w:r>
           <w:rPr>
             <w:rStyle w:val="Hyperlink"/>
@@ -1910,7 +1910,7 @@
       <w:r>
         <w:t xml:space="preserve"> — créé — </w:t>
       </w:r>
-      <w:hyperlink w:history="1" r:id="rIdryxl9o8ivowqawsihlgtf">
+      <w:hyperlink w:history="1" r:id="rIdb0tqheonkuaqrvuonpcqy">
         <w:r>
           <w:rPr>
             <w:rStyle w:val="Hyperlink"/>
@@ -1939,7 +1939,7 @@
       <w:r>
         <w:t xml:space="preserve"> — créé — </w:t>
       </w:r>
-      <w:hyperlink w:history="1" r:id="rId-yss7ihwdosgdk15xv-lg">
+      <w:hyperlink w:history="1" r:id="rIda5-vat8scm9cdgncjs9yo">
         <w:r>
           <w:rPr>
             <w:rStyle w:val="Hyperlink"/>
@@ -1968,7 +1968,7 @@
       <w:r>
         <w:t xml:space="preserve"> — créé — </w:t>
       </w:r>
-      <w:hyperlink w:history="1" r:id="rIdf9kv1e0dozgyuvqel_6s5">
+      <w:hyperlink w:history="1" r:id="rId71gvhhenbecjszwlzmd9g">
         <w:r>
           <w:rPr>
             <w:rStyle w:val="Hyperlink"/>
@@ -1997,7 +1997,7 @@
       <w:r>
         <w:t xml:space="preserve"> — créé — </w:t>
       </w:r>
-      <w:hyperlink w:history="1" r:id="rIdz31g-mrtfizfeyde9pc1i">
+      <w:hyperlink w:history="1" r:id="rIdkev68v_efmst6dq9vrg5g">
         <w:r>
           <w:rPr>
             <w:rStyle w:val="Hyperlink"/>
@@ -2026,7 +2026,7 @@
       <w:r>
         <w:t xml:space="preserve"> — créé — </w:t>
       </w:r>
-      <w:hyperlink w:history="1" r:id="rIdnzkficpsu6f6iyewy2zaz">
+      <w:hyperlink w:history="1" r:id="rIdg2rh_ei2dmtafgorv19-s">
         <w:r>
           <w:rPr>
             <w:rStyle w:val="Hyperlink"/>
@@ -2139,7 +2139,7 @@
       <w:r>
         <w:t xml:space="preserve"> — créé — </w:t>
       </w:r>
-      <w:hyperlink w:history="1" r:id="rIdbx76id8hbs4klkcvm68hj">
+      <w:hyperlink w:history="1" r:id="rIdmsswbcq4uoyrpwpa6gzia">
         <w:r>
           <w:rPr>
             <w:rStyle w:val="Hyperlink"/>
@@ -2189,7 +2189,7 @@
       <w:r>
         <w:t xml:space="preserve"> — créé — </w:t>
       </w:r>
-      <w:hyperlink w:history="1" r:id="rIdnje1oigsijneb2scpnpom">
+      <w:hyperlink w:history="1" r:id="rIdpm0rlb_bczwaonpor5mgt">
         <w:r>
           <w:rPr>
             <w:rStyle w:val="Hyperlink"/>
@@ -2218,7 +2218,7 @@
       <w:r>
         <w:t xml:space="preserve"> — créé — </w:t>
       </w:r>
-      <w:hyperlink w:history="1" r:id="rId0ve6ek7ohcbmurevbyouo">
+      <w:hyperlink w:history="1" r:id="rIdt7o2k1xuauy-ld6x-mxq0">
         <w:r>
           <w:rPr>
             <w:rStyle w:val="Hyperlink"/>
@@ -2247,7 +2247,7 @@
       <w:r>
         <w:t xml:space="preserve"> — créé — </w:t>
       </w:r>
-      <w:hyperlink w:history="1" r:id="rIdajmndl0crgki-ckkiqisc">
+      <w:hyperlink w:history="1" r:id="rIddxak0wxuxhbsd5lqh5biy">
         <w:r>
           <w:rPr>
             <w:rStyle w:val="Hyperlink"/>
@@ -2276,7 +2276,7 @@
       <w:r>
         <w:t xml:space="preserve"> — créé — </w:t>
       </w:r>
-      <w:hyperlink w:history="1" r:id="rIdmctejol4sp1z6j24htac9">
+      <w:hyperlink w:history="1" r:id="rIduhlaoy8zcf2wvwxajprjb">
         <w:r>
           <w:rPr>
             <w:rStyle w:val="Hyperlink"/>
@@ -2313,7 +2313,7 @@
       <w:r>
         <w:t xml:space="preserve"> — créé — </w:t>
       </w:r>
-      <w:hyperlink w:history="1" r:id="rIdfvqw1ikelmthrby-mgimw">
+      <w:hyperlink w:history="1" r:id="rIdxdmpm79b91yabjmnicx0q">
         <w:r>
           <w:rPr>
             <w:rStyle w:val="Hyperlink"/>
@@ -2342,7 +2342,7 @@
       <w:r>
         <w:t xml:space="preserve"> — créé — </w:t>
       </w:r>
-      <w:hyperlink w:history="1" r:id="rIdyoomnzx9civbzjxvmhdzp">
+      <w:hyperlink w:history="1" r:id="rIdfen3wnqu_2anp4es9x-ra">
         <w:r>
           <w:rPr>
             <w:rStyle w:val="Hyperlink"/>
@@ -2379,7 +2379,7 @@
       <w:r>
         <w:t xml:space="preserve"> — créé — </w:t>
       </w:r>
-      <w:hyperlink w:history="1" r:id="rIdemkg6w8vi0ttjdawijgir">
+      <w:hyperlink w:history="1" r:id="rId3mjtccwctvjyn-hllcnl3">
         <w:r>
           <w:rPr>
             <w:rStyle w:val="Hyperlink"/>
@@ -2408,7 +2408,7 @@
       <w:r>
         <w:t xml:space="preserve"> — créé — </w:t>
       </w:r>
-      <w:hyperlink w:history="1" r:id="rIdsyqio4qedw5dm8danod3x">
+      <w:hyperlink w:history="1" r:id="rIdtw7inezy4juxnilnxn0cb">
         <w:r>
           <w:rPr>
             <w:rStyle w:val="Hyperlink"/>
@@ -2437,7 +2437,7 @@
       <w:r>
         <w:t xml:space="preserve"> — créé — </w:t>
       </w:r>
-      <w:hyperlink w:history="1" r:id="rIdysr3sowjjviqqfeut-3sq">
+      <w:hyperlink w:history="1" r:id="rIdd_wwhw-wll33ywzz1jhnh">
         <w:r>
           <w:rPr>
             <w:rStyle w:val="Hyperlink"/>
@@ -2466,7 +2466,7 @@
       <w:r>
         <w:t xml:space="preserve"> — créé — </w:t>
       </w:r>
-      <w:hyperlink w:history="1" r:id="rIdv-sy1mp4jlcxf6kadxflo">
+      <w:hyperlink w:history="1" r:id="rId5ewh4wrzfzukahdqb3wnw">
         <w:r>
           <w:rPr>
             <w:rStyle w:val="Hyperlink"/>
@@ -2495,7 +2495,7 @@
       <w:r>
         <w:t xml:space="preserve"> — créé — </w:t>
       </w:r>
-      <w:hyperlink w:history="1" r:id="rIdsiovk2-yd08gtfueg4g31">
+      <w:hyperlink w:history="1" r:id="rId8zl3v8wklb_jpvfcitevb">
         <w:r>
           <w:rPr>
             <w:rStyle w:val="Hyperlink"/>
@@ -2524,7 +2524,7 @@
       <w:r>
         <w:t xml:space="preserve"> — créé — </w:t>
       </w:r>
-      <w:hyperlink w:history="1" r:id="rId-cl0yehxqcp_4tib8plz8">
+      <w:hyperlink w:history="1" r:id="rIdu5tulcnaxfukdbsfttuzq">
         <w:r>
           <w:rPr>
             <w:rStyle w:val="Hyperlink"/>
@@ -2553,7 +2553,7 @@
       <w:r>
         <w:t xml:space="preserve"> — créé — </w:t>
       </w:r>
-      <w:hyperlink w:history="1" r:id="rIdgf9ffpftq0ta5hahbom69">
+      <w:hyperlink w:history="1" r:id="rId3rnoqzxlxv5wz0zvwy-rm">
         <w:r>
           <w:rPr>
             <w:rStyle w:val="Hyperlink"/>
@@ -2582,7 +2582,7 @@
       <w:r>
         <w:t xml:space="preserve"> — créé — </w:t>
       </w:r>
-      <w:hyperlink w:history="1" r:id="rIdarialaig0fsi7r_o5hco5">
+      <w:hyperlink w:history="1" r:id="rIdbrocupaq88ye6mtvpxhuu">
         <w:r>
           <w:rPr>
             <w:rStyle w:val="Hyperlink"/>
@@ -2611,7 +2611,7 @@
       <w:r>
         <w:t xml:space="preserve"> — créé — </w:t>
       </w:r>
-      <w:hyperlink w:history="1" r:id="rIdxuvojqp78z1ee6uleflp3">
+      <w:hyperlink w:history="1" r:id="rId4ynbsbgpmvqkroiovkjwk">
         <w:r>
           <w:rPr>
             <w:rStyle w:val="Hyperlink"/>
@@ -2648,7 +2648,7 @@
       <w:r>
         <w:t xml:space="preserve"> — créé — </w:t>
       </w:r>
-      <w:hyperlink w:history="1" r:id="rIdz0dmtjryt4yflwzzwrhtf">
+      <w:hyperlink w:history="1" r:id="rId1m3vm8jvgaas4kgx5rhjo">
         <w:r>
           <w:rPr>
             <w:rStyle w:val="Hyperlink"/>
@@ -2677,7 +2677,7 @@
       <w:r>
         <w:t xml:space="preserve"> — créé — </w:t>
       </w:r>
-      <w:hyperlink w:history="1" r:id="rIdkr1pqtesj2xek7anpvt_0">
+      <w:hyperlink w:history="1" r:id="rIdadevrnllddlic5nepvzze">
         <w:r>
           <w:rPr>
             <w:rStyle w:val="Hyperlink"/>
@@ -2706,7 +2706,7 @@
       <w:r>
         <w:t xml:space="preserve"> — créé — </w:t>
       </w:r>
-      <w:hyperlink w:history="1" r:id="rIdfs5xgf7gopxw6mcmo-6bg">
+      <w:hyperlink w:history="1" r:id="rIdhysxrjktosylq16us--ha">
         <w:r>
           <w:rPr>
             <w:rStyle w:val="Hyperlink"/>
@@ -2735,7 +2735,7 @@
       <w:r>
         <w:t xml:space="preserve"> — créé — </w:t>
       </w:r>
-      <w:hyperlink w:history="1" r:id="rIdgh_pdc2dui74lpk4-ro9a">
+      <w:hyperlink w:history="1" r:id="rIdpicegbpqb2zbwftp0nrj-">
         <w:r>
           <w:rPr>
             <w:rStyle w:val="Hyperlink"/>
@@ -2764,7 +2764,7 @@
       <w:r>
         <w:t xml:space="preserve"> — créé — </w:t>
       </w:r>
-      <w:hyperlink w:history="1" r:id="rIdrxor5wtikqbwikbofnz0z">
+      <w:hyperlink w:history="1" r:id="rIdzdgldi9kj5jxbdyvho4vi">
         <w:r>
           <w:rPr>
             <w:rStyle w:val="Hyperlink"/>
@@ -2793,7 +2793,7 @@
       <w:r>
         <w:t xml:space="preserve"> — créé — </w:t>
       </w:r>
-      <w:hyperlink w:history="1" r:id="rIdccs8zzy48c4hbryicq93w">
+      <w:hyperlink w:history="1" r:id="rIdar2xcgg3fvjsfvgg9nj8m">
         <w:r>
           <w:rPr>
             <w:rStyle w:val="Hyperlink"/>
@@ -2822,7 +2822,7 @@
       <w:r>
         <w:t xml:space="preserve"> — créé — </w:t>
       </w:r>
-      <w:hyperlink w:history="1" r:id="rIdb_-mawxp3ytjja4zxstve">
+      <w:hyperlink w:history="1" r:id="rIdd7fevmmpnwfcj_gjifhn1">
         <w:r>
           <w:rPr>
             <w:rStyle w:val="Hyperlink"/>
@@ -2851,7 +2851,7 @@
       <w:r>
         <w:t xml:space="preserve"> — créé — </w:t>
       </w:r>
-      <w:hyperlink w:history="1" r:id="rId6-lcr6wwjfxgv9gtjzc3j">
+      <w:hyperlink w:history="1" r:id="rIdkewy4lfduvv9bofhjkryn">
         <w:r>
           <w:rPr>
             <w:rStyle w:val="Hyperlink"/>

</xml_diff>

<commit_message>
Dossier §15.166 : le tableau En direct d'après la maquette (phase 67)
Co-Authored-By: Claude Opus 5.5 <noreply@anthropic.com>
</commit_message>
<xml_diff>
--- a/docs/developpement/phases/word/PHASE_00_SOCLE_DE_PRODUCTION_ET_CONFIGURATION_DUN_LIEU_VIDE.docx
+++ b/docs/developpement/phases/word/PHASE_00_SOCLE_DE_PRODUCTION_ET_CONFIGURATION_DUN_LIEU_VIDE.docx
@@ -20,7 +20,7 @@
       <w:r>
         <w:t xml:space="preserve">FlaiX Expert · dossier de développement · généré le 2026-10-19 depuis le dépôt </w:t>
       </w:r>
-      <w:hyperlink w:history="1" r:id="rIdowhrl6bxck0-of_j1tush">
+      <w:hyperlink w:history="1" r:id="rIddxdtcthtqym91zvnihqhq">
         <w:r>
           <w:rPr>
             <w:rStyle w:val="Hyperlink"/>
@@ -592,7 +592,7 @@
           <w:numId w:val="3"/>
         </w:numPr>
       </w:pPr>
-      <w:hyperlink w:history="1" r:id="rIdcf008cmuqmmci-ftemy8m">
+      <w:hyperlink w:history="1" r:id="rIdmpiwnho24mly2setl4nar">
         <w:r>
           <w:rPr>
             <w:rStyle w:val="Hyperlink"/>
@@ -612,7 +612,7 @@
           <w:numId w:val="3"/>
         </w:numPr>
       </w:pPr>
-      <w:hyperlink w:history="1" r:id="rIdr1vlz_31o1gl6m4-x_f5u">
+      <w:hyperlink w:history="1" r:id="rIdlq-t8_wtcxzyikmqmrvnj">
         <w:r>
           <w:rPr>
             <w:rStyle w:val="Hyperlink"/>
@@ -660,7 +660,7 @@
       <w:r>
         <w:t xml:space="preserve"> — créé — </w:t>
       </w:r>
-      <w:hyperlink w:history="1" r:id="rIdrngdohyzgmy-umumcaofu">
+      <w:hyperlink w:history="1" r:id="rIdgksfisknivnn6rphquycx">
         <w:r>
           <w:rPr>
             <w:rStyle w:val="Hyperlink"/>
@@ -689,7 +689,7 @@
       <w:r>
         <w:t xml:space="preserve"> — créé — </w:t>
       </w:r>
-      <w:hyperlink w:history="1" r:id="rIddacviyfotw9fmhi5iopzg">
+      <w:hyperlink w:history="1" r:id="rId_y_nqvyjrthg6tft2v93m">
         <w:r>
           <w:rPr>
             <w:rStyle w:val="Hyperlink"/>
@@ -726,7 +726,7 @@
       <w:r>
         <w:t xml:space="preserve"> — créé — </w:t>
       </w:r>
-      <w:hyperlink w:history="1" r:id="rId3sd1xuxspi0k2ziqiqilq">
+      <w:hyperlink w:history="1" r:id="rIdl-cefj5cgjr2skfldmfdh">
         <w:r>
           <w:rPr>
             <w:rStyle w:val="Hyperlink"/>
@@ -755,7 +755,7 @@
       <w:r>
         <w:t xml:space="preserve"> — créé — </w:t>
       </w:r>
-      <w:hyperlink w:history="1" r:id="rIdu19ymhhwfn3wlnghj8qrg">
+      <w:hyperlink w:history="1" r:id="rIdngthuhea3ygl0pn8mxy_f">
         <w:r>
           <w:rPr>
             <w:rStyle w:val="Hyperlink"/>
@@ -784,7 +784,7 @@
       <w:r>
         <w:t xml:space="preserve"> — créé — </w:t>
       </w:r>
-      <w:hyperlink w:history="1" r:id="rIdr8nktrqdgyff-5o3uku-z">
+      <w:hyperlink w:history="1" r:id="rIdzmisxhygndnkkp2sn3qmp">
         <w:r>
           <w:rPr>
             <w:rStyle w:val="Hyperlink"/>
@@ -813,7 +813,7 @@
       <w:r>
         <w:t xml:space="preserve"> — créé — </w:t>
       </w:r>
-      <w:hyperlink w:history="1" r:id="rIdhbrws7l99tagonp1e1spu">
+      <w:hyperlink w:history="1" r:id="rIdyzctvtmbt_9rjz6ceelqk">
         <w:r>
           <w:rPr>
             <w:rStyle w:val="Hyperlink"/>
@@ -842,7 +842,7 @@
       <w:r>
         <w:t xml:space="preserve"> — créé — </w:t>
       </w:r>
-      <w:hyperlink w:history="1" r:id="rIdcwmegavrqkzsiv_ewfpi9">
+      <w:hyperlink w:history="1" r:id="rIdcy3p0dcggy70iyatxttpq">
         <w:r>
           <w:rPr>
             <w:rStyle w:val="Hyperlink"/>
@@ -879,7 +879,7 @@
       <w:r>
         <w:t xml:space="preserve"> — créé — </w:t>
       </w:r>
-      <w:hyperlink w:history="1" r:id="rIdgvkiactwj4z7iocgztfk2">
+      <w:hyperlink w:history="1" r:id="rIdwdyqjundog4ls3qmcpkwe">
         <w:r>
           <w:rPr>
             <w:rStyle w:val="Hyperlink"/>
@@ -908,7 +908,7 @@
       <w:r>
         <w:t xml:space="preserve"> — créé — </w:t>
       </w:r>
-      <w:hyperlink w:history="1" r:id="rIdx0ojhn82nlzpujxnn-7go">
+      <w:hyperlink w:history="1" r:id="rIddtxleu6htfu_ejpxs-l4y">
         <w:r>
           <w:rPr>
             <w:rStyle w:val="Hyperlink"/>
@@ -937,7 +937,7 @@
       <w:r>
         <w:t xml:space="preserve"> — créé — </w:t>
       </w:r>
-      <w:hyperlink w:history="1" r:id="rIdinypbx1-itsekvnyb07uj">
+      <w:hyperlink w:history="1" r:id="rIdr0iwkeejwom1ub72zjjzq">
         <w:r>
           <w:rPr>
             <w:rStyle w:val="Hyperlink"/>
@@ -966,7 +966,7 @@
       <w:r>
         <w:t xml:space="preserve"> — créé — </w:t>
       </w:r>
-      <w:hyperlink w:history="1" r:id="rIdwcgno45ge37n-rymq751t">
+      <w:hyperlink w:history="1" r:id="rIdgu9tnqbjeausrb1jrvnym">
         <w:r>
           <w:rPr>
             <w:rStyle w:val="Hyperlink"/>
@@ -995,7 +995,7 @@
       <w:r>
         <w:t xml:space="preserve"> — créé — </w:t>
       </w:r>
-      <w:hyperlink w:history="1" r:id="rId2lluxi2d35gnn3dpnr8rl">
+      <w:hyperlink w:history="1" r:id="rIdqrlrx8qvfyn9hjvjlujt7">
         <w:r>
           <w:rPr>
             <w:rStyle w:val="Hyperlink"/>
@@ -1024,7 +1024,7 @@
       <w:r>
         <w:t xml:space="preserve"> — créé — </w:t>
       </w:r>
-      <w:hyperlink w:history="1" r:id="rIdcewvnv_mqcysn4uywbx48">
+      <w:hyperlink w:history="1" r:id="rIdc7-oaglakfwcurewavspe">
         <w:r>
           <w:rPr>
             <w:rStyle w:val="Hyperlink"/>
@@ -1053,7 +1053,7 @@
       <w:r>
         <w:t xml:space="preserve"> — créé — </w:t>
       </w:r>
-      <w:hyperlink w:history="1" r:id="rIdjz0qb0acqxfbmq_w0qax_">
+      <w:hyperlink w:history="1" r:id="rIdz46pbtokyb1xabyti-pcn">
         <w:r>
           <w:rPr>
             <w:rStyle w:val="Hyperlink"/>
@@ -1082,7 +1082,7 @@
       <w:r>
         <w:t xml:space="preserve"> — créé — </w:t>
       </w:r>
-      <w:hyperlink w:history="1" r:id="rIdf6mcjeqebeqmgcruk4jk_">
+      <w:hyperlink w:history="1" r:id="rIdi6mnm_lxrktowdb2mktb4">
         <w:r>
           <w:rPr>
             <w:rStyle w:val="Hyperlink"/>
@@ -1111,7 +1111,7 @@
       <w:r>
         <w:t xml:space="preserve"> — créé — </w:t>
       </w:r>
-      <w:hyperlink w:history="1" r:id="rIdn8qcejejpolgm76xcdaii">
+      <w:hyperlink w:history="1" r:id="rId5kpglrdxtvvkmc0st3rbs">
         <w:r>
           <w:rPr>
             <w:rStyle w:val="Hyperlink"/>
@@ -1148,7 +1148,7 @@
       <w:r>
         <w:t xml:space="preserve"> — créé — </w:t>
       </w:r>
-      <w:hyperlink w:history="1" r:id="rIduin8dknzjv5o-kdi4mo5h">
+      <w:hyperlink w:history="1" r:id="rIdq29hg5ej3pmkt24n5oyob">
         <w:r>
           <w:rPr>
             <w:rStyle w:val="Hyperlink"/>
@@ -1177,7 +1177,7 @@
       <w:r>
         <w:t xml:space="preserve"> — créé — </w:t>
       </w:r>
-      <w:hyperlink w:history="1" r:id="rIdsjk6uwbkf2yse1o_sruvv">
+      <w:hyperlink w:history="1" r:id="rIdgsgl5initfkxd8ili0ku0">
         <w:r>
           <w:rPr>
             <w:rStyle w:val="Hyperlink"/>
@@ -1206,7 +1206,7 @@
       <w:r>
         <w:t xml:space="preserve"> — créé — </w:t>
       </w:r>
-      <w:hyperlink w:history="1" r:id="rIdcxy-ok2vet93su5duzzn3">
+      <w:hyperlink w:history="1" r:id="rIdjuk38dcg-cr0ulllyehni">
         <w:r>
           <w:rPr>
             <w:rStyle w:val="Hyperlink"/>
@@ -1235,7 +1235,7 @@
       <w:r>
         <w:t xml:space="preserve"> — créé — </w:t>
       </w:r>
-      <w:hyperlink w:history="1" r:id="rIdlbnupgpzm1bvtppkqtw20">
+      <w:hyperlink w:history="1" r:id="rId7srej36r-8t-cny5ht8zc">
         <w:r>
           <w:rPr>
             <w:rStyle w:val="Hyperlink"/>
@@ -1264,7 +1264,7 @@
       <w:r>
         <w:t xml:space="preserve"> — créé — </w:t>
       </w:r>
-      <w:hyperlink w:history="1" r:id="rIdvw2loujnlk0m98jy428jw">
+      <w:hyperlink w:history="1" r:id="rIdcr6jf3rpbrybtzd5ithls">
         <w:r>
           <w:rPr>
             <w:rStyle w:val="Hyperlink"/>
@@ -1293,7 +1293,7 @@
       <w:r>
         <w:t xml:space="preserve"> — créé — </w:t>
       </w:r>
-      <w:hyperlink w:history="1" r:id="rIddttve6h2xrjj-hf6vzgqe">
+      <w:hyperlink w:history="1" r:id="rIdg2cqmkfviyq5u5eudjayi">
         <w:r>
           <w:rPr>
             <w:rStyle w:val="Hyperlink"/>
@@ -1322,7 +1322,7 @@
       <w:r>
         <w:t xml:space="preserve"> — créé — </w:t>
       </w:r>
-      <w:hyperlink w:history="1" r:id="rIdxoczdvdrmf4gtdzxfynkr">
+      <w:hyperlink w:history="1" r:id="rIdg5sc7htkldjhggka46ejj">
         <w:r>
           <w:rPr>
             <w:rStyle w:val="Hyperlink"/>
@@ -1351,7 +1351,7 @@
       <w:r>
         <w:t xml:space="preserve"> — créé — </w:t>
       </w:r>
-      <w:hyperlink w:history="1" r:id="rId50wtnienaf8_dpdwrtucb">
+      <w:hyperlink w:history="1" r:id="rIdljcrbdyrjoegeihddqywp">
         <w:r>
           <w:rPr>
             <w:rStyle w:val="Hyperlink"/>
@@ -1380,7 +1380,7 @@
       <w:r>
         <w:t xml:space="preserve"> — créé — </w:t>
       </w:r>
-      <w:hyperlink w:history="1" r:id="rId5mbee6b41jysaaidd4-d2">
+      <w:hyperlink w:history="1" r:id="rId56lst4ycu39bd5qbgdx9t">
         <w:r>
           <w:rPr>
             <w:rStyle w:val="Hyperlink"/>
@@ -1409,7 +1409,7 @@
       <w:r>
         <w:t xml:space="preserve"> — créé — </w:t>
       </w:r>
-      <w:hyperlink w:history="1" r:id="rIdkl8rrf8eo0i5nrb3ino53">
+      <w:hyperlink w:history="1" r:id="rIdxjs7_ktxsgyorivsz3xf5">
         <w:r>
           <w:rPr>
             <w:rStyle w:val="Hyperlink"/>
@@ -1438,7 +1438,7 @@
       <w:r>
         <w:t xml:space="preserve"> — créé — </w:t>
       </w:r>
-      <w:hyperlink w:history="1" r:id="rId4nltjksgdjtjl-gynqcii">
+      <w:hyperlink w:history="1" r:id="rId_yhrzuh08yh1inbesako-">
         <w:r>
           <w:rPr>
             <w:rStyle w:val="Hyperlink"/>
@@ -1467,7 +1467,7 @@
       <w:r>
         <w:t xml:space="preserve"> — créé — </w:t>
       </w:r>
-      <w:hyperlink w:history="1" r:id="rId8fzowbons-z_ow0ds_rgp">
+      <w:hyperlink w:history="1" r:id="rIdfia75vixo_oo0cx9nisfz">
         <w:r>
           <w:rPr>
             <w:rStyle w:val="Hyperlink"/>
@@ -1496,7 +1496,7 @@
       <w:r>
         <w:t xml:space="preserve"> — créé — </w:t>
       </w:r>
-      <w:hyperlink w:history="1" r:id="rIdqtndxdui7nm53zrcl9tge">
+      <w:hyperlink w:history="1" r:id="rIdb3eskgk-qnbven8y-_mnr">
         <w:r>
           <w:rPr>
             <w:rStyle w:val="Hyperlink"/>
@@ -1525,7 +1525,7 @@
       <w:r>
         <w:t xml:space="preserve"> — créé — </w:t>
       </w:r>
-      <w:hyperlink w:history="1" r:id="rIdp4jec1xhhylpr0t__e7p5">
+      <w:hyperlink w:history="1" r:id="rIdyvi1wbpaj9ocjqcbnscz8">
         <w:r>
           <w:rPr>
             <w:rStyle w:val="Hyperlink"/>
@@ -1554,7 +1554,7 @@
       <w:r>
         <w:t xml:space="preserve"> — créé — </w:t>
       </w:r>
-      <w:hyperlink w:history="1" r:id="rIdwzrv5rr4bzwbf0-mbtug6">
+      <w:hyperlink w:history="1" r:id="rIdmdyamxnudamtxoxbqiksr">
         <w:r>
           <w:rPr>
             <w:rStyle w:val="Hyperlink"/>
@@ -1583,7 +1583,7 @@
       <w:r>
         <w:t xml:space="preserve"> — créé — </w:t>
       </w:r>
-      <w:hyperlink w:history="1" r:id="rId_qdv3osbgdbtwqsfqlm4f">
+      <w:hyperlink w:history="1" r:id="rIdlbzbn1azoajwlbljyq-hg">
         <w:r>
           <w:rPr>
             <w:rStyle w:val="Hyperlink"/>
@@ -1612,7 +1612,7 @@
       <w:r>
         <w:t xml:space="preserve"> — créé — </w:t>
       </w:r>
-      <w:hyperlink w:history="1" r:id="rId_yj-d1gsixt0c5n4pl3xu">
+      <w:hyperlink w:history="1" r:id="rIddcqwgx6tkgv-gsumy4pry">
         <w:r>
           <w:rPr>
             <w:rStyle w:val="Hyperlink"/>
@@ -1641,7 +1641,7 @@
       <w:r>
         <w:t xml:space="preserve"> — créé — </w:t>
       </w:r>
-      <w:hyperlink w:history="1" r:id="rIdj9bxstyr3mxy_bpzxldeu">
+      <w:hyperlink w:history="1" r:id="rIdlv8lvv0fchvm7ajfa2hst">
         <w:r>
           <w:rPr>
             <w:rStyle w:val="Hyperlink"/>
@@ -1670,7 +1670,7 @@
       <w:r>
         <w:t xml:space="preserve"> — créé — </w:t>
       </w:r>
-      <w:hyperlink w:history="1" r:id="rIdx5sl98ghyuqsfkg0kiqsq">
+      <w:hyperlink w:history="1" r:id="rIdgbgfisl79xoowc43hwchu">
         <w:r>
           <w:rPr>
             <w:rStyle w:val="Hyperlink"/>
@@ -1699,7 +1699,7 @@
       <w:r>
         <w:t xml:space="preserve"> — créé — </w:t>
       </w:r>
-      <w:hyperlink w:history="1" r:id="rId-qt6w6kyjrqix7ac60uzi">
+      <w:hyperlink w:history="1" r:id="rIdrgvdvn_p_fzqhw8nkx11w">
         <w:r>
           <w:rPr>
             <w:rStyle w:val="Hyperlink"/>
@@ -1728,7 +1728,7 @@
       <w:r>
         <w:t xml:space="preserve"> — créé — </w:t>
       </w:r>
-      <w:hyperlink w:history="1" r:id="rId51qinniywsjgzd9rzxfuj">
+      <w:hyperlink w:history="1" r:id="rIdrunjjlvh5-xojxmdbu9yy">
         <w:r>
           <w:rPr>
             <w:rStyle w:val="Hyperlink"/>
@@ -1757,7 +1757,7 @@
       <w:r>
         <w:t xml:space="preserve"> — créé — </w:t>
       </w:r>
-      <w:hyperlink w:history="1" r:id="rIdjjhmeyztz7cax_a0qkhsr">
+      <w:hyperlink w:history="1" r:id="rIdys02z2nfmwjrpm6xj3wcq">
         <w:r>
           <w:rPr>
             <w:rStyle w:val="Hyperlink"/>
@@ -1786,7 +1786,7 @@
       <w:r>
         <w:t xml:space="preserve"> — créé — </w:t>
       </w:r>
-      <w:hyperlink w:history="1" r:id="rIdiizozjlzksmpklms84rkp">
+      <w:hyperlink w:history="1" r:id="rIdefdkp-5soheilfaceprdh">
         <w:r>
           <w:rPr>
             <w:rStyle w:val="Hyperlink"/>
@@ -1823,7 +1823,7 @@
       <w:r>
         <w:t xml:space="preserve"> — créé — </w:t>
       </w:r>
-      <w:hyperlink w:history="1" r:id="rIdyssyix1hzr2m2bx8flasj">
+      <w:hyperlink w:history="1" r:id="rIdlqeycaaqpqjw3rtljbyjp">
         <w:r>
           <w:rPr>
             <w:rStyle w:val="Hyperlink"/>
@@ -1852,7 +1852,7 @@
       <w:r>
         <w:t xml:space="preserve"> — créé — </w:t>
       </w:r>
-      <w:hyperlink w:history="1" r:id="rIdmlt6i-ikui2idthb8dhwt">
+      <w:hyperlink w:history="1" r:id="rIda73hereu6kr5akoa7shey">
         <w:r>
           <w:rPr>
             <w:rStyle w:val="Hyperlink"/>
@@ -1881,7 +1881,7 @@
       <w:r>
         <w:t xml:space="preserve"> — créé — </w:t>
       </w:r>
-      <w:hyperlink w:history="1" r:id="rId-aqwodmj7uu5765ng5g6z">
+      <w:hyperlink w:history="1" r:id="rIdnly3v9w1dev-ozfnldxt8">
         <w:r>
           <w:rPr>
             <w:rStyle w:val="Hyperlink"/>
@@ -1910,7 +1910,7 @@
       <w:r>
         <w:t xml:space="preserve"> — créé — </w:t>
       </w:r>
-      <w:hyperlink w:history="1" r:id="rIdb0tqheonkuaqrvuonpcqy">
+      <w:hyperlink w:history="1" r:id="rIdrovd9oewggzuu9sbpr7yk">
         <w:r>
           <w:rPr>
             <w:rStyle w:val="Hyperlink"/>
@@ -1939,7 +1939,7 @@
       <w:r>
         <w:t xml:space="preserve"> — créé — </w:t>
       </w:r>
-      <w:hyperlink w:history="1" r:id="rIda5-vat8scm9cdgncjs9yo">
+      <w:hyperlink w:history="1" r:id="rIdg3s2f5wvhek8coksdqzhv">
         <w:r>
           <w:rPr>
             <w:rStyle w:val="Hyperlink"/>
@@ -1968,7 +1968,7 @@
       <w:r>
         <w:t xml:space="preserve"> — créé — </w:t>
       </w:r>
-      <w:hyperlink w:history="1" r:id="rId71gvhhenbecjszwlzmd9g">
+      <w:hyperlink w:history="1" r:id="rIdry9pugg2mdjgxjyv0urla">
         <w:r>
           <w:rPr>
             <w:rStyle w:val="Hyperlink"/>
@@ -1997,7 +1997,7 @@
       <w:r>
         <w:t xml:space="preserve"> — créé — </w:t>
       </w:r>
-      <w:hyperlink w:history="1" r:id="rIdkev68v_efmst6dq9vrg5g">
+      <w:hyperlink w:history="1" r:id="rIdnrbz2fvmexgkd6waw5x4r">
         <w:r>
           <w:rPr>
             <w:rStyle w:val="Hyperlink"/>
@@ -2026,7 +2026,7 @@
       <w:r>
         <w:t xml:space="preserve"> — créé — </w:t>
       </w:r>
-      <w:hyperlink w:history="1" r:id="rIdg2rh_ei2dmtafgorv19-s">
+      <w:hyperlink w:history="1" r:id="rIdyvi5qwwx0ggxgzivjqcq2">
         <w:r>
           <w:rPr>
             <w:rStyle w:val="Hyperlink"/>
@@ -2139,7 +2139,7 @@
       <w:r>
         <w:t xml:space="preserve"> — créé — </w:t>
       </w:r>
-      <w:hyperlink w:history="1" r:id="rIdmsswbcq4uoyrpwpa6gzia">
+      <w:hyperlink w:history="1" r:id="rIdj8nlo8oybiqnspqavy38j">
         <w:r>
           <w:rPr>
             <w:rStyle w:val="Hyperlink"/>
@@ -2189,7 +2189,7 @@
       <w:r>
         <w:t xml:space="preserve"> — créé — </w:t>
       </w:r>
-      <w:hyperlink w:history="1" r:id="rIdpm0rlb_bczwaonpor5mgt">
+      <w:hyperlink w:history="1" r:id="rIdfszvays_mny-njry2ip_r">
         <w:r>
           <w:rPr>
             <w:rStyle w:val="Hyperlink"/>
@@ -2218,7 +2218,7 @@
       <w:r>
         <w:t xml:space="preserve"> — créé — </w:t>
       </w:r>
-      <w:hyperlink w:history="1" r:id="rIdt7o2k1xuauy-ld6x-mxq0">
+      <w:hyperlink w:history="1" r:id="rIdgk0umv58ftlz-s0olr_pi">
         <w:r>
           <w:rPr>
             <w:rStyle w:val="Hyperlink"/>
@@ -2247,7 +2247,7 @@
       <w:r>
         <w:t xml:space="preserve"> — créé — </w:t>
       </w:r>
-      <w:hyperlink w:history="1" r:id="rIddxak0wxuxhbsd5lqh5biy">
+      <w:hyperlink w:history="1" r:id="rIdlrq3pvwutwiyzdbjemnv0">
         <w:r>
           <w:rPr>
             <w:rStyle w:val="Hyperlink"/>
@@ -2276,7 +2276,7 @@
       <w:r>
         <w:t xml:space="preserve"> — créé — </w:t>
       </w:r>
-      <w:hyperlink w:history="1" r:id="rIduhlaoy8zcf2wvwxajprjb">
+      <w:hyperlink w:history="1" r:id="rIdrvhhdllc3abrboohdfpta">
         <w:r>
           <w:rPr>
             <w:rStyle w:val="Hyperlink"/>
@@ -2313,7 +2313,7 @@
       <w:r>
         <w:t xml:space="preserve"> — créé — </w:t>
       </w:r>
-      <w:hyperlink w:history="1" r:id="rIdxdmpm79b91yabjmnicx0q">
+      <w:hyperlink w:history="1" r:id="rIds9cdmgvogs3a9gri2s3x8">
         <w:r>
           <w:rPr>
             <w:rStyle w:val="Hyperlink"/>
@@ -2342,7 +2342,7 @@
       <w:r>
         <w:t xml:space="preserve"> — créé — </w:t>
       </w:r>
-      <w:hyperlink w:history="1" r:id="rIdfen3wnqu_2anp4es9x-ra">
+      <w:hyperlink w:history="1" r:id="rIdcrmepmu1yxykizkahsh1i">
         <w:r>
           <w:rPr>
             <w:rStyle w:val="Hyperlink"/>
@@ -2379,7 +2379,7 @@
       <w:r>
         <w:t xml:space="preserve"> — créé — </w:t>
       </w:r>
-      <w:hyperlink w:history="1" r:id="rId3mjtccwctvjyn-hllcnl3">
+      <w:hyperlink w:history="1" r:id="rIdqknedrctq1wvcpuqbu8u5">
         <w:r>
           <w:rPr>
             <w:rStyle w:val="Hyperlink"/>
@@ -2408,7 +2408,7 @@
       <w:r>
         <w:t xml:space="preserve"> — créé — </w:t>
       </w:r>
-      <w:hyperlink w:history="1" r:id="rIdtw7inezy4juxnilnxn0cb">
+      <w:hyperlink w:history="1" r:id="rId0hiu6ltf_ymd2v57oukcn">
         <w:r>
           <w:rPr>
             <w:rStyle w:val="Hyperlink"/>
@@ -2437,7 +2437,7 @@
       <w:r>
         <w:t xml:space="preserve"> — créé — </w:t>
       </w:r>
-      <w:hyperlink w:history="1" r:id="rIdd_wwhw-wll33ywzz1jhnh">
+      <w:hyperlink w:history="1" r:id="rIdssgqovfddaknpprqdkmgf">
         <w:r>
           <w:rPr>
             <w:rStyle w:val="Hyperlink"/>
@@ -2466,7 +2466,7 @@
       <w:r>
         <w:t xml:space="preserve"> — créé — </w:t>
       </w:r>
-      <w:hyperlink w:history="1" r:id="rId5ewh4wrzfzukahdqb3wnw">
+      <w:hyperlink w:history="1" r:id="rIdvr9ks8acpnfkddoflveb9">
         <w:r>
           <w:rPr>
             <w:rStyle w:val="Hyperlink"/>
@@ -2495,7 +2495,7 @@
       <w:r>
         <w:t xml:space="preserve"> — créé — </w:t>
       </w:r>
-      <w:hyperlink w:history="1" r:id="rId8zl3v8wklb_jpvfcitevb">
+      <w:hyperlink w:history="1" r:id="rId4oju8_bdslthcir5awegl">
         <w:r>
           <w:rPr>
             <w:rStyle w:val="Hyperlink"/>
@@ -2524,7 +2524,7 @@
       <w:r>
         <w:t xml:space="preserve"> — créé — </w:t>
       </w:r>
-      <w:hyperlink w:history="1" r:id="rIdu5tulcnaxfukdbsfttuzq">
+      <w:hyperlink w:history="1" r:id="rId3wtrjv4332o2fqn2a5og-">
         <w:r>
           <w:rPr>
             <w:rStyle w:val="Hyperlink"/>
@@ -2553,7 +2553,7 @@
       <w:r>
         <w:t xml:space="preserve"> — créé — </w:t>
       </w:r>
-      <w:hyperlink w:history="1" r:id="rId3rnoqzxlxv5wz0zvwy-rm">
+      <w:hyperlink w:history="1" r:id="rIdoxo38qipuakacqaw1zyn8">
         <w:r>
           <w:rPr>
             <w:rStyle w:val="Hyperlink"/>
@@ -2582,7 +2582,7 @@
       <w:r>
         <w:t xml:space="preserve"> — créé — </w:t>
       </w:r>
-      <w:hyperlink w:history="1" r:id="rIdbrocupaq88ye6mtvpxhuu">
+      <w:hyperlink w:history="1" r:id="rIdwj03fayttfj8v32nzgoft">
         <w:r>
           <w:rPr>
             <w:rStyle w:val="Hyperlink"/>
@@ -2611,7 +2611,7 @@
       <w:r>
         <w:t xml:space="preserve"> — créé — </w:t>
       </w:r>
-      <w:hyperlink w:history="1" r:id="rId4ynbsbgpmvqkroiovkjwk">
+      <w:hyperlink w:history="1" r:id="rIduhtqzaic82qn-tzfvsdti">
         <w:r>
           <w:rPr>
             <w:rStyle w:val="Hyperlink"/>
@@ -2648,7 +2648,7 @@
       <w:r>
         <w:t xml:space="preserve"> — créé — </w:t>
       </w:r>
-      <w:hyperlink w:history="1" r:id="rId1m3vm8jvgaas4kgx5rhjo">
+      <w:hyperlink w:history="1" r:id="rIdt5uc81emkurnzkqocfvbl">
         <w:r>
           <w:rPr>
             <w:rStyle w:val="Hyperlink"/>
@@ -2677,7 +2677,7 @@
       <w:r>
         <w:t xml:space="preserve"> — créé — </w:t>
       </w:r>
-      <w:hyperlink w:history="1" r:id="rIdadevrnllddlic5nepvzze">
+      <w:hyperlink w:history="1" r:id="rIdwq2lhiv88q5yjxka8rnbj">
         <w:r>
           <w:rPr>
             <w:rStyle w:val="Hyperlink"/>
@@ -2706,7 +2706,7 @@
       <w:r>
         <w:t xml:space="preserve"> — créé — </w:t>
       </w:r>
-      <w:hyperlink w:history="1" r:id="rIdhysxrjktosylq16us--ha">
+      <w:hyperlink w:history="1" r:id="rId0ilwtksvc7sw12dervrod">
         <w:r>
           <w:rPr>
             <w:rStyle w:val="Hyperlink"/>
@@ -2735,7 +2735,7 @@
       <w:r>
         <w:t xml:space="preserve"> — créé — </w:t>
       </w:r>
-      <w:hyperlink w:history="1" r:id="rIdpicegbpqb2zbwftp0nrj-">
+      <w:hyperlink w:history="1" r:id="rIde7tq1fn8xkkys9klqy-cd">
         <w:r>
           <w:rPr>
             <w:rStyle w:val="Hyperlink"/>
@@ -2764,7 +2764,7 @@
       <w:r>
         <w:t xml:space="preserve"> — créé — </w:t>
       </w:r>
-      <w:hyperlink w:history="1" r:id="rIdzdgldi9kj5jxbdyvho4vi">
+      <w:hyperlink w:history="1" r:id="rIdtcvy9nlatzgl8wpkyjqdb">
         <w:r>
           <w:rPr>
             <w:rStyle w:val="Hyperlink"/>
@@ -2793,7 +2793,7 @@
       <w:r>
         <w:t xml:space="preserve"> — créé — </w:t>
       </w:r>
-      <w:hyperlink w:history="1" r:id="rIdar2xcgg3fvjsfvgg9nj8m">
+      <w:hyperlink w:history="1" r:id="rIdnyqulczq5xnrke7freoka">
         <w:r>
           <w:rPr>
             <w:rStyle w:val="Hyperlink"/>
@@ -2822,7 +2822,7 @@
       <w:r>
         <w:t xml:space="preserve"> — créé — </w:t>
       </w:r>
-      <w:hyperlink w:history="1" r:id="rIdd7fevmmpnwfcj_gjifhn1">
+      <w:hyperlink w:history="1" r:id="rId3hvbqmrughfmmcgp1ejy0">
         <w:r>
           <w:rPr>
             <w:rStyle w:val="Hyperlink"/>
@@ -2851,7 +2851,7 @@
       <w:r>
         <w:t xml:space="preserve"> — créé — </w:t>
       </w:r>
-      <w:hyperlink w:history="1" r:id="rIdkewy4lfduvv9bofhjkryn">
+      <w:hyperlink w:history="1" r:id="rIdbmrrhrhs5pfkdohbuex07">
         <w:r>
           <w:rPr>
             <w:rStyle w:val="Hyperlink"/>

</xml_diff>

<commit_message>
Dossier §15.167 : En direct à part, Résultats pour les événements terminés (phase 68)
Co-Authored-By: Claude Opus 5.5 <noreply@anthropic.com>
</commit_message>
<xml_diff>
--- a/docs/developpement/phases/word/PHASE_00_SOCLE_DE_PRODUCTION_ET_CONFIGURATION_DUN_LIEU_VIDE.docx
+++ b/docs/developpement/phases/word/PHASE_00_SOCLE_DE_PRODUCTION_ET_CONFIGURATION_DUN_LIEU_VIDE.docx
@@ -20,7 +20,7 @@
       <w:r>
         <w:t xml:space="preserve">FlaiX Expert · dossier de développement · généré le 2026-10-19 depuis le dépôt </w:t>
       </w:r>
-      <w:hyperlink w:history="1" r:id="rIddxdtcthtqym91zvnihqhq">
+      <w:hyperlink w:history="1" r:id="rId2sxff-oawrmdqffjie3j6">
         <w:r>
           <w:rPr>
             <w:rStyle w:val="Hyperlink"/>
@@ -592,7 +592,7 @@
           <w:numId w:val="3"/>
         </w:numPr>
       </w:pPr>
-      <w:hyperlink w:history="1" r:id="rIdmpiwnho24mly2setl4nar">
+      <w:hyperlink w:history="1" r:id="rId6mtpdgbg4cdlwkkemyy8y">
         <w:r>
           <w:rPr>
             <w:rStyle w:val="Hyperlink"/>
@@ -612,7 +612,7 @@
           <w:numId w:val="3"/>
         </w:numPr>
       </w:pPr>
-      <w:hyperlink w:history="1" r:id="rIdlq-t8_wtcxzyikmqmrvnj">
+      <w:hyperlink w:history="1" r:id="rIdew0j8hg4kwesxttyhtmst">
         <w:r>
           <w:rPr>
             <w:rStyle w:val="Hyperlink"/>
@@ -660,7 +660,7 @@
       <w:r>
         <w:t xml:space="preserve"> — créé — </w:t>
       </w:r>
-      <w:hyperlink w:history="1" r:id="rIdgksfisknivnn6rphquycx">
+      <w:hyperlink w:history="1" r:id="rIdwnyzkrtl63gboym4ced3y">
         <w:r>
           <w:rPr>
             <w:rStyle w:val="Hyperlink"/>
@@ -689,7 +689,7 @@
       <w:r>
         <w:t xml:space="preserve"> — créé — </w:t>
       </w:r>
-      <w:hyperlink w:history="1" r:id="rId_y_nqvyjrthg6tft2v93m">
+      <w:hyperlink w:history="1" r:id="rId1kcp9bentvupucbelg3ay">
         <w:r>
           <w:rPr>
             <w:rStyle w:val="Hyperlink"/>
@@ -726,7 +726,7 @@
       <w:r>
         <w:t xml:space="preserve"> — créé — </w:t>
       </w:r>
-      <w:hyperlink w:history="1" r:id="rIdl-cefj5cgjr2skfldmfdh">
+      <w:hyperlink w:history="1" r:id="rIdruayojaiidnei0xalzhwo">
         <w:r>
           <w:rPr>
             <w:rStyle w:val="Hyperlink"/>
@@ -755,7 +755,7 @@
       <w:r>
         <w:t xml:space="preserve"> — créé — </w:t>
       </w:r>
-      <w:hyperlink w:history="1" r:id="rIdngthuhea3ygl0pn8mxy_f">
+      <w:hyperlink w:history="1" r:id="rIdnmq2m6312ytf3i679rbks">
         <w:r>
           <w:rPr>
             <w:rStyle w:val="Hyperlink"/>
@@ -784,7 +784,7 @@
       <w:r>
         <w:t xml:space="preserve"> — créé — </w:t>
       </w:r>
-      <w:hyperlink w:history="1" r:id="rIdzmisxhygndnkkp2sn3qmp">
+      <w:hyperlink w:history="1" r:id="rIdzxptuo2v3cwlg0wboxhqv">
         <w:r>
           <w:rPr>
             <w:rStyle w:val="Hyperlink"/>
@@ -813,7 +813,7 @@
       <w:r>
         <w:t xml:space="preserve"> — créé — </w:t>
       </w:r>
-      <w:hyperlink w:history="1" r:id="rIdyzctvtmbt_9rjz6ceelqk">
+      <w:hyperlink w:history="1" r:id="rIdwkycuadv1xbjfgfc2_3ft">
         <w:r>
           <w:rPr>
             <w:rStyle w:val="Hyperlink"/>
@@ -842,7 +842,7 @@
       <w:r>
         <w:t xml:space="preserve"> — créé — </w:t>
       </w:r>
-      <w:hyperlink w:history="1" r:id="rIdcy3p0dcggy70iyatxttpq">
+      <w:hyperlink w:history="1" r:id="rIdw6xkjew8bqqio7k9dry4h">
         <w:r>
           <w:rPr>
             <w:rStyle w:val="Hyperlink"/>
@@ -879,7 +879,7 @@
       <w:r>
         <w:t xml:space="preserve"> — créé — </w:t>
       </w:r>
-      <w:hyperlink w:history="1" r:id="rIdwdyqjundog4ls3qmcpkwe">
+      <w:hyperlink w:history="1" r:id="rIdol7rofoq6wzzvl-o7crft">
         <w:r>
           <w:rPr>
             <w:rStyle w:val="Hyperlink"/>
@@ -908,7 +908,7 @@
       <w:r>
         <w:t xml:space="preserve"> — créé — </w:t>
       </w:r>
-      <w:hyperlink w:history="1" r:id="rIddtxleu6htfu_ejpxs-l4y">
+      <w:hyperlink w:history="1" r:id="rIdjkiho-ivgy-50x0g4askp">
         <w:r>
           <w:rPr>
             <w:rStyle w:val="Hyperlink"/>
@@ -937,7 +937,7 @@
       <w:r>
         <w:t xml:space="preserve"> — créé — </w:t>
       </w:r>
-      <w:hyperlink w:history="1" r:id="rIdr0iwkeejwom1ub72zjjzq">
+      <w:hyperlink w:history="1" r:id="rIdt7yleklkhzenhqbmnrp6f">
         <w:r>
           <w:rPr>
             <w:rStyle w:val="Hyperlink"/>
@@ -966,7 +966,7 @@
       <w:r>
         <w:t xml:space="preserve"> — créé — </w:t>
       </w:r>
-      <w:hyperlink w:history="1" r:id="rIdgu9tnqbjeausrb1jrvnym">
+      <w:hyperlink w:history="1" r:id="rId1fp2t2qsgjhvwpsa3all8">
         <w:r>
           <w:rPr>
             <w:rStyle w:val="Hyperlink"/>
@@ -995,7 +995,7 @@
       <w:r>
         <w:t xml:space="preserve"> — créé — </w:t>
       </w:r>
-      <w:hyperlink w:history="1" r:id="rIdqrlrx8qvfyn9hjvjlujt7">
+      <w:hyperlink w:history="1" r:id="rIdfrentpk_z5rowaali8jsh">
         <w:r>
           <w:rPr>
             <w:rStyle w:val="Hyperlink"/>
@@ -1024,7 +1024,7 @@
       <w:r>
         <w:t xml:space="preserve"> — créé — </w:t>
       </w:r>
-      <w:hyperlink w:history="1" r:id="rIdc7-oaglakfwcurewavspe">
+      <w:hyperlink w:history="1" r:id="rId3qr8gjyninyycdhjcyfep">
         <w:r>
           <w:rPr>
             <w:rStyle w:val="Hyperlink"/>
@@ -1053,7 +1053,7 @@
       <w:r>
         <w:t xml:space="preserve"> — créé — </w:t>
       </w:r>
-      <w:hyperlink w:history="1" r:id="rIdz46pbtokyb1xabyti-pcn">
+      <w:hyperlink w:history="1" r:id="rIdlt8tkretx-rcujwmjypy7">
         <w:r>
           <w:rPr>
             <w:rStyle w:val="Hyperlink"/>
@@ -1082,7 +1082,7 @@
       <w:r>
         <w:t xml:space="preserve"> — créé — </w:t>
       </w:r>
-      <w:hyperlink w:history="1" r:id="rIdi6mnm_lxrktowdb2mktb4">
+      <w:hyperlink w:history="1" r:id="rIdjlxi4oo0kvurif5yjwy1e">
         <w:r>
           <w:rPr>
             <w:rStyle w:val="Hyperlink"/>
@@ -1111,7 +1111,7 @@
       <w:r>
         <w:t xml:space="preserve"> — créé — </w:t>
       </w:r>
-      <w:hyperlink w:history="1" r:id="rId5kpglrdxtvvkmc0st3rbs">
+      <w:hyperlink w:history="1" r:id="rId_qh4enzxwm-1ekgarz3df">
         <w:r>
           <w:rPr>
             <w:rStyle w:val="Hyperlink"/>
@@ -1148,7 +1148,7 @@
       <w:r>
         <w:t xml:space="preserve"> — créé — </w:t>
       </w:r>
-      <w:hyperlink w:history="1" r:id="rIdq29hg5ej3pmkt24n5oyob">
+      <w:hyperlink w:history="1" r:id="rId9flkbykb9albmzo_40lx3">
         <w:r>
           <w:rPr>
             <w:rStyle w:val="Hyperlink"/>
@@ -1177,7 +1177,7 @@
       <w:r>
         <w:t xml:space="preserve"> — créé — </w:t>
       </w:r>
-      <w:hyperlink w:history="1" r:id="rIdgsgl5initfkxd8ili0ku0">
+      <w:hyperlink w:history="1" r:id="rIdf414afql1qfhnogwstsoe">
         <w:r>
           <w:rPr>
             <w:rStyle w:val="Hyperlink"/>
@@ -1206,7 +1206,7 @@
       <w:r>
         <w:t xml:space="preserve"> — créé — </w:t>
       </w:r>
-      <w:hyperlink w:history="1" r:id="rIdjuk38dcg-cr0ulllyehni">
+      <w:hyperlink w:history="1" r:id="rIdgvwotmmm93bdbzvxs01ay">
         <w:r>
           <w:rPr>
             <w:rStyle w:val="Hyperlink"/>
@@ -1235,7 +1235,7 @@
       <w:r>
         <w:t xml:space="preserve"> — créé — </w:t>
       </w:r>
-      <w:hyperlink w:history="1" r:id="rId7srej36r-8t-cny5ht8zc">
+      <w:hyperlink w:history="1" r:id="rIdf3kxjwq-6cd0mo0eipdkg">
         <w:r>
           <w:rPr>
             <w:rStyle w:val="Hyperlink"/>
@@ -1264,7 +1264,7 @@
       <w:r>
         <w:t xml:space="preserve"> — créé — </w:t>
       </w:r>
-      <w:hyperlink w:history="1" r:id="rIdcr6jf3rpbrybtzd5ithls">
+      <w:hyperlink w:history="1" r:id="rIdhflxnrchxgfcuksa0txya">
         <w:r>
           <w:rPr>
             <w:rStyle w:val="Hyperlink"/>
@@ -1293,7 +1293,7 @@
       <w:r>
         <w:t xml:space="preserve"> — créé — </w:t>
       </w:r>
-      <w:hyperlink w:history="1" r:id="rIdg2cqmkfviyq5u5eudjayi">
+      <w:hyperlink w:history="1" r:id="rIdzivbd-qw6qb8lzwtxp-iq">
         <w:r>
           <w:rPr>
             <w:rStyle w:val="Hyperlink"/>
@@ -1322,7 +1322,7 @@
       <w:r>
         <w:t xml:space="preserve"> — créé — </w:t>
       </w:r>
-      <w:hyperlink w:history="1" r:id="rIdg5sc7htkldjhggka46ejj">
+      <w:hyperlink w:history="1" r:id="rIdz2whqgchcryns3q_ne1zn">
         <w:r>
           <w:rPr>
             <w:rStyle w:val="Hyperlink"/>
@@ -1351,7 +1351,7 @@
       <w:r>
         <w:t xml:space="preserve"> — créé — </w:t>
       </w:r>
-      <w:hyperlink w:history="1" r:id="rIdljcrbdyrjoegeihddqywp">
+      <w:hyperlink w:history="1" r:id="rIdbaka9dcmeghm0_za7algo">
         <w:r>
           <w:rPr>
             <w:rStyle w:val="Hyperlink"/>
@@ -1380,7 +1380,7 @@
       <w:r>
         <w:t xml:space="preserve"> — créé — </w:t>
       </w:r>
-      <w:hyperlink w:history="1" r:id="rId56lst4ycu39bd5qbgdx9t">
+      <w:hyperlink w:history="1" r:id="rIdly94mqhjxypxit7umbopf">
         <w:r>
           <w:rPr>
             <w:rStyle w:val="Hyperlink"/>
@@ -1409,7 +1409,7 @@
       <w:r>
         <w:t xml:space="preserve"> — créé — </w:t>
       </w:r>
-      <w:hyperlink w:history="1" r:id="rIdxjs7_ktxsgyorivsz3xf5">
+      <w:hyperlink w:history="1" r:id="rIdaxb4je9tk9a7ljwobpvlm">
         <w:r>
           <w:rPr>
             <w:rStyle w:val="Hyperlink"/>
@@ -1438,7 +1438,7 @@
       <w:r>
         <w:t xml:space="preserve"> — créé — </w:t>
       </w:r>
-      <w:hyperlink w:history="1" r:id="rId_yhrzuh08yh1inbesako-">
+      <w:hyperlink w:history="1" r:id="rIdbgciffbfszo-zoshinif_">
         <w:r>
           <w:rPr>
             <w:rStyle w:val="Hyperlink"/>
@@ -1467,7 +1467,7 @@
       <w:r>
         <w:t xml:space="preserve"> — créé — </w:t>
       </w:r>
-      <w:hyperlink w:history="1" r:id="rIdfia75vixo_oo0cx9nisfz">
+      <w:hyperlink w:history="1" r:id="rIdf3tl9cikxu1vxkl4kxcq0">
         <w:r>
           <w:rPr>
             <w:rStyle w:val="Hyperlink"/>
@@ -1496,7 +1496,7 @@
       <w:r>
         <w:t xml:space="preserve"> — créé — </w:t>
       </w:r>
-      <w:hyperlink w:history="1" r:id="rIdb3eskgk-qnbven8y-_mnr">
+      <w:hyperlink w:history="1" r:id="rIdnxqatbjdnungk3hdgkuy7">
         <w:r>
           <w:rPr>
             <w:rStyle w:val="Hyperlink"/>
@@ -1525,7 +1525,7 @@
       <w:r>
         <w:t xml:space="preserve"> — créé — </w:t>
       </w:r>
-      <w:hyperlink w:history="1" r:id="rIdyvi1wbpaj9ocjqcbnscz8">
+      <w:hyperlink w:history="1" r:id="rId1r3ypl2hqdq51r4qxx3bp">
         <w:r>
           <w:rPr>
             <w:rStyle w:val="Hyperlink"/>
@@ -1554,7 +1554,7 @@
       <w:r>
         <w:t xml:space="preserve"> — créé — </w:t>
       </w:r>
-      <w:hyperlink w:history="1" r:id="rIdmdyamxnudamtxoxbqiksr">
+      <w:hyperlink w:history="1" r:id="rIdm1lbrtxgslvbgi3nemsoo">
         <w:r>
           <w:rPr>
             <w:rStyle w:val="Hyperlink"/>
@@ -1583,7 +1583,7 @@
       <w:r>
         <w:t xml:space="preserve"> — créé — </w:t>
       </w:r>
-      <w:hyperlink w:history="1" r:id="rIdlbzbn1azoajwlbljyq-hg">
+      <w:hyperlink w:history="1" r:id="rIdcev3vfwapi02j4l5tpmol">
         <w:r>
           <w:rPr>
             <w:rStyle w:val="Hyperlink"/>
@@ -1612,7 +1612,7 @@
       <w:r>
         <w:t xml:space="preserve"> — créé — </w:t>
       </w:r>
-      <w:hyperlink w:history="1" r:id="rIddcqwgx6tkgv-gsumy4pry">
+      <w:hyperlink w:history="1" r:id="rIdn90u3-iue5ggw-zxt9ja2">
         <w:r>
           <w:rPr>
             <w:rStyle w:val="Hyperlink"/>
@@ -1641,7 +1641,7 @@
       <w:r>
         <w:t xml:space="preserve"> — créé — </w:t>
       </w:r>
-      <w:hyperlink w:history="1" r:id="rIdlv8lvv0fchvm7ajfa2hst">
+      <w:hyperlink w:history="1" r:id="rIdht01hfyutvaukom-vx6ov">
         <w:r>
           <w:rPr>
             <w:rStyle w:val="Hyperlink"/>
@@ -1670,7 +1670,7 @@
       <w:r>
         <w:t xml:space="preserve"> — créé — </w:t>
       </w:r>
-      <w:hyperlink w:history="1" r:id="rIdgbgfisl79xoowc43hwchu">
+      <w:hyperlink w:history="1" r:id="rIdwg7lhz_a4uvfb9vefvkj6">
         <w:r>
           <w:rPr>
             <w:rStyle w:val="Hyperlink"/>
@@ -1699,7 +1699,7 @@
       <w:r>
         <w:t xml:space="preserve"> — créé — </w:t>
       </w:r>
-      <w:hyperlink w:history="1" r:id="rIdrgvdvn_p_fzqhw8nkx11w">
+      <w:hyperlink w:history="1" r:id="rIdxtst57d74vp6ygshqj8ch">
         <w:r>
           <w:rPr>
             <w:rStyle w:val="Hyperlink"/>
@@ -1728,7 +1728,7 @@
       <w:r>
         <w:t xml:space="preserve"> — créé — </w:t>
       </w:r>
-      <w:hyperlink w:history="1" r:id="rIdrunjjlvh5-xojxmdbu9yy">
+      <w:hyperlink w:history="1" r:id="rIdc7nruwtzye7hnig17kadc">
         <w:r>
           <w:rPr>
             <w:rStyle w:val="Hyperlink"/>
@@ -1757,7 +1757,7 @@
       <w:r>
         <w:t xml:space="preserve"> — créé — </w:t>
       </w:r>
-      <w:hyperlink w:history="1" r:id="rIdys02z2nfmwjrpm6xj3wcq">
+      <w:hyperlink w:history="1" r:id="rIdud0nvwirksrhm_zfhgezi">
         <w:r>
           <w:rPr>
             <w:rStyle w:val="Hyperlink"/>
@@ -1786,7 +1786,7 @@
       <w:r>
         <w:t xml:space="preserve"> — créé — </w:t>
       </w:r>
-      <w:hyperlink w:history="1" r:id="rIdefdkp-5soheilfaceprdh">
+      <w:hyperlink w:history="1" r:id="rIdxqqmam8oznzad-q1unw9v">
         <w:r>
           <w:rPr>
             <w:rStyle w:val="Hyperlink"/>
@@ -1823,7 +1823,7 @@
       <w:r>
         <w:t xml:space="preserve"> — créé — </w:t>
       </w:r>
-      <w:hyperlink w:history="1" r:id="rIdlqeycaaqpqjw3rtljbyjp">
+      <w:hyperlink w:history="1" r:id="rIdxz0euq0bmps2rkoenujfi">
         <w:r>
           <w:rPr>
             <w:rStyle w:val="Hyperlink"/>
@@ -1852,7 +1852,7 @@
       <w:r>
         <w:t xml:space="preserve"> — créé — </w:t>
       </w:r>
-      <w:hyperlink w:history="1" r:id="rIda73hereu6kr5akoa7shey">
+      <w:hyperlink w:history="1" r:id="rId4baixse370xmp-l_gt2gf">
         <w:r>
           <w:rPr>
             <w:rStyle w:val="Hyperlink"/>
@@ -1881,7 +1881,7 @@
       <w:r>
         <w:t xml:space="preserve"> — créé — </w:t>
       </w:r>
-      <w:hyperlink w:history="1" r:id="rIdnly3v9w1dev-ozfnldxt8">
+      <w:hyperlink w:history="1" r:id="rIdkl_yzs2obbqfigp1zoobk">
         <w:r>
           <w:rPr>
             <w:rStyle w:val="Hyperlink"/>
@@ -1910,7 +1910,7 @@
       <w:r>
         <w:t xml:space="preserve"> — créé — </w:t>
       </w:r>
-      <w:hyperlink w:history="1" r:id="rIdrovd9oewggzuu9sbpr7yk">
+      <w:hyperlink w:history="1" r:id="rIdjzyxon-kgehfodttjjtih">
         <w:r>
           <w:rPr>
             <w:rStyle w:val="Hyperlink"/>
@@ -1939,7 +1939,7 @@
       <w:r>
         <w:t xml:space="preserve"> — créé — </w:t>
       </w:r>
-      <w:hyperlink w:history="1" r:id="rIdg3s2f5wvhek8coksdqzhv">
+      <w:hyperlink w:history="1" r:id="rId0p3mhtwetdugyq3feroom">
         <w:r>
           <w:rPr>
             <w:rStyle w:val="Hyperlink"/>
@@ -1968,7 +1968,7 @@
       <w:r>
         <w:t xml:space="preserve"> — créé — </w:t>
       </w:r>
-      <w:hyperlink w:history="1" r:id="rIdry9pugg2mdjgxjyv0urla">
+      <w:hyperlink w:history="1" r:id="rIdjrl6p7zkvhh8djajglk95">
         <w:r>
           <w:rPr>
             <w:rStyle w:val="Hyperlink"/>
@@ -1997,7 +1997,7 @@
       <w:r>
         <w:t xml:space="preserve"> — créé — </w:t>
       </w:r>
-      <w:hyperlink w:history="1" r:id="rIdnrbz2fvmexgkd6waw5x4r">
+      <w:hyperlink w:history="1" r:id="rIdljlfnhxe61hdt2ksywojn">
         <w:r>
           <w:rPr>
             <w:rStyle w:val="Hyperlink"/>
@@ -2026,7 +2026,7 @@
       <w:r>
         <w:t xml:space="preserve"> — créé — </w:t>
       </w:r>
-      <w:hyperlink w:history="1" r:id="rIdyvi5qwwx0ggxgzivjqcq2">
+      <w:hyperlink w:history="1" r:id="rIdlrorsjcpshayu3gywg6bj">
         <w:r>
           <w:rPr>
             <w:rStyle w:val="Hyperlink"/>
@@ -2139,7 +2139,7 @@
       <w:r>
         <w:t xml:space="preserve"> — créé — </w:t>
       </w:r>
-      <w:hyperlink w:history="1" r:id="rIdj8nlo8oybiqnspqavy38j">
+      <w:hyperlink w:history="1" r:id="rIdjzpbxj95fnyfnp7carkzc">
         <w:r>
           <w:rPr>
             <w:rStyle w:val="Hyperlink"/>
@@ -2189,7 +2189,7 @@
       <w:r>
         <w:t xml:space="preserve"> — créé — </w:t>
       </w:r>
-      <w:hyperlink w:history="1" r:id="rIdfszvays_mny-njry2ip_r">
+      <w:hyperlink w:history="1" r:id="rIdzulv3_p2xdar6ggiw7mnm">
         <w:r>
           <w:rPr>
             <w:rStyle w:val="Hyperlink"/>
@@ -2218,7 +2218,7 @@
       <w:r>
         <w:t xml:space="preserve"> — créé — </w:t>
       </w:r>
-      <w:hyperlink w:history="1" r:id="rIdgk0umv58ftlz-s0olr_pi">
+      <w:hyperlink w:history="1" r:id="rIdp4rytnw7uz-f5qfsimex7">
         <w:r>
           <w:rPr>
             <w:rStyle w:val="Hyperlink"/>
@@ -2247,7 +2247,7 @@
       <w:r>
         <w:t xml:space="preserve"> — créé — </w:t>
       </w:r>
-      <w:hyperlink w:history="1" r:id="rIdlrq3pvwutwiyzdbjemnv0">
+      <w:hyperlink w:history="1" r:id="rIdjjlaafeufx6_al5h8cqf8">
         <w:r>
           <w:rPr>
             <w:rStyle w:val="Hyperlink"/>
@@ -2276,7 +2276,7 @@
       <w:r>
         <w:t xml:space="preserve"> — créé — </w:t>
       </w:r>
-      <w:hyperlink w:history="1" r:id="rIdrvhhdllc3abrboohdfpta">
+      <w:hyperlink w:history="1" r:id="rIdo1akwc83utrwiowizicny">
         <w:r>
           <w:rPr>
             <w:rStyle w:val="Hyperlink"/>
@@ -2313,7 +2313,7 @@
       <w:r>
         <w:t xml:space="preserve"> — créé — </w:t>
       </w:r>
-      <w:hyperlink w:history="1" r:id="rIds9cdmgvogs3a9gri2s3x8">
+      <w:hyperlink w:history="1" r:id="rId4o8njeui2wjgjk7-xrf5y">
         <w:r>
           <w:rPr>
             <w:rStyle w:val="Hyperlink"/>
@@ -2342,7 +2342,7 @@
       <w:r>
         <w:t xml:space="preserve"> — créé — </w:t>
       </w:r>
-      <w:hyperlink w:history="1" r:id="rIdcrmepmu1yxykizkahsh1i">
+      <w:hyperlink w:history="1" r:id="rIdciwaotgbbe5ayc3lpgy1q">
         <w:r>
           <w:rPr>
             <w:rStyle w:val="Hyperlink"/>
@@ -2379,7 +2379,7 @@
       <w:r>
         <w:t xml:space="preserve"> — créé — </w:t>
       </w:r>
-      <w:hyperlink w:history="1" r:id="rIdqknedrctq1wvcpuqbu8u5">
+      <w:hyperlink w:history="1" r:id="rIdpcyldrhxw7ealcpoluogk">
         <w:r>
           <w:rPr>
             <w:rStyle w:val="Hyperlink"/>
@@ -2408,7 +2408,7 @@
       <w:r>
         <w:t xml:space="preserve"> — créé — </w:t>
       </w:r>
-      <w:hyperlink w:history="1" r:id="rId0hiu6ltf_ymd2v57oukcn">
+      <w:hyperlink w:history="1" r:id="rIdlcsbita4vync5m-0wq79l">
         <w:r>
           <w:rPr>
             <w:rStyle w:val="Hyperlink"/>
@@ -2437,7 +2437,7 @@
       <w:r>
         <w:t xml:space="preserve"> — créé — </w:t>
       </w:r>
-      <w:hyperlink w:history="1" r:id="rIdssgqovfddaknpprqdkmgf">
+      <w:hyperlink w:history="1" r:id="rIdzud--yp8tt_lw5abyojqy">
         <w:r>
           <w:rPr>
             <w:rStyle w:val="Hyperlink"/>
@@ -2466,7 +2466,7 @@
       <w:r>
         <w:t xml:space="preserve"> — créé — </w:t>
       </w:r>
-      <w:hyperlink w:history="1" r:id="rIdvr9ks8acpnfkddoflveb9">
+      <w:hyperlink w:history="1" r:id="rIdelairuqban8-fqczv3vsy">
         <w:r>
           <w:rPr>
             <w:rStyle w:val="Hyperlink"/>
@@ -2495,7 +2495,7 @@
       <w:r>
         <w:t xml:space="preserve"> — créé — </w:t>
       </w:r>
-      <w:hyperlink w:history="1" r:id="rId4oju8_bdslthcir5awegl">
+      <w:hyperlink w:history="1" r:id="rIdojln2ljievzjui2htirvj">
         <w:r>
           <w:rPr>
             <w:rStyle w:val="Hyperlink"/>
@@ -2524,7 +2524,7 @@
       <w:r>
         <w:t xml:space="preserve"> — créé — </w:t>
       </w:r>
-      <w:hyperlink w:history="1" r:id="rId3wtrjv4332o2fqn2a5og-">
+      <w:hyperlink w:history="1" r:id="rIdwvbagtmuxrloawetjzpp4">
         <w:r>
           <w:rPr>
             <w:rStyle w:val="Hyperlink"/>
@@ -2553,7 +2553,7 @@
       <w:r>
         <w:t xml:space="preserve"> — créé — </w:t>
       </w:r>
-      <w:hyperlink w:history="1" r:id="rIdoxo38qipuakacqaw1zyn8">
+      <w:hyperlink w:history="1" r:id="rIdlmosatefnpouetamsphxv">
         <w:r>
           <w:rPr>
             <w:rStyle w:val="Hyperlink"/>
@@ -2582,7 +2582,7 @@
       <w:r>
         <w:t xml:space="preserve"> — créé — </w:t>
       </w:r>
-      <w:hyperlink w:history="1" r:id="rIdwj03fayttfj8v32nzgoft">
+      <w:hyperlink w:history="1" r:id="rIdrao_lkmwikwy0si0_bbbj">
         <w:r>
           <w:rPr>
             <w:rStyle w:val="Hyperlink"/>
@@ -2611,7 +2611,7 @@
       <w:r>
         <w:t xml:space="preserve"> — créé — </w:t>
       </w:r>
-      <w:hyperlink w:history="1" r:id="rIduhtqzaic82qn-tzfvsdti">
+      <w:hyperlink w:history="1" r:id="rIdyryqowsnts38tqr-tif3v">
         <w:r>
           <w:rPr>
             <w:rStyle w:val="Hyperlink"/>
@@ -2648,7 +2648,7 @@
       <w:r>
         <w:t xml:space="preserve"> — créé — </w:t>
       </w:r>
-      <w:hyperlink w:history="1" r:id="rIdt5uc81emkurnzkqocfvbl">
+      <w:hyperlink w:history="1" r:id="rIdh33b5ypzg7hw52dd2g52v">
         <w:r>
           <w:rPr>
             <w:rStyle w:val="Hyperlink"/>
@@ -2677,7 +2677,7 @@
       <w:r>
         <w:t xml:space="preserve"> — créé — </w:t>
       </w:r>
-      <w:hyperlink w:history="1" r:id="rIdwq2lhiv88q5yjxka8rnbj">
+      <w:hyperlink w:history="1" r:id="rIdeefuiptjtfbrx7buvqdks">
         <w:r>
           <w:rPr>
             <w:rStyle w:val="Hyperlink"/>
@@ -2706,7 +2706,7 @@
       <w:r>
         <w:t xml:space="preserve"> — créé — </w:t>
       </w:r>
-      <w:hyperlink w:history="1" r:id="rId0ilwtksvc7sw12dervrod">
+      <w:hyperlink w:history="1" r:id="rIdmig3vsorkzm-krddcmwf6">
         <w:r>
           <w:rPr>
             <w:rStyle w:val="Hyperlink"/>
@@ -2735,7 +2735,7 @@
       <w:r>
         <w:t xml:space="preserve"> — créé — </w:t>
       </w:r>
-      <w:hyperlink w:history="1" r:id="rIde7tq1fn8xkkys9klqy-cd">
+      <w:hyperlink w:history="1" r:id="rId_iwzyb_jntfv8jfrs7vgg">
         <w:r>
           <w:rPr>
             <w:rStyle w:val="Hyperlink"/>
@@ -2764,7 +2764,7 @@
       <w:r>
         <w:t xml:space="preserve"> — créé — </w:t>
       </w:r>
-      <w:hyperlink w:history="1" r:id="rIdtcvy9nlatzgl8wpkyjqdb">
+      <w:hyperlink w:history="1" r:id="rId-7hgelshhcx1uzs8n7umi">
         <w:r>
           <w:rPr>
             <w:rStyle w:val="Hyperlink"/>
@@ -2793,7 +2793,7 @@
       <w:r>
         <w:t xml:space="preserve"> — créé — </w:t>
       </w:r>
-      <w:hyperlink w:history="1" r:id="rIdnyqulczq5xnrke7freoka">
+      <w:hyperlink w:history="1" r:id="rIdcmbokfkxopadiel5c4xgt">
         <w:r>
           <w:rPr>
             <w:rStyle w:val="Hyperlink"/>
@@ -2822,7 +2822,7 @@
       <w:r>
         <w:t xml:space="preserve"> — créé — </w:t>
       </w:r>
-      <w:hyperlink w:history="1" r:id="rId3hvbqmrughfmmcgp1ejy0">
+      <w:hyperlink w:history="1" r:id="rId-4q4tns2-jkyk2jqqsdh3">
         <w:r>
           <w:rPr>
             <w:rStyle w:val="Hyperlink"/>
@@ -2851,7 +2851,7 @@
       <w:r>
         <w:t xml:space="preserve"> — créé — </w:t>
       </w:r>
-      <w:hyperlink w:history="1" r:id="rIdbmrrhrhs5pfkdohbuex07">
+      <w:hyperlink w:history="1" r:id="rId0zs4mti8sxilx05weqchc">
         <w:r>
           <w:rPr>
             <w:rStyle w:val="Hyperlink"/>

</xml_diff>

<commit_message>
Dossier §15.168, avancement, phase 69
Co-Authored-By: Claude Opus 5.5 <noreply@anthropic.com>
</commit_message>
<xml_diff>
--- a/docs/developpement/phases/word/PHASE_00_SOCLE_DE_PRODUCTION_ET_CONFIGURATION_DUN_LIEU_VIDE.docx
+++ b/docs/developpement/phases/word/PHASE_00_SOCLE_DE_PRODUCTION_ET_CONFIGURATION_DUN_LIEU_VIDE.docx
@@ -20,7 +20,7 @@
       <w:r>
         <w:t xml:space="preserve">FlaiX Expert · dossier de développement · généré le 2026-10-19 depuis le dépôt </w:t>
       </w:r>
-      <w:hyperlink w:history="1" r:id="rId2sxff-oawrmdqffjie3j6">
+      <w:hyperlink w:history="1" r:id="rIdtulkfopshw0v0zrzwodaz">
         <w:r>
           <w:rPr>
             <w:rStyle w:val="Hyperlink"/>
@@ -592,7 +592,7 @@
           <w:numId w:val="3"/>
         </w:numPr>
       </w:pPr>
-      <w:hyperlink w:history="1" r:id="rId6mtpdgbg4cdlwkkemyy8y">
+      <w:hyperlink w:history="1" r:id="rIdi8slqtpbkzmrjfl1s_vvt">
         <w:r>
           <w:rPr>
             <w:rStyle w:val="Hyperlink"/>
@@ -612,7 +612,7 @@
           <w:numId w:val="3"/>
         </w:numPr>
       </w:pPr>
-      <w:hyperlink w:history="1" r:id="rIdew0j8hg4kwesxttyhtmst">
+      <w:hyperlink w:history="1" r:id="rIdsj6jrybihpqkfy09ctbxz">
         <w:r>
           <w:rPr>
             <w:rStyle w:val="Hyperlink"/>
@@ -660,7 +660,7 @@
       <w:r>
         <w:t xml:space="preserve"> — créé — </w:t>
       </w:r>
-      <w:hyperlink w:history="1" r:id="rIdwnyzkrtl63gboym4ced3y">
+      <w:hyperlink w:history="1" r:id="rId6magkuutge9wz0gpz5hpd">
         <w:r>
           <w:rPr>
             <w:rStyle w:val="Hyperlink"/>
@@ -689,7 +689,7 @@
       <w:r>
         <w:t xml:space="preserve"> — créé — </w:t>
       </w:r>
-      <w:hyperlink w:history="1" r:id="rId1kcp9bentvupucbelg3ay">
+      <w:hyperlink w:history="1" r:id="rIdhhn4zklvceabxtkurhfci">
         <w:r>
           <w:rPr>
             <w:rStyle w:val="Hyperlink"/>
@@ -726,7 +726,7 @@
       <w:r>
         <w:t xml:space="preserve"> — créé — </w:t>
       </w:r>
-      <w:hyperlink w:history="1" r:id="rIdruayojaiidnei0xalzhwo">
+      <w:hyperlink w:history="1" r:id="rIdwhkfgzuwgynis-stdncyc">
         <w:r>
           <w:rPr>
             <w:rStyle w:val="Hyperlink"/>
@@ -755,7 +755,7 @@
       <w:r>
         <w:t xml:space="preserve"> — créé — </w:t>
       </w:r>
-      <w:hyperlink w:history="1" r:id="rIdnmq2m6312ytf3i679rbks">
+      <w:hyperlink w:history="1" r:id="rIdxmq4aghdkoxbqfidy8n1i">
         <w:r>
           <w:rPr>
             <w:rStyle w:val="Hyperlink"/>
@@ -784,7 +784,7 @@
       <w:r>
         <w:t xml:space="preserve"> — créé — </w:t>
       </w:r>
-      <w:hyperlink w:history="1" r:id="rIdzxptuo2v3cwlg0wboxhqv">
+      <w:hyperlink w:history="1" r:id="rIdvpxkpxc5xchxx7sxccvae">
         <w:r>
           <w:rPr>
             <w:rStyle w:val="Hyperlink"/>
@@ -813,7 +813,7 @@
       <w:r>
         <w:t xml:space="preserve"> — créé — </w:t>
       </w:r>
-      <w:hyperlink w:history="1" r:id="rIdwkycuadv1xbjfgfc2_3ft">
+      <w:hyperlink w:history="1" r:id="rId0jqodry8mrpdarnpy9j9p">
         <w:r>
           <w:rPr>
             <w:rStyle w:val="Hyperlink"/>
@@ -842,7 +842,7 @@
       <w:r>
         <w:t xml:space="preserve"> — créé — </w:t>
       </w:r>
-      <w:hyperlink w:history="1" r:id="rIdw6xkjew8bqqio7k9dry4h">
+      <w:hyperlink w:history="1" r:id="rIdu3cqdgetv0bepryijsokq">
         <w:r>
           <w:rPr>
             <w:rStyle w:val="Hyperlink"/>
@@ -879,7 +879,7 @@
       <w:r>
         <w:t xml:space="preserve"> — créé — </w:t>
       </w:r>
-      <w:hyperlink w:history="1" r:id="rIdol7rofoq6wzzvl-o7crft">
+      <w:hyperlink w:history="1" r:id="rIdpch3hzdbk4zjqzc7ye3jp">
         <w:r>
           <w:rPr>
             <w:rStyle w:val="Hyperlink"/>
@@ -908,7 +908,7 @@
       <w:r>
         <w:t xml:space="preserve"> — créé — </w:t>
       </w:r>
-      <w:hyperlink w:history="1" r:id="rIdjkiho-ivgy-50x0g4askp">
+      <w:hyperlink w:history="1" r:id="rId1d0wwlafrorubfxkj9um0">
         <w:r>
           <w:rPr>
             <w:rStyle w:val="Hyperlink"/>
@@ -937,7 +937,7 @@
       <w:r>
         <w:t xml:space="preserve"> — créé — </w:t>
       </w:r>
-      <w:hyperlink w:history="1" r:id="rIdt7yleklkhzenhqbmnrp6f">
+      <w:hyperlink w:history="1" r:id="rId8vcn20wujok-mcphbkbox">
         <w:r>
           <w:rPr>
             <w:rStyle w:val="Hyperlink"/>
@@ -966,7 +966,7 @@
       <w:r>
         <w:t xml:space="preserve"> — créé — </w:t>
       </w:r>
-      <w:hyperlink w:history="1" r:id="rId1fp2t2qsgjhvwpsa3all8">
+      <w:hyperlink w:history="1" r:id="rId6xnk8kokjfsizl_buuzlq">
         <w:r>
           <w:rPr>
             <w:rStyle w:val="Hyperlink"/>
@@ -995,7 +995,7 @@
       <w:r>
         <w:t xml:space="preserve"> — créé — </w:t>
       </w:r>
-      <w:hyperlink w:history="1" r:id="rIdfrentpk_z5rowaali8jsh">
+      <w:hyperlink w:history="1" r:id="rIdxyfvjbdpureo_t7mhhmad">
         <w:r>
           <w:rPr>
             <w:rStyle w:val="Hyperlink"/>
@@ -1024,7 +1024,7 @@
       <w:r>
         <w:t xml:space="preserve"> — créé — </w:t>
       </w:r>
-      <w:hyperlink w:history="1" r:id="rId3qr8gjyninyycdhjcyfep">
+      <w:hyperlink w:history="1" r:id="rIdp612uzf-mh5wsu0n0lrmb">
         <w:r>
           <w:rPr>
             <w:rStyle w:val="Hyperlink"/>
@@ -1053,7 +1053,7 @@
       <w:r>
         <w:t xml:space="preserve"> — créé — </w:t>
       </w:r>
-      <w:hyperlink w:history="1" r:id="rIdlt8tkretx-rcujwmjypy7">
+      <w:hyperlink w:history="1" r:id="rIdvla9wisgwi84pcg5z0o9g">
         <w:r>
           <w:rPr>
             <w:rStyle w:val="Hyperlink"/>
@@ -1082,7 +1082,7 @@
       <w:r>
         <w:t xml:space="preserve"> — créé — </w:t>
       </w:r>
-      <w:hyperlink w:history="1" r:id="rIdjlxi4oo0kvurif5yjwy1e">
+      <w:hyperlink w:history="1" r:id="rIdhcem_tpysr2ixfpsh-atc">
         <w:r>
           <w:rPr>
             <w:rStyle w:val="Hyperlink"/>
@@ -1111,7 +1111,7 @@
       <w:r>
         <w:t xml:space="preserve"> — créé — </w:t>
       </w:r>
-      <w:hyperlink w:history="1" r:id="rId_qh4enzxwm-1ekgarz3df">
+      <w:hyperlink w:history="1" r:id="rIdsy67mlvjvcxyjcagxcnv3">
         <w:r>
           <w:rPr>
             <w:rStyle w:val="Hyperlink"/>
@@ -1148,7 +1148,7 @@
       <w:r>
         <w:t xml:space="preserve"> — créé — </w:t>
       </w:r>
-      <w:hyperlink w:history="1" r:id="rId9flkbykb9albmzo_40lx3">
+      <w:hyperlink w:history="1" r:id="rId6ksadxviip65wzibhiy9c">
         <w:r>
           <w:rPr>
             <w:rStyle w:val="Hyperlink"/>
@@ -1177,7 +1177,7 @@
       <w:r>
         <w:t xml:space="preserve"> — créé — </w:t>
       </w:r>
-      <w:hyperlink w:history="1" r:id="rIdf414afql1qfhnogwstsoe">
+      <w:hyperlink w:history="1" r:id="rIdkytdtqhzrznsqjp6rcm6h">
         <w:r>
           <w:rPr>
             <w:rStyle w:val="Hyperlink"/>
@@ -1206,7 +1206,7 @@
       <w:r>
         <w:t xml:space="preserve"> — créé — </w:t>
       </w:r>
-      <w:hyperlink w:history="1" r:id="rIdgvwotmmm93bdbzvxs01ay">
+      <w:hyperlink w:history="1" r:id="rId0pxn4x6se5in3hjc8_ytb">
         <w:r>
           <w:rPr>
             <w:rStyle w:val="Hyperlink"/>
@@ -1235,7 +1235,7 @@
       <w:r>
         <w:t xml:space="preserve"> — créé — </w:t>
       </w:r>
-      <w:hyperlink w:history="1" r:id="rIdf3kxjwq-6cd0mo0eipdkg">
+      <w:hyperlink w:history="1" r:id="rIdvdcrl6syu90tywarjfcev">
         <w:r>
           <w:rPr>
             <w:rStyle w:val="Hyperlink"/>
@@ -1264,7 +1264,7 @@
       <w:r>
         <w:t xml:space="preserve"> — créé — </w:t>
       </w:r>
-      <w:hyperlink w:history="1" r:id="rIdhflxnrchxgfcuksa0txya">
+      <w:hyperlink w:history="1" r:id="rId7s68uvdck0tsphaosxv3f">
         <w:r>
           <w:rPr>
             <w:rStyle w:val="Hyperlink"/>
@@ -1293,7 +1293,7 @@
       <w:r>
         <w:t xml:space="preserve"> — créé — </w:t>
       </w:r>
-      <w:hyperlink w:history="1" r:id="rIdzivbd-qw6qb8lzwtxp-iq">
+      <w:hyperlink w:history="1" r:id="rIdj1mshqay06drzmaa7aydm">
         <w:r>
           <w:rPr>
             <w:rStyle w:val="Hyperlink"/>
@@ -1322,7 +1322,7 @@
       <w:r>
         <w:t xml:space="preserve"> — créé — </w:t>
       </w:r>
-      <w:hyperlink w:history="1" r:id="rIdz2whqgchcryns3q_ne1zn">
+      <w:hyperlink w:history="1" r:id="rId_3eu0zrt87_jdpmvrqt4q">
         <w:r>
           <w:rPr>
             <w:rStyle w:val="Hyperlink"/>
@@ -1351,7 +1351,7 @@
       <w:r>
         <w:t xml:space="preserve"> — créé — </w:t>
       </w:r>
-      <w:hyperlink w:history="1" r:id="rIdbaka9dcmeghm0_za7algo">
+      <w:hyperlink w:history="1" r:id="rIdw-zulbjci8x3clfzqf4s5">
         <w:r>
           <w:rPr>
             <w:rStyle w:val="Hyperlink"/>
@@ -1380,7 +1380,7 @@
       <w:r>
         <w:t xml:space="preserve"> — créé — </w:t>
       </w:r>
-      <w:hyperlink w:history="1" r:id="rIdly94mqhjxypxit7umbopf">
+      <w:hyperlink w:history="1" r:id="rIdveukgvupeme_rqe4jzhui">
         <w:r>
           <w:rPr>
             <w:rStyle w:val="Hyperlink"/>
@@ -1409,7 +1409,7 @@
       <w:r>
         <w:t xml:space="preserve"> — créé — </w:t>
       </w:r>
-      <w:hyperlink w:history="1" r:id="rIdaxb4je9tk9a7ljwobpvlm">
+      <w:hyperlink w:history="1" r:id="rIdlpsk8ajzjfcmokstkp7ir">
         <w:r>
           <w:rPr>
             <w:rStyle w:val="Hyperlink"/>
@@ -1438,7 +1438,7 @@
       <w:r>
         <w:t xml:space="preserve"> — créé — </w:t>
       </w:r>
-      <w:hyperlink w:history="1" r:id="rIdbgciffbfszo-zoshinif_">
+      <w:hyperlink w:history="1" r:id="rIdzocylmysx3rrb46f9sstc">
         <w:r>
           <w:rPr>
             <w:rStyle w:val="Hyperlink"/>
@@ -1467,7 +1467,7 @@
       <w:r>
         <w:t xml:space="preserve"> — créé — </w:t>
       </w:r>
-      <w:hyperlink w:history="1" r:id="rIdf3tl9cikxu1vxkl4kxcq0">
+      <w:hyperlink w:history="1" r:id="rIdt_83xg5jrqrnfpwyq_nqh">
         <w:r>
           <w:rPr>
             <w:rStyle w:val="Hyperlink"/>
@@ -1496,7 +1496,7 @@
       <w:r>
         <w:t xml:space="preserve"> — créé — </w:t>
       </w:r>
-      <w:hyperlink w:history="1" r:id="rIdnxqatbjdnungk3hdgkuy7">
+      <w:hyperlink w:history="1" r:id="rIdfzefrm81chdxqfysxi7hx">
         <w:r>
           <w:rPr>
             <w:rStyle w:val="Hyperlink"/>
@@ -1525,7 +1525,7 @@
       <w:r>
         <w:t xml:space="preserve"> — créé — </w:t>
       </w:r>
-      <w:hyperlink w:history="1" r:id="rId1r3ypl2hqdq51r4qxx3bp">
+      <w:hyperlink w:history="1" r:id="rIdpploqx7avf2sxtac2amss">
         <w:r>
           <w:rPr>
             <w:rStyle w:val="Hyperlink"/>
@@ -1554,7 +1554,7 @@
       <w:r>
         <w:t xml:space="preserve"> — créé — </w:t>
       </w:r>
-      <w:hyperlink w:history="1" r:id="rIdm1lbrtxgslvbgi3nemsoo">
+      <w:hyperlink w:history="1" r:id="rId54hwx1lz-paah8ghmwzy5">
         <w:r>
           <w:rPr>
             <w:rStyle w:val="Hyperlink"/>
@@ -1583,7 +1583,7 @@
       <w:r>
         <w:t xml:space="preserve"> — créé — </w:t>
       </w:r>
-      <w:hyperlink w:history="1" r:id="rIdcev3vfwapi02j4l5tpmol">
+      <w:hyperlink w:history="1" r:id="rIdfvkckraydliqg2ovwcmzh">
         <w:r>
           <w:rPr>
             <w:rStyle w:val="Hyperlink"/>
@@ -1612,7 +1612,7 @@
       <w:r>
         <w:t xml:space="preserve"> — créé — </w:t>
       </w:r>
-      <w:hyperlink w:history="1" r:id="rIdn90u3-iue5ggw-zxt9ja2">
+      <w:hyperlink w:history="1" r:id="rId2i8josbpxgobh5guqef-9">
         <w:r>
           <w:rPr>
             <w:rStyle w:val="Hyperlink"/>
@@ -1641,7 +1641,7 @@
       <w:r>
         <w:t xml:space="preserve"> — créé — </w:t>
       </w:r>
-      <w:hyperlink w:history="1" r:id="rIdht01hfyutvaukom-vx6ov">
+      <w:hyperlink w:history="1" r:id="rIduofeprayd1fwuia_d1z0j">
         <w:r>
           <w:rPr>
             <w:rStyle w:val="Hyperlink"/>
@@ -1670,7 +1670,7 @@
       <w:r>
         <w:t xml:space="preserve"> — créé — </w:t>
       </w:r>
-      <w:hyperlink w:history="1" r:id="rIdwg7lhz_a4uvfb9vefvkj6">
+      <w:hyperlink w:history="1" r:id="rIdrbifdwsnc8uvvj4chqffb">
         <w:r>
           <w:rPr>
             <w:rStyle w:val="Hyperlink"/>
@@ -1699,7 +1699,7 @@
       <w:r>
         <w:t xml:space="preserve"> — créé — </w:t>
       </w:r>
-      <w:hyperlink w:history="1" r:id="rIdxtst57d74vp6ygshqj8ch">
+      <w:hyperlink w:history="1" r:id="rIdn3r5jjn2ruowdcvuhlaqv">
         <w:r>
           <w:rPr>
             <w:rStyle w:val="Hyperlink"/>
@@ -1728,7 +1728,7 @@
       <w:r>
         <w:t xml:space="preserve"> — créé — </w:t>
       </w:r>
-      <w:hyperlink w:history="1" r:id="rIdc7nruwtzye7hnig17kadc">
+      <w:hyperlink w:history="1" r:id="rIdpkxq2gvf_20gwx47hanj8">
         <w:r>
           <w:rPr>
             <w:rStyle w:val="Hyperlink"/>
@@ -1757,7 +1757,7 @@
       <w:r>
         <w:t xml:space="preserve"> — créé — </w:t>
       </w:r>
-      <w:hyperlink w:history="1" r:id="rIdud0nvwirksrhm_zfhgezi">
+      <w:hyperlink w:history="1" r:id="rIdrsghzse72w8ehvdd5e8b1">
         <w:r>
           <w:rPr>
             <w:rStyle w:val="Hyperlink"/>
@@ -1786,7 +1786,7 @@
       <w:r>
         <w:t xml:space="preserve"> — créé — </w:t>
       </w:r>
-      <w:hyperlink w:history="1" r:id="rIdxqqmam8oznzad-q1unw9v">
+      <w:hyperlink w:history="1" r:id="rIducjpjyqtfbwspbz3x26qd">
         <w:r>
           <w:rPr>
             <w:rStyle w:val="Hyperlink"/>
@@ -1823,7 +1823,7 @@
       <w:r>
         <w:t xml:space="preserve"> — créé — </w:t>
       </w:r>
-      <w:hyperlink w:history="1" r:id="rIdxz0euq0bmps2rkoenujfi">
+      <w:hyperlink w:history="1" r:id="rIdpgiw5lqahhkrusnhievzv">
         <w:r>
           <w:rPr>
             <w:rStyle w:val="Hyperlink"/>
@@ -1852,7 +1852,7 @@
       <w:r>
         <w:t xml:space="preserve"> — créé — </w:t>
       </w:r>
-      <w:hyperlink w:history="1" r:id="rId4baixse370xmp-l_gt2gf">
+      <w:hyperlink w:history="1" r:id="rIdtxhbmzhegstgzu1g-przd">
         <w:r>
           <w:rPr>
             <w:rStyle w:val="Hyperlink"/>
@@ -1881,7 +1881,7 @@
       <w:r>
         <w:t xml:space="preserve"> — créé — </w:t>
       </w:r>
-      <w:hyperlink w:history="1" r:id="rIdkl_yzs2obbqfigp1zoobk">
+      <w:hyperlink w:history="1" r:id="rIdugfro3e1jrsiojvehsaei">
         <w:r>
           <w:rPr>
             <w:rStyle w:val="Hyperlink"/>
@@ -1910,7 +1910,7 @@
       <w:r>
         <w:t xml:space="preserve"> — créé — </w:t>
       </w:r>
-      <w:hyperlink w:history="1" r:id="rIdjzyxon-kgehfodttjjtih">
+      <w:hyperlink w:history="1" r:id="rIdtdpvcb6k8srwlp-7vopnh">
         <w:r>
           <w:rPr>
             <w:rStyle w:val="Hyperlink"/>
@@ -1939,7 +1939,7 @@
       <w:r>
         <w:t xml:space="preserve"> — créé — </w:t>
       </w:r>
-      <w:hyperlink w:history="1" r:id="rId0p3mhtwetdugyq3feroom">
+      <w:hyperlink w:history="1" r:id="rIdblmbhpczmo1g_yxtrvw_h">
         <w:r>
           <w:rPr>
             <w:rStyle w:val="Hyperlink"/>
@@ -1968,7 +1968,7 @@
       <w:r>
         <w:t xml:space="preserve"> — créé — </w:t>
       </w:r>
-      <w:hyperlink w:history="1" r:id="rIdjrl6p7zkvhh8djajglk95">
+      <w:hyperlink w:history="1" r:id="rId4hkofcciqlciwg26umf14">
         <w:r>
           <w:rPr>
             <w:rStyle w:val="Hyperlink"/>
@@ -1997,7 +1997,7 @@
       <w:r>
         <w:t xml:space="preserve"> — créé — </w:t>
       </w:r>
-      <w:hyperlink w:history="1" r:id="rIdljlfnhxe61hdt2ksywojn">
+      <w:hyperlink w:history="1" r:id="rIdijcja8v3sh-uvrtjrnbzh">
         <w:r>
           <w:rPr>
             <w:rStyle w:val="Hyperlink"/>
@@ -2026,7 +2026,7 @@
       <w:r>
         <w:t xml:space="preserve"> — créé — </w:t>
       </w:r>
-      <w:hyperlink w:history="1" r:id="rIdlrorsjcpshayu3gywg6bj">
+      <w:hyperlink w:history="1" r:id="rIdfyyv8iw661ssnh1hhk-pd">
         <w:r>
           <w:rPr>
             <w:rStyle w:val="Hyperlink"/>
@@ -2139,7 +2139,7 @@
       <w:r>
         <w:t xml:space="preserve"> — créé — </w:t>
       </w:r>
-      <w:hyperlink w:history="1" r:id="rIdjzpbxj95fnyfnp7carkzc">
+      <w:hyperlink w:history="1" r:id="rIdyvef-5fqv3lh8nuhmh5oq">
         <w:r>
           <w:rPr>
             <w:rStyle w:val="Hyperlink"/>
@@ -2189,7 +2189,7 @@
       <w:r>
         <w:t xml:space="preserve"> — créé — </w:t>
       </w:r>
-      <w:hyperlink w:history="1" r:id="rIdzulv3_p2xdar6ggiw7mnm">
+      <w:hyperlink w:history="1" r:id="rIdbppo520kf-edyxbe121pg">
         <w:r>
           <w:rPr>
             <w:rStyle w:val="Hyperlink"/>
@@ -2218,7 +2218,7 @@
       <w:r>
         <w:t xml:space="preserve"> — créé — </w:t>
       </w:r>
-      <w:hyperlink w:history="1" r:id="rIdp4rytnw7uz-f5qfsimex7">
+      <w:hyperlink w:history="1" r:id="rIds_jxqk33iraduz5yobp8o">
         <w:r>
           <w:rPr>
             <w:rStyle w:val="Hyperlink"/>
@@ -2247,7 +2247,7 @@
       <w:r>
         <w:t xml:space="preserve"> — créé — </w:t>
       </w:r>
-      <w:hyperlink w:history="1" r:id="rIdjjlaafeufx6_al5h8cqf8">
+      <w:hyperlink w:history="1" r:id="rId9g38pgeocs6hgxp2-a2fl">
         <w:r>
           <w:rPr>
             <w:rStyle w:val="Hyperlink"/>
@@ -2276,7 +2276,7 @@
       <w:r>
         <w:t xml:space="preserve"> — créé — </w:t>
       </w:r>
-      <w:hyperlink w:history="1" r:id="rIdo1akwc83utrwiowizicny">
+      <w:hyperlink w:history="1" r:id="rIdnsbu77nn_hiqzi9f5t78x">
         <w:r>
           <w:rPr>
             <w:rStyle w:val="Hyperlink"/>
@@ -2313,7 +2313,7 @@
       <w:r>
         <w:t xml:space="preserve"> — créé — </w:t>
       </w:r>
-      <w:hyperlink w:history="1" r:id="rId4o8njeui2wjgjk7-xrf5y">
+      <w:hyperlink w:history="1" r:id="rIdddg7q6fgntkaiwq8mbvkp">
         <w:r>
           <w:rPr>
             <w:rStyle w:val="Hyperlink"/>
@@ -2342,7 +2342,7 @@
       <w:r>
         <w:t xml:space="preserve"> — créé — </w:t>
       </w:r>
-      <w:hyperlink w:history="1" r:id="rIdciwaotgbbe5ayc3lpgy1q">
+      <w:hyperlink w:history="1" r:id="rIdftseyhu19royl8dqwfjob">
         <w:r>
           <w:rPr>
             <w:rStyle w:val="Hyperlink"/>
@@ -2379,7 +2379,7 @@
       <w:r>
         <w:t xml:space="preserve"> — créé — </w:t>
       </w:r>
-      <w:hyperlink w:history="1" r:id="rIdpcyldrhxw7ealcpoluogk">
+      <w:hyperlink w:history="1" r:id="rIdrkhgk_nk2_pxgqvs0zod-">
         <w:r>
           <w:rPr>
             <w:rStyle w:val="Hyperlink"/>
@@ -2408,7 +2408,7 @@
       <w:r>
         <w:t xml:space="preserve"> — créé — </w:t>
       </w:r>
-      <w:hyperlink w:history="1" r:id="rIdlcsbita4vync5m-0wq79l">
+      <w:hyperlink w:history="1" r:id="rIdunwtbg6wg33yn2d8ye-rq">
         <w:r>
           <w:rPr>
             <w:rStyle w:val="Hyperlink"/>
@@ -2437,7 +2437,7 @@
       <w:r>
         <w:t xml:space="preserve"> — créé — </w:t>
       </w:r>
-      <w:hyperlink w:history="1" r:id="rIdzud--yp8tt_lw5abyojqy">
+      <w:hyperlink w:history="1" r:id="rIdyg0kb2dgnergijouqfxwk">
         <w:r>
           <w:rPr>
             <w:rStyle w:val="Hyperlink"/>
@@ -2466,7 +2466,7 @@
       <w:r>
         <w:t xml:space="preserve"> — créé — </w:t>
       </w:r>
-      <w:hyperlink w:history="1" r:id="rIdelairuqban8-fqczv3vsy">
+      <w:hyperlink w:history="1" r:id="rIdcsschwzy6mmvrz5yeezjy">
         <w:r>
           <w:rPr>
             <w:rStyle w:val="Hyperlink"/>
@@ -2495,7 +2495,7 @@
       <w:r>
         <w:t xml:space="preserve"> — créé — </w:t>
       </w:r>
-      <w:hyperlink w:history="1" r:id="rIdojln2ljievzjui2htirvj">
+      <w:hyperlink w:history="1" r:id="rIdz0pywhddavqua0aqsibyn">
         <w:r>
           <w:rPr>
             <w:rStyle w:val="Hyperlink"/>
@@ -2524,7 +2524,7 @@
       <w:r>
         <w:t xml:space="preserve"> — créé — </w:t>
       </w:r>
-      <w:hyperlink w:history="1" r:id="rIdwvbagtmuxrloawetjzpp4">
+      <w:hyperlink w:history="1" r:id="rIdeii1puahtdfh4uqwvbq7v">
         <w:r>
           <w:rPr>
             <w:rStyle w:val="Hyperlink"/>
@@ -2553,7 +2553,7 @@
       <w:r>
         <w:t xml:space="preserve"> — créé — </w:t>
       </w:r>
-      <w:hyperlink w:history="1" r:id="rIdlmosatefnpouetamsphxv">
+      <w:hyperlink w:history="1" r:id="rIdu--vlk417x2ktiodbxyeu">
         <w:r>
           <w:rPr>
             <w:rStyle w:val="Hyperlink"/>
@@ -2582,7 +2582,7 @@
       <w:r>
         <w:t xml:space="preserve"> — créé — </w:t>
       </w:r>
-      <w:hyperlink w:history="1" r:id="rIdrao_lkmwikwy0si0_bbbj">
+      <w:hyperlink w:history="1" r:id="rIdom6q_zcjpa0vf3_0hovem">
         <w:r>
           <w:rPr>
             <w:rStyle w:val="Hyperlink"/>
@@ -2611,7 +2611,7 @@
       <w:r>
         <w:t xml:space="preserve"> — créé — </w:t>
       </w:r>
-      <w:hyperlink w:history="1" r:id="rIdyryqowsnts38tqr-tif3v">
+      <w:hyperlink w:history="1" r:id="rIddrm-8jb4ltqveyvhi67oy">
         <w:r>
           <w:rPr>
             <w:rStyle w:val="Hyperlink"/>
@@ -2648,7 +2648,7 @@
       <w:r>
         <w:t xml:space="preserve"> — créé — </w:t>
       </w:r>
-      <w:hyperlink w:history="1" r:id="rIdh33b5ypzg7hw52dd2g52v">
+      <w:hyperlink w:history="1" r:id="rIdzcwgbvxstfia_6rrliq5g">
         <w:r>
           <w:rPr>
             <w:rStyle w:val="Hyperlink"/>
@@ -2677,7 +2677,7 @@
       <w:r>
         <w:t xml:space="preserve"> — créé — </w:t>
       </w:r>
-      <w:hyperlink w:history="1" r:id="rIdeefuiptjtfbrx7buvqdks">
+      <w:hyperlink w:history="1" r:id="rIdwjlghhx7wwpzkmpyaereb">
         <w:r>
           <w:rPr>
             <w:rStyle w:val="Hyperlink"/>
@@ -2706,7 +2706,7 @@
       <w:r>
         <w:t xml:space="preserve"> — créé — </w:t>
       </w:r>
-      <w:hyperlink w:history="1" r:id="rIdmig3vsorkzm-krddcmwf6">
+      <w:hyperlink w:history="1" r:id="rId6go1pkyz9obrryoe-vxx2">
         <w:r>
           <w:rPr>
             <w:rStyle w:val="Hyperlink"/>
@@ -2735,7 +2735,7 @@
       <w:r>
         <w:t xml:space="preserve"> — créé — </w:t>
       </w:r>
-      <w:hyperlink w:history="1" r:id="rId_iwzyb_jntfv8jfrs7vgg">
+      <w:hyperlink w:history="1" r:id="rIdata20_ewp8n9pmficyrfu">
         <w:r>
           <w:rPr>
             <w:rStyle w:val="Hyperlink"/>
@@ -2764,7 +2764,7 @@
       <w:r>
         <w:t xml:space="preserve"> — créé — </w:t>
       </w:r>
-      <w:hyperlink w:history="1" r:id="rId-7hgelshhcx1uzs8n7umi">
+      <w:hyperlink w:history="1" r:id="rIdrsry1rquqqdg4ss9oil_a">
         <w:r>
           <w:rPr>
             <w:rStyle w:val="Hyperlink"/>
@@ -2793,7 +2793,7 @@
       <w:r>
         <w:t xml:space="preserve"> — créé — </w:t>
       </w:r>
-      <w:hyperlink w:history="1" r:id="rIdcmbokfkxopadiel5c4xgt">
+      <w:hyperlink w:history="1" r:id="rIdpahudaumd4noz3xe0jwxl">
         <w:r>
           <w:rPr>
             <w:rStyle w:val="Hyperlink"/>
@@ -2822,7 +2822,7 @@
       <w:r>
         <w:t xml:space="preserve"> — créé — </w:t>
       </w:r>
-      <w:hyperlink w:history="1" r:id="rId-4q4tns2-jkyk2jqqsdh3">
+      <w:hyperlink w:history="1" r:id="rId2ik9aui-xy0eutbbxmov2">
         <w:r>
           <w:rPr>
             <w:rStyle w:val="Hyperlink"/>
@@ -2851,7 +2851,7 @@
       <w:r>
         <w:t xml:space="preserve"> — créé — </w:t>
       </w:r>
-      <w:hyperlink w:history="1" r:id="rId0zs4mti8sxilx05weqchc">
+      <w:hyperlink w:history="1" r:id="rIdj_j9xruts-fdo4xkzoe2w">
         <w:r>
           <w:rPr>
             <w:rStyle w:val="Hyperlink"/>

</xml_diff>

<commit_message>
Dossier §15.169, avancement, phase 70
Co-Authored-By: Claude Opus 5.5 <noreply@anthropic.com>
</commit_message>
<xml_diff>
--- a/docs/developpement/phases/word/PHASE_00_SOCLE_DE_PRODUCTION_ET_CONFIGURATION_DUN_LIEU_VIDE.docx
+++ b/docs/developpement/phases/word/PHASE_00_SOCLE_DE_PRODUCTION_ET_CONFIGURATION_DUN_LIEU_VIDE.docx
@@ -20,7 +20,7 @@
       <w:r>
         <w:t xml:space="preserve">FlaiX Expert · dossier de développement · généré le 2026-10-19 depuis le dépôt </w:t>
       </w:r>
-      <w:hyperlink w:history="1" r:id="rIdtulkfopshw0v0zrzwodaz">
+      <w:hyperlink w:history="1" r:id="rIdb18i_zbni4j4iitjpgqxu">
         <w:r>
           <w:rPr>
             <w:rStyle w:val="Hyperlink"/>
@@ -592,7 +592,7 @@
           <w:numId w:val="3"/>
         </w:numPr>
       </w:pPr>
-      <w:hyperlink w:history="1" r:id="rIdi8slqtpbkzmrjfl1s_vvt">
+      <w:hyperlink w:history="1" r:id="rId9xrxg7tx0r59eosilbdi9">
         <w:r>
           <w:rPr>
             <w:rStyle w:val="Hyperlink"/>
@@ -612,7 +612,7 @@
           <w:numId w:val="3"/>
         </w:numPr>
       </w:pPr>
-      <w:hyperlink w:history="1" r:id="rIdsj6jrybihpqkfy09ctbxz">
+      <w:hyperlink w:history="1" r:id="rIdbs9aof8ykdlcgtp15t8ct">
         <w:r>
           <w:rPr>
             <w:rStyle w:val="Hyperlink"/>
@@ -660,7 +660,7 @@
       <w:r>
         <w:t xml:space="preserve"> — créé — </w:t>
       </w:r>
-      <w:hyperlink w:history="1" r:id="rId6magkuutge9wz0gpz5hpd">
+      <w:hyperlink w:history="1" r:id="rId_6sqxzzkyzzsqpmurvh0c">
         <w:r>
           <w:rPr>
             <w:rStyle w:val="Hyperlink"/>
@@ -689,7 +689,7 @@
       <w:r>
         <w:t xml:space="preserve"> — créé — </w:t>
       </w:r>
-      <w:hyperlink w:history="1" r:id="rIdhhn4zklvceabxtkurhfci">
+      <w:hyperlink w:history="1" r:id="rIdlhhxdoxmhsu2t_okpd1xz">
         <w:r>
           <w:rPr>
             <w:rStyle w:val="Hyperlink"/>
@@ -726,7 +726,7 @@
       <w:r>
         <w:t xml:space="preserve"> — créé — </w:t>
       </w:r>
-      <w:hyperlink w:history="1" r:id="rIdwhkfgzuwgynis-stdncyc">
+      <w:hyperlink w:history="1" r:id="rIdvuu7dp9qwwm5wnbcbyabn">
         <w:r>
           <w:rPr>
             <w:rStyle w:val="Hyperlink"/>
@@ -755,7 +755,7 @@
       <w:r>
         <w:t xml:space="preserve"> — créé — </w:t>
       </w:r>
-      <w:hyperlink w:history="1" r:id="rIdxmq4aghdkoxbqfidy8n1i">
+      <w:hyperlink w:history="1" r:id="rIdptnmudknwe16b5np9dd79">
         <w:r>
           <w:rPr>
             <w:rStyle w:val="Hyperlink"/>
@@ -784,7 +784,7 @@
       <w:r>
         <w:t xml:space="preserve"> — créé — </w:t>
       </w:r>
-      <w:hyperlink w:history="1" r:id="rIdvpxkpxc5xchxx7sxccvae">
+      <w:hyperlink w:history="1" r:id="rId1vemhk-vxy1nk6g3sj8i4">
         <w:r>
           <w:rPr>
             <w:rStyle w:val="Hyperlink"/>
@@ -813,7 +813,7 @@
       <w:r>
         <w:t xml:space="preserve"> — créé — </w:t>
       </w:r>
-      <w:hyperlink w:history="1" r:id="rId0jqodry8mrpdarnpy9j9p">
+      <w:hyperlink w:history="1" r:id="rIdzrfil9g7jeyzqg9wdbsc2">
         <w:r>
           <w:rPr>
             <w:rStyle w:val="Hyperlink"/>
@@ -842,7 +842,7 @@
       <w:r>
         <w:t xml:space="preserve"> — créé — </w:t>
       </w:r>
-      <w:hyperlink w:history="1" r:id="rIdu3cqdgetv0bepryijsokq">
+      <w:hyperlink w:history="1" r:id="rIddvew_l9s9i-agf-nrul9n">
         <w:r>
           <w:rPr>
             <w:rStyle w:val="Hyperlink"/>
@@ -879,7 +879,7 @@
       <w:r>
         <w:t xml:space="preserve"> — créé — </w:t>
       </w:r>
-      <w:hyperlink w:history="1" r:id="rIdpch3hzdbk4zjqzc7ye3jp">
+      <w:hyperlink w:history="1" r:id="rId00b2atod3v7cn9tpqcxlt">
         <w:r>
           <w:rPr>
             <w:rStyle w:val="Hyperlink"/>
@@ -908,7 +908,7 @@
       <w:r>
         <w:t xml:space="preserve"> — créé — </w:t>
       </w:r>
-      <w:hyperlink w:history="1" r:id="rId1d0wwlafrorubfxkj9um0">
+      <w:hyperlink w:history="1" r:id="rIdhofotgictugauk1xc8ieb">
         <w:r>
           <w:rPr>
             <w:rStyle w:val="Hyperlink"/>
@@ -937,7 +937,7 @@
       <w:r>
         <w:t xml:space="preserve"> — créé — </w:t>
       </w:r>
-      <w:hyperlink w:history="1" r:id="rId8vcn20wujok-mcphbkbox">
+      <w:hyperlink w:history="1" r:id="rIdonxmvz2y8kmceefh_4ilo">
         <w:r>
           <w:rPr>
             <w:rStyle w:val="Hyperlink"/>
@@ -966,7 +966,7 @@
       <w:r>
         <w:t xml:space="preserve"> — créé — </w:t>
       </w:r>
-      <w:hyperlink w:history="1" r:id="rId6xnk8kokjfsizl_buuzlq">
+      <w:hyperlink w:history="1" r:id="rIdmlyqseh-xplpks9tpywc-">
         <w:r>
           <w:rPr>
             <w:rStyle w:val="Hyperlink"/>
@@ -995,7 +995,7 @@
       <w:r>
         <w:t xml:space="preserve"> — créé — </w:t>
       </w:r>
-      <w:hyperlink w:history="1" r:id="rIdxyfvjbdpureo_t7mhhmad">
+      <w:hyperlink w:history="1" r:id="rIde3ci7em0mfm8pwrn7gtmn">
         <w:r>
           <w:rPr>
             <w:rStyle w:val="Hyperlink"/>
@@ -1024,7 +1024,7 @@
       <w:r>
         <w:t xml:space="preserve"> — créé — </w:t>
       </w:r>
-      <w:hyperlink w:history="1" r:id="rIdp612uzf-mh5wsu0n0lrmb">
+      <w:hyperlink w:history="1" r:id="rId8nowublfvbnhv8tfwfocc">
         <w:r>
           <w:rPr>
             <w:rStyle w:val="Hyperlink"/>
@@ -1053,7 +1053,7 @@
       <w:r>
         <w:t xml:space="preserve"> — créé — </w:t>
       </w:r>
-      <w:hyperlink w:history="1" r:id="rIdvla9wisgwi84pcg5z0o9g">
+      <w:hyperlink w:history="1" r:id="rIdto0u_a368i2du1fkxbw5w">
         <w:r>
           <w:rPr>
             <w:rStyle w:val="Hyperlink"/>
@@ -1082,7 +1082,7 @@
       <w:r>
         <w:t xml:space="preserve"> — créé — </w:t>
       </w:r>
-      <w:hyperlink w:history="1" r:id="rIdhcem_tpysr2ixfpsh-atc">
+      <w:hyperlink w:history="1" r:id="rIdzes0z10vnmpiype7annbp">
         <w:r>
           <w:rPr>
             <w:rStyle w:val="Hyperlink"/>
@@ -1111,7 +1111,7 @@
       <w:r>
         <w:t xml:space="preserve"> — créé — </w:t>
       </w:r>
-      <w:hyperlink w:history="1" r:id="rIdsy67mlvjvcxyjcagxcnv3">
+      <w:hyperlink w:history="1" r:id="rIdhawws30slj09mfq0l3foi">
         <w:r>
           <w:rPr>
             <w:rStyle w:val="Hyperlink"/>
@@ -1148,7 +1148,7 @@
       <w:r>
         <w:t xml:space="preserve"> — créé — </w:t>
       </w:r>
-      <w:hyperlink w:history="1" r:id="rId6ksadxviip65wzibhiy9c">
+      <w:hyperlink w:history="1" r:id="rId1bc9roi5wuxbkjrr3lmcp">
         <w:r>
           <w:rPr>
             <w:rStyle w:val="Hyperlink"/>
@@ -1177,7 +1177,7 @@
       <w:r>
         <w:t xml:space="preserve"> — créé — </w:t>
       </w:r>
-      <w:hyperlink w:history="1" r:id="rIdkytdtqhzrznsqjp6rcm6h">
+      <w:hyperlink w:history="1" r:id="rId9xdt_cmzz0afab5ctjrxr">
         <w:r>
           <w:rPr>
             <w:rStyle w:val="Hyperlink"/>
@@ -1206,7 +1206,7 @@
       <w:r>
         <w:t xml:space="preserve"> — créé — </w:t>
       </w:r>
-      <w:hyperlink w:history="1" r:id="rId0pxn4x6se5in3hjc8_ytb">
+      <w:hyperlink w:history="1" r:id="rIdkhavchq_hutwis_bco1yj">
         <w:r>
           <w:rPr>
             <w:rStyle w:val="Hyperlink"/>
@@ -1235,7 +1235,7 @@
       <w:r>
         <w:t xml:space="preserve"> — créé — </w:t>
       </w:r>
-      <w:hyperlink w:history="1" r:id="rIdvdcrl6syu90tywarjfcev">
+      <w:hyperlink w:history="1" r:id="rIdpu7ssz77mbjxatmxdsvdg">
         <w:r>
           <w:rPr>
             <w:rStyle w:val="Hyperlink"/>
@@ -1264,7 +1264,7 @@
       <w:r>
         <w:t xml:space="preserve"> — créé — </w:t>
       </w:r>
-      <w:hyperlink w:history="1" r:id="rId7s68uvdck0tsphaosxv3f">
+      <w:hyperlink w:history="1" r:id="rId5tiuksuyiotyagv6orf8n">
         <w:r>
           <w:rPr>
             <w:rStyle w:val="Hyperlink"/>
@@ -1293,7 +1293,7 @@
       <w:r>
         <w:t xml:space="preserve"> — créé — </w:t>
       </w:r>
-      <w:hyperlink w:history="1" r:id="rIdj1mshqay06drzmaa7aydm">
+      <w:hyperlink w:history="1" r:id="rIdpceagupjo2vcsczyrkem-">
         <w:r>
           <w:rPr>
             <w:rStyle w:val="Hyperlink"/>
@@ -1322,7 +1322,7 @@
       <w:r>
         <w:t xml:space="preserve"> — créé — </w:t>
       </w:r>
-      <w:hyperlink w:history="1" r:id="rId_3eu0zrt87_jdpmvrqt4q">
+      <w:hyperlink w:history="1" r:id="rIdikoy6oc5de7c7iv0u0yf_">
         <w:r>
           <w:rPr>
             <w:rStyle w:val="Hyperlink"/>
@@ -1351,7 +1351,7 @@
       <w:r>
         <w:t xml:space="preserve"> — créé — </w:t>
       </w:r>
-      <w:hyperlink w:history="1" r:id="rIdw-zulbjci8x3clfzqf4s5">
+      <w:hyperlink w:history="1" r:id="rIdpxklamatgu_e2mep27qfw">
         <w:r>
           <w:rPr>
             <w:rStyle w:val="Hyperlink"/>
@@ -1380,7 +1380,7 @@
       <w:r>
         <w:t xml:space="preserve"> — créé — </w:t>
       </w:r>
-      <w:hyperlink w:history="1" r:id="rIdveukgvupeme_rqe4jzhui">
+      <w:hyperlink w:history="1" r:id="rIdepwggs5zthu2nxb-npirg">
         <w:r>
           <w:rPr>
             <w:rStyle w:val="Hyperlink"/>
@@ -1409,7 +1409,7 @@
       <w:r>
         <w:t xml:space="preserve"> — créé — </w:t>
       </w:r>
-      <w:hyperlink w:history="1" r:id="rIdlpsk8ajzjfcmokstkp7ir">
+      <w:hyperlink w:history="1" r:id="rIdcaab76epsa4mydh20ewb5">
         <w:r>
           <w:rPr>
             <w:rStyle w:val="Hyperlink"/>
@@ -1438,7 +1438,7 @@
       <w:r>
         <w:t xml:space="preserve"> — créé — </w:t>
       </w:r>
-      <w:hyperlink w:history="1" r:id="rIdzocylmysx3rrb46f9sstc">
+      <w:hyperlink w:history="1" r:id="rId033llogiigjwszy4qlpr9">
         <w:r>
           <w:rPr>
             <w:rStyle w:val="Hyperlink"/>
@@ -1467,7 +1467,7 @@
       <w:r>
         <w:t xml:space="preserve"> — créé — </w:t>
       </w:r>
-      <w:hyperlink w:history="1" r:id="rIdt_83xg5jrqrnfpwyq_nqh">
+      <w:hyperlink w:history="1" r:id="rIdvl8173jrrf6q1ykczav-x">
         <w:r>
           <w:rPr>
             <w:rStyle w:val="Hyperlink"/>
@@ -1496,7 +1496,7 @@
       <w:r>
         <w:t xml:space="preserve"> — créé — </w:t>
       </w:r>
-      <w:hyperlink w:history="1" r:id="rIdfzefrm81chdxqfysxi7hx">
+      <w:hyperlink w:history="1" r:id="rIdwvishbjhzxvenpxb5sbzs">
         <w:r>
           <w:rPr>
             <w:rStyle w:val="Hyperlink"/>
@@ -1525,7 +1525,7 @@
       <w:r>
         <w:t xml:space="preserve"> — créé — </w:t>
       </w:r>
-      <w:hyperlink w:history="1" r:id="rIdpploqx7avf2sxtac2amss">
+      <w:hyperlink w:history="1" r:id="rIdhdks0ewye0pqsaiong6wf">
         <w:r>
           <w:rPr>
             <w:rStyle w:val="Hyperlink"/>
@@ -1554,7 +1554,7 @@
       <w:r>
         <w:t xml:space="preserve"> — créé — </w:t>
       </w:r>
-      <w:hyperlink w:history="1" r:id="rId54hwx1lz-paah8ghmwzy5">
+      <w:hyperlink w:history="1" r:id="rIdt1oupl9ombh3eob06ufzx">
         <w:r>
           <w:rPr>
             <w:rStyle w:val="Hyperlink"/>
@@ -1583,7 +1583,7 @@
       <w:r>
         <w:t xml:space="preserve"> — créé — </w:t>
       </w:r>
-      <w:hyperlink w:history="1" r:id="rIdfvkckraydliqg2ovwcmzh">
+      <w:hyperlink w:history="1" r:id="rIdwxchfgnjkdvrpqy7pq6u1">
         <w:r>
           <w:rPr>
             <w:rStyle w:val="Hyperlink"/>
@@ -1612,7 +1612,7 @@
       <w:r>
         <w:t xml:space="preserve"> — créé — </w:t>
       </w:r>
-      <w:hyperlink w:history="1" r:id="rId2i8josbpxgobh5guqef-9">
+      <w:hyperlink w:history="1" r:id="rId9uujncaj_9aas9n4bdi5u">
         <w:r>
           <w:rPr>
             <w:rStyle w:val="Hyperlink"/>
@@ -1641,7 +1641,7 @@
       <w:r>
         <w:t xml:space="preserve"> — créé — </w:t>
       </w:r>
-      <w:hyperlink w:history="1" r:id="rIduofeprayd1fwuia_d1z0j">
+      <w:hyperlink w:history="1" r:id="rIdc6ovwdxtiuxqdrffu2imr">
         <w:r>
           <w:rPr>
             <w:rStyle w:val="Hyperlink"/>
@@ -1670,7 +1670,7 @@
       <w:r>
         <w:t xml:space="preserve"> — créé — </w:t>
       </w:r>
-      <w:hyperlink w:history="1" r:id="rIdrbifdwsnc8uvvj4chqffb">
+      <w:hyperlink w:history="1" r:id="rIdt_6cstxrgfncpyuxtip2b">
         <w:r>
           <w:rPr>
             <w:rStyle w:val="Hyperlink"/>
@@ -1699,7 +1699,7 @@
       <w:r>
         <w:t xml:space="preserve"> — créé — </w:t>
       </w:r>
-      <w:hyperlink w:history="1" r:id="rIdn3r5jjn2ruowdcvuhlaqv">
+      <w:hyperlink w:history="1" r:id="rId7fmrdai8jtjxxfoc5loz0">
         <w:r>
           <w:rPr>
             <w:rStyle w:val="Hyperlink"/>
@@ -1728,7 +1728,7 @@
       <w:r>
         <w:t xml:space="preserve"> — créé — </w:t>
       </w:r>
-      <w:hyperlink w:history="1" r:id="rIdpkxq2gvf_20gwx47hanj8">
+      <w:hyperlink w:history="1" r:id="rIdjp7ittgll_sfxuplayy7a">
         <w:r>
           <w:rPr>
             <w:rStyle w:val="Hyperlink"/>
@@ -1757,7 +1757,7 @@
       <w:r>
         <w:t xml:space="preserve"> — créé — </w:t>
       </w:r>
-      <w:hyperlink w:history="1" r:id="rIdrsghzse72w8ehvdd5e8b1">
+      <w:hyperlink w:history="1" r:id="rIdgtvzzouve4qfslkjnoqeh">
         <w:r>
           <w:rPr>
             <w:rStyle w:val="Hyperlink"/>
@@ -1786,7 +1786,7 @@
       <w:r>
         <w:t xml:space="preserve"> — créé — </w:t>
       </w:r>
-      <w:hyperlink w:history="1" r:id="rIducjpjyqtfbwspbz3x26qd">
+      <w:hyperlink w:history="1" r:id="rIdujlle28vvogodt368_5wp">
         <w:r>
           <w:rPr>
             <w:rStyle w:val="Hyperlink"/>
@@ -1823,7 +1823,7 @@
       <w:r>
         <w:t xml:space="preserve"> — créé — </w:t>
       </w:r>
-      <w:hyperlink w:history="1" r:id="rIdpgiw5lqahhkrusnhievzv">
+      <w:hyperlink w:history="1" r:id="rIdkvggiebgvtrizjnaursnb">
         <w:r>
           <w:rPr>
             <w:rStyle w:val="Hyperlink"/>
@@ -1852,7 +1852,7 @@
       <w:r>
         <w:t xml:space="preserve"> — créé — </w:t>
       </w:r>
-      <w:hyperlink w:history="1" r:id="rIdtxhbmzhegstgzu1g-przd">
+      <w:hyperlink w:history="1" r:id="rIdvbbrkej7emjzb9eeqb_wf">
         <w:r>
           <w:rPr>
             <w:rStyle w:val="Hyperlink"/>
@@ -1881,7 +1881,7 @@
       <w:r>
         <w:t xml:space="preserve"> — créé — </w:t>
       </w:r>
-      <w:hyperlink w:history="1" r:id="rIdugfro3e1jrsiojvehsaei">
+      <w:hyperlink w:history="1" r:id="rIdwaqogkyqm3bcyh7bgn0p1">
         <w:r>
           <w:rPr>
             <w:rStyle w:val="Hyperlink"/>
@@ -1910,7 +1910,7 @@
       <w:r>
         <w:t xml:space="preserve"> — créé — </w:t>
       </w:r>
-      <w:hyperlink w:history="1" r:id="rIdtdpvcb6k8srwlp-7vopnh">
+      <w:hyperlink w:history="1" r:id="rIdmhds8aj3hqnujibcopx3v">
         <w:r>
           <w:rPr>
             <w:rStyle w:val="Hyperlink"/>
@@ -1939,7 +1939,7 @@
       <w:r>
         <w:t xml:space="preserve"> — créé — </w:t>
       </w:r>
-      <w:hyperlink w:history="1" r:id="rIdblmbhpczmo1g_yxtrvw_h">
+      <w:hyperlink w:history="1" r:id="rIdi_gkztbzb5vbyhkbqdhod">
         <w:r>
           <w:rPr>
             <w:rStyle w:val="Hyperlink"/>
@@ -1968,7 +1968,7 @@
       <w:r>
         <w:t xml:space="preserve"> — créé — </w:t>
       </w:r>
-      <w:hyperlink w:history="1" r:id="rId4hkofcciqlciwg26umf14">
+      <w:hyperlink w:history="1" r:id="rIdlzeqssmo9snzo56fsfyf5">
         <w:r>
           <w:rPr>
             <w:rStyle w:val="Hyperlink"/>
@@ -1997,7 +1997,7 @@
       <w:r>
         <w:t xml:space="preserve"> — créé — </w:t>
       </w:r>
-      <w:hyperlink w:history="1" r:id="rIdijcja8v3sh-uvrtjrnbzh">
+      <w:hyperlink w:history="1" r:id="rIdqjuure3mrojn7wewqjk0n">
         <w:r>
           <w:rPr>
             <w:rStyle w:val="Hyperlink"/>
@@ -2026,7 +2026,7 @@
       <w:r>
         <w:t xml:space="preserve"> — créé — </w:t>
       </w:r>
-      <w:hyperlink w:history="1" r:id="rIdfyyv8iw661ssnh1hhk-pd">
+      <w:hyperlink w:history="1" r:id="rIdnpu0sjfnvyi5mqvn6ycro">
         <w:r>
           <w:rPr>
             <w:rStyle w:val="Hyperlink"/>
@@ -2139,7 +2139,7 @@
       <w:r>
         <w:t xml:space="preserve"> — créé — </w:t>
       </w:r>
-      <w:hyperlink w:history="1" r:id="rIdyvef-5fqv3lh8nuhmh5oq">
+      <w:hyperlink w:history="1" r:id="rIdsae2zu7ruccsmod2tb798">
         <w:r>
           <w:rPr>
             <w:rStyle w:val="Hyperlink"/>
@@ -2189,7 +2189,7 @@
       <w:r>
         <w:t xml:space="preserve"> — créé — </w:t>
       </w:r>
-      <w:hyperlink w:history="1" r:id="rIdbppo520kf-edyxbe121pg">
+      <w:hyperlink w:history="1" r:id="rIdjvq9lo7gkjbmqrpqpepbj">
         <w:r>
           <w:rPr>
             <w:rStyle w:val="Hyperlink"/>
@@ -2218,7 +2218,7 @@
       <w:r>
         <w:t xml:space="preserve"> — créé — </w:t>
       </w:r>
-      <w:hyperlink w:history="1" r:id="rIds_jxqk33iraduz5yobp8o">
+      <w:hyperlink w:history="1" r:id="rIdnnccxyskqf5j70ozoy2js">
         <w:r>
           <w:rPr>
             <w:rStyle w:val="Hyperlink"/>
@@ -2247,7 +2247,7 @@
       <w:r>
         <w:t xml:space="preserve"> — créé — </w:t>
       </w:r>
-      <w:hyperlink w:history="1" r:id="rId9g38pgeocs6hgxp2-a2fl">
+      <w:hyperlink w:history="1" r:id="rIdje1yd09gwzxobmaiv-5un">
         <w:r>
           <w:rPr>
             <w:rStyle w:val="Hyperlink"/>
@@ -2276,7 +2276,7 @@
       <w:r>
         <w:t xml:space="preserve"> — créé — </w:t>
       </w:r>
-      <w:hyperlink w:history="1" r:id="rIdnsbu77nn_hiqzi9f5t78x">
+      <w:hyperlink w:history="1" r:id="rIdvyqri-nxojfxr1y4sfxbc">
         <w:r>
           <w:rPr>
             <w:rStyle w:val="Hyperlink"/>
@@ -2313,7 +2313,7 @@
       <w:r>
         <w:t xml:space="preserve"> — créé — </w:t>
       </w:r>
-      <w:hyperlink w:history="1" r:id="rIdddg7q6fgntkaiwq8mbvkp">
+      <w:hyperlink w:history="1" r:id="rIdpbk2dq_dzmruoguqa9y__">
         <w:r>
           <w:rPr>
             <w:rStyle w:val="Hyperlink"/>
@@ -2342,7 +2342,7 @@
       <w:r>
         <w:t xml:space="preserve"> — créé — </w:t>
       </w:r>
-      <w:hyperlink w:history="1" r:id="rIdftseyhu19royl8dqwfjob">
+      <w:hyperlink w:history="1" r:id="rIdnbvnq09k-wi3srbjegtn-">
         <w:r>
           <w:rPr>
             <w:rStyle w:val="Hyperlink"/>
@@ -2379,7 +2379,7 @@
       <w:r>
         <w:t xml:space="preserve"> — créé — </w:t>
       </w:r>
-      <w:hyperlink w:history="1" r:id="rIdrkhgk_nk2_pxgqvs0zod-">
+      <w:hyperlink w:history="1" r:id="rIdauthgvjmdqufefkvn2stj">
         <w:r>
           <w:rPr>
             <w:rStyle w:val="Hyperlink"/>
@@ -2408,7 +2408,7 @@
       <w:r>
         <w:t xml:space="preserve"> — créé — </w:t>
       </w:r>
-      <w:hyperlink w:history="1" r:id="rIdunwtbg6wg33yn2d8ye-rq">
+      <w:hyperlink w:history="1" r:id="rIdgu3ko4daq18glzbssmzxp">
         <w:r>
           <w:rPr>
             <w:rStyle w:val="Hyperlink"/>
@@ -2437,7 +2437,7 @@
       <w:r>
         <w:t xml:space="preserve"> — créé — </w:t>
       </w:r>
-      <w:hyperlink w:history="1" r:id="rIdyg0kb2dgnergijouqfxwk">
+      <w:hyperlink w:history="1" r:id="rId8shxavxmcpqobgyahdrsh">
         <w:r>
           <w:rPr>
             <w:rStyle w:val="Hyperlink"/>
@@ -2466,7 +2466,7 @@
       <w:r>
         <w:t xml:space="preserve"> — créé — </w:t>
       </w:r>
-      <w:hyperlink w:history="1" r:id="rIdcsschwzy6mmvrz5yeezjy">
+      <w:hyperlink w:history="1" r:id="rId6acuszyyz025u802gf4nx">
         <w:r>
           <w:rPr>
             <w:rStyle w:val="Hyperlink"/>
@@ -2495,7 +2495,7 @@
       <w:r>
         <w:t xml:space="preserve"> — créé — </w:t>
       </w:r>
-      <w:hyperlink w:history="1" r:id="rIdz0pywhddavqua0aqsibyn">
+      <w:hyperlink w:history="1" r:id="rIdng85xhdsrbai4zegmbren">
         <w:r>
           <w:rPr>
             <w:rStyle w:val="Hyperlink"/>
@@ -2524,7 +2524,7 @@
       <w:r>
         <w:t xml:space="preserve"> — créé — </w:t>
       </w:r>
-      <w:hyperlink w:history="1" r:id="rIdeii1puahtdfh4uqwvbq7v">
+      <w:hyperlink w:history="1" r:id="rIdbenjuvmftzljrch7f9bks">
         <w:r>
           <w:rPr>
             <w:rStyle w:val="Hyperlink"/>
@@ -2553,7 +2553,7 @@
       <w:r>
         <w:t xml:space="preserve"> — créé — </w:t>
       </w:r>
-      <w:hyperlink w:history="1" r:id="rIdu--vlk417x2ktiodbxyeu">
+      <w:hyperlink w:history="1" r:id="rIds42b3p8mulj1whxgipkrg">
         <w:r>
           <w:rPr>
             <w:rStyle w:val="Hyperlink"/>
@@ -2582,7 +2582,7 @@
       <w:r>
         <w:t xml:space="preserve"> — créé — </w:t>
       </w:r>
-      <w:hyperlink w:history="1" r:id="rIdom6q_zcjpa0vf3_0hovem">
+      <w:hyperlink w:history="1" r:id="rIdp2xk0ve8vaaimlwwardhd">
         <w:r>
           <w:rPr>
             <w:rStyle w:val="Hyperlink"/>
@@ -2611,7 +2611,7 @@
       <w:r>
         <w:t xml:space="preserve"> — créé — </w:t>
       </w:r>
-      <w:hyperlink w:history="1" r:id="rIddrm-8jb4ltqveyvhi67oy">
+      <w:hyperlink w:history="1" r:id="rId28hcbmiru391z61gzx-eu">
         <w:r>
           <w:rPr>
             <w:rStyle w:val="Hyperlink"/>
@@ -2648,7 +2648,7 @@
       <w:r>
         <w:t xml:space="preserve"> — créé — </w:t>
       </w:r>
-      <w:hyperlink w:history="1" r:id="rIdzcwgbvxstfia_6rrliq5g">
+      <w:hyperlink w:history="1" r:id="rId1vbtejbi9xm-pfb36irtt">
         <w:r>
           <w:rPr>
             <w:rStyle w:val="Hyperlink"/>
@@ -2677,7 +2677,7 @@
       <w:r>
         <w:t xml:space="preserve"> — créé — </w:t>
       </w:r>
-      <w:hyperlink w:history="1" r:id="rIdwjlghhx7wwpzkmpyaereb">
+      <w:hyperlink w:history="1" r:id="rIdkplpbnihxuybkmntkklko">
         <w:r>
           <w:rPr>
             <w:rStyle w:val="Hyperlink"/>
@@ -2706,7 +2706,7 @@
       <w:r>
         <w:t xml:space="preserve"> — créé — </w:t>
       </w:r>
-      <w:hyperlink w:history="1" r:id="rId6go1pkyz9obrryoe-vxx2">
+      <w:hyperlink w:history="1" r:id="rId6p1t9zmmpvga1dtzf4qw7">
         <w:r>
           <w:rPr>
             <w:rStyle w:val="Hyperlink"/>
@@ -2735,7 +2735,7 @@
       <w:r>
         <w:t xml:space="preserve"> — créé — </w:t>
       </w:r>
-      <w:hyperlink w:history="1" r:id="rIdata20_ewp8n9pmficyrfu">
+      <w:hyperlink w:history="1" r:id="rIdvh59492fklr2ibr_se5r_">
         <w:r>
           <w:rPr>
             <w:rStyle w:val="Hyperlink"/>
@@ -2764,7 +2764,7 @@
       <w:r>
         <w:t xml:space="preserve"> — créé — </w:t>
       </w:r>
-      <w:hyperlink w:history="1" r:id="rIdrsry1rquqqdg4ss9oil_a">
+      <w:hyperlink w:history="1" r:id="rId-2nhz8mexropdiyys8qdl">
         <w:r>
           <w:rPr>
             <w:rStyle w:val="Hyperlink"/>
@@ -2793,7 +2793,7 @@
       <w:r>
         <w:t xml:space="preserve"> — créé — </w:t>
       </w:r>
-      <w:hyperlink w:history="1" r:id="rIdpahudaumd4noz3xe0jwxl">
+      <w:hyperlink w:history="1" r:id="rIdtx0lzx9ofktgexzvmvbpr">
         <w:r>
           <w:rPr>
             <w:rStyle w:val="Hyperlink"/>
@@ -2822,7 +2822,7 @@
       <w:r>
         <w:t xml:space="preserve"> — créé — </w:t>
       </w:r>
-      <w:hyperlink w:history="1" r:id="rId2ik9aui-xy0eutbbxmov2">
+      <w:hyperlink w:history="1" r:id="rIdpr4q6alxysgobmfmfrfnz">
         <w:r>
           <w:rPr>
             <w:rStyle w:val="Hyperlink"/>
@@ -2851,7 +2851,7 @@
       <w:r>
         <w:t xml:space="preserve"> — créé — </w:t>
       </w:r>
-      <w:hyperlink w:history="1" r:id="rIdj_j9xruts-fdo4xkzoe2w">
+      <w:hyperlink w:history="1" r:id="rIdcmmqeptytz8or5mcptgja">
         <w:r>
           <w:rPr>
             <w:rStyle w:val="Hyperlink"/>

</xml_diff>

<commit_message>
Dossier §15.170, avancement, phase 71
Co-Authored-By: Claude Opus 5.5 <noreply@anthropic.com>
</commit_message>
<xml_diff>
--- a/docs/developpement/phases/word/PHASE_00_SOCLE_DE_PRODUCTION_ET_CONFIGURATION_DUN_LIEU_VIDE.docx
+++ b/docs/developpement/phases/word/PHASE_00_SOCLE_DE_PRODUCTION_ET_CONFIGURATION_DUN_LIEU_VIDE.docx
@@ -18,9 +18,9 @@
         <w:shd w:fill="F6F3FF" w:color="auto" w:val="clear"/>
       </w:pPr>
       <w:r>
-        <w:t xml:space="preserve">FlaiX Expert · dossier de développement · généré le 2026-10-19 depuis le dépôt </w:t>
-      </w:r>
-      <w:hyperlink w:history="1" r:id="rIdb18i_zbni4j4iitjpgqxu">
+        <w:t xml:space="preserve">FlaiX Expert · dossier de développement · généré le 2026-10-21 depuis le dépôt </w:t>
+      </w:r>
+      <w:hyperlink w:history="1" r:id="rId4716tpxxfqfqlfugdemdr">
         <w:r>
           <w:rPr>
             <w:rStyle w:val="Hyperlink"/>
@@ -592,7 +592,7 @@
           <w:numId w:val="3"/>
         </w:numPr>
       </w:pPr>
-      <w:hyperlink w:history="1" r:id="rId9xrxg7tx0r59eosilbdi9">
+      <w:hyperlink w:history="1" r:id="rIdcpx88gcmbkce9yhmvaebk">
         <w:r>
           <w:rPr>
             <w:rStyle w:val="Hyperlink"/>
@@ -612,7 +612,7 @@
           <w:numId w:val="3"/>
         </w:numPr>
       </w:pPr>
-      <w:hyperlink w:history="1" r:id="rIdbs9aof8ykdlcgtp15t8ct">
+      <w:hyperlink w:history="1" r:id="rId0u6fp00kuttbt-akrcdrv">
         <w:r>
           <w:rPr>
             <w:rStyle w:val="Hyperlink"/>
@@ -660,7 +660,7 @@
       <w:r>
         <w:t xml:space="preserve"> — créé — </w:t>
       </w:r>
-      <w:hyperlink w:history="1" r:id="rId_6sqxzzkyzzsqpmurvh0c">
+      <w:hyperlink w:history="1" r:id="rIdym3hiyzxyn2rtnl8xqk6y">
         <w:r>
           <w:rPr>
             <w:rStyle w:val="Hyperlink"/>
@@ -689,7 +689,7 @@
       <w:r>
         <w:t xml:space="preserve"> — créé — </w:t>
       </w:r>
-      <w:hyperlink w:history="1" r:id="rIdlhhxdoxmhsu2t_okpd1xz">
+      <w:hyperlink w:history="1" r:id="rIdk221nu5gspdvrzpihpdx0">
         <w:r>
           <w:rPr>
             <w:rStyle w:val="Hyperlink"/>
@@ -726,7 +726,7 @@
       <w:r>
         <w:t xml:space="preserve"> — créé — </w:t>
       </w:r>
-      <w:hyperlink w:history="1" r:id="rIdvuu7dp9qwwm5wnbcbyabn">
+      <w:hyperlink w:history="1" r:id="rIde0syq2hrvxulsnhnavajm">
         <w:r>
           <w:rPr>
             <w:rStyle w:val="Hyperlink"/>
@@ -755,7 +755,7 @@
       <w:r>
         <w:t xml:space="preserve"> — créé — </w:t>
       </w:r>
-      <w:hyperlink w:history="1" r:id="rIdptnmudknwe16b5np9dd79">
+      <w:hyperlink w:history="1" r:id="rIdk22e0eavwjiwp0zygo8ro">
         <w:r>
           <w:rPr>
             <w:rStyle w:val="Hyperlink"/>
@@ -784,7 +784,7 @@
       <w:r>
         <w:t xml:space="preserve"> — créé — </w:t>
       </w:r>
-      <w:hyperlink w:history="1" r:id="rId1vemhk-vxy1nk6g3sj8i4">
+      <w:hyperlink w:history="1" r:id="rIdcufqee5kojmdde3kro43i">
         <w:r>
           <w:rPr>
             <w:rStyle w:val="Hyperlink"/>
@@ -813,7 +813,7 @@
       <w:r>
         <w:t xml:space="preserve"> — créé — </w:t>
       </w:r>
-      <w:hyperlink w:history="1" r:id="rIdzrfil9g7jeyzqg9wdbsc2">
+      <w:hyperlink w:history="1" r:id="rId4vvwdmyh4jecsarfk641z">
         <w:r>
           <w:rPr>
             <w:rStyle w:val="Hyperlink"/>
@@ -842,7 +842,7 @@
       <w:r>
         <w:t xml:space="preserve"> — créé — </w:t>
       </w:r>
-      <w:hyperlink w:history="1" r:id="rIddvew_l9s9i-agf-nrul9n">
+      <w:hyperlink w:history="1" r:id="rId4t1iqidy9gf613vc7fwun">
         <w:r>
           <w:rPr>
             <w:rStyle w:val="Hyperlink"/>
@@ -879,7 +879,7 @@
       <w:r>
         <w:t xml:space="preserve"> — créé — </w:t>
       </w:r>
-      <w:hyperlink w:history="1" r:id="rId00b2atod3v7cn9tpqcxlt">
+      <w:hyperlink w:history="1" r:id="rIdns3nac-weqtyuazodk36t">
         <w:r>
           <w:rPr>
             <w:rStyle w:val="Hyperlink"/>
@@ -908,7 +908,7 @@
       <w:r>
         <w:t xml:space="preserve"> — créé — </w:t>
       </w:r>
-      <w:hyperlink w:history="1" r:id="rIdhofotgictugauk1xc8ieb">
+      <w:hyperlink w:history="1" r:id="rIdmxvrpfmwlgibaypxgnurf">
         <w:r>
           <w:rPr>
             <w:rStyle w:val="Hyperlink"/>
@@ -937,7 +937,7 @@
       <w:r>
         <w:t xml:space="preserve"> — créé — </w:t>
       </w:r>
-      <w:hyperlink w:history="1" r:id="rIdonxmvz2y8kmceefh_4ilo">
+      <w:hyperlink w:history="1" r:id="rIdw7az8ducny8qs-h-ukkac">
         <w:r>
           <w:rPr>
             <w:rStyle w:val="Hyperlink"/>
@@ -966,7 +966,7 @@
       <w:r>
         <w:t xml:space="preserve"> — créé — </w:t>
       </w:r>
-      <w:hyperlink w:history="1" r:id="rIdmlyqseh-xplpks9tpywc-">
+      <w:hyperlink w:history="1" r:id="rIdtan9uf8viykodrbdd6c3p">
         <w:r>
           <w:rPr>
             <w:rStyle w:val="Hyperlink"/>
@@ -995,7 +995,7 @@
       <w:r>
         <w:t xml:space="preserve"> — créé — </w:t>
       </w:r>
-      <w:hyperlink w:history="1" r:id="rIde3ci7em0mfm8pwrn7gtmn">
+      <w:hyperlink w:history="1" r:id="rIdyriacqotqfvh8--bbkm11">
         <w:r>
           <w:rPr>
             <w:rStyle w:val="Hyperlink"/>
@@ -1024,7 +1024,7 @@
       <w:r>
         <w:t xml:space="preserve"> — créé — </w:t>
       </w:r>
-      <w:hyperlink w:history="1" r:id="rId8nowublfvbnhv8tfwfocc">
+      <w:hyperlink w:history="1" r:id="rIdhovdd7bko-owkcg91hh2m">
         <w:r>
           <w:rPr>
             <w:rStyle w:val="Hyperlink"/>
@@ -1053,7 +1053,7 @@
       <w:r>
         <w:t xml:space="preserve"> — créé — </w:t>
       </w:r>
-      <w:hyperlink w:history="1" r:id="rIdto0u_a368i2du1fkxbw5w">
+      <w:hyperlink w:history="1" r:id="rIdxnbb2d3dh5ytfh4dkyck_">
         <w:r>
           <w:rPr>
             <w:rStyle w:val="Hyperlink"/>
@@ -1082,7 +1082,7 @@
       <w:r>
         <w:t xml:space="preserve"> — créé — </w:t>
       </w:r>
-      <w:hyperlink w:history="1" r:id="rIdzes0z10vnmpiype7annbp">
+      <w:hyperlink w:history="1" r:id="rId-1zmodv10u3fcsqrr1riu">
         <w:r>
           <w:rPr>
             <w:rStyle w:val="Hyperlink"/>
@@ -1111,7 +1111,7 @@
       <w:r>
         <w:t xml:space="preserve"> — créé — </w:t>
       </w:r>
-      <w:hyperlink w:history="1" r:id="rIdhawws30slj09mfq0l3foi">
+      <w:hyperlink w:history="1" r:id="rIdcgltetd0qe0s0so1eys7p">
         <w:r>
           <w:rPr>
             <w:rStyle w:val="Hyperlink"/>
@@ -1148,7 +1148,7 @@
       <w:r>
         <w:t xml:space="preserve"> — créé — </w:t>
       </w:r>
-      <w:hyperlink w:history="1" r:id="rId1bc9roi5wuxbkjrr3lmcp">
+      <w:hyperlink w:history="1" r:id="rId845frbhhohm2ou_l5z2bn">
         <w:r>
           <w:rPr>
             <w:rStyle w:val="Hyperlink"/>
@@ -1177,7 +1177,7 @@
       <w:r>
         <w:t xml:space="preserve"> — créé — </w:t>
       </w:r>
-      <w:hyperlink w:history="1" r:id="rId9xdt_cmzz0afab5ctjrxr">
+      <w:hyperlink w:history="1" r:id="rId7edil-mbmk2y_grb8qgyu">
         <w:r>
           <w:rPr>
             <w:rStyle w:val="Hyperlink"/>
@@ -1206,7 +1206,7 @@
       <w:r>
         <w:t xml:space="preserve"> — créé — </w:t>
       </w:r>
-      <w:hyperlink w:history="1" r:id="rIdkhavchq_hutwis_bco1yj">
+      <w:hyperlink w:history="1" r:id="rIdissbv1s1nbl-tdm9xyupd">
         <w:r>
           <w:rPr>
             <w:rStyle w:val="Hyperlink"/>
@@ -1235,7 +1235,7 @@
       <w:r>
         <w:t xml:space="preserve"> — créé — </w:t>
       </w:r>
-      <w:hyperlink w:history="1" r:id="rIdpu7ssz77mbjxatmxdsvdg">
+      <w:hyperlink w:history="1" r:id="rIdjaj_a791pjbwjibubcrvb">
         <w:r>
           <w:rPr>
             <w:rStyle w:val="Hyperlink"/>
@@ -1264,7 +1264,7 @@
       <w:r>
         <w:t xml:space="preserve"> — créé — </w:t>
       </w:r>
-      <w:hyperlink w:history="1" r:id="rId5tiuksuyiotyagv6orf8n">
+      <w:hyperlink w:history="1" r:id="rIdvn6su3zmtik-v-jc1fhcs">
         <w:r>
           <w:rPr>
             <w:rStyle w:val="Hyperlink"/>
@@ -1293,7 +1293,7 @@
       <w:r>
         <w:t xml:space="preserve"> — créé — </w:t>
       </w:r>
-      <w:hyperlink w:history="1" r:id="rIdpceagupjo2vcsczyrkem-">
+      <w:hyperlink w:history="1" r:id="rIdbtiqyw4fkbnrigujcodvc">
         <w:r>
           <w:rPr>
             <w:rStyle w:val="Hyperlink"/>
@@ -1322,7 +1322,7 @@
       <w:r>
         <w:t xml:space="preserve"> — créé — </w:t>
       </w:r>
-      <w:hyperlink w:history="1" r:id="rIdikoy6oc5de7c7iv0u0yf_">
+      <w:hyperlink w:history="1" r:id="rIdgrg1z29la-ohbg3pvz-u9">
         <w:r>
           <w:rPr>
             <w:rStyle w:val="Hyperlink"/>
@@ -1351,7 +1351,7 @@
       <w:r>
         <w:t xml:space="preserve"> — créé — </w:t>
       </w:r>
-      <w:hyperlink w:history="1" r:id="rIdpxklamatgu_e2mep27qfw">
+      <w:hyperlink w:history="1" r:id="rIdiuswa3_jyb4xko4ss9iyi">
         <w:r>
           <w:rPr>
             <w:rStyle w:val="Hyperlink"/>
@@ -1380,7 +1380,7 @@
       <w:r>
         <w:t xml:space="preserve"> — créé — </w:t>
       </w:r>
-      <w:hyperlink w:history="1" r:id="rIdepwggs5zthu2nxb-npirg">
+      <w:hyperlink w:history="1" r:id="rIdjprsvi_xnftyjxesf2vec">
         <w:r>
           <w:rPr>
             <w:rStyle w:val="Hyperlink"/>
@@ -1409,7 +1409,7 @@
       <w:r>
         <w:t xml:space="preserve"> — créé — </w:t>
       </w:r>
-      <w:hyperlink w:history="1" r:id="rIdcaab76epsa4mydh20ewb5">
+      <w:hyperlink w:history="1" r:id="rId08z5ufyjdbred0ch_aehz">
         <w:r>
           <w:rPr>
             <w:rStyle w:val="Hyperlink"/>
@@ -1438,7 +1438,7 @@
       <w:r>
         <w:t xml:space="preserve"> — créé — </w:t>
       </w:r>
-      <w:hyperlink w:history="1" r:id="rId033llogiigjwszy4qlpr9">
+      <w:hyperlink w:history="1" r:id="rIdctoylkb_07kviyelkzjed">
         <w:r>
           <w:rPr>
             <w:rStyle w:val="Hyperlink"/>
@@ -1467,7 +1467,7 @@
       <w:r>
         <w:t xml:space="preserve"> — créé — </w:t>
       </w:r>
-      <w:hyperlink w:history="1" r:id="rIdvl8173jrrf6q1ykczav-x">
+      <w:hyperlink w:history="1" r:id="rIdp3zelkzhyydhchtushpwt">
         <w:r>
           <w:rPr>
             <w:rStyle w:val="Hyperlink"/>
@@ -1496,7 +1496,7 @@
       <w:r>
         <w:t xml:space="preserve"> — créé — </w:t>
       </w:r>
-      <w:hyperlink w:history="1" r:id="rIdwvishbjhzxvenpxb5sbzs">
+      <w:hyperlink w:history="1" r:id="rId6juysrbjqmbpvrdy_q6s9">
         <w:r>
           <w:rPr>
             <w:rStyle w:val="Hyperlink"/>
@@ -1525,7 +1525,7 @@
       <w:r>
         <w:t xml:space="preserve"> — créé — </w:t>
       </w:r>
-      <w:hyperlink w:history="1" r:id="rIdhdks0ewye0pqsaiong6wf">
+      <w:hyperlink w:history="1" r:id="rIdvkr5zb0qujmjvp1r-gqr4">
         <w:r>
           <w:rPr>
             <w:rStyle w:val="Hyperlink"/>
@@ -1554,7 +1554,7 @@
       <w:r>
         <w:t xml:space="preserve"> — créé — </w:t>
       </w:r>
-      <w:hyperlink w:history="1" r:id="rIdt1oupl9ombh3eob06ufzx">
+      <w:hyperlink w:history="1" r:id="rId3i8nosajazgwjszbdph-v">
         <w:r>
           <w:rPr>
             <w:rStyle w:val="Hyperlink"/>
@@ -1583,7 +1583,7 @@
       <w:r>
         <w:t xml:space="preserve"> — créé — </w:t>
       </w:r>
-      <w:hyperlink w:history="1" r:id="rIdwxchfgnjkdvrpqy7pq6u1">
+      <w:hyperlink w:history="1" r:id="rIdersh-barwi4pm22sahbdu">
         <w:r>
           <w:rPr>
             <w:rStyle w:val="Hyperlink"/>
@@ -1612,7 +1612,7 @@
       <w:r>
         <w:t xml:space="preserve"> — créé — </w:t>
       </w:r>
-      <w:hyperlink w:history="1" r:id="rId9uujncaj_9aas9n4bdi5u">
+      <w:hyperlink w:history="1" r:id="rId9ixscpbfbgmlwd-wbz9pg">
         <w:r>
           <w:rPr>
             <w:rStyle w:val="Hyperlink"/>
@@ -1641,7 +1641,7 @@
       <w:r>
         <w:t xml:space="preserve"> — créé — </w:t>
       </w:r>
-      <w:hyperlink w:history="1" r:id="rIdc6ovwdxtiuxqdrffu2imr">
+      <w:hyperlink w:history="1" r:id="rIdm_jsgfyl2_snetgnjh2zw">
         <w:r>
           <w:rPr>
             <w:rStyle w:val="Hyperlink"/>
@@ -1670,7 +1670,7 @@
       <w:r>
         <w:t xml:space="preserve"> — créé — </w:t>
       </w:r>
-      <w:hyperlink w:history="1" r:id="rIdt_6cstxrgfncpyuxtip2b">
+      <w:hyperlink w:history="1" r:id="rIdc-dzmwmb5vjclczllwdsg">
         <w:r>
           <w:rPr>
             <w:rStyle w:val="Hyperlink"/>
@@ -1699,7 +1699,7 @@
       <w:r>
         <w:t xml:space="preserve"> — créé — </w:t>
       </w:r>
-      <w:hyperlink w:history="1" r:id="rId7fmrdai8jtjxxfoc5loz0">
+      <w:hyperlink w:history="1" r:id="rIdz-zjlzcsizwjbgg7zh-jj">
         <w:r>
           <w:rPr>
             <w:rStyle w:val="Hyperlink"/>
@@ -1728,7 +1728,7 @@
       <w:r>
         <w:t xml:space="preserve"> — créé — </w:t>
       </w:r>
-      <w:hyperlink w:history="1" r:id="rIdjp7ittgll_sfxuplayy7a">
+      <w:hyperlink w:history="1" r:id="rId4jnox09-ivwwt_yjqswtp">
         <w:r>
           <w:rPr>
             <w:rStyle w:val="Hyperlink"/>
@@ -1757,7 +1757,7 @@
       <w:r>
         <w:t xml:space="preserve"> — créé — </w:t>
       </w:r>
-      <w:hyperlink w:history="1" r:id="rIdgtvzzouve4qfslkjnoqeh">
+      <w:hyperlink w:history="1" r:id="rIduahsnx4t_m2zryrfi0khr">
         <w:r>
           <w:rPr>
             <w:rStyle w:val="Hyperlink"/>
@@ -1786,7 +1786,7 @@
       <w:r>
         <w:t xml:space="preserve"> — créé — </w:t>
       </w:r>
-      <w:hyperlink w:history="1" r:id="rIdujlle28vvogodt368_5wp">
+      <w:hyperlink w:history="1" r:id="rId3qudpri5monrhufp-zf4v">
         <w:r>
           <w:rPr>
             <w:rStyle w:val="Hyperlink"/>
@@ -1823,7 +1823,7 @@
       <w:r>
         <w:t xml:space="preserve"> — créé — </w:t>
       </w:r>
-      <w:hyperlink w:history="1" r:id="rIdkvggiebgvtrizjnaursnb">
+      <w:hyperlink w:history="1" r:id="rIdb4k8deijufgzvgwbgvpxq">
         <w:r>
           <w:rPr>
             <w:rStyle w:val="Hyperlink"/>
@@ -1852,7 +1852,7 @@
       <w:r>
         <w:t xml:space="preserve"> — créé — </w:t>
       </w:r>
-      <w:hyperlink w:history="1" r:id="rIdvbbrkej7emjzb9eeqb_wf">
+      <w:hyperlink w:history="1" r:id="rId8ufxkinxdbxs-p8jjsbmi">
         <w:r>
           <w:rPr>
             <w:rStyle w:val="Hyperlink"/>
@@ -1881,7 +1881,7 @@
       <w:r>
         <w:t xml:space="preserve"> — créé — </w:t>
       </w:r>
-      <w:hyperlink w:history="1" r:id="rIdwaqogkyqm3bcyh7bgn0p1">
+      <w:hyperlink w:history="1" r:id="rIdqngxmmr4l-kjftqcacowo">
         <w:r>
           <w:rPr>
             <w:rStyle w:val="Hyperlink"/>
@@ -1910,7 +1910,7 @@
       <w:r>
         <w:t xml:space="preserve"> — créé — </w:t>
       </w:r>
-      <w:hyperlink w:history="1" r:id="rIdmhds8aj3hqnujibcopx3v">
+      <w:hyperlink w:history="1" r:id="rIdrphl4kzv3gghziy35de9g">
         <w:r>
           <w:rPr>
             <w:rStyle w:val="Hyperlink"/>
@@ -1939,7 +1939,7 @@
       <w:r>
         <w:t xml:space="preserve"> — créé — </w:t>
       </w:r>
-      <w:hyperlink w:history="1" r:id="rIdi_gkztbzb5vbyhkbqdhod">
+      <w:hyperlink w:history="1" r:id="rIdlbikavhmzemzs1xz-rf4_">
         <w:r>
           <w:rPr>
             <w:rStyle w:val="Hyperlink"/>
@@ -1968,7 +1968,7 @@
       <w:r>
         <w:t xml:space="preserve"> — créé — </w:t>
       </w:r>
-      <w:hyperlink w:history="1" r:id="rIdlzeqssmo9snzo56fsfyf5">
+      <w:hyperlink w:history="1" r:id="rIdqpasjvjifgihjft6f2yde">
         <w:r>
           <w:rPr>
             <w:rStyle w:val="Hyperlink"/>
@@ -1997,7 +1997,7 @@
       <w:r>
         <w:t xml:space="preserve"> — créé — </w:t>
       </w:r>
-      <w:hyperlink w:history="1" r:id="rIdqjuure3mrojn7wewqjk0n">
+      <w:hyperlink w:history="1" r:id="rIdldd7po6wwuxwciz_it_yw">
         <w:r>
           <w:rPr>
             <w:rStyle w:val="Hyperlink"/>
@@ -2026,7 +2026,7 @@
       <w:r>
         <w:t xml:space="preserve"> — créé — </w:t>
       </w:r>
-      <w:hyperlink w:history="1" r:id="rIdnpu0sjfnvyi5mqvn6ycro">
+      <w:hyperlink w:history="1" r:id="rIdayu8xvswod6zbacfqpauf">
         <w:r>
           <w:rPr>
             <w:rStyle w:val="Hyperlink"/>
@@ -2139,7 +2139,7 @@
       <w:r>
         <w:t xml:space="preserve"> — créé — </w:t>
       </w:r>
-      <w:hyperlink w:history="1" r:id="rIdsae2zu7ruccsmod2tb798">
+      <w:hyperlink w:history="1" r:id="rIdy2exhebgnqvqxf4acrpbu">
         <w:r>
           <w:rPr>
             <w:rStyle w:val="Hyperlink"/>
@@ -2189,7 +2189,7 @@
       <w:r>
         <w:t xml:space="preserve"> — créé — </w:t>
       </w:r>
-      <w:hyperlink w:history="1" r:id="rIdjvq9lo7gkjbmqrpqpepbj">
+      <w:hyperlink w:history="1" r:id="rId6yefl7vmytd2w3b2-udlk">
         <w:r>
           <w:rPr>
             <w:rStyle w:val="Hyperlink"/>
@@ -2218,7 +2218,7 @@
       <w:r>
         <w:t xml:space="preserve"> — créé — </w:t>
       </w:r>
-      <w:hyperlink w:history="1" r:id="rIdnnccxyskqf5j70ozoy2js">
+      <w:hyperlink w:history="1" r:id="rIdggmqjznm917jrxgx3vzb0">
         <w:r>
           <w:rPr>
             <w:rStyle w:val="Hyperlink"/>
@@ -2247,7 +2247,7 @@
       <w:r>
         <w:t xml:space="preserve"> — créé — </w:t>
       </w:r>
-      <w:hyperlink w:history="1" r:id="rIdje1yd09gwzxobmaiv-5un">
+      <w:hyperlink w:history="1" r:id="rIde-4m6ez9c_xl6aj0mzj6e">
         <w:r>
           <w:rPr>
             <w:rStyle w:val="Hyperlink"/>
@@ -2276,7 +2276,7 @@
       <w:r>
         <w:t xml:space="preserve"> — créé — </w:t>
       </w:r>
-      <w:hyperlink w:history="1" r:id="rIdvyqri-nxojfxr1y4sfxbc">
+      <w:hyperlink w:history="1" r:id="rId48km71zmjmrk5wyqbz-ko">
         <w:r>
           <w:rPr>
             <w:rStyle w:val="Hyperlink"/>
@@ -2313,7 +2313,7 @@
       <w:r>
         <w:t xml:space="preserve"> — créé — </w:t>
       </w:r>
-      <w:hyperlink w:history="1" r:id="rIdpbk2dq_dzmruoguqa9y__">
+      <w:hyperlink w:history="1" r:id="rIdu_amc8thikemgrban72xt">
         <w:r>
           <w:rPr>
             <w:rStyle w:val="Hyperlink"/>
@@ -2342,7 +2342,7 @@
       <w:r>
         <w:t xml:space="preserve"> — créé — </w:t>
       </w:r>
-      <w:hyperlink w:history="1" r:id="rIdnbvnq09k-wi3srbjegtn-">
+      <w:hyperlink w:history="1" r:id="rIdruns7agbavi2zoiohacez">
         <w:r>
           <w:rPr>
             <w:rStyle w:val="Hyperlink"/>
@@ -2379,7 +2379,7 @@
       <w:r>
         <w:t xml:space="preserve"> — créé — </w:t>
       </w:r>
-      <w:hyperlink w:history="1" r:id="rIdauthgvjmdqufefkvn2stj">
+      <w:hyperlink w:history="1" r:id="rIdelc3zvgyybzpppp_dq1kg">
         <w:r>
           <w:rPr>
             <w:rStyle w:val="Hyperlink"/>
@@ -2408,7 +2408,7 @@
       <w:r>
         <w:t xml:space="preserve"> — créé — </w:t>
       </w:r>
-      <w:hyperlink w:history="1" r:id="rIdgu3ko4daq18glzbssmzxp">
+      <w:hyperlink w:history="1" r:id="rIdiqqeeyxpjingugvryq6zu">
         <w:r>
           <w:rPr>
             <w:rStyle w:val="Hyperlink"/>
@@ -2437,7 +2437,7 @@
       <w:r>
         <w:t xml:space="preserve"> — créé — </w:t>
       </w:r>
-      <w:hyperlink w:history="1" r:id="rId8shxavxmcpqobgyahdrsh">
+      <w:hyperlink w:history="1" r:id="rIdu6giap17f8tbu35ifiu3o">
         <w:r>
           <w:rPr>
             <w:rStyle w:val="Hyperlink"/>
@@ -2466,7 +2466,7 @@
       <w:r>
         <w:t xml:space="preserve"> — créé — </w:t>
       </w:r>
-      <w:hyperlink w:history="1" r:id="rId6acuszyyz025u802gf4nx">
+      <w:hyperlink w:history="1" r:id="rIdpbbzhe0thinklwkkep4i6">
         <w:r>
           <w:rPr>
             <w:rStyle w:val="Hyperlink"/>
@@ -2495,7 +2495,7 @@
       <w:r>
         <w:t xml:space="preserve"> — créé — </w:t>
       </w:r>
-      <w:hyperlink w:history="1" r:id="rIdng85xhdsrbai4zegmbren">
+      <w:hyperlink w:history="1" r:id="rIdkuyyle9btfwxtnktzikwn">
         <w:r>
           <w:rPr>
             <w:rStyle w:val="Hyperlink"/>
@@ -2524,7 +2524,7 @@
       <w:r>
         <w:t xml:space="preserve"> — créé — </w:t>
       </w:r>
-      <w:hyperlink w:history="1" r:id="rIdbenjuvmftzljrch7f9bks">
+      <w:hyperlink w:history="1" r:id="rIdletct1zaesd5mjjukxi36">
         <w:r>
           <w:rPr>
             <w:rStyle w:val="Hyperlink"/>
@@ -2553,7 +2553,7 @@
       <w:r>
         <w:t xml:space="preserve"> — créé — </w:t>
       </w:r>
-      <w:hyperlink w:history="1" r:id="rIds42b3p8mulj1whxgipkrg">
+      <w:hyperlink w:history="1" r:id="rIdiy1znlewjiwssp3l7eam9">
         <w:r>
           <w:rPr>
             <w:rStyle w:val="Hyperlink"/>
@@ -2582,7 +2582,7 @@
       <w:r>
         <w:t xml:space="preserve"> — créé — </w:t>
       </w:r>
-      <w:hyperlink w:history="1" r:id="rIdp2xk0ve8vaaimlwwardhd">
+      <w:hyperlink w:history="1" r:id="rIdhzppmj-xwzqqnn85nq7o2">
         <w:r>
           <w:rPr>
             <w:rStyle w:val="Hyperlink"/>
@@ -2611,7 +2611,7 @@
       <w:r>
         <w:t xml:space="preserve"> — créé — </w:t>
       </w:r>
-      <w:hyperlink w:history="1" r:id="rId28hcbmiru391z61gzx-eu">
+      <w:hyperlink w:history="1" r:id="rIdgsogf__zgvm0ckmtomowy">
         <w:r>
           <w:rPr>
             <w:rStyle w:val="Hyperlink"/>
@@ -2648,7 +2648,7 @@
       <w:r>
         <w:t xml:space="preserve"> — créé — </w:t>
       </w:r>
-      <w:hyperlink w:history="1" r:id="rId1vbtejbi9xm-pfb36irtt">
+      <w:hyperlink w:history="1" r:id="rIdvirgpezhvxc3eotdc3myb">
         <w:r>
           <w:rPr>
             <w:rStyle w:val="Hyperlink"/>
@@ -2677,7 +2677,7 @@
       <w:r>
         <w:t xml:space="preserve"> — créé — </w:t>
       </w:r>
-      <w:hyperlink w:history="1" r:id="rIdkplpbnihxuybkmntkklko">
+      <w:hyperlink w:history="1" r:id="rIdtwwvms4fsjxt-zbdmemte">
         <w:r>
           <w:rPr>
             <w:rStyle w:val="Hyperlink"/>
@@ -2706,7 +2706,7 @@
       <w:r>
         <w:t xml:space="preserve"> — créé — </w:t>
       </w:r>
-      <w:hyperlink w:history="1" r:id="rId6p1t9zmmpvga1dtzf4qw7">
+      <w:hyperlink w:history="1" r:id="rIdaw54m9ybeoxq2nklpbbbe">
         <w:r>
           <w:rPr>
             <w:rStyle w:val="Hyperlink"/>
@@ -2735,7 +2735,7 @@
       <w:r>
         <w:t xml:space="preserve"> — créé — </w:t>
       </w:r>
-      <w:hyperlink w:history="1" r:id="rIdvh59492fklr2ibr_se5r_">
+      <w:hyperlink w:history="1" r:id="rId20gp7q_zip4rfvw9ukc13">
         <w:r>
           <w:rPr>
             <w:rStyle w:val="Hyperlink"/>
@@ -2764,7 +2764,7 @@
       <w:r>
         <w:t xml:space="preserve"> — créé — </w:t>
       </w:r>
-      <w:hyperlink w:history="1" r:id="rId-2nhz8mexropdiyys8qdl">
+      <w:hyperlink w:history="1" r:id="rIdjjbi4ytqka4nn3otkwhed">
         <w:r>
           <w:rPr>
             <w:rStyle w:val="Hyperlink"/>
@@ -2793,7 +2793,7 @@
       <w:r>
         <w:t xml:space="preserve"> — créé — </w:t>
       </w:r>
-      <w:hyperlink w:history="1" r:id="rIdtx0lzx9ofktgexzvmvbpr">
+      <w:hyperlink w:history="1" r:id="rIdezkc_fcm869ojpimatus3">
         <w:r>
           <w:rPr>
             <w:rStyle w:val="Hyperlink"/>
@@ -2822,7 +2822,7 @@
       <w:r>
         <w:t xml:space="preserve"> — créé — </w:t>
       </w:r>
-      <w:hyperlink w:history="1" r:id="rIdpr4q6alxysgobmfmfrfnz">
+      <w:hyperlink w:history="1" r:id="rIds-55elausglo0xugi3yyz">
         <w:r>
           <w:rPr>
             <w:rStyle w:val="Hyperlink"/>
@@ -2851,7 +2851,7 @@
       <w:r>
         <w:t xml:space="preserve"> — créé — </w:t>
       </w:r>
-      <w:hyperlink w:history="1" r:id="rIdcmmqeptytz8or5mcptgja">
+      <w:hyperlink w:history="1" r:id="rIdluvl6o755jksz0xuud_xv">
         <w:r>
           <w:rPr>
             <w:rStyle w:val="Hyperlink"/>

</xml_diff>

<commit_message>
Chiffres de la soirée : encadré corrigé ; dossier §15.171, avancement, phase 72
Co-Authored-By: Claude Opus 5.5 <noreply@anthropic.com>
</commit_message>
<xml_diff>
--- a/docs/developpement/phases/word/PHASE_00_SOCLE_DE_PRODUCTION_ET_CONFIGURATION_DUN_LIEU_VIDE.docx
+++ b/docs/developpement/phases/word/PHASE_00_SOCLE_DE_PRODUCTION_ET_CONFIGURATION_DUN_LIEU_VIDE.docx
@@ -20,7 +20,7 @@
       <w:r>
         <w:t xml:space="preserve">FlaiX Expert · dossier de développement · généré le 2026-10-21 depuis le dépôt </w:t>
       </w:r>
-      <w:hyperlink w:history="1" r:id="rId4716tpxxfqfqlfugdemdr">
+      <w:hyperlink w:history="1" r:id="rId0lnfihljdrhe4dotg5ssv">
         <w:r>
           <w:rPr>
             <w:rStyle w:val="Hyperlink"/>
@@ -592,7 +592,7 @@
           <w:numId w:val="3"/>
         </w:numPr>
       </w:pPr>
-      <w:hyperlink w:history="1" r:id="rIdcpx88gcmbkce9yhmvaebk">
+      <w:hyperlink w:history="1" r:id="rIdea5vowe55ivucxk-oaj6t">
         <w:r>
           <w:rPr>
             <w:rStyle w:val="Hyperlink"/>
@@ -612,7 +612,7 @@
           <w:numId w:val="3"/>
         </w:numPr>
       </w:pPr>
-      <w:hyperlink w:history="1" r:id="rId0u6fp00kuttbt-akrcdrv">
+      <w:hyperlink w:history="1" r:id="rIdehtjjpf0nr-cu5xhvrylh">
         <w:r>
           <w:rPr>
             <w:rStyle w:val="Hyperlink"/>
@@ -660,7 +660,7 @@
       <w:r>
         <w:t xml:space="preserve"> — créé — </w:t>
       </w:r>
-      <w:hyperlink w:history="1" r:id="rIdym3hiyzxyn2rtnl8xqk6y">
+      <w:hyperlink w:history="1" r:id="rIdnpaujt7tcwcekoxwziim4">
         <w:r>
           <w:rPr>
             <w:rStyle w:val="Hyperlink"/>
@@ -689,7 +689,7 @@
       <w:r>
         <w:t xml:space="preserve"> — créé — </w:t>
       </w:r>
-      <w:hyperlink w:history="1" r:id="rIdk221nu5gspdvrzpihpdx0">
+      <w:hyperlink w:history="1" r:id="rIdb31okmnq8xunyaas-54np">
         <w:r>
           <w:rPr>
             <w:rStyle w:val="Hyperlink"/>
@@ -726,7 +726,7 @@
       <w:r>
         <w:t xml:space="preserve"> — créé — </w:t>
       </w:r>
-      <w:hyperlink w:history="1" r:id="rIde0syq2hrvxulsnhnavajm">
+      <w:hyperlink w:history="1" r:id="rIdsymnyq-67csadhicpjs2h">
         <w:r>
           <w:rPr>
             <w:rStyle w:val="Hyperlink"/>
@@ -755,7 +755,7 @@
       <w:r>
         <w:t xml:space="preserve"> — créé — </w:t>
       </w:r>
-      <w:hyperlink w:history="1" r:id="rIdk22e0eavwjiwp0zygo8ro">
+      <w:hyperlink w:history="1" r:id="rId0yj-1wbhpowaq3tz7poyh">
         <w:r>
           <w:rPr>
             <w:rStyle w:val="Hyperlink"/>
@@ -784,7 +784,7 @@
       <w:r>
         <w:t xml:space="preserve"> — créé — </w:t>
       </w:r>
-      <w:hyperlink w:history="1" r:id="rIdcufqee5kojmdde3kro43i">
+      <w:hyperlink w:history="1" r:id="rIdlkwtajrgaovogxdxqphis">
         <w:r>
           <w:rPr>
             <w:rStyle w:val="Hyperlink"/>
@@ -813,7 +813,7 @@
       <w:r>
         <w:t xml:space="preserve"> — créé — </w:t>
       </w:r>
-      <w:hyperlink w:history="1" r:id="rId4vvwdmyh4jecsarfk641z">
+      <w:hyperlink w:history="1" r:id="rIdj2wczdh7dzhnrehgcnyad">
         <w:r>
           <w:rPr>
             <w:rStyle w:val="Hyperlink"/>
@@ -842,7 +842,7 @@
       <w:r>
         <w:t xml:space="preserve"> — créé — </w:t>
       </w:r>
-      <w:hyperlink w:history="1" r:id="rId4t1iqidy9gf613vc7fwun">
+      <w:hyperlink w:history="1" r:id="rIdm39d-q6brsqbkxbpxqdxv">
         <w:r>
           <w:rPr>
             <w:rStyle w:val="Hyperlink"/>
@@ -879,7 +879,7 @@
       <w:r>
         <w:t xml:space="preserve"> — créé — </w:t>
       </w:r>
-      <w:hyperlink w:history="1" r:id="rIdns3nac-weqtyuazodk36t">
+      <w:hyperlink w:history="1" r:id="rIdfiq0eohdnx1y-tddriwp4">
         <w:r>
           <w:rPr>
             <w:rStyle w:val="Hyperlink"/>
@@ -908,7 +908,7 @@
       <w:r>
         <w:t xml:space="preserve"> — créé — </w:t>
       </w:r>
-      <w:hyperlink w:history="1" r:id="rIdmxvrpfmwlgibaypxgnurf">
+      <w:hyperlink w:history="1" r:id="rIddg9cvso9fd8micyqhohxq">
         <w:r>
           <w:rPr>
             <w:rStyle w:val="Hyperlink"/>
@@ -937,7 +937,7 @@
       <w:r>
         <w:t xml:space="preserve"> — créé — </w:t>
       </w:r>
-      <w:hyperlink w:history="1" r:id="rIdw7az8ducny8qs-h-ukkac">
+      <w:hyperlink w:history="1" r:id="rIdspyxq7qfopnrbflesovos">
         <w:r>
           <w:rPr>
             <w:rStyle w:val="Hyperlink"/>
@@ -966,7 +966,7 @@
       <w:r>
         <w:t xml:space="preserve"> — créé — </w:t>
       </w:r>
-      <w:hyperlink w:history="1" r:id="rIdtan9uf8viykodrbdd6c3p">
+      <w:hyperlink w:history="1" r:id="rIdcuqgjvgi_vvmyzfcyu_-b">
         <w:r>
           <w:rPr>
             <w:rStyle w:val="Hyperlink"/>
@@ -995,7 +995,7 @@
       <w:r>
         <w:t xml:space="preserve"> — créé — </w:t>
       </w:r>
-      <w:hyperlink w:history="1" r:id="rIdyriacqotqfvh8--bbkm11">
+      <w:hyperlink w:history="1" r:id="rIdu7sxmvgpaxmmtsyzyj-vn">
         <w:r>
           <w:rPr>
             <w:rStyle w:val="Hyperlink"/>
@@ -1024,7 +1024,7 @@
       <w:r>
         <w:t xml:space="preserve"> — créé — </w:t>
       </w:r>
-      <w:hyperlink w:history="1" r:id="rIdhovdd7bko-owkcg91hh2m">
+      <w:hyperlink w:history="1" r:id="rIdu4sycijm3xqdnonnfeieo">
         <w:r>
           <w:rPr>
             <w:rStyle w:val="Hyperlink"/>
@@ -1053,7 +1053,7 @@
       <w:r>
         <w:t xml:space="preserve"> — créé — </w:t>
       </w:r>
-      <w:hyperlink w:history="1" r:id="rIdxnbb2d3dh5ytfh4dkyck_">
+      <w:hyperlink w:history="1" r:id="rIdx3j_q6icplyqitdqequys">
         <w:r>
           <w:rPr>
             <w:rStyle w:val="Hyperlink"/>
@@ -1082,7 +1082,7 @@
       <w:r>
         <w:t xml:space="preserve"> — créé — </w:t>
       </w:r>
-      <w:hyperlink w:history="1" r:id="rId-1zmodv10u3fcsqrr1riu">
+      <w:hyperlink w:history="1" r:id="rIdumhrjjtlz8e1bpn9geupc">
         <w:r>
           <w:rPr>
             <w:rStyle w:val="Hyperlink"/>
@@ -1111,7 +1111,7 @@
       <w:r>
         <w:t xml:space="preserve"> — créé — </w:t>
       </w:r>
-      <w:hyperlink w:history="1" r:id="rIdcgltetd0qe0s0so1eys7p">
+      <w:hyperlink w:history="1" r:id="rIdla0ft7ft8tcawavswl_nd">
         <w:r>
           <w:rPr>
             <w:rStyle w:val="Hyperlink"/>
@@ -1148,7 +1148,7 @@
       <w:r>
         <w:t xml:space="preserve"> — créé — </w:t>
       </w:r>
-      <w:hyperlink w:history="1" r:id="rId845frbhhohm2ou_l5z2bn">
+      <w:hyperlink w:history="1" r:id="rIdpvtr3qhf0eivfh5vz1d27">
         <w:r>
           <w:rPr>
             <w:rStyle w:val="Hyperlink"/>
@@ -1177,7 +1177,7 @@
       <w:r>
         <w:t xml:space="preserve"> — créé — </w:t>
       </w:r>
-      <w:hyperlink w:history="1" r:id="rId7edil-mbmk2y_grb8qgyu">
+      <w:hyperlink w:history="1" r:id="rIdvw2iaeadqkqjuwd118h8n">
         <w:r>
           <w:rPr>
             <w:rStyle w:val="Hyperlink"/>
@@ -1206,7 +1206,7 @@
       <w:r>
         <w:t xml:space="preserve"> — créé — </w:t>
       </w:r>
-      <w:hyperlink w:history="1" r:id="rIdissbv1s1nbl-tdm9xyupd">
+      <w:hyperlink w:history="1" r:id="rIdb4cuqdwzat4d4h79kfv2u">
         <w:r>
           <w:rPr>
             <w:rStyle w:val="Hyperlink"/>
@@ -1235,7 +1235,7 @@
       <w:r>
         <w:t xml:space="preserve"> — créé — </w:t>
       </w:r>
-      <w:hyperlink w:history="1" r:id="rIdjaj_a791pjbwjibubcrvb">
+      <w:hyperlink w:history="1" r:id="rIdizt71bym5cxpyhxet-dfz">
         <w:r>
           <w:rPr>
             <w:rStyle w:val="Hyperlink"/>
@@ -1264,7 +1264,7 @@
       <w:r>
         <w:t xml:space="preserve"> — créé — </w:t>
       </w:r>
-      <w:hyperlink w:history="1" r:id="rIdvn6su3zmtik-v-jc1fhcs">
+      <w:hyperlink w:history="1" r:id="rIdcf3wngbq_krrhc_-bwndw">
         <w:r>
           <w:rPr>
             <w:rStyle w:val="Hyperlink"/>
@@ -1293,7 +1293,7 @@
       <w:r>
         <w:t xml:space="preserve"> — créé — </w:t>
       </w:r>
-      <w:hyperlink w:history="1" r:id="rIdbtiqyw4fkbnrigujcodvc">
+      <w:hyperlink w:history="1" r:id="rIduznpwmqbwgf21774zx3mg">
         <w:r>
           <w:rPr>
             <w:rStyle w:val="Hyperlink"/>
@@ -1322,7 +1322,7 @@
       <w:r>
         <w:t xml:space="preserve"> — créé — </w:t>
       </w:r>
-      <w:hyperlink w:history="1" r:id="rIdgrg1z29la-ohbg3pvz-u9">
+      <w:hyperlink w:history="1" r:id="rIdkecriwprn6-mznziddbhy">
         <w:r>
           <w:rPr>
             <w:rStyle w:val="Hyperlink"/>
@@ -1351,7 +1351,7 @@
       <w:r>
         <w:t xml:space="preserve"> — créé — </w:t>
       </w:r>
-      <w:hyperlink w:history="1" r:id="rIdiuswa3_jyb4xko4ss9iyi">
+      <w:hyperlink w:history="1" r:id="rIdx-ix8c8z6l8jjhncyw69v">
         <w:r>
           <w:rPr>
             <w:rStyle w:val="Hyperlink"/>
@@ -1380,7 +1380,7 @@
       <w:r>
         <w:t xml:space="preserve"> — créé — </w:t>
       </w:r>
-      <w:hyperlink w:history="1" r:id="rIdjprsvi_xnftyjxesf2vec">
+      <w:hyperlink w:history="1" r:id="rIdhfvsu5qe7-vitmbj7mvyd">
         <w:r>
           <w:rPr>
             <w:rStyle w:val="Hyperlink"/>
@@ -1409,7 +1409,7 @@
       <w:r>
         <w:t xml:space="preserve"> — créé — </w:t>
       </w:r>
-      <w:hyperlink w:history="1" r:id="rId08z5ufyjdbred0ch_aehz">
+      <w:hyperlink w:history="1" r:id="rIdi0idea_ck6nqhiyt_mfce">
         <w:r>
           <w:rPr>
             <w:rStyle w:val="Hyperlink"/>
@@ -1438,7 +1438,7 @@
       <w:r>
         <w:t xml:space="preserve"> — créé — </w:t>
       </w:r>
-      <w:hyperlink w:history="1" r:id="rIdctoylkb_07kviyelkzjed">
+      <w:hyperlink w:history="1" r:id="rIdboeugbhzmw5fr92lwjhkq">
         <w:r>
           <w:rPr>
             <w:rStyle w:val="Hyperlink"/>
@@ -1467,7 +1467,7 @@
       <w:r>
         <w:t xml:space="preserve"> — créé — </w:t>
       </w:r>
-      <w:hyperlink w:history="1" r:id="rIdp3zelkzhyydhchtushpwt">
+      <w:hyperlink w:history="1" r:id="rIdasxc6dawtzbiawicm6tyv">
         <w:r>
           <w:rPr>
             <w:rStyle w:val="Hyperlink"/>
@@ -1496,7 +1496,7 @@
       <w:r>
         <w:t xml:space="preserve"> — créé — </w:t>
       </w:r>
-      <w:hyperlink w:history="1" r:id="rId6juysrbjqmbpvrdy_q6s9">
+      <w:hyperlink w:history="1" r:id="rIdpirmwkjwq_3jvqyadedxr">
         <w:r>
           <w:rPr>
             <w:rStyle w:val="Hyperlink"/>
@@ -1525,7 +1525,7 @@
       <w:r>
         <w:t xml:space="preserve"> — créé — </w:t>
       </w:r>
-      <w:hyperlink w:history="1" r:id="rIdvkr5zb0qujmjvp1r-gqr4">
+      <w:hyperlink w:history="1" r:id="rIdxamcru_w15hatwukv7g4u">
         <w:r>
           <w:rPr>
             <w:rStyle w:val="Hyperlink"/>
@@ -1554,7 +1554,7 @@
       <w:r>
         <w:t xml:space="preserve"> — créé — </w:t>
       </w:r>
-      <w:hyperlink w:history="1" r:id="rId3i8nosajazgwjszbdph-v">
+      <w:hyperlink w:history="1" r:id="rIdfqmswkbydijvnak6cnh38">
         <w:r>
           <w:rPr>
             <w:rStyle w:val="Hyperlink"/>
@@ -1583,7 +1583,7 @@
       <w:r>
         <w:t xml:space="preserve"> — créé — </w:t>
       </w:r>
-      <w:hyperlink w:history="1" r:id="rIdersh-barwi4pm22sahbdu">
+      <w:hyperlink w:history="1" r:id="rIdou5dnue3r97lh_v5aolrn">
         <w:r>
           <w:rPr>
             <w:rStyle w:val="Hyperlink"/>
@@ -1612,7 +1612,7 @@
       <w:r>
         <w:t xml:space="preserve"> — créé — </w:t>
       </w:r>
-      <w:hyperlink w:history="1" r:id="rId9ixscpbfbgmlwd-wbz9pg">
+      <w:hyperlink w:history="1" r:id="rIdyr-wjl0wiubnlczm-cqe5">
         <w:r>
           <w:rPr>
             <w:rStyle w:val="Hyperlink"/>
@@ -1641,7 +1641,7 @@
       <w:r>
         <w:t xml:space="preserve"> — créé — </w:t>
       </w:r>
-      <w:hyperlink w:history="1" r:id="rIdm_jsgfyl2_snetgnjh2zw">
+      <w:hyperlink w:history="1" r:id="rIdyynh5n37vjpd9rd9qujtt">
         <w:r>
           <w:rPr>
             <w:rStyle w:val="Hyperlink"/>
@@ -1670,7 +1670,7 @@
       <w:r>
         <w:t xml:space="preserve"> — créé — </w:t>
       </w:r>
-      <w:hyperlink w:history="1" r:id="rIdc-dzmwmb5vjclczllwdsg">
+      <w:hyperlink w:history="1" r:id="rId9uouzvkw1fn7h0jq-lmk8">
         <w:r>
           <w:rPr>
             <w:rStyle w:val="Hyperlink"/>
@@ -1699,7 +1699,7 @@
       <w:r>
         <w:t xml:space="preserve"> — créé — </w:t>
       </w:r>
-      <w:hyperlink w:history="1" r:id="rIdz-zjlzcsizwjbgg7zh-jj">
+      <w:hyperlink w:history="1" r:id="rId0aoud461ga6oeg5niylji">
         <w:r>
           <w:rPr>
             <w:rStyle w:val="Hyperlink"/>
@@ -1728,7 +1728,7 @@
       <w:r>
         <w:t xml:space="preserve"> — créé — </w:t>
       </w:r>
-      <w:hyperlink w:history="1" r:id="rId4jnox09-ivwwt_yjqswtp">
+      <w:hyperlink w:history="1" r:id="rIdcwt0ks1uapspcbteem_hx">
         <w:r>
           <w:rPr>
             <w:rStyle w:val="Hyperlink"/>
@@ -1757,7 +1757,7 @@
       <w:r>
         <w:t xml:space="preserve"> — créé — </w:t>
       </w:r>
-      <w:hyperlink w:history="1" r:id="rIduahsnx4t_m2zryrfi0khr">
+      <w:hyperlink w:history="1" r:id="rIdvgzpi3an6rkwbbg0aiio9">
         <w:r>
           <w:rPr>
             <w:rStyle w:val="Hyperlink"/>
@@ -1786,7 +1786,7 @@
       <w:r>
         <w:t xml:space="preserve"> — créé — </w:t>
       </w:r>
-      <w:hyperlink w:history="1" r:id="rId3qudpri5monrhufp-zf4v">
+      <w:hyperlink w:history="1" r:id="rIdhsu7y9fwqzcuvw3k23qix">
         <w:r>
           <w:rPr>
             <w:rStyle w:val="Hyperlink"/>
@@ -1823,7 +1823,7 @@
       <w:r>
         <w:t xml:space="preserve"> — créé — </w:t>
       </w:r>
-      <w:hyperlink w:history="1" r:id="rIdb4k8deijufgzvgwbgvpxq">
+      <w:hyperlink w:history="1" r:id="rIdeiqcy7wsgbqmzetitoapa">
         <w:r>
           <w:rPr>
             <w:rStyle w:val="Hyperlink"/>
@@ -1852,7 +1852,7 @@
       <w:r>
         <w:t xml:space="preserve"> — créé — </w:t>
       </w:r>
-      <w:hyperlink w:history="1" r:id="rId8ufxkinxdbxs-p8jjsbmi">
+      <w:hyperlink w:history="1" r:id="rIdmum9wq5efkzza_rrsizgo">
         <w:r>
           <w:rPr>
             <w:rStyle w:val="Hyperlink"/>
@@ -1881,7 +1881,7 @@
       <w:r>
         <w:t xml:space="preserve"> — créé — </w:t>
       </w:r>
-      <w:hyperlink w:history="1" r:id="rIdqngxmmr4l-kjftqcacowo">
+      <w:hyperlink w:history="1" r:id="rIdzh8ipuhdrnkcrn-7f9u33">
         <w:r>
           <w:rPr>
             <w:rStyle w:val="Hyperlink"/>
@@ -1910,7 +1910,7 @@
       <w:r>
         <w:t xml:space="preserve"> — créé — </w:t>
       </w:r>
-      <w:hyperlink w:history="1" r:id="rIdrphl4kzv3gghziy35de9g">
+      <w:hyperlink w:history="1" r:id="rIdzqvix9fsfnvprbuisgttv">
         <w:r>
           <w:rPr>
             <w:rStyle w:val="Hyperlink"/>
@@ -1939,7 +1939,7 @@
       <w:r>
         <w:t xml:space="preserve"> — créé — </w:t>
       </w:r>
-      <w:hyperlink w:history="1" r:id="rIdlbikavhmzemzs1xz-rf4_">
+      <w:hyperlink w:history="1" r:id="rIdbtjozskcaverywaoqpumm">
         <w:r>
           <w:rPr>
             <w:rStyle w:val="Hyperlink"/>
@@ -1968,7 +1968,7 @@
       <w:r>
         <w:t xml:space="preserve"> — créé — </w:t>
       </w:r>
-      <w:hyperlink w:history="1" r:id="rIdqpasjvjifgihjft6f2yde">
+      <w:hyperlink w:history="1" r:id="rIdproeojmx1knoov96puloq">
         <w:r>
           <w:rPr>
             <w:rStyle w:val="Hyperlink"/>
@@ -1997,7 +1997,7 @@
       <w:r>
         <w:t xml:space="preserve"> — créé — </w:t>
       </w:r>
-      <w:hyperlink w:history="1" r:id="rIdldd7po6wwuxwciz_it_yw">
+      <w:hyperlink w:history="1" r:id="rId12tpors9vqcatvm4w_amb">
         <w:r>
           <w:rPr>
             <w:rStyle w:val="Hyperlink"/>
@@ -2026,7 +2026,7 @@
       <w:r>
         <w:t xml:space="preserve"> — créé — </w:t>
       </w:r>
-      <w:hyperlink w:history="1" r:id="rIdayu8xvswod6zbacfqpauf">
+      <w:hyperlink w:history="1" r:id="rIdsdludpagsx96kmvfngtm1">
         <w:r>
           <w:rPr>
             <w:rStyle w:val="Hyperlink"/>
@@ -2139,7 +2139,7 @@
       <w:r>
         <w:t xml:space="preserve"> — créé — </w:t>
       </w:r>
-      <w:hyperlink w:history="1" r:id="rIdy2exhebgnqvqxf4acrpbu">
+      <w:hyperlink w:history="1" r:id="rIdm-t-vltmusa6h4n6ntcns">
         <w:r>
           <w:rPr>
             <w:rStyle w:val="Hyperlink"/>
@@ -2189,7 +2189,7 @@
       <w:r>
         <w:t xml:space="preserve"> — créé — </w:t>
       </w:r>
-      <w:hyperlink w:history="1" r:id="rId6yefl7vmytd2w3b2-udlk">
+      <w:hyperlink w:history="1" r:id="rIdaxyhwgxqzqnl4grpvyz-n">
         <w:r>
           <w:rPr>
             <w:rStyle w:val="Hyperlink"/>
@@ -2218,7 +2218,7 @@
       <w:r>
         <w:t xml:space="preserve"> — créé — </w:t>
       </w:r>
-      <w:hyperlink w:history="1" r:id="rIdggmqjznm917jrxgx3vzb0">
+      <w:hyperlink w:history="1" r:id="rIdbc5gxrdftpgzi-jvgdj7x">
         <w:r>
           <w:rPr>
             <w:rStyle w:val="Hyperlink"/>
@@ -2247,7 +2247,7 @@
       <w:r>
         <w:t xml:space="preserve"> — créé — </w:t>
       </w:r>
-      <w:hyperlink w:history="1" r:id="rIde-4m6ez9c_xl6aj0mzj6e">
+      <w:hyperlink w:history="1" r:id="rIdmln2gqhjhmfyj0fckblws">
         <w:r>
           <w:rPr>
             <w:rStyle w:val="Hyperlink"/>
@@ -2276,7 +2276,7 @@
       <w:r>
         <w:t xml:space="preserve"> — créé — </w:t>
       </w:r>
-      <w:hyperlink w:history="1" r:id="rId48km71zmjmrk5wyqbz-ko">
+      <w:hyperlink w:history="1" r:id="rIdsvob_riamh9dpnjzdj0iz">
         <w:r>
           <w:rPr>
             <w:rStyle w:val="Hyperlink"/>
@@ -2313,7 +2313,7 @@
       <w:r>
         <w:t xml:space="preserve"> — créé — </w:t>
       </w:r>
-      <w:hyperlink w:history="1" r:id="rIdu_amc8thikemgrban72xt">
+      <w:hyperlink w:history="1" r:id="rIdrzssanhk-8xyw_u0s1itz">
         <w:r>
           <w:rPr>
             <w:rStyle w:val="Hyperlink"/>
@@ -2342,7 +2342,7 @@
       <w:r>
         <w:t xml:space="preserve"> — créé — </w:t>
       </w:r>
-      <w:hyperlink w:history="1" r:id="rIdruns7agbavi2zoiohacez">
+      <w:hyperlink w:history="1" r:id="rIdqbvdgcomx5ekiqhgqzlud">
         <w:r>
           <w:rPr>
             <w:rStyle w:val="Hyperlink"/>
@@ -2379,7 +2379,7 @@
       <w:r>
         <w:t xml:space="preserve"> — créé — </w:t>
       </w:r>
-      <w:hyperlink w:history="1" r:id="rIdelc3zvgyybzpppp_dq1kg">
+      <w:hyperlink w:history="1" r:id="rIdjhunxr5cucesnerhkwys_">
         <w:r>
           <w:rPr>
             <w:rStyle w:val="Hyperlink"/>
@@ -2408,7 +2408,7 @@
       <w:r>
         <w:t xml:space="preserve"> — créé — </w:t>
       </w:r>
-      <w:hyperlink w:history="1" r:id="rIdiqqeeyxpjingugvryq6zu">
+      <w:hyperlink w:history="1" r:id="rIdc-nhhuvioe09jurgmi2kn">
         <w:r>
           <w:rPr>
             <w:rStyle w:val="Hyperlink"/>
@@ -2437,7 +2437,7 @@
       <w:r>
         <w:t xml:space="preserve"> — créé — </w:t>
       </w:r>
-      <w:hyperlink w:history="1" r:id="rIdu6giap17f8tbu35ifiu3o">
+      <w:hyperlink w:history="1" r:id="rIdqp0f2elty-wbbxzdxy2rb">
         <w:r>
           <w:rPr>
             <w:rStyle w:val="Hyperlink"/>
@@ -2466,7 +2466,7 @@
       <w:r>
         <w:t xml:space="preserve"> — créé — </w:t>
       </w:r>
-      <w:hyperlink w:history="1" r:id="rIdpbbzhe0thinklwkkep4i6">
+      <w:hyperlink w:history="1" r:id="rIdstyyphxyx_cie5zoxkcw7">
         <w:r>
           <w:rPr>
             <w:rStyle w:val="Hyperlink"/>
@@ -2495,7 +2495,7 @@
       <w:r>
         <w:t xml:space="preserve"> — créé — </w:t>
       </w:r>
-      <w:hyperlink w:history="1" r:id="rIdkuyyle9btfwxtnktzikwn">
+      <w:hyperlink w:history="1" r:id="rIdohzr_pst5paoc_3qr46pq">
         <w:r>
           <w:rPr>
             <w:rStyle w:val="Hyperlink"/>
@@ -2524,7 +2524,7 @@
       <w:r>
         <w:t xml:space="preserve"> — créé — </w:t>
       </w:r>
-      <w:hyperlink w:history="1" r:id="rIdletct1zaesd5mjjukxi36">
+      <w:hyperlink w:history="1" r:id="rIdbll3ujelru8oodzn5mnii">
         <w:r>
           <w:rPr>
             <w:rStyle w:val="Hyperlink"/>
@@ -2553,7 +2553,7 @@
       <w:r>
         <w:t xml:space="preserve"> — créé — </w:t>
       </w:r>
-      <w:hyperlink w:history="1" r:id="rIdiy1znlewjiwssp3l7eam9">
+      <w:hyperlink w:history="1" r:id="rIdv-fd971mcgceol-ljnqij">
         <w:r>
           <w:rPr>
             <w:rStyle w:val="Hyperlink"/>
@@ -2582,7 +2582,7 @@
       <w:r>
         <w:t xml:space="preserve"> — créé — </w:t>
       </w:r>
-      <w:hyperlink w:history="1" r:id="rIdhzppmj-xwzqqnn85nq7o2">
+      <w:hyperlink w:history="1" r:id="rIdnvisxvni7v6ciebspougd">
         <w:r>
           <w:rPr>
             <w:rStyle w:val="Hyperlink"/>
@@ -2611,7 +2611,7 @@
       <w:r>
         <w:t xml:space="preserve"> — créé — </w:t>
       </w:r>
-      <w:hyperlink w:history="1" r:id="rIdgsogf__zgvm0ckmtomowy">
+      <w:hyperlink w:history="1" r:id="rIdu1sv76m-k16m0a6o1kscz">
         <w:r>
           <w:rPr>
             <w:rStyle w:val="Hyperlink"/>
@@ -2648,7 +2648,7 @@
       <w:r>
         <w:t xml:space="preserve"> — créé — </w:t>
       </w:r>
-      <w:hyperlink w:history="1" r:id="rIdvirgpezhvxc3eotdc3myb">
+      <w:hyperlink w:history="1" r:id="rId00j4ul1tng6ci5uxsxh7k">
         <w:r>
           <w:rPr>
             <w:rStyle w:val="Hyperlink"/>
@@ -2677,7 +2677,7 @@
       <w:r>
         <w:t xml:space="preserve"> — créé — </w:t>
       </w:r>
-      <w:hyperlink w:history="1" r:id="rIdtwwvms4fsjxt-zbdmemte">
+      <w:hyperlink w:history="1" r:id="rIdtpsdaqnmvdplqnjdynlt8">
         <w:r>
           <w:rPr>
             <w:rStyle w:val="Hyperlink"/>
@@ -2706,7 +2706,7 @@
       <w:r>
         <w:t xml:space="preserve"> — créé — </w:t>
       </w:r>
-      <w:hyperlink w:history="1" r:id="rIdaw54m9ybeoxq2nklpbbbe">
+      <w:hyperlink w:history="1" r:id="rIdgxofixqwklrtwl-0xkvpb">
         <w:r>
           <w:rPr>
             <w:rStyle w:val="Hyperlink"/>
@@ -2735,7 +2735,7 @@
       <w:r>
         <w:t xml:space="preserve"> — créé — </w:t>
       </w:r>
-      <w:hyperlink w:history="1" r:id="rId20gp7q_zip4rfvw9ukc13">
+      <w:hyperlink w:history="1" r:id="rIdvfvdzx6mrynby2scqr5iq">
         <w:r>
           <w:rPr>
             <w:rStyle w:val="Hyperlink"/>
@@ -2764,7 +2764,7 @@
       <w:r>
         <w:t xml:space="preserve"> — créé — </w:t>
       </w:r>
-      <w:hyperlink w:history="1" r:id="rIdjjbi4ytqka4nn3otkwhed">
+      <w:hyperlink w:history="1" r:id="rIdss5ljlsmyk5ba5yjgujkb">
         <w:r>
           <w:rPr>
             <w:rStyle w:val="Hyperlink"/>
@@ -2793,7 +2793,7 @@
       <w:r>
         <w:t xml:space="preserve"> — créé — </w:t>
       </w:r>
-      <w:hyperlink w:history="1" r:id="rIdezkc_fcm869ojpimatus3">
+      <w:hyperlink w:history="1" r:id="rIda2hqalkkugagxuxk9hruf">
         <w:r>
           <w:rPr>
             <w:rStyle w:val="Hyperlink"/>
@@ -2822,7 +2822,7 @@
       <w:r>
         <w:t xml:space="preserve"> — créé — </w:t>
       </w:r>
-      <w:hyperlink w:history="1" r:id="rIds-55elausglo0xugi3yyz">
+      <w:hyperlink w:history="1" r:id="rIdbqayq3gm4ubetc_zcus3p">
         <w:r>
           <w:rPr>
             <w:rStyle w:val="Hyperlink"/>
@@ -2851,7 +2851,7 @@
       <w:r>
         <w:t xml:space="preserve"> — créé — </w:t>
       </w:r>
-      <w:hyperlink w:history="1" r:id="rIdluvl6o755jksz0xuud_xv">
+      <w:hyperlink w:history="1" r:id="rIdygvljitojuaaght3zacnx">
         <w:r>
           <w:rPr>
             <w:rStyle w:val="Hyperlink"/>

</xml_diff>

<commit_message>
Dossier §15.172, avancement, phase 73
Co-Authored-By: Claude Opus 5.5 <noreply@anthropic.com>
</commit_message>
<xml_diff>
--- a/docs/developpement/phases/word/PHASE_00_SOCLE_DE_PRODUCTION_ET_CONFIGURATION_DUN_LIEU_VIDE.docx
+++ b/docs/developpement/phases/word/PHASE_00_SOCLE_DE_PRODUCTION_ET_CONFIGURATION_DUN_LIEU_VIDE.docx
@@ -18,9 +18,9 @@
         <w:shd w:fill="F6F3FF" w:color="auto" w:val="clear"/>
       </w:pPr>
       <w:r>
-        <w:t xml:space="preserve">FlaiX Expert · dossier de développement · généré le 2026-10-21 depuis le dépôt </w:t>
-      </w:r>
-      <w:hyperlink w:history="1" r:id="rId0lnfihljdrhe4dotg5ssv">
+        <w:t xml:space="preserve">FlaiX Expert · dossier de développement · généré le 2026-10-23 depuis le dépôt </w:t>
+      </w:r>
+      <w:hyperlink w:history="1" r:id="rIdrgw_akudasi3cwiqca31y">
         <w:r>
           <w:rPr>
             <w:rStyle w:val="Hyperlink"/>
@@ -592,7 +592,7 @@
           <w:numId w:val="3"/>
         </w:numPr>
       </w:pPr>
-      <w:hyperlink w:history="1" r:id="rIdea5vowe55ivucxk-oaj6t">
+      <w:hyperlink w:history="1" r:id="rIdklahb8qol81fr_tqjhvzx">
         <w:r>
           <w:rPr>
             <w:rStyle w:val="Hyperlink"/>
@@ -612,7 +612,7 @@
           <w:numId w:val="3"/>
         </w:numPr>
       </w:pPr>
-      <w:hyperlink w:history="1" r:id="rIdehtjjpf0nr-cu5xhvrylh">
+      <w:hyperlink w:history="1" r:id="rIdcfufpb-i13lknawmzsujp">
         <w:r>
           <w:rPr>
             <w:rStyle w:val="Hyperlink"/>
@@ -660,7 +660,7 @@
       <w:r>
         <w:t xml:space="preserve"> — créé — </w:t>
       </w:r>
-      <w:hyperlink w:history="1" r:id="rIdnpaujt7tcwcekoxwziim4">
+      <w:hyperlink w:history="1" r:id="rIdi-qqe210bawof3gjxfvj9">
         <w:r>
           <w:rPr>
             <w:rStyle w:val="Hyperlink"/>
@@ -689,7 +689,7 @@
       <w:r>
         <w:t xml:space="preserve"> — créé — </w:t>
       </w:r>
-      <w:hyperlink w:history="1" r:id="rIdb31okmnq8xunyaas-54np">
+      <w:hyperlink w:history="1" r:id="rIdnacgx8o1dptiohxhd0ddm">
         <w:r>
           <w:rPr>
             <w:rStyle w:val="Hyperlink"/>
@@ -726,7 +726,7 @@
       <w:r>
         <w:t xml:space="preserve"> — créé — </w:t>
       </w:r>
-      <w:hyperlink w:history="1" r:id="rIdsymnyq-67csadhicpjs2h">
+      <w:hyperlink w:history="1" r:id="rIdpnfqgoo8d2vlyruqxiwjl">
         <w:r>
           <w:rPr>
             <w:rStyle w:val="Hyperlink"/>
@@ -755,7 +755,7 @@
       <w:r>
         <w:t xml:space="preserve"> — créé — </w:t>
       </w:r>
-      <w:hyperlink w:history="1" r:id="rId0yj-1wbhpowaq3tz7poyh">
+      <w:hyperlink w:history="1" r:id="rId8w47_3aezu6oef7dhkmyj">
         <w:r>
           <w:rPr>
             <w:rStyle w:val="Hyperlink"/>
@@ -784,7 +784,7 @@
       <w:r>
         <w:t xml:space="preserve"> — créé — </w:t>
       </w:r>
-      <w:hyperlink w:history="1" r:id="rIdlkwtajrgaovogxdxqphis">
+      <w:hyperlink w:history="1" r:id="rIdhdhj84_hw9-d1eom2ypun">
         <w:r>
           <w:rPr>
             <w:rStyle w:val="Hyperlink"/>
@@ -813,7 +813,7 @@
       <w:r>
         <w:t xml:space="preserve"> — créé — </w:t>
       </w:r>
-      <w:hyperlink w:history="1" r:id="rIdj2wczdh7dzhnrehgcnyad">
+      <w:hyperlink w:history="1" r:id="rIdc1qh-ugbxsvr9rucn_y6z">
         <w:r>
           <w:rPr>
             <w:rStyle w:val="Hyperlink"/>
@@ -842,7 +842,7 @@
       <w:r>
         <w:t xml:space="preserve"> — créé — </w:t>
       </w:r>
-      <w:hyperlink w:history="1" r:id="rIdm39d-q6brsqbkxbpxqdxv">
+      <w:hyperlink w:history="1" r:id="rIdaetweobjwfe0wcrq0wzao">
         <w:r>
           <w:rPr>
             <w:rStyle w:val="Hyperlink"/>
@@ -879,7 +879,7 @@
       <w:r>
         <w:t xml:space="preserve"> — créé — </w:t>
       </w:r>
-      <w:hyperlink w:history="1" r:id="rIdfiq0eohdnx1y-tddriwp4">
+      <w:hyperlink w:history="1" r:id="rIdg8btmc6t5i7smwfrooia9">
         <w:r>
           <w:rPr>
             <w:rStyle w:val="Hyperlink"/>
@@ -908,7 +908,7 @@
       <w:r>
         <w:t xml:space="preserve"> — créé — </w:t>
       </w:r>
-      <w:hyperlink w:history="1" r:id="rIddg9cvso9fd8micyqhohxq">
+      <w:hyperlink w:history="1" r:id="rId2ivhzehe-egsmunt1cbcv">
         <w:r>
           <w:rPr>
             <w:rStyle w:val="Hyperlink"/>
@@ -937,7 +937,7 @@
       <w:r>
         <w:t xml:space="preserve"> — créé — </w:t>
       </w:r>
-      <w:hyperlink w:history="1" r:id="rIdspyxq7qfopnrbflesovos">
+      <w:hyperlink w:history="1" r:id="rIdouvfb-dsrbj8tbhw7uopc">
         <w:r>
           <w:rPr>
             <w:rStyle w:val="Hyperlink"/>
@@ -966,7 +966,7 @@
       <w:r>
         <w:t xml:space="preserve"> — créé — </w:t>
       </w:r>
-      <w:hyperlink w:history="1" r:id="rIdcuqgjvgi_vvmyzfcyu_-b">
+      <w:hyperlink w:history="1" r:id="rIdzmtssulcpmdj4smwzvvju">
         <w:r>
           <w:rPr>
             <w:rStyle w:val="Hyperlink"/>
@@ -995,7 +995,7 @@
       <w:r>
         <w:t xml:space="preserve"> — créé — </w:t>
       </w:r>
-      <w:hyperlink w:history="1" r:id="rIdu7sxmvgpaxmmtsyzyj-vn">
+      <w:hyperlink w:history="1" r:id="rId61x8mj6p7ixbspxena83z">
         <w:r>
           <w:rPr>
             <w:rStyle w:val="Hyperlink"/>
@@ -1024,7 +1024,7 @@
       <w:r>
         <w:t xml:space="preserve"> — créé — </w:t>
       </w:r>
-      <w:hyperlink w:history="1" r:id="rIdu4sycijm3xqdnonnfeieo">
+      <w:hyperlink w:history="1" r:id="rIdt5y1xsa_eoiza3a6m0fdn">
         <w:r>
           <w:rPr>
             <w:rStyle w:val="Hyperlink"/>
@@ -1053,7 +1053,7 @@
       <w:r>
         <w:t xml:space="preserve"> — créé — </w:t>
       </w:r>
-      <w:hyperlink w:history="1" r:id="rIdx3j_q6icplyqitdqequys">
+      <w:hyperlink w:history="1" r:id="rId2f0fijtkx3g9aqpfjnsl0">
         <w:r>
           <w:rPr>
             <w:rStyle w:val="Hyperlink"/>
@@ -1082,7 +1082,7 @@
       <w:r>
         <w:t xml:space="preserve"> — créé — </w:t>
       </w:r>
-      <w:hyperlink w:history="1" r:id="rIdumhrjjtlz8e1bpn9geupc">
+      <w:hyperlink w:history="1" r:id="rId1abylteuv0tcq0lqjmrtt">
         <w:r>
           <w:rPr>
             <w:rStyle w:val="Hyperlink"/>
@@ -1111,7 +1111,7 @@
       <w:r>
         <w:t xml:space="preserve"> — créé — </w:t>
       </w:r>
-      <w:hyperlink w:history="1" r:id="rIdla0ft7ft8tcawavswl_nd">
+      <w:hyperlink w:history="1" r:id="rIdvhzgozl3zvtxnzp5cx9xc">
         <w:r>
           <w:rPr>
             <w:rStyle w:val="Hyperlink"/>
@@ -1148,7 +1148,7 @@
       <w:r>
         <w:t xml:space="preserve"> — créé — </w:t>
       </w:r>
-      <w:hyperlink w:history="1" r:id="rIdpvtr3qhf0eivfh5vz1d27">
+      <w:hyperlink w:history="1" r:id="rIdrzy8gjombkjyg8oq0t1do">
         <w:r>
           <w:rPr>
             <w:rStyle w:val="Hyperlink"/>
@@ -1177,7 +1177,7 @@
       <w:r>
         <w:t xml:space="preserve"> — créé — </w:t>
       </w:r>
-      <w:hyperlink w:history="1" r:id="rIdvw2iaeadqkqjuwd118h8n">
+      <w:hyperlink w:history="1" r:id="rIdqovkzifolldmikcexflrr">
         <w:r>
           <w:rPr>
             <w:rStyle w:val="Hyperlink"/>
@@ -1206,7 +1206,7 @@
       <w:r>
         <w:t xml:space="preserve"> — créé — </w:t>
       </w:r>
-      <w:hyperlink w:history="1" r:id="rIdb4cuqdwzat4d4h79kfv2u">
+      <w:hyperlink w:history="1" r:id="rIdnjsnazfybautxlgsysqvd">
         <w:r>
           <w:rPr>
             <w:rStyle w:val="Hyperlink"/>
@@ -1235,7 +1235,7 @@
       <w:r>
         <w:t xml:space="preserve"> — créé — </w:t>
       </w:r>
-      <w:hyperlink w:history="1" r:id="rIdizt71bym5cxpyhxet-dfz">
+      <w:hyperlink w:history="1" r:id="rIdeiapoh6shpzj9yenaedvq">
         <w:r>
           <w:rPr>
             <w:rStyle w:val="Hyperlink"/>
@@ -1264,7 +1264,7 @@
       <w:r>
         <w:t xml:space="preserve"> — créé — </w:t>
       </w:r>
-      <w:hyperlink w:history="1" r:id="rIdcf3wngbq_krrhc_-bwndw">
+      <w:hyperlink w:history="1" r:id="rId8cmfwgrdsthoghu0dmyyx">
         <w:r>
           <w:rPr>
             <w:rStyle w:val="Hyperlink"/>
@@ -1293,7 +1293,7 @@
       <w:r>
         <w:t xml:space="preserve"> — créé — </w:t>
       </w:r>
-      <w:hyperlink w:history="1" r:id="rIduznpwmqbwgf21774zx3mg">
+      <w:hyperlink w:history="1" r:id="rId0sd1etquyahem1rcn_s64">
         <w:r>
           <w:rPr>
             <w:rStyle w:val="Hyperlink"/>
@@ -1322,7 +1322,7 @@
       <w:r>
         <w:t xml:space="preserve"> — créé — </w:t>
       </w:r>
-      <w:hyperlink w:history="1" r:id="rIdkecriwprn6-mznziddbhy">
+      <w:hyperlink w:history="1" r:id="rId_-y8zbcduvriiwztidh7s">
         <w:r>
           <w:rPr>
             <w:rStyle w:val="Hyperlink"/>
@@ -1351,7 +1351,7 @@
       <w:r>
         <w:t xml:space="preserve"> — créé — </w:t>
       </w:r>
-      <w:hyperlink w:history="1" r:id="rIdx-ix8c8z6l8jjhncyw69v">
+      <w:hyperlink w:history="1" r:id="rIdt9o3nyfnsvb4yc77s5mwe">
         <w:r>
           <w:rPr>
             <w:rStyle w:val="Hyperlink"/>
@@ -1380,7 +1380,7 @@
       <w:r>
         <w:t xml:space="preserve"> — créé — </w:t>
       </w:r>
-      <w:hyperlink w:history="1" r:id="rIdhfvsu5qe7-vitmbj7mvyd">
+      <w:hyperlink w:history="1" r:id="rIdosnxolkzxvljcscgmj1gt">
         <w:r>
           <w:rPr>
             <w:rStyle w:val="Hyperlink"/>
@@ -1409,7 +1409,7 @@
       <w:r>
         <w:t xml:space="preserve"> — créé — </w:t>
       </w:r>
-      <w:hyperlink w:history="1" r:id="rIdi0idea_ck6nqhiyt_mfce">
+      <w:hyperlink w:history="1" r:id="rIdqss5majyznhp6p0ausg8r">
         <w:r>
           <w:rPr>
             <w:rStyle w:val="Hyperlink"/>
@@ -1438,7 +1438,7 @@
       <w:r>
         <w:t xml:space="preserve"> — créé — </w:t>
       </w:r>
-      <w:hyperlink w:history="1" r:id="rIdboeugbhzmw5fr92lwjhkq">
+      <w:hyperlink w:history="1" r:id="rIddby2f66xtcnhrypscfloy">
         <w:r>
           <w:rPr>
             <w:rStyle w:val="Hyperlink"/>
@@ -1467,7 +1467,7 @@
       <w:r>
         <w:t xml:space="preserve"> — créé — </w:t>
       </w:r>
-      <w:hyperlink w:history="1" r:id="rIdasxc6dawtzbiawicm6tyv">
+      <w:hyperlink w:history="1" r:id="rIdcog23iu6iezbm26_v4n9u">
         <w:r>
           <w:rPr>
             <w:rStyle w:val="Hyperlink"/>
@@ -1496,7 +1496,7 @@
       <w:r>
         <w:t xml:space="preserve"> — créé — </w:t>
       </w:r>
-      <w:hyperlink w:history="1" r:id="rIdpirmwkjwq_3jvqyadedxr">
+      <w:hyperlink w:history="1" r:id="rIdckjfof1ugwd2fvrrdwoqn">
         <w:r>
           <w:rPr>
             <w:rStyle w:val="Hyperlink"/>
@@ -1525,7 +1525,7 @@
       <w:r>
         <w:t xml:space="preserve"> — créé — </w:t>
       </w:r>
-      <w:hyperlink w:history="1" r:id="rIdxamcru_w15hatwukv7g4u">
+      <w:hyperlink w:history="1" r:id="rIdy0tkz3y2bqc87f6_eovrb">
         <w:r>
           <w:rPr>
             <w:rStyle w:val="Hyperlink"/>
@@ -1554,7 +1554,7 @@
       <w:r>
         <w:t xml:space="preserve"> — créé — </w:t>
       </w:r>
-      <w:hyperlink w:history="1" r:id="rIdfqmswkbydijvnak6cnh38">
+      <w:hyperlink w:history="1" r:id="rIdqjro-3mk8lkjdbh_7ace3">
         <w:r>
           <w:rPr>
             <w:rStyle w:val="Hyperlink"/>
@@ -1583,7 +1583,7 @@
       <w:r>
         <w:t xml:space="preserve"> — créé — </w:t>
       </w:r>
-      <w:hyperlink w:history="1" r:id="rIdou5dnue3r97lh_v5aolrn">
+      <w:hyperlink w:history="1" r:id="rIdxrsenz4fhirpuf3qxqejb">
         <w:r>
           <w:rPr>
             <w:rStyle w:val="Hyperlink"/>
@@ -1612,7 +1612,7 @@
       <w:r>
         <w:t xml:space="preserve"> — créé — </w:t>
       </w:r>
-      <w:hyperlink w:history="1" r:id="rIdyr-wjl0wiubnlczm-cqe5">
+      <w:hyperlink w:history="1" r:id="rIdenpnu0ohh5ivenosil45q">
         <w:r>
           <w:rPr>
             <w:rStyle w:val="Hyperlink"/>
@@ -1641,7 +1641,7 @@
       <w:r>
         <w:t xml:space="preserve"> — créé — </w:t>
       </w:r>
-      <w:hyperlink w:history="1" r:id="rIdyynh5n37vjpd9rd9qujtt">
+      <w:hyperlink w:history="1" r:id="rIdofl1aueyoim6hvfedgxr5">
         <w:r>
           <w:rPr>
             <w:rStyle w:val="Hyperlink"/>
@@ -1670,7 +1670,7 @@
       <w:r>
         <w:t xml:space="preserve"> — créé — </w:t>
       </w:r>
-      <w:hyperlink w:history="1" r:id="rId9uouzvkw1fn7h0jq-lmk8">
+      <w:hyperlink w:history="1" r:id="rId-fzv5nbbj8qu4cjue1qwb">
         <w:r>
           <w:rPr>
             <w:rStyle w:val="Hyperlink"/>
@@ -1699,7 +1699,7 @@
       <w:r>
         <w:t xml:space="preserve"> — créé — </w:t>
       </w:r>
-      <w:hyperlink w:history="1" r:id="rId0aoud461ga6oeg5niylji">
+      <w:hyperlink w:history="1" r:id="rIdpjjol_ba7e3f8glmxy3q8">
         <w:r>
           <w:rPr>
             <w:rStyle w:val="Hyperlink"/>
@@ -1728,7 +1728,7 @@
       <w:r>
         <w:t xml:space="preserve"> — créé — </w:t>
       </w:r>
-      <w:hyperlink w:history="1" r:id="rIdcwt0ks1uapspcbteem_hx">
+      <w:hyperlink w:history="1" r:id="rId5dn3gnlbrx1cs-gd1x7gd">
         <w:r>
           <w:rPr>
             <w:rStyle w:val="Hyperlink"/>
@@ -1757,7 +1757,7 @@
       <w:r>
         <w:t xml:space="preserve"> — créé — </w:t>
       </w:r>
-      <w:hyperlink w:history="1" r:id="rIdvgzpi3an6rkwbbg0aiio9">
+      <w:hyperlink w:history="1" r:id="rIdy6p7lygjxrecq2epy0msy">
         <w:r>
           <w:rPr>
             <w:rStyle w:val="Hyperlink"/>
@@ -1786,7 +1786,7 @@
       <w:r>
         <w:t xml:space="preserve"> — créé — </w:t>
       </w:r>
-      <w:hyperlink w:history="1" r:id="rIdhsu7y9fwqzcuvw3k23qix">
+      <w:hyperlink w:history="1" r:id="rId9av9s6cjvahg2_xyqiyhv">
         <w:r>
           <w:rPr>
             <w:rStyle w:val="Hyperlink"/>
@@ -1823,7 +1823,7 @@
       <w:r>
         <w:t xml:space="preserve"> — créé — </w:t>
       </w:r>
-      <w:hyperlink w:history="1" r:id="rIdeiqcy7wsgbqmzetitoapa">
+      <w:hyperlink w:history="1" r:id="rIdo8zmqdmbjw8w85v1sef00">
         <w:r>
           <w:rPr>
             <w:rStyle w:val="Hyperlink"/>
@@ -1852,7 +1852,7 @@
       <w:r>
         <w:t xml:space="preserve"> — créé — </w:t>
       </w:r>
-      <w:hyperlink w:history="1" r:id="rIdmum9wq5efkzza_rrsizgo">
+      <w:hyperlink w:history="1" r:id="rIdhqruh5jhuu1dne0nsajat">
         <w:r>
           <w:rPr>
             <w:rStyle w:val="Hyperlink"/>
@@ -1881,7 +1881,7 @@
       <w:r>
         <w:t xml:space="preserve"> — créé — </w:t>
       </w:r>
-      <w:hyperlink w:history="1" r:id="rIdzh8ipuhdrnkcrn-7f9u33">
+      <w:hyperlink w:history="1" r:id="rIdaucpg_2k5gf2_-dozoter">
         <w:r>
           <w:rPr>
             <w:rStyle w:val="Hyperlink"/>
@@ -1910,7 +1910,7 @@
       <w:r>
         <w:t xml:space="preserve"> — créé — </w:t>
       </w:r>
-      <w:hyperlink w:history="1" r:id="rIdzqvix9fsfnvprbuisgttv">
+      <w:hyperlink w:history="1" r:id="rIdu-xlnazjqeul4v_txuggr">
         <w:r>
           <w:rPr>
             <w:rStyle w:val="Hyperlink"/>
@@ -1939,7 +1939,7 @@
       <w:r>
         <w:t xml:space="preserve"> — créé — </w:t>
       </w:r>
-      <w:hyperlink w:history="1" r:id="rIdbtjozskcaverywaoqpumm">
+      <w:hyperlink w:history="1" r:id="rId5op1abta-ijggqoic8_h_">
         <w:r>
           <w:rPr>
             <w:rStyle w:val="Hyperlink"/>
@@ -1968,7 +1968,7 @@
       <w:r>
         <w:t xml:space="preserve"> — créé — </w:t>
       </w:r>
-      <w:hyperlink w:history="1" r:id="rIdproeojmx1knoov96puloq">
+      <w:hyperlink w:history="1" r:id="rIddognr7aohnmgszspiir3x">
         <w:r>
           <w:rPr>
             <w:rStyle w:val="Hyperlink"/>
@@ -1997,7 +1997,7 @@
       <w:r>
         <w:t xml:space="preserve"> — créé — </w:t>
       </w:r>
-      <w:hyperlink w:history="1" r:id="rId12tpors9vqcatvm4w_amb">
+      <w:hyperlink w:history="1" r:id="rId-87gks9q2emrfguvzjgi6">
         <w:r>
           <w:rPr>
             <w:rStyle w:val="Hyperlink"/>
@@ -2026,7 +2026,7 @@
       <w:r>
         <w:t xml:space="preserve"> — créé — </w:t>
       </w:r>
-      <w:hyperlink w:history="1" r:id="rIdsdludpagsx96kmvfngtm1">
+      <w:hyperlink w:history="1" r:id="rId8fld5n9ob0d-v0em42cfc">
         <w:r>
           <w:rPr>
             <w:rStyle w:val="Hyperlink"/>
@@ -2139,7 +2139,7 @@
       <w:r>
         <w:t xml:space="preserve"> — créé — </w:t>
       </w:r>
-      <w:hyperlink w:history="1" r:id="rIdm-t-vltmusa6h4n6ntcns">
+      <w:hyperlink w:history="1" r:id="rIdvloupk5oslzare7rp_cwk">
         <w:r>
           <w:rPr>
             <w:rStyle w:val="Hyperlink"/>
@@ -2189,7 +2189,7 @@
       <w:r>
         <w:t xml:space="preserve"> — créé — </w:t>
       </w:r>
-      <w:hyperlink w:history="1" r:id="rIdaxyhwgxqzqnl4grpvyz-n">
+      <w:hyperlink w:history="1" r:id="rIdsybp3_jszdbsmces4dbwu">
         <w:r>
           <w:rPr>
             <w:rStyle w:val="Hyperlink"/>
@@ -2218,7 +2218,7 @@
       <w:r>
         <w:t xml:space="preserve"> — créé — </w:t>
       </w:r>
-      <w:hyperlink w:history="1" r:id="rIdbc5gxrdftpgzi-jvgdj7x">
+      <w:hyperlink w:history="1" r:id="rIdg0lxqlceid6snxjdxhr_q">
         <w:r>
           <w:rPr>
             <w:rStyle w:val="Hyperlink"/>
@@ -2247,7 +2247,7 @@
       <w:r>
         <w:t xml:space="preserve"> — créé — </w:t>
       </w:r>
-      <w:hyperlink w:history="1" r:id="rIdmln2gqhjhmfyj0fckblws">
+      <w:hyperlink w:history="1" r:id="rIdgftptwyhtljmy2thzsby-">
         <w:r>
           <w:rPr>
             <w:rStyle w:val="Hyperlink"/>
@@ -2276,7 +2276,7 @@
       <w:r>
         <w:t xml:space="preserve"> — créé — </w:t>
       </w:r>
-      <w:hyperlink w:history="1" r:id="rIdsvob_riamh9dpnjzdj0iz">
+      <w:hyperlink w:history="1" r:id="rIdqqao67we44t3rlzm89oi0">
         <w:r>
           <w:rPr>
             <w:rStyle w:val="Hyperlink"/>
@@ -2313,7 +2313,7 @@
       <w:r>
         <w:t xml:space="preserve"> — créé — </w:t>
       </w:r>
-      <w:hyperlink w:history="1" r:id="rIdrzssanhk-8xyw_u0s1itz">
+      <w:hyperlink w:history="1" r:id="rIdy1slvg0t-z5jcy6feqeqn">
         <w:r>
           <w:rPr>
             <w:rStyle w:val="Hyperlink"/>
@@ -2342,7 +2342,7 @@
       <w:r>
         <w:t xml:space="preserve"> — créé — </w:t>
       </w:r>
-      <w:hyperlink w:history="1" r:id="rIdqbvdgcomx5ekiqhgqzlud">
+      <w:hyperlink w:history="1" r:id="rId1jghh0svgia8rzqpma-j9">
         <w:r>
           <w:rPr>
             <w:rStyle w:val="Hyperlink"/>
@@ -2379,7 +2379,7 @@
       <w:r>
         <w:t xml:space="preserve"> — créé — </w:t>
       </w:r>
-      <w:hyperlink w:history="1" r:id="rIdjhunxr5cucesnerhkwys_">
+      <w:hyperlink w:history="1" r:id="rId225qg_nvnf4qh638kz4bw">
         <w:r>
           <w:rPr>
             <w:rStyle w:val="Hyperlink"/>
@@ -2408,7 +2408,7 @@
       <w:r>
         <w:t xml:space="preserve"> — créé — </w:t>
       </w:r>
-      <w:hyperlink w:history="1" r:id="rIdc-nhhuvioe09jurgmi2kn">
+      <w:hyperlink w:history="1" r:id="rId7m3njn56sjj9ifq-ewpzo">
         <w:r>
           <w:rPr>
             <w:rStyle w:val="Hyperlink"/>
@@ -2437,7 +2437,7 @@
       <w:r>
         <w:t xml:space="preserve"> — créé — </w:t>
       </w:r>
-      <w:hyperlink w:history="1" r:id="rIdqp0f2elty-wbbxzdxy2rb">
+      <w:hyperlink w:history="1" r:id="rIdtqp8tb1rn3ov4jkmb_tj9">
         <w:r>
           <w:rPr>
             <w:rStyle w:val="Hyperlink"/>
@@ -2466,7 +2466,7 @@
       <w:r>
         <w:t xml:space="preserve"> — créé — </w:t>
       </w:r>
-      <w:hyperlink w:history="1" r:id="rIdstyyphxyx_cie5zoxkcw7">
+      <w:hyperlink w:history="1" r:id="rIdturwk106mjtv1bt6devdu">
         <w:r>
           <w:rPr>
             <w:rStyle w:val="Hyperlink"/>
@@ -2495,7 +2495,7 @@
       <w:r>
         <w:t xml:space="preserve"> — créé — </w:t>
       </w:r>
-      <w:hyperlink w:history="1" r:id="rIdohzr_pst5paoc_3qr46pq">
+      <w:hyperlink w:history="1" r:id="rIdu_p7vppmgshxpdg4poj8f">
         <w:r>
           <w:rPr>
             <w:rStyle w:val="Hyperlink"/>
@@ -2524,7 +2524,7 @@
       <w:r>
         <w:t xml:space="preserve"> — créé — </w:t>
       </w:r>
-      <w:hyperlink w:history="1" r:id="rIdbll3ujelru8oodzn5mnii">
+      <w:hyperlink w:history="1" r:id="rIdtdjdwzzj4ym-q59znvz0l">
         <w:r>
           <w:rPr>
             <w:rStyle w:val="Hyperlink"/>
@@ -2553,7 +2553,7 @@
       <w:r>
         <w:t xml:space="preserve"> — créé — </w:t>
       </w:r>
-      <w:hyperlink w:history="1" r:id="rIdv-fd971mcgceol-ljnqij">
+      <w:hyperlink w:history="1" r:id="rIdpsaz7wt9jsywes1ifug02">
         <w:r>
           <w:rPr>
             <w:rStyle w:val="Hyperlink"/>
@@ -2582,7 +2582,7 @@
       <w:r>
         <w:t xml:space="preserve"> — créé — </w:t>
       </w:r>
-      <w:hyperlink w:history="1" r:id="rIdnvisxvni7v6ciebspougd">
+      <w:hyperlink w:history="1" r:id="rIdtxvvrtrl-mqf2_ihjh_a-">
         <w:r>
           <w:rPr>
             <w:rStyle w:val="Hyperlink"/>
@@ -2611,7 +2611,7 @@
       <w:r>
         <w:t xml:space="preserve"> — créé — </w:t>
       </w:r>
-      <w:hyperlink w:history="1" r:id="rIdu1sv76m-k16m0a6o1kscz">
+      <w:hyperlink w:history="1" r:id="rIdj85z2y8mgore6x6c6amil">
         <w:r>
           <w:rPr>
             <w:rStyle w:val="Hyperlink"/>
@@ -2648,7 +2648,7 @@
       <w:r>
         <w:t xml:space="preserve"> — créé — </w:t>
       </w:r>
-      <w:hyperlink w:history="1" r:id="rId00j4ul1tng6ci5uxsxh7k">
+      <w:hyperlink w:history="1" r:id="rId74vglpvnw6mlulzlu15gk">
         <w:r>
           <w:rPr>
             <w:rStyle w:val="Hyperlink"/>
@@ -2677,7 +2677,7 @@
       <w:r>
         <w:t xml:space="preserve"> — créé — </w:t>
       </w:r>
-      <w:hyperlink w:history="1" r:id="rIdtpsdaqnmvdplqnjdynlt8">
+      <w:hyperlink w:history="1" r:id="rId5luqd4jhexygqrhkwzovh">
         <w:r>
           <w:rPr>
             <w:rStyle w:val="Hyperlink"/>
@@ -2706,7 +2706,7 @@
       <w:r>
         <w:t xml:space="preserve"> — créé — </w:t>
       </w:r>
-      <w:hyperlink w:history="1" r:id="rIdgxofixqwklrtwl-0xkvpb">
+      <w:hyperlink w:history="1" r:id="rIdrxw_6hlbfqax2lv7aaxkv">
         <w:r>
           <w:rPr>
             <w:rStyle w:val="Hyperlink"/>
@@ -2735,7 +2735,7 @@
       <w:r>
         <w:t xml:space="preserve"> — créé — </w:t>
       </w:r>
-      <w:hyperlink w:history="1" r:id="rIdvfvdzx6mrynby2scqr5iq">
+      <w:hyperlink w:history="1" r:id="rIdlqpxpzrh0snvnbp3cwlwr">
         <w:r>
           <w:rPr>
             <w:rStyle w:val="Hyperlink"/>
@@ -2764,7 +2764,7 @@
       <w:r>
         <w:t xml:space="preserve"> — créé — </w:t>
       </w:r>
-      <w:hyperlink w:history="1" r:id="rIdss5ljlsmyk5ba5yjgujkb">
+      <w:hyperlink w:history="1" r:id="rIdggyjffvrhnkznr4ais7ti">
         <w:r>
           <w:rPr>
             <w:rStyle w:val="Hyperlink"/>
@@ -2793,7 +2793,7 @@
       <w:r>
         <w:t xml:space="preserve"> — créé — </w:t>
       </w:r>
-      <w:hyperlink w:history="1" r:id="rIda2hqalkkugagxuxk9hruf">
+      <w:hyperlink w:history="1" r:id="rId94ksxetflpiailw07j-cd">
         <w:r>
           <w:rPr>
             <w:rStyle w:val="Hyperlink"/>
@@ -2822,7 +2822,7 @@
       <w:r>
         <w:t xml:space="preserve"> — créé — </w:t>
       </w:r>
-      <w:hyperlink w:history="1" r:id="rIdbqayq3gm4ubetc_zcus3p">
+      <w:hyperlink w:history="1" r:id="rIdbk4ga3tozcrzeh5_mbsbn">
         <w:r>
           <w:rPr>
             <w:rStyle w:val="Hyperlink"/>
@@ -2851,7 +2851,7 @@
       <w:r>
         <w:t xml:space="preserve"> — créé — </w:t>
       </w:r>
-      <w:hyperlink w:history="1" r:id="rIdygvljitojuaaght3zacnx">
+      <w:hyperlink w:history="1" r:id="rId8ozgak26_2acu7ymfxz2p">
         <w:r>
           <w:rPr>
             <w:rStyle w:val="Hyperlink"/>

</xml_diff>

<commit_message>
Dossier §15.173, avancement, phase 74
Co-Authored-By: Claude Opus 5.5 <noreply@anthropic.com>
</commit_message>
<xml_diff>
--- a/docs/developpement/phases/word/PHASE_00_SOCLE_DE_PRODUCTION_ET_CONFIGURATION_DUN_LIEU_VIDE.docx
+++ b/docs/developpement/phases/word/PHASE_00_SOCLE_DE_PRODUCTION_ET_CONFIGURATION_DUN_LIEU_VIDE.docx
@@ -18,9 +18,9 @@
         <w:shd w:fill="F6F3FF" w:color="auto" w:val="clear"/>
       </w:pPr>
       <w:r>
-        <w:t xml:space="preserve">FlaiX Expert · dossier de développement · généré le 2026-10-23 depuis le dépôt </w:t>
-      </w:r>
-      <w:hyperlink w:history="1" r:id="rIdrgw_akudasi3cwiqca31y">
+        <w:t xml:space="preserve">FlaiX Expert · dossier de développement · généré le 2026-10-24 depuis le dépôt </w:t>
+      </w:r>
+      <w:hyperlink w:history="1" r:id="rIdzen70i-hx_n9wsja6glgc">
         <w:r>
           <w:rPr>
             <w:rStyle w:val="Hyperlink"/>
@@ -592,7 +592,7 @@
           <w:numId w:val="3"/>
         </w:numPr>
       </w:pPr>
-      <w:hyperlink w:history="1" r:id="rIdklahb8qol81fr_tqjhvzx">
+      <w:hyperlink w:history="1" r:id="rId8xnsqrerjfusthgxhju6n">
         <w:r>
           <w:rPr>
             <w:rStyle w:val="Hyperlink"/>
@@ -612,7 +612,7 @@
           <w:numId w:val="3"/>
         </w:numPr>
       </w:pPr>
-      <w:hyperlink w:history="1" r:id="rIdcfufpb-i13lknawmzsujp">
+      <w:hyperlink w:history="1" r:id="rIdwpqhpdpdhtej1uhccfjq3">
         <w:r>
           <w:rPr>
             <w:rStyle w:val="Hyperlink"/>
@@ -660,7 +660,7 @@
       <w:r>
         <w:t xml:space="preserve"> — créé — </w:t>
       </w:r>
-      <w:hyperlink w:history="1" r:id="rIdi-qqe210bawof3gjxfvj9">
+      <w:hyperlink w:history="1" r:id="rIdgi6n_wg_4yxwyculjcjem">
         <w:r>
           <w:rPr>
             <w:rStyle w:val="Hyperlink"/>
@@ -689,7 +689,7 @@
       <w:r>
         <w:t xml:space="preserve"> — créé — </w:t>
       </w:r>
-      <w:hyperlink w:history="1" r:id="rIdnacgx8o1dptiohxhd0ddm">
+      <w:hyperlink w:history="1" r:id="rIdlu_xzfovm1ek0w8gzrxr_">
         <w:r>
           <w:rPr>
             <w:rStyle w:val="Hyperlink"/>
@@ -726,7 +726,7 @@
       <w:r>
         <w:t xml:space="preserve"> — créé — </w:t>
       </w:r>
-      <w:hyperlink w:history="1" r:id="rIdpnfqgoo8d2vlyruqxiwjl">
+      <w:hyperlink w:history="1" r:id="rId0vc4un9sxobsn2hapjgia">
         <w:r>
           <w:rPr>
             <w:rStyle w:val="Hyperlink"/>
@@ -755,7 +755,7 @@
       <w:r>
         <w:t xml:space="preserve"> — créé — </w:t>
       </w:r>
-      <w:hyperlink w:history="1" r:id="rId8w47_3aezu6oef7dhkmyj">
+      <w:hyperlink w:history="1" r:id="rIdpha42zluo2u-dhft8dlje">
         <w:r>
           <w:rPr>
             <w:rStyle w:val="Hyperlink"/>
@@ -784,7 +784,7 @@
       <w:r>
         <w:t xml:space="preserve"> — créé — </w:t>
       </w:r>
-      <w:hyperlink w:history="1" r:id="rIdhdhj84_hw9-d1eom2ypun">
+      <w:hyperlink w:history="1" r:id="rIdovmx9ac83hcgvodsvpfds">
         <w:r>
           <w:rPr>
             <w:rStyle w:val="Hyperlink"/>
@@ -813,7 +813,7 @@
       <w:r>
         <w:t xml:space="preserve"> — créé — </w:t>
       </w:r>
-      <w:hyperlink w:history="1" r:id="rIdc1qh-ugbxsvr9rucn_y6z">
+      <w:hyperlink w:history="1" r:id="rIdzlax9bequmr6gmwrvadv7">
         <w:r>
           <w:rPr>
             <w:rStyle w:val="Hyperlink"/>
@@ -842,7 +842,7 @@
       <w:r>
         <w:t xml:space="preserve"> — créé — </w:t>
       </w:r>
-      <w:hyperlink w:history="1" r:id="rIdaetweobjwfe0wcrq0wzao">
+      <w:hyperlink w:history="1" r:id="rIdkocuqgl4bqp5xm93uiydn">
         <w:r>
           <w:rPr>
             <w:rStyle w:val="Hyperlink"/>
@@ -879,7 +879,7 @@
       <w:r>
         <w:t xml:space="preserve"> — créé — </w:t>
       </w:r>
-      <w:hyperlink w:history="1" r:id="rIdg8btmc6t5i7smwfrooia9">
+      <w:hyperlink w:history="1" r:id="rId5czjxqmkb2c19vw3g4m-0">
         <w:r>
           <w:rPr>
             <w:rStyle w:val="Hyperlink"/>
@@ -908,7 +908,7 @@
       <w:r>
         <w:t xml:space="preserve"> — créé — </w:t>
       </w:r>
-      <w:hyperlink w:history="1" r:id="rId2ivhzehe-egsmunt1cbcv">
+      <w:hyperlink w:history="1" r:id="rId3jel7hwrexu77mvhklkn6">
         <w:r>
           <w:rPr>
             <w:rStyle w:val="Hyperlink"/>
@@ -937,7 +937,7 @@
       <w:r>
         <w:t xml:space="preserve"> — créé — </w:t>
       </w:r>
-      <w:hyperlink w:history="1" r:id="rIdouvfb-dsrbj8tbhw7uopc">
+      <w:hyperlink w:history="1" r:id="rId-aqrncn3mhglap_gcxruq">
         <w:r>
           <w:rPr>
             <w:rStyle w:val="Hyperlink"/>
@@ -966,7 +966,7 @@
       <w:r>
         <w:t xml:space="preserve"> — créé — </w:t>
       </w:r>
-      <w:hyperlink w:history="1" r:id="rIdzmtssulcpmdj4smwzvvju">
+      <w:hyperlink w:history="1" r:id="rIdf81x8fdxyhxnpldxuy8z_">
         <w:r>
           <w:rPr>
             <w:rStyle w:val="Hyperlink"/>
@@ -995,7 +995,7 @@
       <w:r>
         <w:t xml:space="preserve"> — créé — </w:t>
       </w:r>
-      <w:hyperlink w:history="1" r:id="rId61x8mj6p7ixbspxena83z">
+      <w:hyperlink w:history="1" r:id="rIdma7wls9spparenqcsv9av">
         <w:r>
           <w:rPr>
             <w:rStyle w:val="Hyperlink"/>
@@ -1024,7 +1024,7 @@
       <w:r>
         <w:t xml:space="preserve"> — créé — </w:t>
       </w:r>
-      <w:hyperlink w:history="1" r:id="rIdt5y1xsa_eoiza3a6m0fdn">
+      <w:hyperlink w:history="1" r:id="rId81xim-oc0uadronukbiab">
         <w:r>
           <w:rPr>
             <w:rStyle w:val="Hyperlink"/>
@@ -1053,7 +1053,7 @@
       <w:r>
         <w:t xml:space="preserve"> — créé — </w:t>
       </w:r>
-      <w:hyperlink w:history="1" r:id="rId2f0fijtkx3g9aqpfjnsl0">
+      <w:hyperlink w:history="1" r:id="rIdwjf7aef57hootlorie7mg">
         <w:r>
           <w:rPr>
             <w:rStyle w:val="Hyperlink"/>
@@ -1082,7 +1082,7 @@
       <w:r>
         <w:t xml:space="preserve"> — créé — </w:t>
       </w:r>
-      <w:hyperlink w:history="1" r:id="rId1abylteuv0tcq0lqjmrtt">
+      <w:hyperlink w:history="1" r:id="rIdef2v0kqtz15jxlagaqb4q">
         <w:r>
           <w:rPr>
             <w:rStyle w:val="Hyperlink"/>
@@ -1111,7 +1111,7 @@
       <w:r>
         <w:t xml:space="preserve"> — créé — </w:t>
       </w:r>
-      <w:hyperlink w:history="1" r:id="rIdvhzgozl3zvtxnzp5cx9xc">
+      <w:hyperlink w:history="1" r:id="rIdjslltou-vayxqcjlhfiia">
         <w:r>
           <w:rPr>
             <w:rStyle w:val="Hyperlink"/>
@@ -1148,7 +1148,7 @@
       <w:r>
         <w:t xml:space="preserve"> — créé — </w:t>
       </w:r>
-      <w:hyperlink w:history="1" r:id="rIdrzy8gjombkjyg8oq0t1do">
+      <w:hyperlink w:history="1" r:id="rIdcdtq9eemdsixve9qdu5gq">
         <w:r>
           <w:rPr>
             <w:rStyle w:val="Hyperlink"/>
@@ -1177,7 +1177,7 @@
       <w:r>
         <w:t xml:space="preserve"> — créé — </w:t>
       </w:r>
-      <w:hyperlink w:history="1" r:id="rIdqovkzifolldmikcexflrr">
+      <w:hyperlink w:history="1" r:id="rId6xamkwroyej8mjkqbyyz9">
         <w:r>
           <w:rPr>
             <w:rStyle w:val="Hyperlink"/>
@@ -1206,7 +1206,7 @@
       <w:r>
         <w:t xml:space="preserve"> — créé — </w:t>
       </w:r>
-      <w:hyperlink w:history="1" r:id="rIdnjsnazfybautxlgsysqvd">
+      <w:hyperlink w:history="1" r:id="rIdpswufui__6_19onkw9t2q">
         <w:r>
           <w:rPr>
             <w:rStyle w:val="Hyperlink"/>
@@ -1235,7 +1235,7 @@
       <w:r>
         <w:t xml:space="preserve"> — créé — </w:t>
       </w:r>
-      <w:hyperlink w:history="1" r:id="rIdeiapoh6shpzj9yenaedvq">
+      <w:hyperlink w:history="1" r:id="rIdmt1l8qz1chbs9jqhdeuo9">
         <w:r>
           <w:rPr>
             <w:rStyle w:val="Hyperlink"/>
@@ -1264,7 +1264,7 @@
       <w:r>
         <w:t xml:space="preserve"> — créé — </w:t>
       </w:r>
-      <w:hyperlink w:history="1" r:id="rId8cmfwgrdsthoghu0dmyyx">
+      <w:hyperlink w:history="1" r:id="rIdapchj94oxs80v7pzoxatn">
         <w:r>
           <w:rPr>
             <w:rStyle w:val="Hyperlink"/>
@@ -1293,7 +1293,7 @@
       <w:r>
         <w:t xml:space="preserve"> — créé — </w:t>
       </w:r>
-      <w:hyperlink w:history="1" r:id="rId0sd1etquyahem1rcn_s64">
+      <w:hyperlink w:history="1" r:id="rIdelwlk16vz48f2hw_l2epy">
         <w:r>
           <w:rPr>
             <w:rStyle w:val="Hyperlink"/>
@@ -1322,7 +1322,7 @@
       <w:r>
         <w:t xml:space="preserve"> — créé — </w:t>
       </w:r>
-      <w:hyperlink w:history="1" r:id="rId_-y8zbcduvriiwztidh7s">
+      <w:hyperlink w:history="1" r:id="rIdjbuqiczmksobs5m00acge">
         <w:r>
           <w:rPr>
             <w:rStyle w:val="Hyperlink"/>
@@ -1351,7 +1351,7 @@
       <w:r>
         <w:t xml:space="preserve"> — créé — </w:t>
       </w:r>
-      <w:hyperlink w:history="1" r:id="rIdt9o3nyfnsvb4yc77s5mwe">
+      <w:hyperlink w:history="1" r:id="rId95sspkz3u9r3lwyxacjp4">
         <w:r>
           <w:rPr>
             <w:rStyle w:val="Hyperlink"/>
@@ -1380,7 +1380,7 @@
       <w:r>
         <w:t xml:space="preserve"> — créé — </w:t>
       </w:r>
-      <w:hyperlink w:history="1" r:id="rIdosnxolkzxvljcscgmj1gt">
+      <w:hyperlink w:history="1" r:id="rIday7scqadgduxpt0ebjr7r">
         <w:r>
           <w:rPr>
             <w:rStyle w:val="Hyperlink"/>
@@ -1409,7 +1409,7 @@
       <w:r>
         <w:t xml:space="preserve"> — créé — </w:t>
       </w:r>
-      <w:hyperlink w:history="1" r:id="rIdqss5majyznhp6p0ausg8r">
+      <w:hyperlink w:history="1" r:id="rIdaqugzsm0d8codnsvkw6ny">
         <w:r>
           <w:rPr>
             <w:rStyle w:val="Hyperlink"/>
@@ -1438,7 +1438,7 @@
       <w:r>
         <w:t xml:space="preserve"> — créé — </w:t>
       </w:r>
-      <w:hyperlink w:history="1" r:id="rIddby2f66xtcnhrypscfloy">
+      <w:hyperlink w:history="1" r:id="rId-u8yq-_igukyligotty9f">
         <w:r>
           <w:rPr>
             <w:rStyle w:val="Hyperlink"/>
@@ -1467,7 +1467,7 @@
       <w:r>
         <w:t xml:space="preserve"> — créé — </w:t>
       </w:r>
-      <w:hyperlink w:history="1" r:id="rIdcog23iu6iezbm26_v4n9u">
+      <w:hyperlink w:history="1" r:id="rId2k69b08eztnlle98xfbmf">
         <w:r>
           <w:rPr>
             <w:rStyle w:val="Hyperlink"/>
@@ -1496,7 +1496,7 @@
       <w:r>
         <w:t xml:space="preserve"> — créé — </w:t>
       </w:r>
-      <w:hyperlink w:history="1" r:id="rIdckjfof1ugwd2fvrrdwoqn">
+      <w:hyperlink w:history="1" r:id="rIdqvotysoyteesxup4pwron">
         <w:r>
           <w:rPr>
             <w:rStyle w:val="Hyperlink"/>
@@ -1525,7 +1525,7 @@
       <w:r>
         <w:t xml:space="preserve"> — créé — </w:t>
       </w:r>
-      <w:hyperlink w:history="1" r:id="rIdy0tkz3y2bqc87f6_eovrb">
+      <w:hyperlink w:history="1" r:id="rId6j9f5yg9e4jlzy1b2eqqm">
         <w:r>
           <w:rPr>
             <w:rStyle w:val="Hyperlink"/>
@@ -1554,7 +1554,7 @@
       <w:r>
         <w:t xml:space="preserve"> — créé — </w:t>
       </w:r>
-      <w:hyperlink w:history="1" r:id="rIdqjro-3mk8lkjdbh_7ace3">
+      <w:hyperlink w:history="1" r:id="rIdsaj5nnfzbww4ryhnfa2-h">
         <w:r>
           <w:rPr>
             <w:rStyle w:val="Hyperlink"/>
@@ -1583,7 +1583,7 @@
       <w:r>
         <w:t xml:space="preserve"> — créé — </w:t>
       </w:r>
-      <w:hyperlink w:history="1" r:id="rIdxrsenz4fhirpuf3qxqejb">
+      <w:hyperlink w:history="1" r:id="rIdehdmp9nyybqhxiuiz3sas">
         <w:r>
           <w:rPr>
             <w:rStyle w:val="Hyperlink"/>
@@ -1612,7 +1612,7 @@
       <w:r>
         <w:t xml:space="preserve"> — créé — </w:t>
       </w:r>
-      <w:hyperlink w:history="1" r:id="rIdenpnu0ohh5ivenosil45q">
+      <w:hyperlink w:history="1" r:id="rIdapo1elgds6hnboocgb6lh">
         <w:r>
           <w:rPr>
             <w:rStyle w:val="Hyperlink"/>
@@ -1641,7 +1641,7 @@
       <w:r>
         <w:t xml:space="preserve"> — créé — </w:t>
       </w:r>
-      <w:hyperlink w:history="1" r:id="rIdofl1aueyoim6hvfedgxr5">
+      <w:hyperlink w:history="1" r:id="rIdxm1vsbdwboomzsbsiyt5s">
         <w:r>
           <w:rPr>
             <w:rStyle w:val="Hyperlink"/>
@@ -1670,7 +1670,7 @@
       <w:r>
         <w:t xml:space="preserve"> — créé — </w:t>
       </w:r>
-      <w:hyperlink w:history="1" r:id="rId-fzv5nbbj8qu4cjue1qwb">
+      <w:hyperlink w:history="1" r:id="rIdgvbmircvmrfzjgvhtzso5">
         <w:r>
           <w:rPr>
             <w:rStyle w:val="Hyperlink"/>
@@ -1699,7 +1699,7 @@
       <w:r>
         <w:t xml:space="preserve"> — créé — </w:t>
       </w:r>
-      <w:hyperlink w:history="1" r:id="rIdpjjol_ba7e3f8glmxy3q8">
+      <w:hyperlink w:history="1" r:id="rIdjvlcypxf6u-kzd157gcwh">
         <w:r>
           <w:rPr>
             <w:rStyle w:val="Hyperlink"/>
@@ -1728,7 +1728,7 @@
       <w:r>
         <w:t xml:space="preserve"> — créé — </w:t>
       </w:r>
-      <w:hyperlink w:history="1" r:id="rId5dn3gnlbrx1cs-gd1x7gd">
+      <w:hyperlink w:history="1" r:id="rIdlcommlsgtdc1txwp6ka1f">
         <w:r>
           <w:rPr>
             <w:rStyle w:val="Hyperlink"/>
@@ -1757,7 +1757,7 @@
       <w:r>
         <w:t xml:space="preserve"> — créé — </w:t>
       </w:r>
-      <w:hyperlink w:history="1" r:id="rIdy6p7lygjxrecq2epy0msy">
+      <w:hyperlink w:history="1" r:id="rIduzobobzhd0y2hd6l93hna">
         <w:r>
           <w:rPr>
             <w:rStyle w:val="Hyperlink"/>
@@ -1786,7 +1786,7 @@
       <w:r>
         <w:t xml:space="preserve"> — créé — </w:t>
       </w:r>
-      <w:hyperlink w:history="1" r:id="rId9av9s6cjvahg2_xyqiyhv">
+      <w:hyperlink w:history="1" r:id="rId6aku0-r7ep-9ppcwvpi2s">
         <w:r>
           <w:rPr>
             <w:rStyle w:val="Hyperlink"/>
@@ -1823,7 +1823,7 @@
       <w:r>
         <w:t xml:space="preserve"> — créé — </w:t>
       </w:r>
-      <w:hyperlink w:history="1" r:id="rIdo8zmqdmbjw8w85v1sef00">
+      <w:hyperlink w:history="1" r:id="rId5webi4jz-gqzqddqkuu4a">
         <w:r>
           <w:rPr>
             <w:rStyle w:val="Hyperlink"/>
@@ -1852,7 +1852,7 @@
       <w:r>
         <w:t xml:space="preserve"> — créé — </w:t>
       </w:r>
-      <w:hyperlink w:history="1" r:id="rIdhqruh5jhuu1dne0nsajat">
+      <w:hyperlink w:history="1" r:id="rIdtjxixgdlibfahww0zkaxd">
         <w:r>
           <w:rPr>
             <w:rStyle w:val="Hyperlink"/>
@@ -1881,7 +1881,7 @@
       <w:r>
         <w:t xml:space="preserve"> — créé — </w:t>
       </w:r>
-      <w:hyperlink w:history="1" r:id="rIdaucpg_2k5gf2_-dozoter">
+      <w:hyperlink w:history="1" r:id="rId8etlr9kkbxqqmogfab_gk">
         <w:r>
           <w:rPr>
             <w:rStyle w:val="Hyperlink"/>
@@ -1910,7 +1910,7 @@
       <w:r>
         <w:t xml:space="preserve"> — créé — </w:t>
       </w:r>
-      <w:hyperlink w:history="1" r:id="rIdu-xlnazjqeul4v_txuggr">
+      <w:hyperlink w:history="1" r:id="rIdmdwvaehngvvxvb01cnnbc">
         <w:r>
           <w:rPr>
             <w:rStyle w:val="Hyperlink"/>
@@ -1939,7 +1939,7 @@
       <w:r>
         <w:t xml:space="preserve"> — créé — </w:t>
       </w:r>
-      <w:hyperlink w:history="1" r:id="rId5op1abta-ijggqoic8_h_">
+      <w:hyperlink w:history="1" r:id="rIdtdq2wlghiq7m2j1yem8m_">
         <w:r>
           <w:rPr>
             <w:rStyle w:val="Hyperlink"/>
@@ -1968,7 +1968,7 @@
       <w:r>
         <w:t xml:space="preserve"> — créé — </w:t>
       </w:r>
-      <w:hyperlink w:history="1" r:id="rIddognr7aohnmgszspiir3x">
+      <w:hyperlink w:history="1" r:id="rIdojhukyzcxkp6rktsm0pe1">
         <w:r>
           <w:rPr>
             <w:rStyle w:val="Hyperlink"/>
@@ -1997,7 +1997,7 @@
       <w:r>
         <w:t xml:space="preserve"> — créé — </w:t>
       </w:r>
-      <w:hyperlink w:history="1" r:id="rId-87gks9q2emrfguvzjgi6">
+      <w:hyperlink w:history="1" r:id="rIdax_b1wlrvpfpb8ilzq5nj">
         <w:r>
           <w:rPr>
             <w:rStyle w:val="Hyperlink"/>
@@ -2026,7 +2026,7 @@
       <w:r>
         <w:t xml:space="preserve"> — créé — </w:t>
       </w:r>
-      <w:hyperlink w:history="1" r:id="rId8fld5n9ob0d-v0em42cfc">
+      <w:hyperlink w:history="1" r:id="rId_tr4sfttz7okaw0l8psd6">
         <w:r>
           <w:rPr>
             <w:rStyle w:val="Hyperlink"/>
@@ -2139,7 +2139,7 @@
       <w:r>
         <w:t xml:space="preserve"> — créé — </w:t>
       </w:r>
-      <w:hyperlink w:history="1" r:id="rIdvloupk5oslzare7rp_cwk">
+      <w:hyperlink w:history="1" r:id="rIdfncuyqdpxivmaahoxocn8">
         <w:r>
           <w:rPr>
             <w:rStyle w:val="Hyperlink"/>
@@ -2189,7 +2189,7 @@
       <w:r>
         <w:t xml:space="preserve"> — créé — </w:t>
       </w:r>
-      <w:hyperlink w:history="1" r:id="rIdsybp3_jszdbsmces4dbwu">
+      <w:hyperlink w:history="1" r:id="rIdjn2-5ubuopopcaongegpl">
         <w:r>
           <w:rPr>
             <w:rStyle w:val="Hyperlink"/>
@@ -2218,7 +2218,7 @@
       <w:r>
         <w:t xml:space="preserve"> — créé — </w:t>
       </w:r>
-      <w:hyperlink w:history="1" r:id="rIdg0lxqlceid6snxjdxhr_q">
+      <w:hyperlink w:history="1" r:id="rId9knl29wxjh_1_dq20t17k">
         <w:r>
           <w:rPr>
             <w:rStyle w:val="Hyperlink"/>
@@ -2247,7 +2247,7 @@
       <w:r>
         <w:t xml:space="preserve"> — créé — </w:t>
       </w:r>
-      <w:hyperlink w:history="1" r:id="rIdgftptwyhtljmy2thzsby-">
+      <w:hyperlink w:history="1" r:id="rIdde51w8wwhofeocckrugzq">
         <w:r>
           <w:rPr>
             <w:rStyle w:val="Hyperlink"/>
@@ -2276,7 +2276,7 @@
       <w:r>
         <w:t xml:space="preserve"> — créé — </w:t>
       </w:r>
-      <w:hyperlink w:history="1" r:id="rIdqqao67we44t3rlzm89oi0">
+      <w:hyperlink w:history="1" r:id="rId39zm5uvmizc0ino0rnpdq">
         <w:r>
           <w:rPr>
             <w:rStyle w:val="Hyperlink"/>
@@ -2313,7 +2313,7 @@
       <w:r>
         <w:t xml:space="preserve"> — créé — </w:t>
       </w:r>
-      <w:hyperlink w:history="1" r:id="rIdy1slvg0t-z5jcy6feqeqn">
+      <w:hyperlink w:history="1" r:id="rIdvcmhy9rb96kxu0gljmzu0">
         <w:r>
           <w:rPr>
             <w:rStyle w:val="Hyperlink"/>
@@ -2342,7 +2342,7 @@
       <w:r>
         <w:t xml:space="preserve"> — créé — </w:t>
       </w:r>
-      <w:hyperlink w:history="1" r:id="rId1jghh0svgia8rzqpma-j9">
+      <w:hyperlink w:history="1" r:id="rIdwbjk5s-zx3slbhr4tchyk">
         <w:r>
           <w:rPr>
             <w:rStyle w:val="Hyperlink"/>
@@ -2379,7 +2379,7 @@
       <w:r>
         <w:t xml:space="preserve"> — créé — </w:t>
       </w:r>
-      <w:hyperlink w:history="1" r:id="rId225qg_nvnf4qh638kz4bw">
+      <w:hyperlink w:history="1" r:id="rIdjbxo7c5ir1hacxp60nftq">
         <w:r>
           <w:rPr>
             <w:rStyle w:val="Hyperlink"/>
@@ -2408,7 +2408,7 @@
       <w:r>
         <w:t xml:space="preserve"> — créé — </w:t>
       </w:r>
-      <w:hyperlink w:history="1" r:id="rId7m3njn56sjj9ifq-ewpzo">
+      <w:hyperlink w:history="1" r:id="rIdvwf2j8smwzbr7ahmg1v38">
         <w:r>
           <w:rPr>
             <w:rStyle w:val="Hyperlink"/>
@@ -2437,7 +2437,7 @@
       <w:r>
         <w:t xml:space="preserve"> — créé — </w:t>
       </w:r>
-      <w:hyperlink w:history="1" r:id="rIdtqp8tb1rn3ov4jkmb_tj9">
+      <w:hyperlink w:history="1" r:id="rIdeiplxxnowqwrshjcuuvij">
         <w:r>
           <w:rPr>
             <w:rStyle w:val="Hyperlink"/>
@@ -2466,7 +2466,7 @@
       <w:r>
         <w:t xml:space="preserve"> — créé — </w:t>
       </w:r>
-      <w:hyperlink w:history="1" r:id="rIdturwk106mjtv1bt6devdu">
+      <w:hyperlink w:history="1" r:id="rId88efwogpfaom_hk2i6akd">
         <w:r>
           <w:rPr>
             <w:rStyle w:val="Hyperlink"/>
@@ -2495,7 +2495,7 @@
       <w:r>
         <w:t xml:space="preserve"> — créé — </w:t>
       </w:r>
-      <w:hyperlink w:history="1" r:id="rIdu_p7vppmgshxpdg4poj8f">
+      <w:hyperlink w:history="1" r:id="rIdsqfwjz7wh26prltxlv4xn">
         <w:r>
           <w:rPr>
             <w:rStyle w:val="Hyperlink"/>
@@ -2524,7 +2524,7 @@
       <w:r>
         <w:t xml:space="preserve"> — créé — </w:t>
       </w:r>
-      <w:hyperlink w:history="1" r:id="rIdtdjdwzzj4ym-q59znvz0l">
+      <w:hyperlink w:history="1" r:id="rIdvf14emxnug0lqwbwc8mqs">
         <w:r>
           <w:rPr>
             <w:rStyle w:val="Hyperlink"/>
@@ -2553,7 +2553,7 @@
       <w:r>
         <w:t xml:space="preserve"> — créé — </w:t>
       </w:r>
-      <w:hyperlink w:history="1" r:id="rIdpsaz7wt9jsywes1ifug02">
+      <w:hyperlink w:history="1" r:id="rId3uvfhxaa8rbhbdkiwu4kf">
         <w:r>
           <w:rPr>
             <w:rStyle w:val="Hyperlink"/>
@@ -2582,7 +2582,7 @@
       <w:r>
         <w:t xml:space="preserve"> — créé — </w:t>
       </w:r>
-      <w:hyperlink w:history="1" r:id="rIdtxvvrtrl-mqf2_ihjh_a-">
+      <w:hyperlink w:history="1" r:id="rIdqc4peirbjiefqeijbiice">
         <w:r>
           <w:rPr>
             <w:rStyle w:val="Hyperlink"/>
@@ -2611,7 +2611,7 @@
       <w:r>
         <w:t xml:space="preserve"> — créé — </w:t>
       </w:r>
-      <w:hyperlink w:history="1" r:id="rIdj85z2y8mgore6x6c6amil">
+      <w:hyperlink w:history="1" r:id="rIdjpcdenapbylcuwtigke55">
         <w:r>
           <w:rPr>
             <w:rStyle w:val="Hyperlink"/>
@@ -2648,7 +2648,7 @@
       <w:r>
         <w:t xml:space="preserve"> — créé — </w:t>
       </w:r>
-      <w:hyperlink w:history="1" r:id="rId74vglpvnw6mlulzlu15gk">
+      <w:hyperlink w:history="1" r:id="rIdr-8-dxlwj4isyzzmhs7kc">
         <w:r>
           <w:rPr>
             <w:rStyle w:val="Hyperlink"/>
@@ -2677,7 +2677,7 @@
       <w:r>
         <w:t xml:space="preserve"> — créé — </w:t>
       </w:r>
-      <w:hyperlink w:history="1" r:id="rId5luqd4jhexygqrhkwzovh">
+      <w:hyperlink w:history="1" r:id="rIdxhk_dtz2xbja-f9-1seli">
         <w:r>
           <w:rPr>
             <w:rStyle w:val="Hyperlink"/>
@@ -2706,7 +2706,7 @@
       <w:r>
         <w:t xml:space="preserve"> — créé — </w:t>
       </w:r>
-      <w:hyperlink w:history="1" r:id="rIdrxw_6hlbfqax2lv7aaxkv">
+      <w:hyperlink w:history="1" r:id="rIdhqhdkie31koprzbzdrbob">
         <w:r>
           <w:rPr>
             <w:rStyle w:val="Hyperlink"/>
@@ -2735,7 +2735,7 @@
       <w:r>
         <w:t xml:space="preserve"> — créé — </w:t>
       </w:r>
-      <w:hyperlink w:history="1" r:id="rIdlqpxpzrh0snvnbp3cwlwr">
+      <w:hyperlink w:history="1" r:id="rIdrcvjygjnp4hqkpzepnfli">
         <w:r>
           <w:rPr>
             <w:rStyle w:val="Hyperlink"/>
@@ -2764,7 +2764,7 @@
       <w:r>
         <w:t xml:space="preserve"> — créé — </w:t>
       </w:r>
-      <w:hyperlink w:history="1" r:id="rIdggyjffvrhnkznr4ais7ti">
+      <w:hyperlink w:history="1" r:id="rIdp72johjymp1aje91ssmie">
         <w:r>
           <w:rPr>
             <w:rStyle w:val="Hyperlink"/>
@@ -2793,7 +2793,7 @@
       <w:r>
         <w:t xml:space="preserve"> — créé — </w:t>
       </w:r>
-      <w:hyperlink w:history="1" r:id="rId94ksxetflpiailw07j-cd">
+      <w:hyperlink w:history="1" r:id="rIdmrxw1acojb9kbfkown2qc">
         <w:r>
           <w:rPr>
             <w:rStyle w:val="Hyperlink"/>
@@ -2822,7 +2822,7 @@
       <w:r>
         <w:t xml:space="preserve"> — créé — </w:t>
       </w:r>
-      <w:hyperlink w:history="1" r:id="rIdbk4ga3tozcrzeh5_mbsbn">
+      <w:hyperlink w:history="1" r:id="rIdxunew1dccgjbssqeepztr">
         <w:r>
           <w:rPr>
             <w:rStyle w:val="Hyperlink"/>
@@ -2851,7 +2851,7 @@
       <w:r>
         <w:t xml:space="preserve"> — créé — </w:t>
       </w:r>
-      <w:hyperlink w:history="1" r:id="rId8ozgak26_2acu7ymfxz2p">
+      <w:hyperlink w:history="1" r:id="rIdhm4nply4_uexy1t3o7qv3">
         <w:r>
           <w:rPr>
             <w:rStyle w:val="Hyperlink"/>

</xml_diff>

<commit_message>
Dossier §15.174, avancement, phase 75, points à revoir à jour
Co-Authored-By: Claude Opus 5.5 <noreply@anthropic.com>
</commit_message>
<xml_diff>
--- a/docs/developpement/phases/word/PHASE_00_SOCLE_DE_PRODUCTION_ET_CONFIGURATION_DUN_LIEU_VIDE.docx
+++ b/docs/developpement/phases/word/PHASE_00_SOCLE_DE_PRODUCTION_ET_CONFIGURATION_DUN_LIEU_VIDE.docx
@@ -18,9 +18,9 @@
         <w:shd w:fill="F6F3FF" w:color="auto" w:val="clear"/>
       </w:pPr>
       <w:r>
-        <w:t xml:space="preserve">FlaiX Expert · dossier de développement · généré le 2026-10-24 depuis le dépôt </w:t>
-      </w:r>
-      <w:hyperlink w:history="1" r:id="rIdzen70i-hx_n9wsja6glgc">
+        <w:t xml:space="preserve">FlaiX Expert · dossier de développement · généré le 2026-10-25 depuis le dépôt </w:t>
+      </w:r>
+      <w:hyperlink w:history="1" r:id="rIdlhxuxkfmuzp5ts3ytrmvg">
         <w:r>
           <w:rPr>
             <w:rStyle w:val="Hyperlink"/>
@@ -592,7 +592,7 @@
           <w:numId w:val="3"/>
         </w:numPr>
       </w:pPr>
-      <w:hyperlink w:history="1" r:id="rId8xnsqrerjfusthgxhju6n">
+      <w:hyperlink w:history="1" r:id="rIdzja2lvghzgekbbvfnedid">
         <w:r>
           <w:rPr>
             <w:rStyle w:val="Hyperlink"/>
@@ -612,7 +612,7 @@
           <w:numId w:val="3"/>
         </w:numPr>
       </w:pPr>
-      <w:hyperlink w:history="1" r:id="rIdwpqhpdpdhtej1uhccfjq3">
+      <w:hyperlink w:history="1" r:id="rIdrza06nx4i2myez34oxlpo">
         <w:r>
           <w:rPr>
             <w:rStyle w:val="Hyperlink"/>
@@ -660,7 +660,7 @@
       <w:r>
         <w:t xml:space="preserve"> — créé — </w:t>
       </w:r>
-      <w:hyperlink w:history="1" r:id="rIdgi6n_wg_4yxwyculjcjem">
+      <w:hyperlink w:history="1" r:id="rIdu9jh5ultambvfteqp-9_f">
         <w:r>
           <w:rPr>
             <w:rStyle w:val="Hyperlink"/>
@@ -689,7 +689,7 @@
       <w:r>
         <w:t xml:space="preserve"> — créé — </w:t>
       </w:r>
-      <w:hyperlink w:history="1" r:id="rIdlu_xzfovm1ek0w8gzrxr_">
+      <w:hyperlink w:history="1" r:id="rId3i3ct3ge3ailh5ek5jwwv">
         <w:r>
           <w:rPr>
             <w:rStyle w:val="Hyperlink"/>
@@ -726,7 +726,7 @@
       <w:r>
         <w:t xml:space="preserve"> — créé — </w:t>
       </w:r>
-      <w:hyperlink w:history="1" r:id="rId0vc4un9sxobsn2hapjgia">
+      <w:hyperlink w:history="1" r:id="rIdrkgf6avl4ktqd-in24mc7">
         <w:r>
           <w:rPr>
             <w:rStyle w:val="Hyperlink"/>
@@ -755,7 +755,7 @@
       <w:r>
         <w:t xml:space="preserve"> — créé — </w:t>
       </w:r>
-      <w:hyperlink w:history="1" r:id="rIdpha42zluo2u-dhft8dlje">
+      <w:hyperlink w:history="1" r:id="rIduaapzr0ufgvdjxhhcvg55">
         <w:r>
           <w:rPr>
             <w:rStyle w:val="Hyperlink"/>
@@ -784,7 +784,7 @@
       <w:r>
         <w:t xml:space="preserve"> — créé — </w:t>
       </w:r>
-      <w:hyperlink w:history="1" r:id="rIdovmx9ac83hcgvodsvpfds">
+      <w:hyperlink w:history="1" r:id="rIdug-zxngamsmzbawsmrutf">
         <w:r>
           <w:rPr>
             <w:rStyle w:val="Hyperlink"/>
@@ -813,7 +813,7 @@
       <w:r>
         <w:t xml:space="preserve"> — créé — </w:t>
       </w:r>
-      <w:hyperlink w:history="1" r:id="rIdzlax9bequmr6gmwrvadv7">
+      <w:hyperlink w:history="1" r:id="rIdz2c5mquyfblsntzcfzo_y">
         <w:r>
           <w:rPr>
             <w:rStyle w:val="Hyperlink"/>
@@ -842,7 +842,7 @@
       <w:r>
         <w:t xml:space="preserve"> — créé — </w:t>
       </w:r>
-      <w:hyperlink w:history="1" r:id="rIdkocuqgl4bqp5xm93uiydn">
+      <w:hyperlink w:history="1" r:id="rId-wvtf10ajdgmeorr9g8ci">
         <w:r>
           <w:rPr>
             <w:rStyle w:val="Hyperlink"/>
@@ -879,7 +879,7 @@
       <w:r>
         <w:t xml:space="preserve"> — créé — </w:t>
       </w:r>
-      <w:hyperlink w:history="1" r:id="rId5czjxqmkb2c19vw3g4m-0">
+      <w:hyperlink w:history="1" r:id="rIdkmza1f4gevpctqb1lwzuo">
         <w:r>
           <w:rPr>
             <w:rStyle w:val="Hyperlink"/>
@@ -908,7 +908,7 @@
       <w:r>
         <w:t xml:space="preserve"> — créé — </w:t>
       </w:r>
-      <w:hyperlink w:history="1" r:id="rId3jel7hwrexu77mvhklkn6">
+      <w:hyperlink w:history="1" r:id="rIdvclsbye7coxtqr_csao8k">
         <w:r>
           <w:rPr>
             <w:rStyle w:val="Hyperlink"/>
@@ -937,7 +937,7 @@
       <w:r>
         <w:t xml:space="preserve"> — créé — </w:t>
       </w:r>
-      <w:hyperlink w:history="1" r:id="rId-aqrncn3mhglap_gcxruq">
+      <w:hyperlink w:history="1" r:id="rIdxck1j9syoaoiy4qgr6wg-">
         <w:r>
           <w:rPr>
             <w:rStyle w:val="Hyperlink"/>
@@ -966,7 +966,7 @@
       <w:r>
         <w:t xml:space="preserve"> — créé — </w:t>
       </w:r>
-      <w:hyperlink w:history="1" r:id="rIdf81x8fdxyhxnpldxuy8z_">
+      <w:hyperlink w:history="1" r:id="rIdc6oqipmp1jvksbod9a1gc">
         <w:r>
           <w:rPr>
             <w:rStyle w:val="Hyperlink"/>
@@ -995,7 +995,7 @@
       <w:r>
         <w:t xml:space="preserve"> — créé — </w:t>
       </w:r>
-      <w:hyperlink w:history="1" r:id="rIdma7wls9spparenqcsv9av">
+      <w:hyperlink w:history="1" r:id="rIdyclavuvhu4l6ywbmbd144">
         <w:r>
           <w:rPr>
             <w:rStyle w:val="Hyperlink"/>
@@ -1024,7 +1024,7 @@
       <w:r>
         <w:t xml:space="preserve"> — créé — </w:t>
       </w:r>
-      <w:hyperlink w:history="1" r:id="rId81xim-oc0uadronukbiab">
+      <w:hyperlink w:history="1" r:id="rIdbkx_0tizlu0sx1x6h6uvx">
         <w:r>
           <w:rPr>
             <w:rStyle w:val="Hyperlink"/>
@@ -1053,7 +1053,7 @@
       <w:r>
         <w:t xml:space="preserve"> — créé — </w:t>
       </w:r>
-      <w:hyperlink w:history="1" r:id="rIdwjf7aef57hootlorie7mg">
+      <w:hyperlink w:history="1" r:id="rIdp-fvki5b-_f-8b5phcxde">
         <w:r>
           <w:rPr>
             <w:rStyle w:val="Hyperlink"/>
@@ -1082,7 +1082,7 @@
       <w:r>
         <w:t xml:space="preserve"> — créé — </w:t>
       </w:r>
-      <w:hyperlink w:history="1" r:id="rIdef2v0kqtz15jxlagaqb4q">
+      <w:hyperlink w:history="1" r:id="rIdl7m8m8-ljk9aslm9tttfd">
         <w:r>
           <w:rPr>
             <w:rStyle w:val="Hyperlink"/>
@@ -1111,7 +1111,7 @@
       <w:r>
         <w:t xml:space="preserve"> — créé — </w:t>
       </w:r>
-      <w:hyperlink w:history="1" r:id="rIdjslltou-vayxqcjlhfiia">
+      <w:hyperlink w:history="1" r:id="rIdenyhivvvha8yz8ullx4kz">
         <w:r>
           <w:rPr>
             <w:rStyle w:val="Hyperlink"/>
@@ -1148,7 +1148,7 @@
       <w:r>
         <w:t xml:space="preserve"> — créé — </w:t>
       </w:r>
-      <w:hyperlink w:history="1" r:id="rIdcdtq9eemdsixve9qdu5gq">
+      <w:hyperlink w:history="1" r:id="rIdco5j87leb62bezr6zgvxz">
         <w:r>
           <w:rPr>
             <w:rStyle w:val="Hyperlink"/>
@@ -1177,7 +1177,7 @@
       <w:r>
         <w:t xml:space="preserve"> — créé — </w:t>
       </w:r>
-      <w:hyperlink w:history="1" r:id="rId6xamkwroyej8mjkqbyyz9">
+      <w:hyperlink w:history="1" r:id="rIdv_n2jsgfj6-hqher8eo0f">
         <w:r>
           <w:rPr>
             <w:rStyle w:val="Hyperlink"/>
@@ -1206,7 +1206,7 @@
       <w:r>
         <w:t xml:space="preserve"> — créé — </w:t>
       </w:r>
-      <w:hyperlink w:history="1" r:id="rIdpswufui__6_19onkw9t2q">
+      <w:hyperlink w:history="1" r:id="rIdfeluswnhw2phymszzbeov">
         <w:r>
           <w:rPr>
             <w:rStyle w:val="Hyperlink"/>
@@ -1235,7 +1235,7 @@
       <w:r>
         <w:t xml:space="preserve"> — créé — </w:t>
       </w:r>
-      <w:hyperlink w:history="1" r:id="rIdmt1l8qz1chbs9jqhdeuo9">
+      <w:hyperlink w:history="1" r:id="rIddvzkp7aiwwddvpdwbz3vn">
         <w:r>
           <w:rPr>
             <w:rStyle w:val="Hyperlink"/>
@@ -1264,7 +1264,7 @@
       <w:r>
         <w:t xml:space="preserve"> — créé — </w:t>
       </w:r>
-      <w:hyperlink w:history="1" r:id="rIdapchj94oxs80v7pzoxatn">
+      <w:hyperlink w:history="1" r:id="rIdsjjfbpn40wjyk1npxmbpm">
         <w:r>
           <w:rPr>
             <w:rStyle w:val="Hyperlink"/>
@@ -1293,7 +1293,7 @@
       <w:r>
         <w:t xml:space="preserve"> — créé — </w:t>
       </w:r>
-      <w:hyperlink w:history="1" r:id="rIdelwlk16vz48f2hw_l2epy">
+      <w:hyperlink w:history="1" r:id="rIdyxgk-m93mfsulwwy6dsih">
         <w:r>
           <w:rPr>
             <w:rStyle w:val="Hyperlink"/>
@@ -1322,7 +1322,7 @@
       <w:r>
         <w:t xml:space="preserve"> — créé — </w:t>
       </w:r>
-      <w:hyperlink w:history="1" r:id="rIdjbuqiczmksobs5m00acge">
+      <w:hyperlink w:history="1" r:id="rIdlkieh8s2z8pebpshv_h50">
         <w:r>
           <w:rPr>
             <w:rStyle w:val="Hyperlink"/>
@@ -1351,7 +1351,7 @@
       <w:r>
         <w:t xml:space="preserve"> — créé — </w:t>
       </w:r>
-      <w:hyperlink w:history="1" r:id="rId95sspkz3u9r3lwyxacjp4">
+      <w:hyperlink w:history="1" r:id="rIdneeeyxcp_zyxmttutycad">
         <w:r>
           <w:rPr>
             <w:rStyle w:val="Hyperlink"/>
@@ -1380,7 +1380,7 @@
       <w:r>
         <w:t xml:space="preserve"> — créé — </w:t>
       </w:r>
-      <w:hyperlink w:history="1" r:id="rIday7scqadgduxpt0ebjr7r">
+      <w:hyperlink w:history="1" r:id="rIdzz8eeru_izhggmuadxgbc">
         <w:r>
           <w:rPr>
             <w:rStyle w:val="Hyperlink"/>
@@ -1409,7 +1409,7 @@
       <w:r>
         <w:t xml:space="preserve"> — créé — </w:t>
       </w:r>
-      <w:hyperlink w:history="1" r:id="rIdaqugzsm0d8codnsvkw6ny">
+      <w:hyperlink w:history="1" r:id="rIdji-lh4amkddyklv75zd8g">
         <w:r>
           <w:rPr>
             <w:rStyle w:val="Hyperlink"/>
@@ -1438,7 +1438,7 @@
       <w:r>
         <w:t xml:space="preserve"> — créé — </w:t>
       </w:r>
-      <w:hyperlink w:history="1" r:id="rId-u8yq-_igukyligotty9f">
+      <w:hyperlink w:history="1" r:id="rIdts12ar6ptixur69nakd86">
         <w:r>
           <w:rPr>
             <w:rStyle w:val="Hyperlink"/>
@@ -1467,7 +1467,7 @@
       <w:r>
         <w:t xml:space="preserve"> — créé — </w:t>
       </w:r>
-      <w:hyperlink w:history="1" r:id="rId2k69b08eztnlle98xfbmf">
+      <w:hyperlink w:history="1" r:id="rId10tujxsascnp3-modtxh1">
         <w:r>
           <w:rPr>
             <w:rStyle w:val="Hyperlink"/>
@@ -1496,7 +1496,7 @@
       <w:r>
         <w:t xml:space="preserve"> — créé — </w:t>
       </w:r>
-      <w:hyperlink w:history="1" r:id="rIdqvotysoyteesxup4pwron">
+      <w:hyperlink w:history="1" r:id="rId1ow-q-vhv3ugv6r6t-uk9">
         <w:r>
           <w:rPr>
             <w:rStyle w:val="Hyperlink"/>
@@ -1525,7 +1525,7 @@
       <w:r>
         <w:t xml:space="preserve"> — créé — </w:t>
       </w:r>
-      <w:hyperlink w:history="1" r:id="rId6j9f5yg9e4jlzy1b2eqqm">
+      <w:hyperlink w:history="1" r:id="rIdsuzupyniqk99sort3mjgq">
         <w:r>
           <w:rPr>
             <w:rStyle w:val="Hyperlink"/>
@@ -1554,7 +1554,7 @@
       <w:r>
         <w:t xml:space="preserve"> — créé — </w:t>
       </w:r>
-      <w:hyperlink w:history="1" r:id="rIdsaj5nnfzbww4ryhnfa2-h">
+      <w:hyperlink w:history="1" r:id="rIdsf-bnl7jolwtvx2opdk8x">
         <w:r>
           <w:rPr>
             <w:rStyle w:val="Hyperlink"/>
@@ -1583,7 +1583,7 @@
       <w:r>
         <w:t xml:space="preserve"> — créé — </w:t>
       </w:r>
-      <w:hyperlink w:history="1" r:id="rIdehdmp9nyybqhxiuiz3sas">
+      <w:hyperlink w:history="1" r:id="rId0nmiwyutu8hs_xa9573lk">
         <w:r>
           <w:rPr>
             <w:rStyle w:val="Hyperlink"/>
@@ -1612,7 +1612,7 @@
       <w:r>
         <w:t xml:space="preserve"> — créé — </w:t>
       </w:r>
-      <w:hyperlink w:history="1" r:id="rIdapo1elgds6hnboocgb6lh">
+      <w:hyperlink w:history="1" r:id="rIdm9vz3cyngogyizrfcv8ey">
         <w:r>
           <w:rPr>
             <w:rStyle w:val="Hyperlink"/>
@@ -1641,7 +1641,7 @@
       <w:r>
         <w:t xml:space="preserve"> — créé — </w:t>
       </w:r>
-      <w:hyperlink w:history="1" r:id="rIdxm1vsbdwboomzsbsiyt5s">
+      <w:hyperlink w:history="1" r:id="rIdyckew9otahtzy89zqom9y">
         <w:r>
           <w:rPr>
             <w:rStyle w:val="Hyperlink"/>
@@ -1670,7 +1670,7 @@
       <w:r>
         <w:t xml:space="preserve"> — créé — </w:t>
       </w:r>
-      <w:hyperlink w:history="1" r:id="rIdgvbmircvmrfzjgvhtzso5">
+      <w:hyperlink w:history="1" r:id="rId6hhlzq1jyk6e4yhud6cnv">
         <w:r>
           <w:rPr>
             <w:rStyle w:val="Hyperlink"/>
@@ -1699,7 +1699,7 @@
       <w:r>
         <w:t xml:space="preserve"> — créé — </w:t>
       </w:r>
-      <w:hyperlink w:history="1" r:id="rIdjvlcypxf6u-kzd157gcwh">
+      <w:hyperlink w:history="1" r:id="rIdf317xqjvq_md-lns5auaa">
         <w:r>
           <w:rPr>
             <w:rStyle w:val="Hyperlink"/>
@@ -1728,7 +1728,7 @@
       <w:r>
         <w:t xml:space="preserve"> — créé — </w:t>
       </w:r>
-      <w:hyperlink w:history="1" r:id="rIdlcommlsgtdc1txwp6ka1f">
+      <w:hyperlink w:history="1" r:id="rIdnakejc_6zg1lbtdzbn4vt">
         <w:r>
           <w:rPr>
             <w:rStyle w:val="Hyperlink"/>
@@ -1757,7 +1757,7 @@
       <w:r>
         <w:t xml:space="preserve"> — créé — </w:t>
       </w:r>
-      <w:hyperlink w:history="1" r:id="rIduzobobzhd0y2hd6l93hna">
+      <w:hyperlink w:history="1" r:id="rId678hwemkbbcyrxfjh0h_l">
         <w:r>
           <w:rPr>
             <w:rStyle w:val="Hyperlink"/>
@@ -1786,7 +1786,7 @@
       <w:r>
         <w:t xml:space="preserve"> — créé — </w:t>
       </w:r>
-      <w:hyperlink w:history="1" r:id="rId6aku0-r7ep-9ppcwvpi2s">
+      <w:hyperlink w:history="1" r:id="rIdv4vp8tmn9xj3nmr7uuj9f">
         <w:r>
           <w:rPr>
             <w:rStyle w:val="Hyperlink"/>
@@ -1823,7 +1823,7 @@
       <w:r>
         <w:t xml:space="preserve"> — créé — </w:t>
       </w:r>
-      <w:hyperlink w:history="1" r:id="rId5webi4jz-gqzqddqkuu4a">
+      <w:hyperlink w:history="1" r:id="rIdv6ydxiksfoiefyhkdyl53">
         <w:r>
           <w:rPr>
             <w:rStyle w:val="Hyperlink"/>
@@ -1852,7 +1852,7 @@
       <w:r>
         <w:t xml:space="preserve"> — créé — </w:t>
       </w:r>
-      <w:hyperlink w:history="1" r:id="rIdtjxixgdlibfahww0zkaxd">
+      <w:hyperlink w:history="1" r:id="rIdxvc4p_l-692a80psqgtwf">
         <w:r>
           <w:rPr>
             <w:rStyle w:val="Hyperlink"/>
@@ -1881,7 +1881,7 @@
       <w:r>
         <w:t xml:space="preserve"> — créé — </w:t>
       </w:r>
-      <w:hyperlink w:history="1" r:id="rId8etlr9kkbxqqmogfab_gk">
+      <w:hyperlink w:history="1" r:id="rIdzjysd6mopafsvj4wmkrw9">
         <w:r>
           <w:rPr>
             <w:rStyle w:val="Hyperlink"/>
@@ -1910,7 +1910,7 @@
       <w:r>
         <w:t xml:space="preserve"> — créé — </w:t>
       </w:r>
-      <w:hyperlink w:history="1" r:id="rIdmdwvaehngvvxvb01cnnbc">
+      <w:hyperlink w:history="1" r:id="rIdikkji5kt7-_atpnkt-ke8">
         <w:r>
           <w:rPr>
             <w:rStyle w:val="Hyperlink"/>
@@ -1939,7 +1939,7 @@
       <w:r>
         <w:t xml:space="preserve"> — créé — </w:t>
       </w:r>
-      <w:hyperlink w:history="1" r:id="rIdtdq2wlghiq7m2j1yem8m_">
+      <w:hyperlink w:history="1" r:id="rId94betcc1pumviaoyticyg">
         <w:r>
           <w:rPr>
             <w:rStyle w:val="Hyperlink"/>
@@ -1968,7 +1968,7 @@
       <w:r>
         <w:t xml:space="preserve"> — créé — </w:t>
       </w:r>
-      <w:hyperlink w:history="1" r:id="rIdojhukyzcxkp6rktsm0pe1">
+      <w:hyperlink w:history="1" r:id="rIds7hmedgqywpxlwvoyqbny">
         <w:r>
           <w:rPr>
             <w:rStyle w:val="Hyperlink"/>
@@ -1997,7 +1997,7 @@
       <w:r>
         <w:t xml:space="preserve"> — créé — </w:t>
       </w:r>
-      <w:hyperlink w:history="1" r:id="rIdax_b1wlrvpfpb8ilzq5nj">
+      <w:hyperlink w:history="1" r:id="rIdppvgescbyxv2meon9nxe9">
         <w:r>
           <w:rPr>
             <w:rStyle w:val="Hyperlink"/>
@@ -2026,7 +2026,7 @@
       <w:r>
         <w:t xml:space="preserve"> — créé — </w:t>
       </w:r>
-      <w:hyperlink w:history="1" r:id="rId_tr4sfttz7okaw0l8psd6">
+      <w:hyperlink w:history="1" r:id="rIdoezxa2-w8sqiue-kgsn-3">
         <w:r>
           <w:rPr>
             <w:rStyle w:val="Hyperlink"/>
@@ -2139,7 +2139,7 @@
       <w:r>
         <w:t xml:space="preserve"> — créé — </w:t>
       </w:r>
-      <w:hyperlink w:history="1" r:id="rIdfncuyqdpxivmaahoxocn8">
+      <w:hyperlink w:history="1" r:id="rId70vaurryo9mf53__qvxd4">
         <w:r>
           <w:rPr>
             <w:rStyle w:val="Hyperlink"/>
@@ -2189,7 +2189,7 @@
       <w:r>
         <w:t xml:space="preserve"> — créé — </w:t>
       </w:r>
-      <w:hyperlink w:history="1" r:id="rIdjn2-5ubuopopcaongegpl">
+      <w:hyperlink w:history="1" r:id="rIdigsuu3wywgyacgmvmawtd">
         <w:r>
           <w:rPr>
             <w:rStyle w:val="Hyperlink"/>
@@ -2218,7 +2218,7 @@
       <w:r>
         <w:t xml:space="preserve"> — créé — </w:t>
       </w:r>
-      <w:hyperlink w:history="1" r:id="rId9knl29wxjh_1_dq20t17k">
+      <w:hyperlink w:history="1" r:id="rIdtvc-1oozc48al4ffpe1uw">
         <w:r>
           <w:rPr>
             <w:rStyle w:val="Hyperlink"/>
@@ -2247,7 +2247,7 @@
       <w:r>
         <w:t xml:space="preserve"> — créé — </w:t>
       </w:r>
-      <w:hyperlink w:history="1" r:id="rIdde51w8wwhofeocckrugzq">
+      <w:hyperlink w:history="1" r:id="rIdzjpsnc2kwxltaqp0tophd">
         <w:r>
           <w:rPr>
             <w:rStyle w:val="Hyperlink"/>
@@ -2276,7 +2276,7 @@
       <w:r>
         <w:t xml:space="preserve"> — créé — </w:t>
       </w:r>
-      <w:hyperlink w:history="1" r:id="rId39zm5uvmizc0ino0rnpdq">
+      <w:hyperlink w:history="1" r:id="rIdyxu2tuhhsmhwia4x8fq7z">
         <w:r>
           <w:rPr>
             <w:rStyle w:val="Hyperlink"/>
@@ -2313,7 +2313,7 @@
       <w:r>
         <w:t xml:space="preserve"> — créé — </w:t>
       </w:r>
-      <w:hyperlink w:history="1" r:id="rIdvcmhy9rb96kxu0gljmzu0">
+      <w:hyperlink w:history="1" r:id="rId8jrn5ntg3jg5d6dd_zodj">
         <w:r>
           <w:rPr>
             <w:rStyle w:val="Hyperlink"/>
@@ -2342,7 +2342,7 @@
       <w:r>
         <w:t xml:space="preserve"> — créé — </w:t>
       </w:r>
-      <w:hyperlink w:history="1" r:id="rIdwbjk5s-zx3slbhr4tchyk">
+      <w:hyperlink w:history="1" r:id="rIdnwyh-kr4fpjip6ft6dmxr">
         <w:r>
           <w:rPr>
             <w:rStyle w:val="Hyperlink"/>
@@ -2379,7 +2379,7 @@
       <w:r>
         <w:t xml:space="preserve"> — créé — </w:t>
       </w:r>
-      <w:hyperlink w:history="1" r:id="rIdjbxo7c5ir1hacxp60nftq">
+      <w:hyperlink w:history="1" r:id="rIdjdsram-wvo7zagpepiru5">
         <w:r>
           <w:rPr>
             <w:rStyle w:val="Hyperlink"/>
@@ -2408,7 +2408,7 @@
       <w:r>
         <w:t xml:space="preserve"> — créé — </w:t>
       </w:r>
-      <w:hyperlink w:history="1" r:id="rIdvwf2j8smwzbr7ahmg1v38">
+      <w:hyperlink w:history="1" r:id="rIde7vmzb9erm8nuow7zs9vk">
         <w:r>
           <w:rPr>
             <w:rStyle w:val="Hyperlink"/>
@@ -2437,7 +2437,7 @@
       <w:r>
         <w:t xml:space="preserve"> — créé — </w:t>
       </w:r>
-      <w:hyperlink w:history="1" r:id="rIdeiplxxnowqwrshjcuuvij">
+      <w:hyperlink w:history="1" r:id="rIdkqmkisseh9hc8iysjt66m">
         <w:r>
           <w:rPr>
             <w:rStyle w:val="Hyperlink"/>
@@ -2466,7 +2466,7 @@
       <w:r>
         <w:t xml:space="preserve"> — créé — </w:t>
       </w:r>
-      <w:hyperlink w:history="1" r:id="rId88efwogpfaom_hk2i6akd">
+      <w:hyperlink w:history="1" r:id="rIdurapmgk6u0tuffctcapmx">
         <w:r>
           <w:rPr>
             <w:rStyle w:val="Hyperlink"/>
@@ -2495,7 +2495,7 @@
       <w:r>
         <w:t xml:space="preserve"> — créé — </w:t>
       </w:r>
-      <w:hyperlink w:history="1" r:id="rIdsqfwjz7wh26prltxlv4xn">
+      <w:hyperlink w:history="1" r:id="rIddokfumpqmhiu6x3wrfc9v">
         <w:r>
           <w:rPr>
             <w:rStyle w:val="Hyperlink"/>
@@ -2524,7 +2524,7 @@
       <w:r>
         <w:t xml:space="preserve"> — créé — </w:t>
       </w:r>
-      <w:hyperlink w:history="1" r:id="rIdvf14emxnug0lqwbwc8mqs">
+      <w:hyperlink w:history="1" r:id="rIdrc3e9ola05o5z7z2bz6w4">
         <w:r>
           <w:rPr>
             <w:rStyle w:val="Hyperlink"/>
@@ -2553,7 +2553,7 @@
       <w:r>
         <w:t xml:space="preserve"> — créé — </w:t>
       </w:r>
-      <w:hyperlink w:history="1" r:id="rId3uvfhxaa8rbhbdkiwu4kf">
+      <w:hyperlink w:history="1" r:id="rIdoveft90nhyprqmwnab0kg">
         <w:r>
           <w:rPr>
             <w:rStyle w:val="Hyperlink"/>
@@ -2582,7 +2582,7 @@
       <w:r>
         <w:t xml:space="preserve"> — créé — </w:t>
       </w:r>
-      <w:hyperlink w:history="1" r:id="rIdqc4peirbjiefqeijbiice">
+      <w:hyperlink w:history="1" r:id="rId4xuonea4nfbr_z3-iaupk">
         <w:r>
           <w:rPr>
             <w:rStyle w:val="Hyperlink"/>
@@ -2611,7 +2611,7 @@
       <w:r>
         <w:t xml:space="preserve"> — créé — </w:t>
       </w:r>
-      <w:hyperlink w:history="1" r:id="rIdjpcdenapbylcuwtigke55">
+      <w:hyperlink w:history="1" r:id="rIdgcduu5n7kylt5izioznln">
         <w:r>
           <w:rPr>
             <w:rStyle w:val="Hyperlink"/>
@@ -2648,7 +2648,7 @@
       <w:r>
         <w:t xml:space="preserve"> — créé — </w:t>
       </w:r>
-      <w:hyperlink w:history="1" r:id="rIdr-8-dxlwj4isyzzmhs7kc">
+      <w:hyperlink w:history="1" r:id="rIdcmlwsu3iqpfluxufprz3e">
         <w:r>
           <w:rPr>
             <w:rStyle w:val="Hyperlink"/>
@@ -2677,7 +2677,7 @@
       <w:r>
         <w:t xml:space="preserve"> — créé — </w:t>
       </w:r>
-      <w:hyperlink w:history="1" r:id="rIdxhk_dtz2xbja-f9-1seli">
+      <w:hyperlink w:history="1" r:id="rIdim_1qcfsvesqsipjxercu">
         <w:r>
           <w:rPr>
             <w:rStyle w:val="Hyperlink"/>
@@ -2706,7 +2706,7 @@
       <w:r>
         <w:t xml:space="preserve"> — créé — </w:t>
       </w:r>
-      <w:hyperlink w:history="1" r:id="rIdhqhdkie31koprzbzdrbob">
+      <w:hyperlink w:history="1" r:id="rIdpqu23qgaivqw6mgflijbx">
         <w:r>
           <w:rPr>
             <w:rStyle w:val="Hyperlink"/>
@@ -2735,7 +2735,7 @@
       <w:r>
         <w:t xml:space="preserve"> — créé — </w:t>
       </w:r>
-      <w:hyperlink w:history="1" r:id="rIdrcvjygjnp4hqkpzepnfli">
+      <w:hyperlink w:history="1" r:id="rIdcftthl24r5zvmcwjq_2xq">
         <w:r>
           <w:rPr>
             <w:rStyle w:val="Hyperlink"/>
@@ -2764,7 +2764,7 @@
       <w:r>
         <w:t xml:space="preserve"> — créé — </w:t>
       </w:r>
-      <w:hyperlink w:history="1" r:id="rIdp72johjymp1aje91ssmie">
+      <w:hyperlink w:history="1" r:id="rIdexhgj0njmw2_k5hmpk1wm">
         <w:r>
           <w:rPr>
             <w:rStyle w:val="Hyperlink"/>
@@ -2793,7 +2793,7 @@
       <w:r>
         <w:t xml:space="preserve"> — créé — </w:t>
       </w:r>
-      <w:hyperlink w:history="1" r:id="rIdmrxw1acojb9kbfkown2qc">
+      <w:hyperlink w:history="1" r:id="rIdxutcqhbq0zntooekedh4l">
         <w:r>
           <w:rPr>
             <w:rStyle w:val="Hyperlink"/>
@@ -2822,7 +2822,7 @@
       <w:r>
         <w:t xml:space="preserve"> — créé — </w:t>
       </w:r>
-      <w:hyperlink w:history="1" r:id="rIdxunew1dccgjbssqeepztr">
+      <w:hyperlink w:history="1" r:id="rIdncsgwdc1tfpeo5mdnpivq">
         <w:r>
           <w:rPr>
             <w:rStyle w:val="Hyperlink"/>
@@ -2851,7 +2851,7 @@
       <w:r>
         <w:t xml:space="preserve"> — créé — </w:t>
       </w:r>
-      <w:hyperlink w:history="1" r:id="rIdhm4nply4_uexy1t3o7qv3">
+      <w:hyperlink w:history="1" r:id="rIdixt3nrcr5tepvlt2pxh3q">
         <w:r>
           <w:rPr>
             <w:rStyle w:val="Hyperlink"/>

</xml_diff>

<commit_message>
Phase 76 : commits de l'audit rattachés
Co-Authored-By: Claude Opus 5.5 <noreply@anthropic.com>
</commit_message>
<xml_diff>
--- a/docs/developpement/phases/word/PHASE_00_SOCLE_DE_PRODUCTION_ET_CONFIGURATION_DUN_LIEU_VIDE.docx
+++ b/docs/developpement/phases/word/PHASE_00_SOCLE_DE_PRODUCTION_ET_CONFIGURATION_DUN_LIEU_VIDE.docx
@@ -20,7 +20,7 @@
       <w:r>
         <w:t xml:space="preserve">FlaiX Expert · dossier de développement · généré le 2026-10-25 depuis le dépôt </w:t>
       </w:r>
-      <w:hyperlink w:history="1" r:id="rIde7xun_mh9u9l_kncn21yi">
+      <w:hyperlink w:history="1" r:id="rIdba3p7qvdga1dvfmgkq8lj">
         <w:r>
           <w:rPr>
             <w:rStyle w:val="Hyperlink"/>
@@ -592,7 +592,7 @@
           <w:numId w:val="3"/>
         </w:numPr>
       </w:pPr>
-      <w:hyperlink w:history="1" r:id="rIds1s6ypc4te31e67rwyel9">
+      <w:hyperlink w:history="1" r:id="rId64vykyq-0yyut9zdyieov">
         <w:r>
           <w:rPr>
             <w:rStyle w:val="Hyperlink"/>
@@ -612,7 +612,7 @@
           <w:numId w:val="3"/>
         </w:numPr>
       </w:pPr>
-      <w:hyperlink w:history="1" r:id="rIdymfufqwguf65fmv0aquo2">
+      <w:hyperlink w:history="1" r:id="rIdqorgiabor1l4ppd_x13nu">
         <w:r>
           <w:rPr>
             <w:rStyle w:val="Hyperlink"/>
@@ -660,7 +660,7 @@
       <w:r>
         <w:t xml:space="preserve"> — créé — </w:t>
       </w:r>
-      <w:hyperlink w:history="1" r:id="rId5n0k1lvw6rcsur4x9xvni">
+      <w:hyperlink w:history="1" r:id="rIdzlj75mx7ick7y-frnbbpb">
         <w:r>
           <w:rPr>
             <w:rStyle w:val="Hyperlink"/>
@@ -689,7 +689,7 @@
       <w:r>
         <w:t xml:space="preserve"> — créé — </w:t>
       </w:r>
-      <w:hyperlink w:history="1" r:id="rIdfccoq43kmfzc3j44x-tqs">
+      <w:hyperlink w:history="1" r:id="rIdqe0u07-y6iq99tszt2vvj">
         <w:r>
           <w:rPr>
             <w:rStyle w:val="Hyperlink"/>
@@ -726,7 +726,7 @@
       <w:r>
         <w:t xml:space="preserve"> — créé — </w:t>
       </w:r>
-      <w:hyperlink w:history="1" r:id="rId2d4rfdsgr58axj0j-fqm2">
+      <w:hyperlink w:history="1" r:id="rIdwvqcbycyx4b_04zuubndq">
         <w:r>
           <w:rPr>
             <w:rStyle w:val="Hyperlink"/>
@@ -755,7 +755,7 @@
       <w:r>
         <w:t xml:space="preserve"> — créé — </w:t>
       </w:r>
-      <w:hyperlink w:history="1" r:id="rIdzialz9bkitab4bgtgqcoq">
+      <w:hyperlink w:history="1" r:id="rIdshmbthhnikufj-mjx7lcw">
         <w:r>
           <w:rPr>
             <w:rStyle w:val="Hyperlink"/>
@@ -784,7 +784,7 @@
       <w:r>
         <w:t xml:space="preserve"> — créé — </w:t>
       </w:r>
-      <w:hyperlink w:history="1" r:id="rIdyinxunjcuclrjsqlgdgxn">
+      <w:hyperlink w:history="1" r:id="rId-dqx2hoyrtj-1qfewlsl3">
         <w:r>
           <w:rPr>
             <w:rStyle w:val="Hyperlink"/>
@@ -813,7 +813,7 @@
       <w:r>
         <w:t xml:space="preserve"> — créé — </w:t>
       </w:r>
-      <w:hyperlink w:history="1" r:id="rIdnm_r0lalavmktciej8hfq">
+      <w:hyperlink w:history="1" r:id="rId3hy4inqmytaaxrfnbobow">
         <w:r>
           <w:rPr>
             <w:rStyle w:val="Hyperlink"/>
@@ -842,7 +842,7 @@
       <w:r>
         <w:t xml:space="preserve"> — créé — </w:t>
       </w:r>
-      <w:hyperlink w:history="1" r:id="rId3v1joqnicqqinksh7kqxj">
+      <w:hyperlink w:history="1" r:id="rId25i2jysz_kw9c0dtd_hfh">
         <w:r>
           <w:rPr>
             <w:rStyle w:val="Hyperlink"/>
@@ -879,7 +879,7 @@
       <w:r>
         <w:t xml:space="preserve"> — créé — </w:t>
       </w:r>
-      <w:hyperlink w:history="1" r:id="rIda8u2tg4kacksy6t92isss">
+      <w:hyperlink w:history="1" r:id="rIdijygqipkmygzmwcquvrcz">
         <w:r>
           <w:rPr>
             <w:rStyle w:val="Hyperlink"/>
@@ -908,7 +908,7 @@
       <w:r>
         <w:t xml:space="preserve"> — créé — </w:t>
       </w:r>
-      <w:hyperlink w:history="1" r:id="rId68hvavqgmfvczajc1ierl">
+      <w:hyperlink w:history="1" r:id="rIdwhwzv97ehrbr7awtno8jy">
         <w:r>
           <w:rPr>
             <w:rStyle w:val="Hyperlink"/>
@@ -937,7 +937,7 @@
       <w:r>
         <w:t xml:space="preserve"> — créé — </w:t>
       </w:r>
-      <w:hyperlink w:history="1" r:id="rIdhpjmmquntdvhf7lm8y9ls">
+      <w:hyperlink w:history="1" r:id="rIdrwqyceknyedb7ax51ljsc">
         <w:r>
           <w:rPr>
             <w:rStyle w:val="Hyperlink"/>
@@ -966,7 +966,7 @@
       <w:r>
         <w:t xml:space="preserve"> — créé — </w:t>
       </w:r>
-      <w:hyperlink w:history="1" r:id="rIdewh94qkdc_7uupc6hnilv">
+      <w:hyperlink w:history="1" r:id="rIdzg3lecxeqx1f3dg3hos4a">
         <w:r>
           <w:rPr>
             <w:rStyle w:val="Hyperlink"/>
@@ -995,7 +995,7 @@
       <w:r>
         <w:t xml:space="preserve"> — créé — </w:t>
       </w:r>
-      <w:hyperlink w:history="1" r:id="rIdhis0ba4x1tn1gsbmthr-v">
+      <w:hyperlink w:history="1" r:id="rIdzpuybf_xnt1wwqmaowcm1">
         <w:r>
           <w:rPr>
             <w:rStyle w:val="Hyperlink"/>
@@ -1024,7 +1024,7 @@
       <w:r>
         <w:t xml:space="preserve"> — créé — </w:t>
       </w:r>
-      <w:hyperlink w:history="1" r:id="rIdar3s6166zbccacxgqwclj">
+      <w:hyperlink w:history="1" r:id="rIdebv1x48ps8kfigqnosrru">
         <w:r>
           <w:rPr>
             <w:rStyle w:val="Hyperlink"/>
@@ -1053,7 +1053,7 @@
       <w:r>
         <w:t xml:space="preserve"> — créé — </w:t>
       </w:r>
-      <w:hyperlink w:history="1" r:id="rIdo9rxfmryfpjsrrwtctlhx">
+      <w:hyperlink w:history="1" r:id="rIdzuo7xyqy0hjs7py3gjcst">
         <w:r>
           <w:rPr>
             <w:rStyle w:val="Hyperlink"/>
@@ -1082,7 +1082,7 @@
       <w:r>
         <w:t xml:space="preserve"> — créé — </w:t>
       </w:r>
-      <w:hyperlink w:history="1" r:id="rIdg5xrrpjioenlqqd21f9jp">
+      <w:hyperlink w:history="1" r:id="rId_inhjrshvqjum4hf9metc">
         <w:r>
           <w:rPr>
             <w:rStyle w:val="Hyperlink"/>
@@ -1111,7 +1111,7 @@
       <w:r>
         <w:t xml:space="preserve"> — créé — </w:t>
       </w:r>
-      <w:hyperlink w:history="1" r:id="rId5rjk1tqrpgjkkcmwmh8_7">
+      <w:hyperlink w:history="1" r:id="rIdcfrre0xrw6lt5_6ye53hm">
         <w:r>
           <w:rPr>
             <w:rStyle w:val="Hyperlink"/>
@@ -1148,7 +1148,7 @@
       <w:r>
         <w:t xml:space="preserve"> — créé — </w:t>
       </w:r>
-      <w:hyperlink w:history="1" r:id="rIdywpzt-vvwdr4ej3yuqxxy">
+      <w:hyperlink w:history="1" r:id="rId5a7zvxdq2vf4ttzkg_32g">
         <w:r>
           <w:rPr>
             <w:rStyle w:val="Hyperlink"/>
@@ -1177,7 +1177,7 @@
       <w:r>
         <w:t xml:space="preserve"> — créé — </w:t>
       </w:r>
-      <w:hyperlink w:history="1" r:id="rIdp3f5m-vqsbtdwrtk6wgnl">
+      <w:hyperlink w:history="1" r:id="rIdx7sud0daq1tx-tmfd6uyd">
         <w:r>
           <w:rPr>
             <w:rStyle w:val="Hyperlink"/>
@@ -1206,7 +1206,7 @@
       <w:r>
         <w:t xml:space="preserve"> — créé — </w:t>
       </w:r>
-      <w:hyperlink w:history="1" r:id="rId6wb-vu9xrq47ep2-57o-b">
+      <w:hyperlink w:history="1" r:id="rIdco1hyeuwnb-oe2bmm-ski">
         <w:r>
           <w:rPr>
             <w:rStyle w:val="Hyperlink"/>
@@ -1235,7 +1235,7 @@
       <w:r>
         <w:t xml:space="preserve"> — créé — </w:t>
       </w:r>
-      <w:hyperlink w:history="1" r:id="rIdoafbndleuxtwjxocejadx">
+      <w:hyperlink w:history="1" r:id="rIdc0jpvvssyea8yi0ha2irg">
         <w:r>
           <w:rPr>
             <w:rStyle w:val="Hyperlink"/>
@@ -1264,7 +1264,7 @@
       <w:r>
         <w:t xml:space="preserve"> — créé — </w:t>
       </w:r>
-      <w:hyperlink w:history="1" r:id="rIdagpow54cghtn4k71zrxg_">
+      <w:hyperlink w:history="1" r:id="rIdocqvktqtigallc-3r_gzp">
         <w:r>
           <w:rPr>
             <w:rStyle w:val="Hyperlink"/>
@@ -1293,7 +1293,7 @@
       <w:r>
         <w:t xml:space="preserve"> — créé — </w:t>
       </w:r>
-      <w:hyperlink w:history="1" r:id="rIde5x5b0pxgpwr91gs07fcs">
+      <w:hyperlink w:history="1" r:id="rIdsuvnk9lfou50fpxyk5ryd">
         <w:r>
           <w:rPr>
             <w:rStyle w:val="Hyperlink"/>
@@ -1322,7 +1322,7 @@
       <w:r>
         <w:t xml:space="preserve"> — créé — </w:t>
       </w:r>
-      <w:hyperlink w:history="1" r:id="rIdwexsss_geo3sj0opkbofu">
+      <w:hyperlink w:history="1" r:id="rIddbo1et1tyy82f9njlwwkb">
         <w:r>
           <w:rPr>
             <w:rStyle w:val="Hyperlink"/>
@@ -1351,7 +1351,7 @@
       <w:r>
         <w:t xml:space="preserve"> — créé — </w:t>
       </w:r>
-      <w:hyperlink w:history="1" r:id="rIdpi6l6hnjq8rtcpiaq3wi2">
+      <w:hyperlink w:history="1" r:id="rIdl8lvh-j0wbgtvvywusgib">
         <w:r>
           <w:rPr>
             <w:rStyle w:val="Hyperlink"/>
@@ -1380,7 +1380,7 @@
       <w:r>
         <w:t xml:space="preserve"> — créé — </w:t>
       </w:r>
-      <w:hyperlink w:history="1" r:id="rIdez1z3jhvkke0rnwmamq-d">
+      <w:hyperlink w:history="1" r:id="rIdfu_1gckuijjp0fk3-osy7">
         <w:r>
           <w:rPr>
             <w:rStyle w:val="Hyperlink"/>
@@ -1409,7 +1409,7 @@
       <w:r>
         <w:t xml:space="preserve"> — créé — </w:t>
       </w:r>
-      <w:hyperlink w:history="1" r:id="rIdamgvpe40xs-1cqa515uap">
+      <w:hyperlink w:history="1" r:id="rIdg8baxhfrb5v8bu1btypzl">
         <w:r>
           <w:rPr>
             <w:rStyle w:val="Hyperlink"/>
@@ -1438,7 +1438,7 @@
       <w:r>
         <w:t xml:space="preserve"> — créé — </w:t>
       </w:r>
-      <w:hyperlink w:history="1" r:id="rIdv9l7blgfgnbwbpazqvts7">
+      <w:hyperlink w:history="1" r:id="rId0qqnhdo_j55htoeqnyrr4">
         <w:r>
           <w:rPr>
             <w:rStyle w:val="Hyperlink"/>
@@ -1467,7 +1467,7 @@
       <w:r>
         <w:t xml:space="preserve"> — créé — </w:t>
       </w:r>
-      <w:hyperlink w:history="1" r:id="rId0hi38two04upgmvmovvsh">
+      <w:hyperlink w:history="1" r:id="rId7f7omv1mrrrdj2ogiqyul">
         <w:r>
           <w:rPr>
             <w:rStyle w:val="Hyperlink"/>
@@ -1496,7 +1496,7 @@
       <w:r>
         <w:t xml:space="preserve"> — créé — </w:t>
       </w:r>
-      <w:hyperlink w:history="1" r:id="rId6vnd0kv6cs8dfwlrdznw1">
+      <w:hyperlink w:history="1" r:id="rIdz4oeyo51kabrl36sgs1sq">
         <w:r>
           <w:rPr>
             <w:rStyle w:val="Hyperlink"/>
@@ -1525,7 +1525,7 @@
       <w:r>
         <w:t xml:space="preserve"> — créé — </w:t>
       </w:r>
-      <w:hyperlink w:history="1" r:id="rIdnqxeyiyonqtagccaqvzxv">
+      <w:hyperlink w:history="1" r:id="rId1oyvc7ofg7mgmizywd9ga">
         <w:r>
           <w:rPr>
             <w:rStyle w:val="Hyperlink"/>
@@ -1554,7 +1554,7 @@
       <w:r>
         <w:t xml:space="preserve"> — créé — </w:t>
       </w:r>
-      <w:hyperlink w:history="1" r:id="rId4pvkuxjm3mykk6pfwa5kj">
+      <w:hyperlink w:history="1" r:id="rIdsgnr54ybakyizdmaqvzfn">
         <w:r>
           <w:rPr>
             <w:rStyle w:val="Hyperlink"/>
@@ -1583,7 +1583,7 @@
       <w:r>
         <w:t xml:space="preserve"> — créé — </w:t>
       </w:r>
-      <w:hyperlink w:history="1" r:id="rIdlapwmalijwkfnomhwt6un">
+      <w:hyperlink w:history="1" r:id="rIdvfohjzznk6gc45vbhgbth">
         <w:r>
           <w:rPr>
             <w:rStyle w:val="Hyperlink"/>
@@ -1612,7 +1612,7 @@
       <w:r>
         <w:t xml:space="preserve"> — créé — </w:t>
       </w:r>
-      <w:hyperlink w:history="1" r:id="rIdx68llbwpe_kksylki_clc">
+      <w:hyperlink w:history="1" r:id="rIdx1yrnncrlawa2ikwbhhlq">
         <w:r>
           <w:rPr>
             <w:rStyle w:val="Hyperlink"/>
@@ -1641,7 +1641,7 @@
       <w:r>
         <w:t xml:space="preserve"> — créé — </w:t>
       </w:r>
-      <w:hyperlink w:history="1" r:id="rIdho98difbwzszwzydhpusz">
+      <w:hyperlink w:history="1" r:id="rIdiklp1qhm4xevkunzmldyt">
         <w:r>
           <w:rPr>
             <w:rStyle w:val="Hyperlink"/>
@@ -1670,7 +1670,7 @@
       <w:r>
         <w:t xml:space="preserve"> — créé — </w:t>
       </w:r>
-      <w:hyperlink w:history="1" r:id="rIdpa7vozfpdtqsxzz7sozwf">
+      <w:hyperlink w:history="1" r:id="rIdtctri5pqsguhyqisvyarr">
         <w:r>
           <w:rPr>
             <w:rStyle w:val="Hyperlink"/>
@@ -1699,7 +1699,7 @@
       <w:r>
         <w:t xml:space="preserve"> — créé — </w:t>
       </w:r>
-      <w:hyperlink w:history="1" r:id="rId7gplx2puwktzjxiyc_5ro">
+      <w:hyperlink w:history="1" r:id="rIdkt4010syt2yfopilfcwoy">
         <w:r>
           <w:rPr>
             <w:rStyle w:val="Hyperlink"/>
@@ -1728,7 +1728,7 @@
       <w:r>
         <w:t xml:space="preserve"> — créé — </w:t>
       </w:r>
-      <w:hyperlink w:history="1" r:id="rIdokkrrxvwtyezeizu-1c0n">
+      <w:hyperlink w:history="1" r:id="rIdq21pnrmbuwt7q4qwwtjo3">
         <w:r>
           <w:rPr>
             <w:rStyle w:val="Hyperlink"/>
@@ -1757,7 +1757,7 @@
       <w:r>
         <w:t xml:space="preserve"> — créé — </w:t>
       </w:r>
-      <w:hyperlink w:history="1" r:id="rIdrqslkl1lc83_rwbls4nyy">
+      <w:hyperlink w:history="1" r:id="rIdxeg_0zyy4ieqqa2tyk6cq">
         <w:r>
           <w:rPr>
             <w:rStyle w:val="Hyperlink"/>
@@ -1786,7 +1786,7 @@
       <w:r>
         <w:t xml:space="preserve"> — créé — </w:t>
       </w:r>
-      <w:hyperlink w:history="1" r:id="rIdl1xi_hluzbbd1biymit0i">
+      <w:hyperlink w:history="1" r:id="rIdfgztpybbsohg7m62ebkta">
         <w:r>
           <w:rPr>
             <w:rStyle w:val="Hyperlink"/>
@@ -1823,7 +1823,7 @@
       <w:r>
         <w:t xml:space="preserve"> — créé — </w:t>
       </w:r>
-      <w:hyperlink w:history="1" r:id="rIdyy5e_2pzwqazbaw6gmmv2">
+      <w:hyperlink w:history="1" r:id="rId3zyxbti2qubrmj0y2hot3">
         <w:r>
           <w:rPr>
             <w:rStyle w:val="Hyperlink"/>
@@ -1852,7 +1852,7 @@
       <w:r>
         <w:t xml:space="preserve"> — créé — </w:t>
       </w:r>
-      <w:hyperlink w:history="1" r:id="rIdxga2oc0o3mvuibk5nss_i">
+      <w:hyperlink w:history="1" r:id="rId1wyh-5-hozty4lxhuqsuy">
         <w:r>
           <w:rPr>
             <w:rStyle w:val="Hyperlink"/>
@@ -1881,7 +1881,7 @@
       <w:r>
         <w:t xml:space="preserve"> — créé — </w:t>
       </w:r>
-      <w:hyperlink w:history="1" r:id="rIduj8lufahrgnqqt4rsj9xu">
+      <w:hyperlink w:history="1" r:id="rIdfeil31xeq4aeiqhbs37f0">
         <w:r>
           <w:rPr>
             <w:rStyle w:val="Hyperlink"/>
@@ -1910,7 +1910,7 @@
       <w:r>
         <w:t xml:space="preserve"> — créé — </w:t>
       </w:r>
-      <w:hyperlink w:history="1" r:id="rIdzbrb-qtjq-29lnn7g0shg">
+      <w:hyperlink w:history="1" r:id="rIdv5wvkrorszkxicmythcgn">
         <w:r>
           <w:rPr>
             <w:rStyle w:val="Hyperlink"/>
@@ -1939,7 +1939,7 @@
       <w:r>
         <w:t xml:space="preserve"> — créé — </w:t>
       </w:r>
-      <w:hyperlink w:history="1" r:id="rIdov2yq1efnj4qmkupjneh8">
+      <w:hyperlink w:history="1" r:id="rIdu9msu9j62t6hp5fv6veuc">
         <w:r>
           <w:rPr>
             <w:rStyle w:val="Hyperlink"/>
@@ -1968,7 +1968,7 @@
       <w:r>
         <w:t xml:space="preserve"> — créé — </w:t>
       </w:r>
-      <w:hyperlink w:history="1" r:id="rId14myg0udsj3s_pcagjy9a">
+      <w:hyperlink w:history="1" r:id="rIdgiiywr7g-ei-kvckiechi">
         <w:r>
           <w:rPr>
             <w:rStyle w:val="Hyperlink"/>
@@ -1997,7 +1997,7 @@
       <w:r>
         <w:t xml:space="preserve"> — créé — </w:t>
       </w:r>
-      <w:hyperlink w:history="1" r:id="rIdrq4uhn1vq15txqlundusj">
+      <w:hyperlink w:history="1" r:id="rIdzhcxupemv_hgybgyoix7b">
         <w:r>
           <w:rPr>
             <w:rStyle w:val="Hyperlink"/>
@@ -2026,7 +2026,7 @@
       <w:r>
         <w:t xml:space="preserve"> — créé — </w:t>
       </w:r>
-      <w:hyperlink w:history="1" r:id="rIdmidk3zs_s3emso_um5e3k">
+      <w:hyperlink w:history="1" r:id="rIdelbgzv-vjrbed8li0lc9x">
         <w:r>
           <w:rPr>
             <w:rStyle w:val="Hyperlink"/>
@@ -2139,7 +2139,7 @@
       <w:r>
         <w:t xml:space="preserve"> — créé — </w:t>
       </w:r>
-      <w:hyperlink w:history="1" r:id="rIdryv2wyqefjui7u8hbum3s">
+      <w:hyperlink w:history="1" r:id="rId9hm4ivtoodygyhk-z7aq0">
         <w:r>
           <w:rPr>
             <w:rStyle w:val="Hyperlink"/>
@@ -2189,7 +2189,7 @@
       <w:r>
         <w:t xml:space="preserve"> — créé — </w:t>
       </w:r>
-      <w:hyperlink w:history="1" r:id="rIdjzpuxdshrzbk5kcq6dsrg">
+      <w:hyperlink w:history="1" r:id="rIdpytzqqxaekkg93kts6__9">
         <w:r>
           <w:rPr>
             <w:rStyle w:val="Hyperlink"/>
@@ -2218,7 +2218,7 @@
       <w:r>
         <w:t xml:space="preserve"> — créé — </w:t>
       </w:r>
-      <w:hyperlink w:history="1" r:id="rIdmzroeovhldsqlqlwjtavd">
+      <w:hyperlink w:history="1" r:id="rIdlv_yfvz9xkxtmt0qnnreo">
         <w:r>
           <w:rPr>
             <w:rStyle w:val="Hyperlink"/>
@@ -2247,7 +2247,7 @@
       <w:r>
         <w:t xml:space="preserve"> — créé — </w:t>
       </w:r>
-      <w:hyperlink w:history="1" r:id="rIdlxl3bgc1spxa7cbdktu3t">
+      <w:hyperlink w:history="1" r:id="rIdvveoa76gt1331l5kucmmd">
         <w:r>
           <w:rPr>
             <w:rStyle w:val="Hyperlink"/>
@@ -2276,7 +2276,7 @@
       <w:r>
         <w:t xml:space="preserve"> — créé — </w:t>
       </w:r>
-      <w:hyperlink w:history="1" r:id="rIdhlaizeyvhkmpo5bsezbhu">
+      <w:hyperlink w:history="1" r:id="rId6j47tnjg7bw_o71uag03i">
         <w:r>
           <w:rPr>
             <w:rStyle w:val="Hyperlink"/>
@@ -2313,7 +2313,7 @@
       <w:r>
         <w:t xml:space="preserve"> — créé — </w:t>
       </w:r>
-      <w:hyperlink w:history="1" r:id="rIdqergbxqrroqkgnpeji9n3">
+      <w:hyperlink w:history="1" r:id="rIddrdisdlibhj0bzjr92ifr">
         <w:r>
           <w:rPr>
             <w:rStyle w:val="Hyperlink"/>
@@ -2342,7 +2342,7 @@
       <w:r>
         <w:t xml:space="preserve"> — créé — </w:t>
       </w:r>
-      <w:hyperlink w:history="1" r:id="rIdbvnv4ncmmuhkc_-wvovzj">
+      <w:hyperlink w:history="1" r:id="rIdbgvdvwsd2nhpbslxrwgmt">
         <w:r>
           <w:rPr>
             <w:rStyle w:val="Hyperlink"/>
@@ -2379,7 +2379,7 @@
       <w:r>
         <w:t xml:space="preserve"> — créé — </w:t>
       </w:r>
-      <w:hyperlink w:history="1" r:id="rIdruavc0cimqrxnjpqphe6f">
+      <w:hyperlink w:history="1" r:id="rId6s3fl9hoygm9qgltotcdg">
         <w:r>
           <w:rPr>
             <w:rStyle w:val="Hyperlink"/>
@@ -2408,7 +2408,7 @@
       <w:r>
         <w:t xml:space="preserve"> — créé — </w:t>
       </w:r>
-      <w:hyperlink w:history="1" r:id="rId3nyqgei153tonr2s1dxzc">
+      <w:hyperlink w:history="1" r:id="rIdrn51w4jnd2c4kvk9lwyus">
         <w:r>
           <w:rPr>
             <w:rStyle w:val="Hyperlink"/>
@@ -2437,7 +2437,7 @@
       <w:r>
         <w:t xml:space="preserve"> — créé — </w:t>
       </w:r>
-      <w:hyperlink w:history="1" r:id="rIdt5cullxmkjiz3nxt0wooo">
+      <w:hyperlink w:history="1" r:id="rIdqyxlwkj4o9adaj16ev8wk">
         <w:r>
           <w:rPr>
             <w:rStyle w:val="Hyperlink"/>
@@ -2466,7 +2466,7 @@
       <w:r>
         <w:t xml:space="preserve"> — créé — </w:t>
       </w:r>
-      <w:hyperlink w:history="1" r:id="rId0qthlj1yhwgt3lugsy_hf">
+      <w:hyperlink w:history="1" r:id="rIdeni1b6rkvjuzi9gpmthyt">
         <w:r>
           <w:rPr>
             <w:rStyle w:val="Hyperlink"/>
@@ -2495,7 +2495,7 @@
       <w:r>
         <w:t xml:space="preserve"> — créé — </w:t>
       </w:r>
-      <w:hyperlink w:history="1" r:id="rIdwm86ql0amzddr-vgvzwhi">
+      <w:hyperlink w:history="1" r:id="rIdjepqa_tu2kti1ks7aajqo">
         <w:r>
           <w:rPr>
             <w:rStyle w:val="Hyperlink"/>
@@ -2524,7 +2524,7 @@
       <w:r>
         <w:t xml:space="preserve"> — créé — </w:t>
       </w:r>
-      <w:hyperlink w:history="1" r:id="rIdx8kuic82olbq8dykl5o9x">
+      <w:hyperlink w:history="1" r:id="rIdjxqgqvuzv_awpfkr6lzzs">
         <w:r>
           <w:rPr>
             <w:rStyle w:val="Hyperlink"/>
@@ -2553,7 +2553,7 @@
       <w:r>
         <w:t xml:space="preserve"> — créé — </w:t>
       </w:r>
-      <w:hyperlink w:history="1" r:id="rIdibp6rnl_dzq9o2jupwhyw">
+      <w:hyperlink w:history="1" r:id="rIdinvsvxi2kcv71cwil9p9l">
         <w:r>
           <w:rPr>
             <w:rStyle w:val="Hyperlink"/>
@@ -2582,7 +2582,7 @@
       <w:r>
         <w:t xml:space="preserve"> — créé — </w:t>
       </w:r>
-      <w:hyperlink w:history="1" r:id="rIdcm44d5cpc5dkzd_ulolry">
+      <w:hyperlink w:history="1" r:id="rIdpvfkz0tw6jxltbfrpzemh">
         <w:r>
           <w:rPr>
             <w:rStyle w:val="Hyperlink"/>
@@ -2611,7 +2611,7 @@
       <w:r>
         <w:t xml:space="preserve"> — créé — </w:t>
       </w:r>
-      <w:hyperlink w:history="1" r:id="rId3cudkvcrvsv_wdbbpsoyk">
+      <w:hyperlink w:history="1" r:id="rIdabtaxysz3jnobjepq4twm">
         <w:r>
           <w:rPr>
             <w:rStyle w:val="Hyperlink"/>
@@ -2648,7 +2648,7 @@
       <w:r>
         <w:t xml:space="preserve"> — créé — </w:t>
       </w:r>
-      <w:hyperlink w:history="1" r:id="rIdhaz1uzwcmclcsg_pw52kw">
+      <w:hyperlink w:history="1" r:id="rIdtifighelaijciyro7nw0k">
         <w:r>
           <w:rPr>
             <w:rStyle w:val="Hyperlink"/>
@@ -2677,7 +2677,7 @@
       <w:r>
         <w:t xml:space="preserve"> — créé — </w:t>
       </w:r>
-      <w:hyperlink w:history="1" r:id="rIdeoz4zpvczzwnwuyqic694">
+      <w:hyperlink w:history="1" r:id="rIdv0xu2b5am6vl3lp_x-w5u">
         <w:r>
           <w:rPr>
             <w:rStyle w:val="Hyperlink"/>
@@ -2706,7 +2706,7 @@
       <w:r>
         <w:t xml:space="preserve"> — créé — </w:t>
       </w:r>
-      <w:hyperlink w:history="1" r:id="rIdqywo-gzmnwpv10r8l4fom">
+      <w:hyperlink w:history="1" r:id="rIdaugao1wsykkgwj3sgxjsy">
         <w:r>
           <w:rPr>
             <w:rStyle w:val="Hyperlink"/>
@@ -2735,7 +2735,7 @@
       <w:r>
         <w:t xml:space="preserve"> — créé — </w:t>
       </w:r>
-      <w:hyperlink w:history="1" r:id="rId0r8oflshkqiyp5cv0_huh">
+      <w:hyperlink w:history="1" r:id="rIdkbtqb68vzw2ys5gw3ijuf">
         <w:r>
           <w:rPr>
             <w:rStyle w:val="Hyperlink"/>
@@ -2764,7 +2764,7 @@
       <w:r>
         <w:t xml:space="preserve"> — créé — </w:t>
       </w:r>
-      <w:hyperlink w:history="1" r:id="rId2hobwj-kcxt5ykiwbz1hf">
+      <w:hyperlink w:history="1" r:id="rIdfmivea7nb7apuxks5mfzm">
         <w:r>
           <w:rPr>
             <w:rStyle w:val="Hyperlink"/>
@@ -2793,7 +2793,7 @@
       <w:r>
         <w:t xml:space="preserve"> — créé — </w:t>
       </w:r>
-      <w:hyperlink w:history="1" r:id="rIdvb1nwphbct1pifud22fek">
+      <w:hyperlink w:history="1" r:id="rIdpprgw4ch91oh8nqtnyrf8">
         <w:r>
           <w:rPr>
             <w:rStyle w:val="Hyperlink"/>
@@ -2822,7 +2822,7 @@
       <w:r>
         <w:t xml:space="preserve"> — créé — </w:t>
       </w:r>
-      <w:hyperlink w:history="1" r:id="rIdchrfdjxdja2fgcbcacy6o">
+      <w:hyperlink w:history="1" r:id="rIdgjx3vx6eue8ir8zu4vqz4">
         <w:r>
           <w:rPr>
             <w:rStyle w:val="Hyperlink"/>
@@ -2851,7 +2851,7 @@
       <w:r>
         <w:t xml:space="preserve"> — créé — </w:t>
       </w:r>
-      <w:hyperlink w:history="1" r:id="rIdrml7hr0u5k1gnje6xb4lq">
+      <w:hyperlink w:history="1" r:id="rIdnoeif23skn4374zb5ha79">
         <w:r>
           <w:rPr>
             <w:rStyle w:val="Hyperlink"/>

</xml_diff>